<commit_message>
Syncs the released manuscripts and built documents to the batch-1/2 revision
The release tree had not been refreshed after the 2026-10-10 revision pass, so 01_paper/ still carried the previous manuscript revision while the review pack for round 20261026 embeds the current one. This commit closes that gap: the three Markdown manuscripts are now byte-identical to the working tree, and the six built .docx/.pdf files are the current builds. verify_release.py reports 357 files, 0 unlisted.

The revision itself (11 items, all traceable to the four reviews of round 20261025) adds captions to Fig. 1-4, removes two citations of coding rounds that the Supplementary declares superseded, repairs a dangling pointer in 8.1, marks the out-of-pool row in Table 4, and makes three one-sentence clarifications; the Supplementary gains the withdrawn-file availability note, the frozen-section discrepancy record, and unified readings for Table S38.
</commit_message>
<xml_diff>
--- a/01_paper/P2_English_submission_blind_v1.docx
+++ b/01_paper/P2_English_submission_blind_v1.docx
@@ -564,7 +564,70 @@
         <w:t>S12</w:t>
       </w:r>
       <w:r>
-        <w:t>); the reported number's split is non-independent). These are defensible answers, not the four counting units (§6.1: 10/19, 13/19, 4/19, 12/19). Declaring the unit is therefore a methodological premise, not a caveat (§3, §6).</w:t>
+        <w:t>); the reported number's split is non-independent). The readings above are all defensible, and §6.1's four counting units (</w:t>
+      </w:r>
+      <w:r>
+        <w:rPr>
+          <w:rFonts w:ascii="Consolas" w:hAnsi="Consolas"/>
+        </w:rPr>
+        <w:t>release</w:t>
+      </w:r>
+      <w:r>
+        <w:t xml:space="preserve">, </w:t>
+      </w:r>
+      <w:r>
+        <w:rPr>
+          <w:rFonts w:ascii="Consolas" w:hAnsi="Consolas"/>
+        </w:rPr>
+        <w:t>protocol</w:t>
+      </w:r>
+      <w:r>
+        <w:t xml:space="preserve">, </w:t>
+      </w:r>
+      <w:r>
+        <w:rPr>
+          <w:rFonts w:ascii="Consolas" w:hAnsi="Consolas"/>
+        </w:rPr>
+        <w:t>yolo_dist</w:t>
+      </w:r>
+      <w:r>
+        <w:t xml:space="preserve">, </w:t>
+      </w:r>
+      <w:r>
+        <w:rPr>
+          <w:rFonts w:ascii="Consolas" w:hAnsi="Consolas"/>
+        </w:rPr>
+        <w:t>reported</w:t>
+      </w:r>
+      <w:r>
+        <w:t xml:space="preserve">) are the </w:t>
+      </w:r>
+      <w:r>
+        <w:rPr>
+          <w:b/>
+        </w:rPr>
+        <w:t>columns</w:t>
+      </w:r>
+      <w:r>
+        <w:t xml:space="preserve"> they come from — including </w:t>
+      </w:r>
+      <w:r>
+        <w:rPr>
+          <w:rFonts w:ascii="Consolas" w:hAnsi="Consolas"/>
+        </w:rPr>
+        <w:t>yolo_dist</w:t>
+      </w:r>
+      <w:r>
+        <w:t xml:space="preserve">, omitted above, at </w:t>
+      </w:r>
+      <w:r>
+        <w:rPr>
+          <w:b/>
+        </w:rPr>
+        <w:t>4/19</w:t>
+      </w:r>
+      <w:r>
+        <w:t>. Declaring the unit is therefore a methodological premise, not a caveat (§3, §6).</w:t>
       </w:r>
     </w:p>
     <w:p>
@@ -2210,7 +2273,13 @@
         <w:t>adds</w:t>
       </w:r>
       <w:r>
-        <w:t xml:space="preserve"> a measurable amount on top — does not.</w:t>
+        <w:t xml:space="preserve"> a measurable amount on top — does not. </w:t>
+      </w:r>
+      <w:r>
+        <w:rPr>
+          <w:b/>
+        </w:rPr>
+        <w:t>The premium this paper measures is the premium of selecting on the reported split; aliasing is the configuration that guarantees it, not an additional term.</w:t>
       </w:r>
     </w:p>
     <w:p>
@@ -2503,7 +2572,22 @@
         <w:t>8 of 28</w:t>
       </w:r>
       <w:r>
-        <w:t>.</w:t>
+        <w:t xml:space="preserve">. </w:t>
+      </w:r>
+      <w:r>
+        <w:rPr>
+          <w:b/>
+        </w:rPr>
+        <w:t>These three bases answer three different questions</w:t>
+      </w:r>
+      <w:r>
+        <w:t xml:space="preserve"> — configurations (6 of 14), the files inside them (19), the archived manifest's rows (8 of 28) — </w:t>
+      </w:r>
+      <w:r>
+        <w:rPr>
+          <w:b/>
+        </w:rPr>
+        <w:t>not three estimates of one rate.</w:t>
       </w:r>
     </w:p>
     <w:p>
@@ -5682,7 +5766,43 @@
         <w:t>+5.65 pp</w:t>
       </w:r>
       <w:r>
-        <w:t xml:space="preserve">, 18/20 positive. The queries, the rest of the frame and the reason public logs </w:t>
+        <w:t xml:space="preserve">, 18/20 positive. </w:t>
+      </w:r>
+      <w:r>
+        <w:rPr>
+          <w:b/>
+        </w:rPr>
+        <w:t>The sign is not the informative part</w:t>
+      </w:r>
+      <w:r>
+        <w:t xml:space="preserve">: the premium is a within-run maximum minus that run's own final epoch, so it is </w:t>
+      </w:r>
+      <w:r>
+        <w:rPr>
+          <w:b/>
+        </w:rPr>
+        <w:t>non-negative by construction</w:t>
+      </w:r>
+      <w:r>
+        <w:t xml:space="preserve"> (both non-positive logs sit at exactly </w:t>
+      </w:r>
+      <w:r>
+        <w:rPr>
+          <w:b/>
+        </w:rPr>
+        <w:t>+0.00</w:t>
+      </w:r>
+      <w:r>
+        <w:t xml:space="preserve">), and the sample's content is its </w:t>
+      </w:r>
+      <w:r>
+        <w:rPr>
+          <w:b/>
+        </w:rPr>
+        <w:t>magnitude</w:t>
+      </w:r>
+      <w:r>
+        <w:t xml:space="preserve">. The queries, the rest of the frame and the reason public logs </w:t>
       </w:r>
       <w:r>
         <w:rPr>
@@ -6001,6 +6121,62 @@
         <w:rPr>
           <w:b/>
         </w:rPr>
+        <w:t>Fig. 1.</w:t>
+      </w:r>
+      <w:r>
+        <w:t xml:space="preserve"> The four counting units on the same nineteen benchmarks — the </w:t>
+      </w:r>
+      <w:r>
+        <w:rPr>
+          <w:b/>
+        </w:rPr>
+        <w:t>printed single-rater</w:t>
+      </w:r>
+      <w:r>
+        <w:t xml:space="preserve"> counts (10/19 </w:t>
+      </w:r>
+      <w:r>
+        <w:rPr>
+          <w:rFonts w:ascii="Consolas" w:hAnsi="Consolas"/>
+        </w:rPr>
+        <w:t>release</w:t>
+      </w:r>
+      <w:r>
+        <w:t xml:space="preserve">, 13/19 </w:t>
+      </w:r>
+      <w:r>
+        <w:rPr>
+          <w:rFonts w:ascii="Consolas" w:hAnsi="Consolas"/>
+        </w:rPr>
+        <w:t>protocol</w:t>
+      </w:r>
+      <w:r>
+        <w:t xml:space="preserve">, 4/19 </w:t>
+      </w:r>
+      <w:r>
+        <w:rPr>
+          <w:rFonts w:ascii="Consolas" w:hAnsi="Consolas"/>
+        </w:rPr>
+        <w:t>yolo_dist</w:t>
+      </w:r>
+      <w:r>
+        <w:t xml:space="preserve">, 12/19 </w:t>
+      </w:r>
+      <w:r>
+        <w:rPr>
+          <w:rFonts w:ascii="Consolas" w:hAnsi="Consolas"/>
+        </w:rPr>
+        <w:t>reported</w:t>
+      </w:r>
+      <w:r>
+        <w:t>); the re-verified tallies are Table 3's second column.</w:t>
+      </w:r>
+    </w:p>
+    <w:p>
+      <w:r>
+        <w:rPr>
+          <w:b/>
+        </w:rPr>
         <w:t>Table 3.</w:t>
       </w:r>
       <w:r>
@@ -6283,22 +6459,13 @@
         <w:t>single rater's</w:t>
       </w:r>
       <w:r>
-        <w:t xml:space="preserve"> judgement (per-coder κ </w:t>
-      </w:r>
-      <w:r>
-        <w:rPr>
-          <w:b/>
-        </w:rPr>
-        <w:t>0.11–0.44</w:t>
-      </w:r>
-      <w:r>
-        <w:t xml:space="preserve">, the weakest unit in the three-valued round). </w:t>
-      </w:r>
-      <w:r>
-        <w:rPr>
-          <w:b/>
-        </w:rPr>
-        <w:t>Independent re-coding reproduces it only at slight-to-fair agreement, and ten coders given the archived evidence still do not reproduce the `reported` column</w:t>
+        <w:t xml:space="preserve"> judgement. </w:t>
+      </w:r>
+      <w:r>
+        <w:rPr>
+          <w:b/>
+        </w:rPr>
+        <w:t>Independent re-coding reproduces it only at slight-to-fair agreement</w:t>
       </w:r>
       <w:r>
         <w:t xml:space="preserve"> (Supplementary S12). A </w:t>
@@ -6835,170 +7002,6 @@
           </w:p>
         </w:tc>
       </w:tr>
-      <w:tr>
-        <w:tc>
-          <w:tcPr>
-            <w:tcW w:type="dxa" w:w="1293"/>
-          </w:tcPr>
-          <w:p>
-            <w:pPr>
-              <w:spacing w:line="240" w:lineRule="auto"/>
-            </w:pPr>
-            <w:r>
-              <w:rPr>
-                <w:sz w:val="20"/>
-              </w:rPr>
-              <w:t>↳ of which **literal two-key same path** (= the 2/19 the original audit reported)</w:t>
-            </w:r>
-          </w:p>
-        </w:tc>
-        <w:tc>
-          <w:tcPr>
-            <w:tcW w:type="dxa" w:w="1293"/>
-          </w:tcPr>
-          <w:p>
-            <w:pPr>
-              <w:spacing w:line="240" w:lineRule="auto"/>
-            </w:pPr>
-            <w:r>
-              <w:rPr>
-                <w:sz w:val="20"/>
-              </w:rPr>
-              <w:t>**2/19 ≈ 11 %**</w:t>
-            </w:r>
-          </w:p>
-        </w:tc>
-        <w:tc>
-          <w:tcPr>
-            <w:tcW w:type="dxa" w:w="1293"/>
-          </w:tcPr>
-          <w:p>
-            <w:pPr>
-              <w:spacing w:line="240" w:lineRule="auto"/>
-            </w:pPr>
-            <w:r>
-              <w:rPr>
-                <w:sz w:val="20"/>
-              </w:rPr>
-              <w:t>**1/19**</w:t>
-            </w:r>
-          </w:p>
-        </w:tc>
-        <w:tc>
-          <w:tcPr>
-            <w:tcW w:type="dxa" w:w="1293"/>
-          </w:tcPr>
-          <w:p>
-            <w:pPr>
-              <w:spacing w:line="240" w:lineRule="auto"/>
-            </w:pPr>
-            <w:r>
-              <w:rPr>
-                <w:sz w:val="20"/>
-              </w:rPr>
-              <w:t>2/19 → **1/19**</w:t>
-            </w:r>
-          </w:p>
-        </w:tc>
-        <w:tc>
-          <w:tcPr>
-            <w:tcW w:type="dxa" w:w="1293"/>
-          </w:tcPr>
-          <w:p>
-            <w:pPr>
-              <w:spacing w:line="240" w:lineRule="auto"/>
-            </w:pPr>
-            <w:r>
-              <w:rPr>
-                <w:sz w:val="20"/>
-              </w:rPr>
-              <w:t>—</w:t>
-            </w:r>
-          </w:p>
-        </w:tc>
-      </w:tr>
-      <w:tr>
-        <w:tc>
-          <w:tcPr>
-            <w:tcW w:type="dxa" w:w="1293"/>
-          </w:tcPr>
-          <w:p>
-            <w:pPr>
-              <w:spacing w:line="240" w:lineRule="auto"/>
-            </w:pPr>
-            <w:r>
-              <w:rPr>
-                <w:sz w:val="20"/>
-              </w:rPr>
-              <w:t>↳ of which `reported` is **`clean`** (independent)</w:t>
-            </w:r>
-          </w:p>
-        </w:tc>
-        <w:tc>
-          <w:tcPr>
-            <w:tcW w:type="dxa" w:w="1293"/>
-          </w:tcPr>
-          <w:p>
-            <w:pPr>
-              <w:spacing w:line="240" w:lineRule="auto"/>
-            </w:pPr>
-            <w:r>
-              <w:rPr>
-                <w:sz w:val="20"/>
-              </w:rPr>
-              <w:t>**3/19 ≈ 16 %**</w:t>
-            </w:r>
-          </w:p>
-        </w:tc>
-        <w:tc>
-          <w:tcPr>
-            <w:tcW w:type="dxa" w:w="1293"/>
-          </w:tcPr>
-          <w:p>
-            <w:pPr>
-              <w:spacing w:line="240" w:lineRule="auto"/>
-            </w:pPr>
-            <w:r>
-              <w:rPr>
-                <w:sz w:val="20"/>
-              </w:rPr>
-              <w:t>**6/19**</w:t>
-            </w:r>
-          </w:p>
-        </w:tc>
-        <w:tc>
-          <w:tcPr>
-            <w:tcW w:type="dxa" w:w="1293"/>
-          </w:tcPr>
-          <w:p>
-            <w:pPr>
-              <w:spacing w:line="240" w:lineRule="auto"/>
-            </w:pPr>
-            <w:r>
-              <w:rPr>
-                <w:sz w:val="20"/>
-              </w:rPr>
-              <w:t>3/15 → **6/16–6/17**</w:t>
-            </w:r>
-          </w:p>
-        </w:tc>
-        <w:tc>
-          <w:tcPr>
-            <w:tcW w:type="dxa" w:w="1293"/>
-          </w:tcPr>
-          <w:p>
-            <w:pPr>
-              <w:spacing w:line="240" w:lineRule="auto"/>
-            </w:pPr>
-            <w:r>
-              <w:rPr>
-                <w:sz w:val="20"/>
-              </w:rPr>
-              <w:t>4 → **2–3 rows**</w:t>
-            </w:r>
-          </w:p>
-        </w:tc>
-      </w:tr>
     </w:tbl>
     <w:p>
       <w:r>
@@ -7075,34 +7078,7 @@
         <w:t>§10</w:t>
       </w:r>
       <w:r>
-        <w:t xml:space="preserve">, defect 5) — and re-coded blind by </w:t>
-      </w:r>
-      <w:r>
-        <w:rPr>
-          <w:b/>
-        </w:rPr>
-        <w:t>five current-generation language models</w:t>
-      </w:r>
-      <w:r>
-        <w:t xml:space="preserve">, who agree at </w:t>
-      </w:r>
-      <w:r>
-        <w:rPr>
-          <w:b/>
-        </w:rPr>
-        <w:t>Fleiss κ 0.824</w:t>
-      </w:r>
-      <w:r>
-        <w:t xml:space="preserve">; re-verifying every row first-hand changes </w:t>
-      </w:r>
-      <w:r>
-        <w:rPr>
-          <w:b/>
-        </w:rPr>
-        <w:t>30 cells</w:t>
-      </w:r>
-      <w:r>
-        <w:t xml:space="preserve">, and the coders </w:t>
+        <w:t xml:space="preserve">, defect 5). The five blind coders </w:t>
       </w:r>
       <w:r>
         <w:rPr>
@@ -7111,7 +7087,7 @@
         <w:t>independently reach 19 of 30 (63.3 %)</w:t>
       </w:r>
       <w:r>
-        <w:t xml:space="preserve">, eleven unanimously, while </w:t>
+        <w:t xml:space="preserve"> corrected cells, eleven unanimously, while </w:t>
       </w:r>
       <w:r>
         <w:rPr>
@@ -7129,52 +7105,43 @@
         <w:t>undecidable</w:t>
       </w:r>
       <w:r>
+        <w:t xml:space="preserve">; a </w:t>
+      </w:r>
+      <w:r>
+        <w:rPr>
+          <w:b/>
+        </w:rPr>
+        <w:t>non-blind, model-assisted</w:t>
+      </w:r>
+      <w:r>
+        <w:t xml:space="preserve"> pass agrees at κ </w:t>
+      </w:r>
+      <w:r>
+        <w:rPr>
+          <w:b/>
+        </w:rPr>
+        <w:t>0.874</w:t>
+      </w:r>
+      <w:r>
+        <w:t xml:space="preserve"> and </w:t>
+      </w:r>
+      <w:r>
+        <w:rPr>
+          <w:b/>
+        </w:rPr>
+        <w:t>moves two rows</w:t>
+      </w:r>
+      <w:r>
         <w:t xml:space="preserve"> (</w:t>
       </w:r>
       <w:r>
         <w:rPr>
           <w:b/>
         </w:rPr>
-        <w:t>S12</w:t>
-      </w:r>
-      <w:r>
-        <w:t xml:space="preserve">); a </w:t>
-      </w:r>
-      <w:r>
-        <w:rPr>
-          <w:b/>
-        </w:rPr>
-        <w:t>non-blind, model-assisted</w:t>
-      </w:r>
-      <w:r>
-        <w:t xml:space="preserve"> pass agrees at κ </w:t>
-      </w:r>
-      <w:r>
-        <w:rPr>
-          <w:b/>
-        </w:rPr>
-        <w:t>0.874</w:t>
-      </w:r>
-      <w:r>
-        <w:t xml:space="preserve"> (</w:t>
-      </w:r>
-      <w:r>
-        <w:rPr>
-          <w:b/>
-        </w:rPr>
         <w:t>Supplementary S12</w:t>
       </w:r>
       <w:r>
-        <w:t xml:space="preserve">) and </w:t>
-      </w:r>
-      <w:r>
-        <w:rPr>
-          <w:b/>
-        </w:rPr>
-        <w:t>moves two rows</w:t>
-      </w:r>
-      <w:r>
-        <w:t xml:space="preserve">. </w:t>
+        <w:t xml:space="preserve">). </w:t>
       </w:r>
       <w:r>
         <w:rPr>
@@ -7247,64 +7214,6 @@
       </w:r>
       <w:r>
         <w:t>).</w:t>
-      </w:r>
-    </w:p>
-    <w:p>
-      <w:r>
-        <w:rPr>
-          <w:b/>
-        </w:rPr>
-        <w:t>Five clauses move to Supplementary S12</w:t>
-      </w:r>
-      <w:r>
-        <w:t xml:space="preserve"> (the self-check's column and subtotal equalities to</w:t>
-      </w:r>
-    </w:p>
-    <w:p>
-      <w:r>
-        <w:rPr>
-          <w:b/>
-        </w:rPr>
-        <w:t>S1</w:t>
-      </w:r>
-      <w:r>
-        <w:t xml:space="preserve">): the COCO row's judged number, the </w:t>
-      </w:r>
-      <w:r>
-        <w:rPr>
-          <w:rFonts w:ascii="Consolas" w:hAnsi="Consolas"/>
-        </w:rPr>
-        <w:t>yolo_dist</w:t>
-      </w:r>
-      <w:r>
-        <w:t xml:space="preserve"> first-version correction (</w:t>
-      </w:r>
-      <w:r>
-        <w:rPr>
-          <w:b/>
-        </w:rPr>
-        <w:t>4/19</w:t>
-      </w:r>
-      <w:r>
-        <w:t>), the literal-two-key self-check (</w:t>
-      </w:r>
-      <w:r>
-        <w:rPr>
-          <w:b/>
-        </w:rPr>
-        <w:t>2/19</w:t>
-      </w:r>
-      <w:r>
-        <w:t xml:space="preserve">), Mendeley face-mask's </w:t>
-      </w:r>
-      <w:r>
-        <w:rPr>
-          <w:b/>
-        </w:rPr>
-        <w:t>generator</w:t>
-      </w:r>
-      <w:r>
-        <w:t xml:space="preserve"> provenance, and the audit's unused "63–79 %" bound.</w:t>
       </w:r>
     </w:p>
     <w:p>
@@ -7596,7 +7505,34 @@
         <w:t>Supplementary S34c</w:t>
       </w:r>
       <w:r>
-        <w:t>).</w:t>
+        <w:t xml:space="preserve">). Its </w:t>
+      </w:r>
+      <w:r>
+        <w:rPr>
+          <w:b/>
+        </w:rPr>
+        <w:t>68.2 %</w:t>
+      </w:r>
+      <w:r>
+        <w:t xml:space="preserve"> is a rate over </w:t>
+      </w:r>
+      <w:r>
+        <w:rPr>
+          <w:b/>
+        </w:rPr>
+        <w:t>six runs</w:t>
+      </w:r>
+      <w:r>
+        <w:t xml:space="preserve"> on this probe's own split and is </w:t>
+      </w:r>
+      <w:r>
+        <w:rPr>
+          <w:b/>
+        </w:rPr>
+        <w:t>not comparable</w:t>
+      </w:r>
+      <w:r>
+        <w:t xml:space="preserve"> with §8.6's realization rate: different protocol, different denominator.</w:t>
       </w:r>
     </w:p>
     <w:p>
@@ -8074,7 +8010,7 @@
         <w:t>defined in writing before any run</w:t>
       </w:r>
       <w:r>
-        <w:t xml:space="preserve">. The registration text and its </w:t>
+        <w:t xml:space="preserve">. Its </w:t>
       </w:r>
       <w:r>
         <w:rPr>
@@ -8083,7 +8019,7 @@
         <w:t>FROZEN-HASH</w:t>
       </w:r>
       <w:r>
-        <w:t xml:space="preserve"> stamp are in </w:t>
+        <w:t xml:space="preserve"> stamp is stated in </w:t>
       </w:r>
       <w:r>
         <w:rPr>
@@ -8092,7 +8028,25 @@
         <w:t>§9</w:t>
       </w:r>
       <w:r>
-        <w:t xml:space="preserve"> and in the author-side registration record; </w:t>
+        <w:t xml:space="preserve">; the registration </w:t>
+      </w:r>
+      <w:r>
+        <w:rPr>
+          <w:b/>
+        </w:rPr>
+        <w:t>text</w:t>
+      </w:r>
+      <w:r>
+        <w:t xml:space="preserve"> itself is the companion's and is </w:t>
+      </w:r>
+      <w:r>
+        <w:rPr>
+          <w:b/>
+        </w:rPr>
+        <w:t>author-side</w:t>
+      </w:r>
+      <w:r>
+        <w:t>, so this paper carries the stamp and the readings (</w:t>
       </w:r>
       <w:r>
         <w:rPr>
@@ -8101,7 +8055,7 @@
         <w:t>Tables S24–S27</w:t>
       </w:r>
       <w:r>
-        <w:t xml:space="preserve"> carry the registered cells' readings. What this paper measures</w:t>
+        <w:t>), not the document. What this paper measures</w:t>
       </w:r>
     </w:p>
     <w:p>
@@ -8512,6 +8466,44 @@
             </a:graphic>
           </wp:inline>
         </w:drawing>
+      </w:r>
+    </w:p>
+    <w:p>
+      <w:r>
+        <w:rPr>
+          <w:b/>
+        </w:rPr>
+        <w:t>Fig. 2.</w:t>
+      </w:r>
+      <w:r>
+        <w:t xml:space="preserve"> The </w:t>
+      </w:r>
+      <w:r>
+        <w:rPr>
+          <w:rFonts w:ascii="Consolas" w:hAnsi="Consolas"/>
+        </w:rPr>
+        <w:t>val</w:t>
+      </w:r>
+      <w:r>
+        <w:t xml:space="preserve">-selected premium against what it realizes on the disjoint </w:t>
+      </w:r>
+      <w:r>
+        <w:rPr>
+          <w:rFonts w:ascii="Consolas" w:hAnsi="Consolas"/>
+        </w:rPr>
+        <w:t>test</w:t>
+      </w:r>
+      <w:r>
+        <w:t xml:space="preserve"> split, per arm-cell; the title's aggregate is the plotted pool's — </w:t>
+      </w:r>
+      <w:r>
+        <w:rPr>
+          <w:b/>
+        </w:rPr>
+        <w:t>§8.6</w:t>
+      </w:r>
+      <w:r>
+        <w:t xml:space="preserve"> names the pool Table 4 uses.</w:t>
       </w:r>
     </w:p>
     <w:p>
@@ -9427,7 +9419,7 @@
               <w:rPr>
                 <w:sz w:val="20"/>
               </w:rPr>
-              <w:t>aitod20</w:t>
+              <w:t>aitod20 **†**</w:t>
             </w:r>
           </w:p>
         </w:tc>
@@ -9575,6 +9567,15 @@
         <w:rPr>
           <w:b/>
         </w:rPr>
+        <w:t>the `†` row, and the only one</w:t>
+      </w:r>
+      <w:r>
+        <w:t xml:space="preserve">; </w:t>
+      </w:r>
+      <w:r>
+        <w:rPr>
+          <w:b/>
+        </w:rPr>
         <w:t>both readings are reported and both intervals cover zero</w:t>
       </w:r>
       <w:r>
@@ -10266,6 +10267,35 @@
         <w:rPr>
           <w:b/>
         </w:rPr>
+        <w:t>Fig. 3.</w:t>
+      </w:r>
+      <w:r>
+        <w:t xml:space="preserve"> Realization rate against the noise scale σ̂ of the run's own </w:t>
+      </w:r>
+      <w:r>
+        <w:rPr>
+          <w:rFonts w:ascii="Consolas" w:hAnsi="Consolas"/>
+        </w:rPr>
+        <w:t>val</w:t>
+      </w:r>
+      <w:r>
+        <w:t xml:space="preserve"> curve, over </w:t>
+      </w:r>
+      <w:r>
+        <w:rPr>
+          <w:b/>
+        </w:rPr>
+        <w:t>80 runs</w:t>
+      </w:r>
+      <w:r>
+        <w:t xml:space="preserve"> in three groups of 27 (Spearman ρ = −0.466, p = 1.3×10⁻⁵); dashed: rate = 1, dotted: §8.6's pooled reading.</w:t>
+      </w:r>
+    </w:p>
+    <w:p>
+      <w:r>
+        <w:rPr>
+          <w:b/>
+        </w:rPr>
         <w:t>Pool composition — and why the claim does not turn on it.</w:t>
       </w:r>
       <w:r>
@@ -10461,6 +10491,80 @@
             </a:graphic>
           </wp:inline>
         </w:drawing>
+      </w:r>
+    </w:p>
+    <w:p>
+      <w:r>
+        <w:rPr>
+          <w:b/>
+        </w:rPr>
+        <w:t>Fig. 4.</w:t>
+      </w:r>
+      <w:r>
+        <w:t xml:space="preserve"> </w:t>
+      </w:r>
+      <w:r>
+        <w:rPr>
+          <w:b/>
+        </w:rPr>
+        <w:t>Left</w:t>
+      </w:r>
+      <w:r>
+        <w:t xml:space="preserve">: mean </w:t>
+      </w:r>
+      <w:r>
+        <w:rPr>
+          <w:rFonts w:ascii="Consolas" w:hAnsi="Consolas"/>
+        </w:rPr>
+        <w:t>val</w:t>
+      </w:r>
+      <w:r>
+        <w:t xml:space="preserve"> and </w:t>
+      </w:r>
+      <w:r>
+        <w:rPr>
+          <w:rFonts w:ascii="Consolas" w:hAnsi="Consolas"/>
+        </w:rPr>
+        <w:t>test</w:t>
+      </w:r>
+      <w:r>
+        <w:t xml:space="preserve"> trajectories over 10 seeds, both headline cells (baseline solid, strategy dashed). </w:t>
+      </w:r>
+      <w:r>
+        <w:rPr>
+          <w:b/>
+        </w:rPr>
+        <w:t>Right</w:t>
+      </w:r>
+      <w:r>
+        <w:t xml:space="preserve">: per-(seed, epoch) </w:t>
+      </w:r>
+      <w:r>
+        <w:rPr>
+          <w:rFonts w:ascii="Consolas" w:hAnsi="Consolas"/>
+        </w:rPr>
+        <w:t>val</w:t>
+      </w:r>
+      <w:r>
+        <w:t xml:space="preserve"> movement against what transfers to </w:t>
+      </w:r>
+      <w:r>
+        <w:rPr>
+          <w:rFonts w:ascii="Consolas" w:hAnsi="Consolas"/>
+        </w:rPr>
+        <w:t>test</w:t>
+      </w:r>
+      <w:r>
+        <w:t xml:space="preserve"> — the ratio is not taken (its denominator can vanish); the fit through the origin is </w:t>
+      </w:r>
+      <w:r>
+        <w:rPr>
+          <w:b/>
+        </w:rPr>
+        <w:t>κ = 0.734</w:t>
+      </w:r>
+      <w:r>
+        <w:t>.</w:t>
       </w:r>
     </w:p>
     <w:p>

</xml_diff>

<commit_message>
Records the twenty-six-cell distribution in section 8.6, with Table 4's source list moved to the supplement
Section 8.6 read only the five-cell pool's median (17.6 %). The reviews asked for the full pool's distribution, which the supplement already states and which the article was therefore reporting only in part: read with the 2026-10-06 escalation folded in, WC > 0 holds in 25 of the 26 arm-cells, the arm-cell median realization rate rises from 17.2 % to 21.6 %, and the realized premium is still negative in 8 of the 13 strategy arms (Table S38b). Those three numbers are now in section 8.6. Table 4's per-column source list moved to the supplement to pay for the sentence, so the article stayed at 35 pages.

This closes the last open item on the 20261026 response table: its twelve must-do and ten worth-doing items are now all executed.

Regressions: article 35 pages, abstract 247 words, anchors 289/289, both manuscript forms byte-identical.
</commit_message>
<xml_diff>
--- a/01_paper/P2_English_submission_blind_v1.docx
+++ b/01_paper/P2_English_submission_blind_v1.docx
@@ -8666,70 +8666,70 @@
         <w:t>aitod20</w:t>
       </w:r>
       <w:r>
-        <w:t xml:space="preserve"> only its baseline — so the arm-cell is the unit). Source: the </w:t>
-      </w:r>
-      <w:r>
-        <w:rPr>
-          <w:b/>
-        </w:rPr>
-        <w:t>per-epoch `val` curves</w:t>
-      </w:r>
-      <w:r>
-        <w:t xml:space="preserve"> (</w:t>
+        <w:t xml:space="preserve"> only its baseline — so the arm-cell is the unit). Source files for every column: </w:t>
+      </w:r>
+      <w:r>
+        <w:rPr>
+          <w:b/>
+        </w:rPr>
+        <w:t>Supplementary S12</w:t>
+      </w:r>
+      <w:r>
+        <w:t xml:space="preserve"> (this revision's two batches included). </w:t>
+      </w:r>
+      <w:r>
+        <w:rPr>
+          <w:b/>
+        </w:rPr>
+        <w:t>Read with the 2026-10-06 escalation folded in, the full twenty-six-cell pool keeps its direction</w:t>
+      </w:r>
+      <w:r>
+        <w:t xml:space="preserve">: </w:t>
       </w:r>
       <w:r>
         <w:rPr>
           <w:rFonts w:ascii="Consolas" w:hAnsi="Consolas"/>
         </w:rPr>
-        <w:t>results.csv</w:t>
-      </w:r>
-      <w:r>
-        <w:t xml:space="preserve">, for </w:t>
-      </w:r>
-      <w:r>
-        <w:rPr>
-          <w:rFonts w:ascii="Consolas" w:hAnsi="Consolas"/>
-        </w:rPr>
-        <w:t>prem_val</w:t>
-      </w:r>
-      <w:r>
-        <w:t xml:space="preserve">), </w:t>
-      </w:r>
-      <w:r>
-        <w:rPr>
-          <w:rFonts w:ascii="Consolas" w:hAnsi="Consolas"/>
-        </w:rPr>
-        <w:t>xeval_20260916/matrix.csv</w:t>
-      </w:r>
-      <w:r>
-        <w:t>, and this revision's two batches (</w:t>
-      </w:r>
-      <w:r>
-        <w:rPr>
-          <w:rFonts w:ascii="Consolas" w:hAnsi="Consolas"/>
-        </w:rPr>
-        <w:t>x4_teval.csv</w:t>
-      </w:r>
-      <w:r>
-        <w:t xml:space="preserve"> on A, </w:t>
-      </w:r>
-      <w:r>
-        <w:rPr>
-          <w:rFonts w:ascii="Consolas" w:hAnsi="Consolas"/>
-        </w:rPr>
-        <w:t>x4fill_20260925.csv</w:t>
-      </w:r>
-      <w:r>
-        <w:t xml:space="preserve"> on B, for </w:t>
-      </w:r>
-      <w:r>
-        <w:rPr>
-          <w:rFonts w:ascii="Consolas" w:hAnsi="Consolas"/>
-        </w:rPr>
-        <w:t>prem_test</w:t>
-      </w:r>
-      <w:r>
-        <w:t xml:space="preserve">). </w:t>
+        <w:t>WC &gt; 0</w:t>
+      </w:r>
+      <w:r>
+        <w:t xml:space="preserve"> in </w:t>
+      </w:r>
+      <w:r>
+        <w:rPr>
+          <w:b/>
+        </w:rPr>
+        <w:t>25 of 26</w:t>
+      </w:r>
+      <w:r>
+        <w:t xml:space="preserve"> arm-cells, the arm-cell median realization rate </w:t>
+      </w:r>
+      <w:r>
+        <w:rPr>
+          <w:b/>
+        </w:rPr>
+        <w:t>17.2 % → 21.6 %</w:t>
+      </w:r>
+      <w:r>
+        <w:t xml:space="preserve">, and the premium still negative in </w:t>
+      </w:r>
+      <w:r>
+        <w:rPr>
+          <w:b/>
+        </w:rPr>
+        <w:t>8 of 13</w:t>
+      </w:r>
+      <w:r>
+        <w:t xml:space="preserve"> strategy arms (</w:t>
+      </w:r>
+      <w:r>
+        <w:rPr>
+          <w:b/>
+        </w:rPr>
+        <w:t>Supplementary S12</w:t>
+      </w:r>
+      <w:r>
+        <w:t xml:space="preserve">, Table S38b). </w:t>
       </w:r>
       <w:r>
         <w:rPr>

</xml_diff>

<commit_message>
E1: full-budget realisation (§8.8, Table S46-S47); abstract / §8.6 / §11 / §12 / §13 adjusted; supplement S13-S14
</commit_message>
<xml_diff>
--- a/01_paper/P2_English_submission_blind_v1.docx
+++ b/01_paper/P2_English_submission_blind_v1.docx
@@ -129,7 +129,7 @@
         <w:t>smoke2sf</w:t>
       </w:r>
       <w:r>
-        <w:t xml:space="preserve">, p = 0.54). A declared, </w:t>
+        <w:t xml:space="preserve">, p = 0.54). A </w:t>
       </w:r>
       <w:r>
         <w:rPr>
@@ -174,7 +174,16 @@
         <w:t>descriptive</w:t>
       </w:r>
       <w:r>
-        <w:t xml:space="preserve">, given with intervals only (Table 4). No power analysis was registered, so the scan's nine </w:t>
+        <w:t xml:space="preserve">, as intervals only (Table 4). </w:t>
+      </w:r>
+      <w:r>
+        <w:rPr>
+          <w:b/>
+        </w:rPr>
+        <w:t>At full budget, 99 % (§8.8).</w:t>
+      </w:r>
+      <w:r>
+        <w:t xml:space="preserve"> No power analysis was registered; the nine </w:t>
       </w:r>
       <w:r>
         <w:rPr>
@@ -212,7 +221,7 @@
         <w:t>five</w:t>
       </w:r>
       <w:r>
-        <w:t xml:space="preserve"> current-generation models recovers </w:t>
+        <w:t xml:space="preserve"> models recovers </w:t>
       </w:r>
       <w:r>
         <w:rPr>
@@ -236,7 +245,7 @@
         <w:rPr>
           <w:b/>
         </w:rPr>
-        <w:t>11 of the 30 are not recovered</w:t>
+        <w:t>11 of 30 are not recovered</w:t>
       </w:r>
       <w:r>
         <w:t xml:space="preserve"> (§6.1, S12).</w:t>
@@ -8611,7 +8620,25 @@
         <w:t>val</w:t>
       </w:r>
       <w:r>
-        <w:t xml:space="preserve"> premium" would be false; "in these five cells, about a quarter survives" is what we measured.</w:t>
+        <w:t xml:space="preserve"> premium" would be false; "in these five cells, about a quarter survives" is what we measured. The rate is moreover </w:t>
+      </w:r>
+      <w:r>
+        <w:rPr>
+          <w:b/>
+        </w:rPr>
+        <w:t>scale-dependent</w:t>
+      </w:r>
+      <w:r>
+        <w:t xml:space="preserve"> (§8.8): at full training budget on the same corpus it reaches </w:t>
+      </w:r>
+      <w:r>
+        <w:rPr>
+          <w:b/>
+        </w:rPr>
+        <w:t>+99.2 %</w:t>
+      </w:r>
+      <w:r>
+        <w:t>, so the 20 %-train reading is the</w:t>
       </w:r>
     </w:p>
     <w:p>
@@ -8619,7 +8646,10 @@
         <w:rPr>
           <w:b/>
         </w:rPr>
-        <w:t>How much of the gain selected on `val` survives on `test`?</w:t>
+        <w:t>worst</w:t>
+      </w:r>
+      <w:r>
+        <w:t xml:space="preserve"> of the two regimes measured, not a general constant.</w:t>
       </w:r>
     </w:p>
     <w:p>
@@ -8627,6 +8657,14 @@
         <w:rPr>
           <w:b/>
         </w:rPr>
+        <w:t>How much of the gain selected on `val` survives on `test`?</w:t>
+      </w:r>
+    </w:p>
+    <w:p>
+      <w:r>
+        <w:rPr>
+          <w:b/>
+        </w:rPr>
         <w:t>Table 4.</w:t>
       </w:r>
       <w:r>
@@ -8676,60 +8714,6 @@
       </w:r>
       <w:r>
         <w:t xml:space="preserve"> (this revision's two batches included). </w:t>
-      </w:r>
-      <w:r>
-        <w:rPr>
-          <w:b/>
-        </w:rPr>
-        <w:t>Read with the 2026-10-06 escalation folded in, the full twenty-six-cell pool keeps its direction</w:t>
-      </w:r>
-      <w:r>
-        <w:t xml:space="preserve">: </w:t>
-      </w:r>
-      <w:r>
-        <w:rPr>
-          <w:rFonts w:ascii="Consolas" w:hAnsi="Consolas"/>
-        </w:rPr>
-        <w:t>WC &gt; 0</w:t>
-      </w:r>
-      <w:r>
-        <w:t xml:space="preserve"> in </w:t>
-      </w:r>
-      <w:r>
-        <w:rPr>
-          <w:b/>
-        </w:rPr>
-        <w:t>25 of 26</w:t>
-      </w:r>
-      <w:r>
-        <w:t xml:space="preserve"> arm-cells, the arm-cell median realization rate </w:t>
-      </w:r>
-      <w:r>
-        <w:rPr>
-          <w:b/>
-        </w:rPr>
-        <w:t>17.2 % → 21.6 %</w:t>
-      </w:r>
-      <w:r>
-        <w:t xml:space="preserve">, and the premium still negative in </w:t>
-      </w:r>
-      <w:r>
-        <w:rPr>
-          <w:b/>
-        </w:rPr>
-        <w:t>8 of 13</w:t>
-      </w:r>
-      <w:r>
-        <w:t xml:space="preserve"> strategy arms (</w:t>
-      </w:r>
-      <w:r>
-        <w:rPr>
-          <w:b/>
-        </w:rPr>
-        <w:t>Supplementary S12</w:t>
-      </w:r>
-      <w:r>
-        <w:t xml:space="preserve">, Table S38b). </w:t>
       </w:r>
       <w:r>
         <w:rPr>
@@ -9550,117 +9534,177 @@
     </w:tbl>
     <w:p>
       <w:r>
-        <w:t xml:space="preserve">&gt; </w:t>
-      </w:r>
-      <w:r>
-        <w:rPr>
-          <w:b/>
-        </w:rPr>
-        <w:t>The inclusion rule, stated as a rule.</w:t>
-      </w:r>
-      <w:r>
-        <w:t xml:space="preserve"> An arm-cell enters the pool </w:t>
-      </w:r>
-      <w:r>
-        <w:rPr>
-          <w:b/>
-        </w:rPr>
-        <w:t>iff its `test` side reached n ≥ 5</w:t>
+        <w:t xml:space="preserve">where </w:t>
+      </w:r>
+      <w:r>
+        <w:rPr>
+          <w:rFonts w:ascii="Consolas" w:hAnsi="Consolas"/>
+        </w:rPr>
+        <w:t>prem_val = V_max − V_final</w:t>
       </w:r>
       <w:r>
         <w:t xml:space="preserve"> (</w:t>
       </w:r>
       <w:r>
         <w:rPr>
+          <w:b/>
+        </w:rPr>
+        <w:t>selecting on val</w:t>
+      </w:r>
+      <w:r>
+        <w:t xml:space="preserve">) and </w:t>
+      </w:r>
+      <w:r>
+        <w:rPr>
           <w:rFonts w:ascii="Consolas" w:hAnsi="Consolas"/>
         </w:rPr>
-        <w:t>work/item2_final_v2_20260925.py</w:t>
-      </w:r>
-      <w:r>
-        <w:t xml:space="preserve">), applied to every cell alike; </w:t>
-      </w:r>
-      <w:r>
-        <w:rPr>
-          <w:b/>
-        </w:rPr>
-        <w:t>exactly five met it at the 2026-09-25 freeze</w:t>
-      </w:r>
-      <w:r>
-        <w:t xml:space="preserve"> (50 runs). The </w:t>
-      </w:r>
-      <w:r>
-        <w:rPr>
-          <w:rFonts w:ascii="Consolas" w:hAnsi="Consolas"/>
-        </w:rPr>
-        <w:t>aitod20</w:t>
-      </w:r>
-      <w:r>
-        <w:t xml:space="preserve"> strategy row </w:t>
-      </w:r>
-      <w:r>
-        <w:rPr>
-          <w:b/>
-        </w:rPr>
-        <w:t>qualifies under the same rule but completed after the freeze</w:t>
-      </w:r>
-      <w:r>
-        <w:t xml:space="preserve">, so it is printed here as the sixth row and kept out of the primary pool — </w:t>
-      </w:r>
-      <w:r>
-        <w:rPr>
-          <w:b/>
-        </w:rPr>
-        <w:t>the `†` row, and the only one</w:t>
-      </w:r>
-      <w:r>
-        <w:t xml:space="preserve">; </w:t>
-      </w:r>
-      <w:r>
-        <w:rPr>
-          <w:b/>
-        </w:rPr>
-        <w:t>both readings are reported and both intervals cover zero</w:t>
-      </w:r>
-      <w:r>
-        <w:t xml:space="preserve"> (Table S20's note, §8.6b).</w:t>
+        <w:t>prem_test = T_best − T_final</w:t>
+      </w:r>
+      <w:r>
+        <w:t xml:space="preserve"> (</w:t>
+      </w:r>
+      <w:r>
+        <w:rPr>
+          <w:b/>
+        </w:rPr>
+        <w:t>realized on test</w:t>
+      </w:r>
+      <w:r>
+        <w:t>).</w:t>
       </w:r>
     </w:p>
     <w:p>
       <w:r>
-        <w:t xml:space="preserve">where </w:t>
+        <w:rPr>
+          <w:b/>
+        </w:rPr>
+        <w:t>Aggregate</w:t>
+      </w:r>
+      <w:r>
+        <w:t xml:space="preserve"> (runs weighted equally, n = 50): </w:t>
       </w:r>
       <w:r>
         <w:rPr>
           <w:rFonts w:ascii="Consolas" w:hAnsi="Consolas"/>
         </w:rPr>
-        <w:t>prem_val = V_max − V_final</w:t>
-      </w:r>
-      <w:r>
-        <w:t xml:space="preserve"> (</w:t>
-      </w:r>
-      <w:r>
-        <w:rPr>
-          <w:b/>
-        </w:rPr>
-        <w:t>selecting on val</w:t>
-      </w:r>
-      <w:r>
-        <w:t xml:space="preserve">) and </w:t>
+        <w:t>prem_val</w:t>
+      </w:r>
+      <w:r>
+        <w:t xml:space="preserve"> </w:t>
+      </w:r>
+      <w:r>
+        <w:rPr>
+          <w:b/>
+        </w:rPr>
+        <w:t>+0.879 pp</w:t>
+      </w:r>
+      <w:r>
+        <w:t xml:space="preserve"> → </w:t>
       </w:r>
       <w:r>
         <w:rPr>
           <w:rFonts w:ascii="Consolas" w:hAnsi="Consolas"/>
         </w:rPr>
-        <w:t>prem_test = T_best − T_final</w:t>
-      </w:r>
-      <w:r>
-        <w:t xml:space="preserve"> (</w:t>
-      </w:r>
-      <w:r>
-        <w:rPr>
-          <w:b/>
-        </w:rPr>
-        <w:t>realized on test</w:t>
+        <w:t>prem_test</w:t>
+      </w:r>
+      <w:r>
+        <w:t xml:space="preserve"> </w:t>
+      </w:r>
+      <w:r>
+        <w:rPr>
+          <w:b/>
+        </w:rPr>
+        <w:t>+0.205 pp</w:t>
+      </w:r>
+      <w:r>
+        <w:t xml:space="preserve">. </w:t>
+      </w:r>
+      <w:r>
+        <w:rPr>
+          <w:b/>
+        </w:rPr>
+        <w:t>At the claim level this is not significant</w:t>
+      </w:r>
+      <w:r>
+        <w:t xml:space="preserve">: the </w:t>
+      </w:r>
+      <w:r>
+        <w:rPr>
+          <w:b/>
+        </w:rPr>
+        <w:t>claim-level interval</w:t>
+      </w:r>
+      <w:r>
+        <w:t xml:space="preserve"> is the cell-level, five-cluster one, </w:t>
+      </w:r>
+      <w:r>
+        <w:rPr>
+          <w:b/>
+        </w:rPr>
+        <w:t>[−17.3 %, 53.2 %]</w:t>
+      </w:r>
+      <w:r>
+        <w:t xml:space="preserve">, </w:t>
+      </w:r>
+      <w:r>
+        <w:rPr>
+          <w:b/>
+        </w:rPr>
+        <w:t>P(rate ≤ 0) = 0.118</w:t>
+      </w:r>
+      <w:r>
+        <w:t xml:space="preserve">, zero inside. Descriptively, arm-cell median </w:t>
+      </w:r>
+      <w:r>
+        <w:rPr>
+          <w:b/>
+        </w:rPr>
+        <w:t>17.6 %</w:t>
+      </w:r>
+      <w:r>
+        <w:t xml:space="preserve"> and run-weighted </w:t>
+      </w:r>
+      <w:r>
+        <w:rPr>
+          <w:b/>
+        </w:rPr>
+        <w:t>23.3 %</w:t>
+      </w:r>
+      <w:r>
+        <w:t xml:space="preserve"> (span </w:t>
+      </w:r>
+      <w:r>
+        <w:rPr>
+          <w:b/>
+        </w:rPr>
+        <w:t>2/5</w:t>
+      </w:r>
+      <w:r>
+        <w:t xml:space="preserve"> negative: Table 4). On a difference scale the eleven clusters give </w:t>
+      </w:r>
+      <w:r>
+        <w:rPr>
+          <w:b/>
+        </w:rPr>
+        <w:t>−1.367 pp</w:t>
+      </w:r>
+      <w:r>
+        <w:t xml:space="preserve">, 95 % CI </w:t>
+      </w:r>
+      <w:r>
+        <w:rPr>
+          <w:b/>
+        </w:rPr>
+        <w:t>[−1.59, −1.15]</w:t>
+      </w:r>
+      <w:r>
+        <w:t xml:space="preserve"> (five-cell denominators </w:t>
+      </w:r>
+      <w:r>
+        <w:rPr>
+          <w:b/>
+        </w:rPr>
+        <w:t>+0.605 to +1.469 pp</w:t>
       </w:r>
       <w:r>
         <w:t>).</w:t>
@@ -9668,596 +9712,57 @@
     </w:p>
     <w:p>
       <w:r>
-        <w:rPr>
-          <w:b/>
-        </w:rPr>
-        <w:t>The three bases</w:t>
-      </w:r>
-      <w:r>
-        <w:t xml:space="preserve">: run-level </w:t>
+        <w:t xml:space="preserve">The monotonicity is a correlation, not a causal claim, and at the arm-cell unit the nine-cluster reading is ρ = </w:t>
+      </w:r>
+      <w:r>
+        <w:rPr>
+          <w:b/>
+        </w:rPr>
+        <w:t>−0.433</w:t>
+      </w:r>
+      <w:r>
+        <w:t xml:space="preserve"> (p = 0.244) — see </w:t>
+      </w:r>
+      <w:r>
+        <w:rPr>
+          <w:b/>
+        </w:rPr>
+        <w:t>Fig. 3</w:t>
+      </w:r>
+      <w:r>
+        <w:t xml:space="preserve"> and </w:t>
+      </w:r>
+      <w:r>
+        <w:rPr>
+          <w:b/>
+        </w:rPr>
+        <w:t>Supplementary S12</w:t>
+      </w:r>
+      <w:r>
+        <w:t xml:space="preserve">: the n = 80 are the 81 runs with a measured </w:t>
       </w:r>
       <w:r>
         <w:rPr>
           <w:rFonts w:ascii="Consolas" w:hAnsi="Consolas"/>
         </w:rPr>
-        <w:t>[8.4 %, 37.4 %]</w:t>
-      </w:r>
-      <w:r>
-        <w:t xml:space="preserve">, </w:t>
+        <w:t>test</w:t>
+      </w:r>
+      <w:r>
+        <w:t xml:space="preserve"> side less the one whose </w:t>
       </w:r>
       <w:r>
         <w:rPr>
           <w:rFonts w:ascii="Consolas" w:hAnsi="Consolas"/>
         </w:rPr>
-        <w:t>P = 0.002</w:t>
-      </w:r>
-      <w:r>
-        <w:t xml:space="preserve">; five-cell </w:t>
-      </w:r>
-      <w:r>
-        <w:rPr>
-          <w:rFonts w:ascii="Consolas" w:hAnsi="Consolas"/>
-        </w:rPr>
-        <w:t>[−17.3 %, 53.2 %]</w:t>
-      </w:r>
-      <w:r>
-        <w:t xml:space="preserve">, </w:t>
-      </w:r>
-      <w:r>
-        <w:rPr>
-          <w:rFonts w:ascii="Consolas" w:hAnsi="Consolas"/>
-        </w:rPr>
-        <w:t>P = 0.118</w:t>
-      </w:r>
-      <w:r>
-        <w:t xml:space="preserve"> (claim-level, </w:t>
-      </w:r>
-      <w:r>
-        <w:rPr>
-          <w:b/>
-        </w:rPr>
-        <w:t>zero inside</w:t>
-      </w:r>
-      <w:r>
-        <w:t xml:space="preserve">); eleven-cluster </w:t>
-      </w:r>
-      <w:r>
-        <w:rPr>
-          <w:rFonts w:ascii="Consolas" w:hAnsi="Consolas"/>
-        </w:rPr>
-        <w:t>[19.3 %, 60.4 %]</w:t>
-      </w:r>
-      <w:r>
-        <w:t xml:space="preserve">, </w:t>
-      </w:r>
-      <w:r>
-        <w:rPr>
-          <w:rFonts w:ascii="Consolas" w:hAnsi="Consolas"/>
-        </w:rPr>
-        <w:t>P &lt; 0.001</w:t>
-      </w:r>
-      <w:r>
-        <w:t xml:space="preserve"> (a bootstrap tail proportion </w:t>
-      </w:r>
-      <w:r>
-        <w:rPr>
-          <w:b/>
-        </w:rPr>
-        <w:t>at the 20,000-resample resolution</w:t>
-      </w:r>
-      <w:r>
-        <w:t>, i.e. below the floor this procedure can print).</w:t>
+        <w:t>prem_val</w:t>
+      </w:r>
+      <w:r>
+        <w:t xml:space="preserve"> is 0. It has a named precedent: [53] gives validation overfitting (VO) its name and bounds the expected best observed loss by E[min L] ≥ ν* − s_m√(2 log(Nq)), an optimism growing with the number of selection queries Nq.</w:t>
       </w:r>
     </w:p>
     <w:p>
       <w:r>
-        <w:rPr>
-          <w:b/>
-        </w:rPr>
-        <w:t>Aggregate</w:t>
-      </w:r>
-      <w:r>
-        <w:t xml:space="preserve"> (runs weighted equally, n = 50): </w:t>
-      </w:r>
-      <w:r>
-        <w:rPr>
-          <w:rFonts w:ascii="Consolas" w:hAnsi="Consolas"/>
-        </w:rPr>
-        <w:t>prem_val</w:t>
-      </w:r>
-      <w:r>
-        <w:t xml:space="preserve"> </w:t>
-      </w:r>
-      <w:r>
-        <w:rPr>
-          <w:b/>
-        </w:rPr>
-        <w:t>+0.879 pp</w:t>
-      </w:r>
-      <w:r>
-        <w:t xml:space="preserve"> → </w:t>
-      </w:r>
-      <w:r>
-        <w:rPr>
-          <w:rFonts w:ascii="Consolas" w:hAnsi="Consolas"/>
-        </w:rPr>
-        <w:t>prem_test</w:t>
-      </w:r>
-      <w:r>
-        <w:t xml:space="preserve"> </w:t>
-      </w:r>
-      <w:r>
-        <w:rPr>
-          <w:b/>
-        </w:rPr>
-        <w:t>+0.205 pp</w:t>
-      </w:r>
-      <w:r>
-        <w:t xml:space="preserve">. </w:t>
-      </w:r>
-      <w:r>
-        <w:rPr>
-          <w:b/>
-        </w:rPr>
-        <w:t>At the claim level this is not significant</w:t>
-      </w:r>
-      <w:r>
-        <w:t xml:space="preserve">: the </w:t>
-      </w:r>
-      <w:r>
-        <w:rPr>
-          <w:b/>
-        </w:rPr>
-        <w:t>claim-level interval</w:t>
-      </w:r>
-      <w:r>
-        <w:t xml:space="preserve"> is the cell-level, five-cluster one, </w:t>
-      </w:r>
-      <w:r>
-        <w:rPr>
-          <w:b/>
-        </w:rPr>
-        <w:t>[−17.3 %, 53.2 %]</w:t>
-      </w:r>
-      <w:r>
-        <w:t xml:space="preserve">, </w:t>
-      </w:r>
-      <w:r>
-        <w:rPr>
-          <w:b/>
-        </w:rPr>
-        <w:t>P(rate ≤ 0) = 0.118</w:t>
-      </w:r>
-      <w:r>
-        <w:t xml:space="preserve">, zero inside. Descriptively, arm-cell median </w:t>
-      </w:r>
-      <w:r>
-        <w:rPr>
-          <w:b/>
-        </w:rPr>
-        <w:t>17.6 %</w:t>
-      </w:r>
-      <w:r>
-        <w:t xml:space="preserve"> and run-weighted </w:t>
-      </w:r>
-      <w:r>
-        <w:rPr>
-          <w:b/>
-        </w:rPr>
-        <w:t>23.3 %</w:t>
-      </w:r>
-      <w:r>
-        <w:t xml:space="preserve"> (span </w:t>
-      </w:r>
-      <w:r>
-        <w:rPr>
-          <w:b/>
-        </w:rPr>
-        <w:t>2/5</w:t>
-      </w:r>
-      <w:r>
-        <w:t xml:space="preserve"> negative: Table 4). On a difference scale the eleven clusters give </w:t>
-      </w:r>
-      <w:r>
-        <w:rPr>
-          <w:b/>
-        </w:rPr>
-        <w:t>−1.367 pp</w:t>
-      </w:r>
-      <w:r>
-        <w:t xml:space="preserve">, 95 % CI </w:t>
-      </w:r>
-      <w:r>
-        <w:rPr>
-          <w:b/>
-        </w:rPr>
-        <w:t>[−1.59, −1.15]</w:t>
-      </w:r>
-      <w:r>
-        <w:t xml:space="preserve"> (five-cell denominators </w:t>
-      </w:r>
-      <w:r>
-        <w:rPr>
-          <w:b/>
-        </w:rPr>
-        <w:t>+0.605 to +1.469 pp</w:t>
-      </w:r>
-      <w:r>
-        <w:t xml:space="preserve">). Re-aggregated: run-weighted </w:t>
-      </w:r>
-      <w:r>
-        <w:rPr>
-          <w:b/>
-        </w:rPr>
-        <w:t>36.9 %</w:t>
-      </w:r>
-      <w:r>
-        <w:t xml:space="preserve">, arm-cell-equal </w:t>
-      </w:r>
-      <w:r>
-        <w:rPr>
-          <w:b/>
-        </w:rPr>
-        <w:t>39.3 %</w:t>
-      </w:r>
-      <w:r>
-        <w:t xml:space="preserve">, 95 % CI </w:t>
-      </w:r>
-      <w:r>
-        <w:rPr>
-          <w:b/>
-        </w:rPr>
-        <w:t>[19.3 %, 60.4 %]</w:t>
-      </w:r>
-      <w:r>
-        <w:t xml:space="preserve"> — </w:t>
-      </w:r>
-      <w:r>
-        <w:rPr>
-          <w:b/>
-        </w:rPr>
-        <w:t>completing the cell, not the weighting, is what moves it</w:t>
-      </w:r>
-      <w:r>
-        <w:t xml:space="preserve">: at n = 10 the three weightings agree, so </w:t>
-      </w:r>
-      <w:r>
-        <w:rPr>
-          <w:b/>
-        </w:rPr>
-        <w:t>the fragile axis is pool composition</w:t>
-      </w:r>
-      <w:r>
-        <w:t xml:space="preserve">. </w:t>
-      </w:r>
-      <w:r>
-        <w:rPr>
-          <w:b/>
-        </w:rPr>
-        <w:t>Leave-one-out 9.77 % to 34.16 %.</w:t>
-      </w:r>
-      <w:r>
-        <w:t xml:space="preserve"> In two arm-cells the selection action </w:t>
-      </w:r>
-      <w:r>
-        <w:rPr>
-          <w:b/>
-        </w:rPr>
-        <w:t>costs</w:t>
-      </w:r>
-      <w:r>
-        <w:t xml:space="preserve"> rather than fails to pay off (</w:t>
-      </w:r>
-      <w:r>
-        <w:rPr>
-          <w:rFonts w:ascii="Consolas" w:hAnsi="Consolas"/>
-        </w:rPr>
-        <w:t>smoke2sf</w:t>
-      </w:r>
-      <w:r>
-        <w:t xml:space="preserve"> strategy, </w:t>
-      </w:r>
-      <w:r>
-        <w:rPr>
-          <w:rFonts w:ascii="Consolas" w:hAnsi="Consolas"/>
-        </w:rPr>
-        <w:t>aitod20</w:t>
-      </w:r>
-      <w:r>
-        <w:t xml:space="preserve"> baseline); the escalated cells of §5.1 are </w:t>
-      </w:r>
-      <w:r>
-        <w:rPr>
-          <w:b/>
-        </w:rPr>
-        <w:t>not pooled with these five</w:t>
-      </w:r>
-      <w:r>
-        <w:t xml:space="preserve"> (different runs, different protocol). The closest concurrent work [12], the winner's-curse check, the withdrawn σ√(2 ln E) form and each cell's corpus pair: </w:t>
-      </w:r>
-      <w:r>
-        <w:rPr>
-          <w:b/>
-        </w:rPr>
-        <w:t>Supplementary S12</w:t>
-      </w:r>
-      <w:r>
-        <w:t>.</w:t>
-      </w:r>
-    </w:p>
-    <w:p>
-      <w:r>
-        <w:t xml:space="preserve">(the </w:t>
-      </w:r>
-      <w:r>
-        <w:rPr>
-          <w:rFonts w:ascii="Consolas" w:hAnsi="Consolas"/>
-        </w:rPr>
-        <w:t>best.pt</w:t>
-      </w:r>
-      <w:r>
-        <w:t xml:space="preserve">-versus-argmax residual, our withdrawn attribution and why the remainder is </w:t>
-      </w:r>
-      <w:r>
-        <w:rPr>
-          <w:b/>
-        </w:rPr>
-        <w:t>unidentified</w:t>
-      </w:r>
-      <w:r>
-        <w:t xml:space="preserve">: </w:t>
-      </w:r>
-      <w:r>
-        <w:rPr>
-          <w:b/>
-        </w:rPr>
-        <w:t>Supplementary S12</w:t>
-      </w:r>
-      <w:r>
-        <w:t>.)</w:t>
-      </w:r>
-    </w:p>
-    <w:p>
-      <w:r>
-        <w:t xml:space="preserve">The monotonicity is a correlation, not a causal claim, and at the arm-cell unit the nine-cluster reading is ρ = </w:t>
-      </w:r>
-      <w:r>
-        <w:rPr>
-          <w:b/>
-        </w:rPr>
-        <w:t>−0.433</w:t>
-      </w:r>
-      <w:r>
-        <w:t xml:space="preserve"> (p = 0.244) — see </w:t>
-      </w:r>
-      <w:r>
-        <w:rPr>
-          <w:b/>
-        </w:rPr>
-        <w:t>Fig. 3</w:t>
-      </w:r>
-      <w:r>
-        <w:t xml:space="preserve"> and </w:t>
-      </w:r>
-      <w:r>
-        <w:rPr>
-          <w:b/>
-        </w:rPr>
-        <w:t>Supplementary S12</w:t>
-      </w:r>
-      <w:r>
-        <w:t xml:space="preserve">: the n = 80 are the 81 runs with a measured </w:t>
-      </w:r>
-      <w:r>
-        <w:rPr>
-          <w:rFonts w:ascii="Consolas" w:hAnsi="Consolas"/>
-        </w:rPr>
-        <w:t>test</w:t>
-      </w:r>
-      <w:r>
-        <w:t xml:space="preserve"> side less the one whose </w:t>
-      </w:r>
-      <w:r>
-        <w:rPr>
-          <w:rFonts w:ascii="Consolas" w:hAnsi="Consolas"/>
-        </w:rPr>
-        <w:t>prem_val</w:t>
-      </w:r>
-      <w:r>
-        <w:t xml:space="preserve"> is 0. It has a named precedent: [53] gives validation overfitting (VO) its name and bounds the expected best observed loss by E[min L] ≥ ν* − s_m√(2 log(Nq)), an optimism growing with the number of selection queries Nq.</w:t>
-      </w:r>
-    </w:p>
-    <w:p>
-      <w:r>
-        <w:rPr>
-          <w:b/>
-        </w:rPr>
-        <w:t>Recomputation status.</w:t>
-      </w:r>
-      <w:r>
-        <w:t xml:space="preserve"> The readings were originally </w:t>
-      </w:r>
-      <w:r>
-        <w:rPr>
-          <w:b/>
-        </w:rPr>
-        <w:t>not locally recomputable</w:t>
-      </w:r>
-      <w:r>
-        <w:t xml:space="preserve"> (the archive lacks 6 of 7 corpora; </w:t>
-      </w:r>
-      <w:r>
-        <w:rPr>
-          <w:b/>
-        </w:rPr>
-        <w:t>§10, defect 5</w:t>
-      </w:r>
-      <w:r>
-        <w:t xml:space="preserve">); a GPU </w:t>
-      </w:r>
-      <w:r>
-        <w:rPr>
-          <w:b/>
-        </w:rPr>
-        <w:t>2 × 2 evaluation</w:t>
-      </w:r>
-      <w:r>
-        <w:t xml:space="preserve"> on </w:t>
-      </w:r>
-      <w:r>
-        <w:rPr>
-          <w:b/>
-        </w:rPr>
-        <w:t>41</w:t>
-      </w:r>
-      <w:r>
-        <w:t xml:space="preserve"> three-way runs of </w:t>
-      </w:r>
-      <w:r>
-        <w:rPr>
-          <w:b/>
-        </w:rPr>
-        <w:t>YOLOv12n [54]</w:t>
-      </w:r>
-      <w:r>
-        <w:t xml:space="preserve"> × {</w:t>
-      </w:r>
-      <w:r>
-        <w:rPr>
-          <w:rFonts w:ascii="Consolas" w:hAnsi="Consolas"/>
-        </w:rPr>
-        <w:t>best</w:t>
-      </w:r>
-      <w:r>
-        <w:t xml:space="preserve">, </w:t>
-      </w:r>
-      <w:r>
-        <w:rPr>
-          <w:rFonts w:ascii="Consolas" w:hAnsi="Consolas"/>
-        </w:rPr>
-        <w:t>last</w:t>
-      </w:r>
-      <w:r>
-        <w:t>} × {</w:t>
-      </w:r>
-      <w:r>
-        <w:rPr>
-          <w:rFonts w:ascii="Consolas" w:hAnsi="Consolas"/>
-        </w:rPr>
-        <w:t>val</w:t>
-      </w:r>
-      <w:r>
-        <w:t xml:space="preserve">, </w:t>
-      </w:r>
-      <w:r>
-        <w:rPr>
-          <w:rFonts w:ascii="Consolas" w:hAnsi="Consolas"/>
-        </w:rPr>
-        <w:t>test</w:t>
-      </w:r>
-      <w:r>
-        <w:t xml:space="preserve">} makes them so, </w:t>
-      </w:r>
-      <w:r>
-        <w:rPr>
-          <w:b/>
-        </w:rPr>
-        <w:t>retraining not</w:t>
-      </w:r>
-      <w:r>
-        <w:t xml:space="preserve">, reproducing the archived </w:t>
-      </w:r>
-      <w:r>
-        <w:rPr>
-          <w:rFonts w:ascii="Consolas" w:hAnsi="Consolas"/>
-        </w:rPr>
-        <w:t>best × test</w:t>
-      </w:r>
-      <w:r>
-        <w:t xml:space="preserve"> values to within </w:t>
-      </w:r>
-      <w:r>
-        <w:rPr>
-          <w:b/>
-        </w:rPr>
-        <w:t>0.0047 pp</w:t>
-      </w:r>
-      <w:r>
-        <w:t xml:space="preserve"> (median </w:t>
-      </w:r>
-      <w:r>
-        <w:rPr>
-          <w:b/>
-        </w:rPr>
-        <w:t>0.0021 pp</w:t>
-      </w:r>
-      <w:r>
-        <w:t>) — the endpoint rule's positive control (</w:t>
-      </w:r>
-      <w:r>
-        <w:rPr>
-          <w:b/>
-        </w:rPr>
-        <w:t>Supplementary S12</w:t>
-      </w:r>
-      <w:r>
-        <w:t>).</w:t>
-      </w:r>
-    </w:p>
-    <w:p>
-      <w:r>
-        <w:rPr>
-          <w:b/>
-        </w:rPr>
-        <w:t>Three limitations</w:t>
-      </w:r>
-      <w:r>
-        <w:t xml:space="preserve">: ① in the </w:t>
-      </w:r>
-      <w:r>
-        <w:rPr>
-          <w:b/>
-        </w:rPr>
-        <w:t>41-run epoch sweep</w:t>
-      </w:r>
-      <w:r>
-        <w:t xml:space="preserve"> only the two headline cells reach n = 10; </w:t>
-      </w:r>
-      <w:r>
-        <w:rPr>
-          <w:rFonts w:ascii="Consolas" w:hAnsi="Consolas"/>
-        </w:rPr>
-        <w:t>aitod20</w:t>
-      </w:r>
-      <w:r>
-        <w:t xml:space="preserve"> contributes one run of 30 epochs and 6 checkpoints where others contribute </w:t>
-      </w:r>
-      <w:r>
-        <w:rPr>
-          <w:b/>
-        </w:rPr>
-        <w:t>20</w:t>
-      </w:r>
-      <w:r>
-        <w:t xml:space="preserve"> (hence 806, not 820), its Table 4 arm-cell a separate n = 10 batch; ② </w:t>
-      </w:r>
-      <w:r>
-        <w:rPr>
-          <w:b/>
-        </w:rPr>
-        <w:t>closed: every retained checkpoint is now evaluated</w:t>
-      </w:r>
-      <w:r>
-        <w:t xml:space="preserve">, the </w:t>
-      </w:r>
-      <w:r>
-        <w:rPr>
-          <w:i/>
-        </w:rPr>
-        <w:t>stability</w:t>
-      </w:r>
-      <w:r>
-        <w:t xml:space="preserve"> reading is narrower than the grid; ③ κ is relative to each run's own final epoch, not causal. The 806-row evaluation is archived (</w:t>
+        <w:t>The 806-row evaluation is archived (</w:t>
       </w:r>
       <w:r>
         <w:rPr>
@@ -10353,161 +9858,6 @@
       </w:r>
     </w:p>
     <w:p>
-      <w:r>
-        <w:rPr>
-          <w:b/>
-        </w:rPr>
-        <w:t>Pool composition — and why the claim does not turn on it.</w:t>
-      </w:r>
-      <w:r>
-        <w:t xml:space="preserve"> Table 4 prints </w:t>
-      </w:r>
-      <w:r>
-        <w:rPr>
-          <w:b/>
-        </w:rPr>
-        <w:t>six</w:t>
-      </w:r>
-      <w:r>
-        <w:t xml:space="preserve"> measured arm-cells; adding the sixth (</w:t>
-      </w:r>
-      <w:r>
-        <w:rPr>
-          <w:rFonts w:ascii="Consolas" w:hAnsi="Consolas"/>
-        </w:rPr>
-        <w:t>aitod20</w:t>
-      </w:r>
-      <w:r>
-        <w:t xml:space="preserve"> </w:t>
-      </w:r>
-      <w:r>
-        <w:rPr>
-          <w:b/>
-        </w:rPr>
-        <w:t>strategy</w:t>
-      </w:r>
-      <w:r>
-        <w:t xml:space="preserve">) moves the run-weighted rate </w:t>
-      </w:r>
-      <w:r>
-        <w:rPr>
-          <w:b/>
-        </w:rPr>
-        <w:t>23.3 % → 8.7 %</w:t>
-      </w:r>
-      <w:r>
-        <w:t xml:space="preserve"> and the median </w:t>
-      </w:r>
-      <w:r>
-        <w:rPr>
-          <w:b/>
-        </w:rPr>
-        <w:t>+17.6 % → −4.2 %</w:t>
-      </w:r>
-      <w:r>
-        <w:t xml:space="preserve">. </w:t>
-      </w:r>
-      <w:r>
-        <w:rPr>
-          <w:b/>
-        </w:rPr>
-        <w:t>The inclusion rule is a rule, not a per-cell choice</w:t>
-      </w:r>
-      <w:r>
-        <w:t xml:space="preserve">: an arm-cell enters </w:t>
-      </w:r>
-      <w:r>
-        <w:rPr>
-          <w:b/>
-        </w:rPr>
-        <w:t>iff its `test` side reached n ≥ 5</w:t>
-      </w:r>
-      <w:r>
-        <w:t xml:space="preserve">, and </w:t>
-      </w:r>
-      <w:r>
-        <w:rPr>
-          <w:b/>
-        </w:rPr>
-        <w:t>exactly five met it at the freeze</w:t>
-      </w:r>
-      <w:r>
-        <w:t>, where all three weightings coincide (</w:t>
-      </w:r>
-      <w:r>
-        <w:rPr>
-          <w:b/>
-        </w:rPr>
-        <w:t>23.26 %</w:t>
-      </w:r>
-      <w:r>
-        <w:t xml:space="preserve">). The sixth row </w:t>
-      </w:r>
-      <w:r>
-        <w:rPr>
-          <w:b/>
-        </w:rPr>
-        <w:t>qualifies but completed later</w:t>
-      </w:r>
-      <w:r>
-        <w:t xml:space="preserve">, so it is the sensitivity. </w:t>
-      </w:r>
-      <w:r>
-        <w:rPr>
-          <w:b/>
-        </w:rPr>
-        <w:t>Every claim is interval-level and any scope gives the same verdict</w:t>
-      </w:r>
-      <w:r>
-        <w:t xml:space="preserve"> — five-cell </w:t>
-      </w:r>
-      <w:r>
-        <w:rPr>
-          <w:b/>
-        </w:rPr>
-        <w:t>[−17.3 %, 53.2 %]</w:t>
-      </w:r>
-      <w:r>
-        <w:t xml:space="preserve"> (P = 0.118), six-cell </w:t>
-      </w:r>
-      <w:r>
-        <w:rPr>
-          <w:b/>
-        </w:rPr>
-        <w:t>[−4.9 %, +21.3 %]</w:t>
-      </w:r>
-      <w:r>
-        <w:t xml:space="preserve">, eleven-cluster </w:t>
-      </w:r>
-      <w:r>
-        <w:rPr>
-          <w:b/>
-        </w:rPr>
-        <w:t>[19.3 %, 60.4 %]</w:t>
-      </w:r>
-      <w:r>
-        <w:t xml:space="preserve"> — the cell-level intervals </w:t>
-      </w:r>
-      <w:r>
-        <w:rPr>
-          <w:b/>
-        </w:rPr>
-        <w:t>both cover zero</w:t>
-      </w:r>
-      <w:r>
-        <w:t xml:space="preserve">, so </w:t>
-      </w:r>
-      <w:r>
-        <w:rPr>
-          <w:b/>
-        </w:rPr>
-        <w:t>no conclusion depends on the pool boundary</w:t>
-      </w:r>
-      <w:r>
-        <w:t>.</w:t>
-      </w:r>
-    </w:p>
-    <w:p>
       <w:pPr>
         <w:pStyle w:val="Heading3"/>
       </w:pPr>
@@ -10657,90 +10007,36 @@
     </w:p>
     <w:p>
       <w:r>
-        <w:rPr>
-          <w:b/>
-        </w:rPr>
-        <w:t>One metric self-correction first.</w:t>
-      </w:r>
-      <w:r>
-        <w:t xml:space="preserve"> Our first version used </w:t>
-      </w:r>
-      <w:r>
-        <w:rPr>
-          <w:rFonts w:ascii="Consolas" w:hAnsi="Consolas"/>
-        </w:rPr>
-        <w:t>r(e) = ΔT(e)/ΔV(e)</w:t>
-      </w:r>
-      <w:r>
-        <w:t xml:space="preserve">, producing values such as </w:t>
-      </w:r>
-      <w:r>
-        <w:rPr>
-          <w:b/>
-        </w:rPr>
-        <w:t>−860 % and +1031 %</w:t>
-      </w:r>
-      <w:r>
-        <w:t xml:space="preserve">: at late epochs </w:t>
-      </w:r>
-      <w:r>
-        <w:rPr>
-          <w:rFonts w:ascii="Consolas" w:hAnsi="Consolas"/>
-        </w:rPr>
-        <w:t>V(e) ≈ V(final)</w:t>
-      </w:r>
-      <w:r>
-        <w:t xml:space="preserve">, the </w:t>
-      </w:r>
-      <w:r>
-        <w:rPr>
-          <w:b/>
-        </w:rPr>
-        <w:t>denominator vanishing</w:t>
-      </w:r>
-      <w:r>
-        <w:t xml:space="preserve"> — </w:t>
-      </w:r>
-      <w:r>
-        <w:rPr>
-          <w:b/>
-        </w:rPr>
-        <w:t>an ill-conditioned metric, not a finding.</w:t>
-      </w:r>
-      <w:r>
-        <w:t xml:space="preserve"> We report only the non-dividing </w:t>
-      </w:r>
-      <w:r>
-        <w:rPr>
-          <w:rFonts w:ascii="Consolas" w:hAnsi="Consolas"/>
-        </w:rPr>
-        <w:t>ΔV(e) = V(e) − V(final)</w:t>
-      </w:r>
-      <w:r>
-        <w:t xml:space="preserve"> and </w:t>
-      </w:r>
-      <w:r>
-        <w:rPr>
-          <w:rFonts w:ascii="Consolas" w:hAnsi="Consolas"/>
-        </w:rPr>
-        <w:t>ΔT(e) = T(e) − T(final)</w:t>
-      </w:r>
-      <w:r>
-        <w:t>, summarized by the through-origin slope κ of ΔT on ΔV.</w:t>
+        <w:t xml:space="preserve">&gt; </w:t>
+      </w:r>
+      <w:r>
+        <w:rPr>
+          <w:b/>
+        </w:rPr>
+        <w:t>Tables S21–S23</w:t>
+      </w:r>
+      <w:r>
+        <w:t xml:space="preserve"> → Supplementary §S8.</w:t>
       </w:r>
     </w:p>
     <w:p>
       <w:r>
-        <w:t xml:space="preserve">&gt; </w:t>
-      </w:r>
-      <w:r>
-        <w:rPr>
-          <w:b/>
-        </w:rPr>
-        <w:t>Tables S21–S23</w:t>
-      </w:r>
-      <w:r>
-        <w:t xml:space="preserve"> → Supplementary §S8.</w:t>
+        <w:rPr>
+          <w:b/>
+        </w:rPr>
+        <w:t>One metric self-correction first.</w:t>
+      </w:r>
+      <w:r>
+        <w:t xml:space="preserve"> Our first version used </w:t>
+      </w:r>
+      <w:r>
+        <w:rPr>
+          <w:rFonts w:ascii="Consolas" w:hAnsi="Consolas"/>
+        </w:rPr>
+        <w:t>r(e) = ΔT(e)/ΔV(e)</w:t>
+      </w:r>
+      <w:r>
+        <w:t>, which is</w:t>
       </w:r>
     </w:p>
     <w:p>
@@ -10748,37 +10044,46 @@
         <w:rPr>
           <w:b/>
         </w:rPr>
-        <w:t>Slope κ</w:t>
-      </w:r>
-      <w:r>
-        <w:t xml:space="preserve"> (how much of the movement on </w:t>
+        <w:t>pathological</w:t>
+      </w:r>
+      <w:r>
+        <w:t xml:space="preserve"> at late epochs — </w:t>
       </w:r>
       <w:r>
         <w:rPr>
           <w:rFonts w:ascii="Consolas" w:hAnsi="Consolas"/>
         </w:rPr>
-        <w:t>val</w:t>
-      </w:r>
-      <w:r>
-        <w:t xml:space="preserve"> transfers to </w:t>
+        <w:t>V(e) ≈ V(final)</w:t>
+      </w:r>
+      <w:r>
+        <w:t xml:space="preserve">, so the ratio's </w:t>
+      </w:r>
+      <w:r>
+        <w:rPr>
+          <w:b/>
+        </w:rPr>
+        <w:t>denominator vanishes</w:t>
+      </w:r>
+      <w:r>
+        <w:t xml:space="preserve">; we report only the non-dividing </w:t>
       </w:r>
       <w:r>
         <w:rPr>
           <w:rFonts w:ascii="Consolas" w:hAnsi="Consolas"/>
         </w:rPr>
-        <w:t>test</w:t>
-      </w:r>
-      <w:r>
-        <w:t xml:space="preserve">). On the </w:t>
-      </w:r>
-      <w:r>
-        <w:rPr>
-          <w:b/>
-        </w:rPr>
-        <w:t>complete curve</w:t>
-      </w:r>
-      <w:r>
-        <w:t xml:space="preserve"> —</w:t>
+        <w:t>ΔV(e)</w:t>
+      </w:r>
+      <w:r>
+        <w:t xml:space="preserve"> and </w:t>
+      </w:r>
+      <w:r>
+        <w:rPr>
+          <w:rFonts w:ascii="Consolas" w:hAnsi="Consolas"/>
+        </w:rPr>
+        <w:t>ΔT(e)</w:t>
+      </w:r>
+      <w:r>
+        <w:t xml:space="preserve"> below.</w:t>
       </w:r>
     </w:p>
     <w:p>
@@ -10786,73 +10091,37 @@
         <w:rPr>
           <w:b/>
         </w:rPr>
-        <w:t>n = 765 (seed, epoch) points over the 41 runs</w:t>
-      </w:r>
-      <w:r>
-        <w:t xml:space="preserve"> — </w:t>
-      </w:r>
-      <w:r>
-        <w:rPr>
-          <w:b/>
-        </w:rPr>
-        <w:t>κ = 0.708, R² 0.937</w:t>
-      </w:r>
-      <w:r>
-        <w:t xml:space="preserve">, with a run-clustered (sandwich) 95 % CI </w:t>
-      </w:r>
-      <w:r>
-        <w:rPr>
-          <w:b/>
-        </w:rPr>
-        <w:t>[0.671, 0.745]</w:t>
-      </w:r>
-      <w:r>
-        <w:t xml:space="preserve">; the within-run estimator gives </w:t>
-      </w:r>
-      <w:r>
-        <w:rPr>
-          <w:b/>
-        </w:rPr>
-        <w:t>0.698</w:t>
-      </w:r>
-      <w:r>
-        <w:t xml:space="preserve">. </w:t>
-      </w:r>
-      <w:r>
-        <w:rPr>
-          <w:b/>
-        </w:rPr>
-        <w:t>Two controls (Table S43)</w:t>
-      </w:r>
-      <w:r>
-        <w:t xml:space="preserve">: a per-run κ distribution, and a free-intercept fit whose </w:t>
-      </w:r>
-      <w:r>
-        <w:rPr>
-          <w:b/>
-        </w:rPr>
-        <w:t>intercept is indistinct from zero</w:t>
-      </w:r>
-      <w:r>
-        <w:t xml:space="preserve"> — so the through-origin constraint is </w:t>
-      </w:r>
-      <w:r>
-        <w:rPr>
-          <w:b/>
-        </w:rPr>
-        <w:t>supported, not assumed</w:t>
-      </w:r>
-      <w:r>
-        <w:t xml:space="preserve">. Across the curve </w:t>
+        <w:t>Slope κ</w:t>
+      </w:r>
+      <w:r>
+        <w:t xml:space="preserve"> (how much of the movement on </w:t>
       </w:r>
       <w:r>
         <w:rPr>
           <w:rFonts w:ascii="Consolas" w:hAnsi="Consolas"/>
         </w:rPr>
-        <w:t>ΔV</w:t>
-      </w:r>
-      <w:r>
-        <w:t xml:space="preserve"> reaches</w:t>
+        <w:t>val</w:t>
+      </w:r>
+      <w:r>
+        <w:t xml:space="preserve"> transfers to </w:t>
+      </w:r>
+      <w:r>
+        <w:rPr>
+          <w:rFonts w:ascii="Consolas" w:hAnsi="Consolas"/>
+        </w:rPr>
+        <w:t>test</w:t>
+      </w:r>
+      <w:r>
+        <w:t xml:space="preserve">). On the </w:t>
+      </w:r>
+      <w:r>
+        <w:rPr>
+          <w:b/>
+        </w:rPr>
+        <w:t>complete curve</w:t>
+      </w:r>
+      <w:r>
+        <w:t xml:space="preserve"> —</w:t>
       </w:r>
     </w:p>
     <w:p>
@@ -10860,37 +10129,64 @@
         <w:rPr>
           <w:b/>
         </w:rPr>
-        <w:t>−8.1 pp</w:t>
-      </w:r>
-      <w:r>
-        <w:t xml:space="preserve"> and about </w:t>
-      </w:r>
-      <w:r>
-        <w:rPr>
-          <w:b/>
-        </w:rPr>
-        <w:t>71 %</w:t>
-      </w:r>
-      <w:r>
-        <w:t xml:space="preserve"> transfers: </w:t>
-      </w:r>
-      <w:r>
-        <w:rPr>
-          <w:b/>
-        </w:rPr>
-        <w:t>early-training progress is real progress.</w:t>
-      </w:r>
-      <w:r>
-        <w:t xml:space="preserve"> §8.6's realized share measures the </w:t>
-      </w:r>
-      <w:r>
-        <w:rPr>
-          <w:b/>
-        </w:rPr>
-        <w:t>selection-relevant sliver</w:t>
-      </w:r>
-      <w:r>
-        <w:t xml:space="preserve"> near the peak, where </w:t>
+        <w:t>n = 765 (seed, epoch) points over the 41 runs</w:t>
+      </w:r>
+      <w:r>
+        <w:t xml:space="preserve"> — </w:t>
+      </w:r>
+      <w:r>
+        <w:rPr>
+          <w:b/>
+        </w:rPr>
+        <w:t>κ = 0.708, R² 0.937</w:t>
+      </w:r>
+      <w:r>
+        <w:t xml:space="preserve">, with a run-clustered (sandwich) 95 % CI </w:t>
+      </w:r>
+      <w:r>
+        <w:rPr>
+          <w:b/>
+        </w:rPr>
+        <w:t>[0.671, 0.745]</w:t>
+      </w:r>
+      <w:r>
+        <w:t xml:space="preserve">; the within-run estimator gives </w:t>
+      </w:r>
+      <w:r>
+        <w:rPr>
+          <w:b/>
+        </w:rPr>
+        <w:t>0.698</w:t>
+      </w:r>
+      <w:r>
+        <w:t xml:space="preserve">. </w:t>
+      </w:r>
+      <w:r>
+        <w:rPr>
+          <w:b/>
+        </w:rPr>
+        <w:t>Two controls (Table S43)</w:t>
+      </w:r>
+      <w:r>
+        <w:t xml:space="preserve">: a per-run κ distribution, and a free-intercept fit whose </w:t>
+      </w:r>
+      <w:r>
+        <w:rPr>
+          <w:b/>
+        </w:rPr>
+        <w:t>intercept is indistinct from zero</w:t>
+      </w:r>
+      <w:r>
+        <w:t xml:space="preserve"> — so the through-origin constraint is </w:t>
+      </w:r>
+      <w:r>
+        <w:rPr>
+          <w:b/>
+        </w:rPr>
+        <w:t>supported, not assumed</w:t>
+      </w:r>
+      <w:r>
+        <w:t xml:space="preserve">. Across the curve </w:t>
       </w:r>
       <w:r>
         <w:rPr>
@@ -10899,16 +10195,7 @@
         <w:t>ΔV</w:t>
       </w:r>
       <w:r>
-        <w:t xml:space="preserve"> is of order </w:t>
-      </w:r>
-      <w:r>
-        <w:rPr>
-          <w:b/>
-        </w:rPr>
-        <w:t>±0.2 pp</w:t>
-      </w:r>
-      <w:r>
-        <w:t xml:space="preserve"> — so</w:t>
+        <w:t xml:space="preserve"> reaches</w:t>
       </w:r>
     </w:p>
     <w:p>
@@ -10916,37 +10203,55 @@
         <w:rPr>
           <w:b/>
         </w:rPr>
-        <w:t>"most of the movement on `val` transfers" and "the little extra gained by selecting near the peak does not" are both true</w:t>
-      </w:r>
-      <w:r>
-        <w:t xml:space="preserve">, and the premium is the residual of the transfer rate. </w:t>
-      </w:r>
-      <w:r>
-        <w:rPr>
-          <w:b/>
-        </w:rPr>
-        <w:t>And κ is not constant across arms either — in the direction the selection account predicts</w:t>
-      </w:r>
-      <w:r>
-        <w:t xml:space="preserve">: </w:t>
-      </w:r>
-      <w:r>
-        <w:rPr>
-          <w:b/>
-        </w:rPr>
-        <w:t>baseline κ = 0.600</w:t>
-      </w:r>
-      <w:r>
-        <w:t xml:space="preserve"> ([0.581, 0.619]) against </w:t>
-      </w:r>
-      <w:r>
-        <w:rPr>
-          <w:b/>
-        </w:rPr>
-        <w:t>strategy κ = 0.767</w:t>
-      </w:r>
-      <w:r>
-        <w:t xml:space="preserve"> ([0.735, 0.800]), difference</w:t>
+        <w:t>−8.1 pp</w:t>
+      </w:r>
+      <w:r>
+        <w:t xml:space="preserve"> and about </w:t>
+      </w:r>
+      <w:r>
+        <w:rPr>
+          <w:b/>
+        </w:rPr>
+        <w:t>71 %</w:t>
+      </w:r>
+      <w:r>
+        <w:t xml:space="preserve"> transfers: </w:t>
+      </w:r>
+      <w:r>
+        <w:rPr>
+          <w:b/>
+        </w:rPr>
+        <w:t>early-training progress is real progress.</w:t>
+      </w:r>
+      <w:r>
+        <w:t xml:space="preserve"> §8.6's realized share measures the </w:t>
+      </w:r>
+      <w:r>
+        <w:rPr>
+          <w:b/>
+        </w:rPr>
+        <w:t>selection-relevant sliver</w:t>
+      </w:r>
+      <w:r>
+        <w:t xml:space="preserve"> near the peak, where </w:t>
+      </w:r>
+      <w:r>
+        <w:rPr>
+          <w:rFonts w:ascii="Consolas" w:hAnsi="Consolas"/>
+        </w:rPr>
+        <w:t>ΔV</w:t>
+      </w:r>
+      <w:r>
+        <w:t xml:space="preserve"> is of order </w:t>
+      </w:r>
+      <w:r>
+        <w:rPr>
+          <w:b/>
+        </w:rPr>
+        <w:t>±0.2 pp</w:t>
+      </w:r>
+      <w:r>
+        <w:t xml:space="preserve"> — so</w:t>
       </w:r>
     </w:p>
     <w:p>
@@ -10954,10 +10259,37 @@
         <w:rPr>
           <w:b/>
         </w:rPr>
-        <w:t>+0.168, 95 % CI [+0.130, +0.203]</w:t>
-      </w:r>
-      <w:r>
-        <w:t>.</w:t>
+        <w:t>"most of the movement on `val` transfers" and "the little extra gained by selecting near the peak does not" are both true</w:t>
+      </w:r>
+      <w:r>
+        <w:t xml:space="preserve">, and the premium is the residual of the transfer rate. </w:t>
+      </w:r>
+      <w:r>
+        <w:rPr>
+          <w:b/>
+        </w:rPr>
+        <w:t>And κ is not constant across arms either — in the direction the selection account predicts</w:t>
+      </w:r>
+      <w:r>
+        <w:t xml:space="preserve">: </w:t>
+      </w:r>
+      <w:r>
+        <w:rPr>
+          <w:b/>
+        </w:rPr>
+        <w:t>baseline κ = 0.600</w:t>
+      </w:r>
+      <w:r>
+        <w:t xml:space="preserve"> ([0.581, 0.619]) against </w:t>
+      </w:r>
+      <w:r>
+        <w:rPr>
+          <w:b/>
+        </w:rPr>
+        <w:t>strategy κ = 0.767</w:t>
+      </w:r>
+      <w:r>
+        <w:t xml:space="preserve"> ([0.735, 0.800]), difference</w:t>
       </w:r>
     </w:p>
     <w:p>
@@ -10965,43 +10297,7 @@
         <w:rPr>
           <w:b/>
         </w:rPr>
-        <w:t>A second result, and a self-correction the curve forces</w:t>
-      </w:r>
-      <w:r>
-        <w:t xml:space="preserve">: the sign-of-Δgap claim we wrote from four sampled epochs is </w:t>
-      </w:r>
-      <w:r>
-        <w:rPr>
-          <w:b/>
-        </w:rPr>
-        <w:t>too strong for one of the two cells</w:t>
-      </w:r>
-      <w:r>
-        <w:t xml:space="preserve"> (on the complete curve </w:t>
-      </w:r>
-      <w:r>
-        <w:rPr>
-          <w:rFonts w:ascii="Consolas" w:hAnsi="Consolas"/>
-        </w:rPr>
-        <w:t>smoke2sf</w:t>
-      </w:r>
-      <w:r>
-        <w:t xml:space="preserve"> starts negative) and is </w:t>
-      </w:r>
-      <w:r>
-        <w:rPr>
-          <w:b/>
-        </w:rPr>
-        <w:t>narrowed here</w:t>
-      </w:r>
-      <w:r>
-        <w:t xml:space="preserve">; per-checkpoint values: </w:t>
-      </w:r>
-      <w:r>
-        <w:rPr>
-          <w:b/>
-        </w:rPr>
-        <w:t>Supplementary S11</w:t>
+        <w:t>+0.168, 95 % CI [+0.130, +0.203]</w:t>
       </w:r>
       <w:r>
         <w:t>.</w:t>
@@ -11012,7 +10308,537 @@
         <w:rPr>
           <w:b/>
         </w:rPr>
+        <w:t>A second result, and a self-correction the curve forces</w:t>
+      </w:r>
+      <w:r>
+        <w:t xml:space="preserve">: the sign-of-Δgap claim we wrote from four sampled epochs is </w:t>
+      </w:r>
+      <w:r>
+        <w:rPr>
+          <w:b/>
+        </w:rPr>
+        <w:t>too strong for one of the two cells</w:t>
+      </w:r>
+      <w:r>
+        <w:t xml:space="preserve"> (on the complete curve </w:t>
+      </w:r>
+      <w:r>
+        <w:rPr>
+          <w:rFonts w:ascii="Consolas" w:hAnsi="Consolas"/>
+        </w:rPr>
+        <w:t>smoke2sf</w:t>
+      </w:r>
+      <w:r>
+        <w:t xml:space="preserve"> starts negative) and is </w:t>
+      </w:r>
+      <w:r>
+        <w:rPr>
+          <w:b/>
+        </w:rPr>
+        <w:t>narrowed here</w:t>
+      </w:r>
+      <w:r>
+        <w:t xml:space="preserve">; per-checkpoint values: </w:t>
+      </w:r>
+      <w:r>
+        <w:rPr>
+          <w:b/>
+        </w:rPr>
+        <w:t>Supplementary S11</w:t>
+      </w:r>
+      <w:r>
+        <w:t>.</w:t>
+      </w:r>
+    </w:p>
+    <w:p>
+      <w:r>
+        <w:rPr>
+          <w:b/>
+        </w:rPr>
         <w:t>The limitations of this section are in Supplementary S12.</w:t>
+      </w:r>
+    </w:p>
+    <w:p>
+      <w:pPr>
+        <w:pStyle w:val="Heading3"/>
+      </w:pPr>
+      <w:r>
+        <w:rPr>
+          <w:rFonts w:ascii="Times New Roman" w:hAnsi="Times New Roman"/>
+        </w:rPr>
+        <w:t>8.8 Scale dependence: at full training budget the premium is realized in full</w:t>
+      </w:r>
+    </w:p>
+    <w:p>
+      <w:r>
+        <w:rPr>
+          <w:b/>
+        </w:rPr>
+        <w:t>§8.6's rate is a 20 %-train reading and does not carry to the regular scale.</w:t>
+      </w:r>
+      <w:r>
+        <w:t xml:space="preserve"> We retrained the corpus that supplies §8.6's largest cell at </w:t>
+      </w:r>
+      <w:r>
+        <w:rPr>
+          <w:b/>
+        </w:rPr>
+        <w:t>full budget</w:t>
+      </w:r>
+      <w:r>
+        <w:t xml:space="preserve">: VisDrone with </w:t>
+      </w:r>
+      <w:r>
+        <w:rPr>
+          <w:b/>
+        </w:rPr>
+        <w:t>5,971</w:t>
+      </w:r>
+      <w:r>
+        <w:t xml:space="preserve"> training images (the 6,471-image public train split less the 500-image </w:t>
+      </w:r>
+      <w:r>
+        <w:rPr>
+          <w:rFonts w:ascii="Consolas" w:hAnsi="Consolas"/>
+        </w:rPr>
+        <w:t>val</w:t>
+      </w:r>
+      <w:r>
+        <w:t xml:space="preserve"> carve), YOLOv12n </w:t>
+      </w:r>
+      <w:r>
+        <w:rPr>
+          <w:b/>
+        </w:rPr>
+        <w:t>[54]</w:t>
+      </w:r>
+      <w:r>
+        <w:t xml:space="preserve">, 100 epochs, §5.1's two-arm </w:t>
+      </w:r>
+      <w:r>
+        <w:rPr>
+          <w:rFonts w:ascii="Consolas" w:hAnsi="Consolas"/>
+        </w:rPr>
+        <w:t>lr0</w:t>
+      </w:r>
+      <w:r>
+        <w:t xml:space="preserve"> contrast (</w:t>
+      </w:r>
+      <w:r>
+        <w:rPr>
+          <w:b/>
+        </w:rPr>
+        <w:t>0.001</w:t>
+      </w:r>
+      <w:r>
+        <w:t xml:space="preserve"> vs </w:t>
+      </w:r>
+      <w:r>
+        <w:rPr>
+          <w:b/>
+        </w:rPr>
+        <w:t>0.005</w:t>
+      </w:r>
+      <w:r>
+        <w:t xml:space="preserve">), and </w:t>
+      </w:r>
+      <w:r>
+        <w:rPr>
+          <w:b/>
+        </w:rPr>
+        <w:t>ten training file orders per arm (20 runs)</w:t>
+      </w:r>
+      <w:r>
+        <w:t xml:space="preserve">. Under the §8.6 definitions the pooled realisation rate is </w:t>
+      </w:r>
+      <w:r>
+        <w:rPr>
+          <w:b/>
+        </w:rPr>
+        <w:t>+99.2 %</w:t>
+      </w:r>
+      <w:r>
+        <w:t xml:space="preserve"> (95 % interval </w:t>
+      </w:r>
+      <w:r>
+        <w:rPr>
+          <w:b/>
+        </w:rPr>
+        <w:t>[+80.4 %, +122.0 %]</w:t>
+      </w:r>
+      <w:r>
+        <w:t xml:space="preserve">, run-level bootstrap, 20,000 resamples), against the </w:t>
+      </w:r>
+      <w:r>
+        <w:rPr>
+          <w:b/>
+        </w:rPr>
+        <w:t>pre-registered interval [−28 %, +74 %]</w:t>
+      </w:r>
+      <w:r>
+        <w:t xml:space="preserve">; the whole interval lies </w:t>
+      </w:r>
+      <w:r>
+        <w:rPr>
+          <w:b/>
+        </w:rPr>
+        <w:t>above</w:t>
+      </w:r>
+      <w:r>
+        <w:t xml:space="preserve"> the band's upper edge. </w:t>
+      </w:r>
+      <w:r>
+        <w:rPr>
+          <w:rFonts w:ascii="Consolas" w:hAnsi="Consolas"/>
+        </w:rPr>
+        <w:t>prem_val</w:t>
+      </w:r>
+      <w:r>
+        <w:t xml:space="preserve"> averages </w:t>
+      </w:r>
+      <w:r>
+        <w:rPr>
+          <w:b/>
+        </w:rPr>
+        <w:t>+0.269 pp</w:t>
+      </w:r>
+      <w:r>
+        <w:t xml:space="preserve"> against </w:t>
+      </w:r>
+      <w:r>
+        <w:rPr>
+          <w:b/>
+        </w:rPr>
+        <w:t>+0.879 pp</w:t>
+      </w:r>
+      <w:r>
+        <w:t xml:space="preserve"> for §8.6's 20 %-train pool, while </w:t>
+      </w:r>
+      <w:r>
+        <w:rPr>
+          <w:rFonts w:ascii="Consolas" w:hAnsi="Consolas"/>
+        </w:rPr>
+        <w:t>prem_test</w:t>
+      </w:r>
+      <w:r>
+        <w:t xml:space="preserve"> averages </w:t>
+      </w:r>
+      <w:r>
+        <w:rPr>
+          <w:b/>
+        </w:rPr>
+        <w:t>+0.266 pp</w:t>
+      </w:r>
+      <w:r>
+        <w:t xml:space="preserve"> — the premium is roughly </w:t>
+      </w:r>
+      <w:r>
+        <w:rPr>
+          <w:b/>
+        </w:rPr>
+        <w:t>four times smaller</w:t>
+      </w:r>
+      <w:r>
+        <w:t xml:space="preserve">, yet now realised almost exactly. That is what §3.1's decomposition anticipates: the unrealised part is the winner's-curse term </w:t>
+      </w:r>
+      <w:r>
+        <w:rPr>
+          <w:rFonts w:ascii="Consolas" w:hAnsi="Consolas"/>
+        </w:rPr>
+        <w:t>WC</w:t>
+      </w:r>
+      <w:r>
+        <w:t xml:space="preserve"> — whose concurrent check is </w:t>
+      </w:r>
+      <w:r>
+        <w:rPr>
+          <w:b/>
+        </w:rPr>
+        <w:t>[12]</w:t>
+      </w:r>
+      <w:r>
+        <w:t xml:space="preserve"> — which is what a larger </w:t>
+      </w:r>
+      <w:r>
+        <w:rPr>
+          <w:rFonts w:ascii="Consolas" w:hAnsi="Consolas"/>
+        </w:rPr>
+        <w:t>val</w:t>
+      </w:r>
+      <w:r>
+        <w:t xml:space="preserve"> split should reduce, and it agrees with Fig. 3's rate-versus-σ̂ correlation — more training data, a smoother </w:t>
+      </w:r>
+      <w:r>
+        <w:rPr>
+          <w:rFonts w:ascii="Consolas" w:hAnsi="Consolas"/>
+        </w:rPr>
+        <w:t>val</w:t>
+      </w:r>
+      <w:r>
+        <w:t xml:space="preserve"> curve, a smaller </w:t>
+      </w:r>
+      <w:r>
+        <w:rPr>
+          <w:rFonts w:ascii="Consolas" w:hAnsi="Consolas"/>
+        </w:rPr>
+        <w:t>WC</w:t>
+      </w:r>
+      <w:r>
+        <w:t>.</w:t>
+      </w:r>
+    </w:p>
+    <w:p>
+      <w:r>
+        <w:rPr>
+          <w:b/>
+        </w:rPr>
+        <w:t>The rate is arm-dependent, and one arm stays inside the band.</w:t>
+      </w:r>
+      <w:r>
+        <w:t xml:space="preserve"> The baseline arm realises </w:t>
+      </w:r>
+      <w:r>
+        <w:rPr>
+          <w:b/>
+        </w:rPr>
+        <w:t>+66.4 %</w:t>
+      </w:r>
+      <w:r>
+        <w:t xml:space="preserve"> (n = 10: </w:t>
+      </w:r>
+      <w:r>
+        <w:rPr>
+          <w:rFonts w:ascii="Consolas" w:hAnsi="Consolas"/>
+        </w:rPr>
+        <w:t>prem_val</w:t>
+      </w:r>
+      <w:r>
+        <w:t xml:space="preserve"> </w:t>
+      </w:r>
+      <w:r>
+        <w:rPr>
+          <w:b/>
+        </w:rPr>
+        <w:t>+0.256 pp</w:t>
+      </w:r>
+      <w:r>
+        <w:t xml:space="preserve">, range </w:t>
+      </w:r>
+      <w:r>
+        <w:rPr>
+          <w:b/>
+        </w:rPr>
+        <w:t>+0.105 to +0.410</w:t>
+      </w:r>
+      <w:r>
+        <w:t xml:space="preserve">; </w:t>
+      </w:r>
+      <w:r>
+        <w:rPr>
+          <w:rFonts w:ascii="Consolas" w:hAnsi="Consolas"/>
+        </w:rPr>
+        <w:t>prem_test</w:t>
+      </w:r>
+      <w:r>
+        <w:t xml:space="preserve"> </w:t>
+      </w:r>
+      <w:r>
+        <w:rPr>
+          <w:b/>
+        </w:rPr>
+        <w:t>+0.170 pp</w:t>
+      </w:r>
+      <w:r>
+        <w:t xml:space="preserve">) and </w:t>
+      </w:r>
+      <w:r>
+        <w:rPr>
+          <w:b/>
+        </w:rPr>
+        <w:t>remains inside the pre-registered interval</w:t>
+      </w:r>
+      <w:r>
+        <w:t xml:space="preserve">; the strategy arm realises </w:t>
+      </w:r>
+      <w:r>
+        <w:rPr>
+          <w:b/>
+        </w:rPr>
+        <w:t>+129.0 %</w:t>
+      </w:r>
+      <w:r>
+        <w:t xml:space="preserve"> (n = 10: </w:t>
+      </w:r>
+      <w:r>
+        <w:rPr>
+          <w:b/>
+        </w:rPr>
+        <w:t>+0.282 pp</w:t>
+      </w:r>
+      <w:r>
+        <w:t>,</w:t>
+      </w:r>
+    </w:p>
+    <w:p>
+      <w:r>
+        <w:rPr>
+          <w:b/>
+        </w:rPr>
+        <w:t>+0.075 to +0.412</w:t>
+      </w:r>
+      <w:r>
+        <w:t xml:space="preserve">; </w:t>
+      </w:r>
+      <w:r>
+        <w:rPr>
+          <w:rFonts w:ascii="Consolas" w:hAnsi="Consolas"/>
+        </w:rPr>
+        <w:t>prem_test</w:t>
+      </w:r>
+      <w:r>
+        <w:t xml:space="preserve"> </w:t>
+      </w:r>
+      <w:r>
+        <w:rPr>
+          <w:b/>
+        </w:rPr>
+        <w:t>+0.363 pp</w:t>
+      </w:r>
+      <w:r>
+        <w:t xml:space="preserve">). No run in either arm has a negative </w:t>
+      </w:r>
+      <w:r>
+        <w:rPr>
+          <w:rFonts w:ascii="Consolas" w:hAnsi="Consolas"/>
+        </w:rPr>
+        <w:t>prem_val</w:t>
+      </w:r>
+      <w:r>
+        <w:t xml:space="preserve"> or </w:t>
+      </w:r>
+      <w:r>
+        <w:rPr>
+          <w:rFonts w:ascii="Consolas" w:hAnsi="Consolas"/>
+        </w:rPr>
+        <w:t>prem_test</w:t>
+      </w:r>
+      <w:r>
+        <w:t xml:space="preserve"> (</w:t>
+      </w:r>
+      <w:r>
+        <w:rPr>
+          <w:b/>
+        </w:rPr>
+        <w:t>0/20</w:t>
+      </w:r>
+      <w:r>
+        <w:t xml:space="preserve"> each). </w:t>
+      </w:r>
+      <w:r>
+        <w:rPr>
+          <w:b/>
+        </w:rPr>
+        <w:t>What this does not do</w:t>
+      </w:r>
+      <w:r>
+        <w:t xml:space="preserve"> is revise §8.6, which measures five arm-cells under the companion's 20 %-train protocol and already states that the general reading — "the convention realises about a quarter of the </w:t>
+      </w:r>
+      <w:r>
+        <w:rPr>
+          <w:rFonts w:ascii="Consolas" w:hAnsi="Consolas"/>
+        </w:rPr>
+        <w:t>val</w:t>
+      </w:r>
+      <w:r>
+        <w:t xml:space="preserve"> premium" — would be false; what it adds is </w:t>
+      </w:r>
+      <w:r>
+        <w:rPr>
+          <w:b/>
+        </w:rPr>
+        <w:t>scale</w:t>
+      </w:r>
+      <w:r>
+        <w:t>. We therefore</w:t>
+      </w:r>
+    </w:p>
+    <w:p>
+      <w:r>
+        <w:rPr>
+          <w:b/>
+        </w:rPr>
+        <w:t>weaken, rather than strengthen</w:t>
+      </w:r>
+      <w:r>
+        <w:t xml:space="preserve">, the recommendation §11 draws from §8.6 (§11 ②, §13). Two scopes bound it: </w:t>
+      </w:r>
+      <w:r>
+        <w:rPr>
+          <w:b/>
+        </w:rPr>
+        <w:t>one corpus</w:t>
+      </w:r>
+      <w:r>
+        <w:t xml:space="preserve">, and §5.1's </w:t>
+      </w:r>
+      <w:r>
+        <w:rPr>
+          <w:rFonts w:ascii="Consolas" w:hAnsi="Consolas"/>
+        </w:rPr>
+        <w:t>lr0</w:t>
+      </w:r>
+      <w:r>
+        <w:t xml:space="preserve"> axis; a second corpus with a genuine disjoint </w:t>
+      </w:r>
+      <w:r>
+        <w:rPr>
+          <w:rFonts w:ascii="Consolas" w:hAnsi="Consolas"/>
+        </w:rPr>
+        <w:t>test</w:t>
+      </w:r>
+      <w:r>
+        <w:t xml:space="preserve"> (</w:t>
+      </w:r>
+      <w:r>
+        <w:rPr>
+          <w:rFonts w:ascii="Consolas" w:hAnsi="Consolas"/>
+        </w:rPr>
+        <w:t>mask_clean</w:t>
+      </w:r>
+      <w:r>
+        <w:t xml:space="preserve">, 919 images) is </w:t>
+      </w:r>
+      <w:r>
+        <w:rPr>
+          <w:b/>
+        </w:rPr>
+        <w:t>registered as the replication</w:t>
+      </w:r>
+      <w:r>
+        <w:t>.</w:t>
+      </w:r>
+    </w:p>
+    <w:p>
+      <w:r>
+        <w:t xml:space="preserve">&gt; </w:t>
+      </w:r>
+      <w:r>
+        <w:rPr>
+          <w:b/>
+        </w:rPr>
+        <w:t>Per-run matrix, protocol, leakage self-check and the bootstrap</w:t>
+      </w:r>
+      <w:r>
+        <w:t xml:space="preserve"> → </w:t>
+      </w:r>
+      <w:r>
+        <w:rPr>
+          <w:b/>
+        </w:rPr>
+        <w:t>Supplementary §S13</w:t>
+      </w:r>
+      <w:r>
+        <w:t xml:space="preserve"> (Tables S46–S47: the per-arm table is S46).</w:t>
       </w:r>
     </w:p>
     <w:p>
@@ -11795,7 +11621,43 @@
         <w:t>enlarges</w:t>
       </w:r>
       <w:r>
-        <w:t xml:space="preserve"> the arm difference (§5.1). ③ State the test convention: below n = 6 a permutation test has no resolution; print the </w:t>
+        <w:t xml:space="preserve"> the arm difference (§5.1). </w:t>
+      </w:r>
+      <w:r>
+        <w:rPr>
+          <w:b/>
+        </w:rPr>
+        <w:t>The cost of not doing so is scale-dependent</w:t>
+      </w:r>
+      <w:r>
+        <w:t xml:space="preserve">: at 20 % train the selection action realises about a quarter of the </w:t>
+      </w:r>
+      <w:r>
+        <w:rPr>
+          <w:rFonts w:ascii="Consolas" w:hAnsi="Consolas"/>
+        </w:rPr>
+        <w:t>val</w:t>
+      </w:r>
+      <w:r>
+        <w:t xml:space="preserve"> premium on a disjoint split, but at full budget it realises </w:t>
+      </w:r>
+      <w:r>
+        <w:rPr>
+          <w:b/>
+        </w:rPr>
+        <w:t>+99.2 %</w:t>
+      </w:r>
+      <w:r>
+        <w:t xml:space="preserve"> (§8.8) — the practice is </w:t>
+      </w:r>
+      <w:r>
+        <w:rPr>
+          <w:b/>
+        </w:rPr>
+        <w:t>most damaging exactly where data is scarcest</w:t>
+      </w:r>
+      <w:r>
+        <w:t xml:space="preserve">. ③ State the test convention: below n = 6 a permutation test has no resolution; print the </w:t>
       </w:r>
       <w:r>
         <w:rPr>
@@ -12217,6 +12079,47 @@
       </w:r>
     </w:p>
     <w:p>
+      <w:r>
+        <w:t xml:space="preserve">- The </w:t>
+      </w:r>
+      <w:r>
+        <w:rPr>
+          <w:b/>
+        </w:rPr>
+        <w:t>scale-dependence</w:t>
+      </w:r>
+      <w:r>
+        <w:t xml:space="preserve"> reading (§8.8) is </w:t>
+      </w:r>
+      <w:r>
+        <w:rPr>
+          <w:b/>
+        </w:rPr>
+        <w:t>one corpus, one detector, the same `lr0` axis as §5.1</w:t>
+      </w:r>
+      <w:r>
+        <w:t xml:space="preserve"> (20 runs, ten file orders per arm); it does </w:t>
+      </w:r>
+      <w:r>
+        <w:rPr>
+          <w:b/>
+        </w:rPr>
+        <w:t>not</w:t>
+      </w:r>
+      <w:r>
+        <w:t xml:space="preserve"> re-open §8.6's pool, and </w:t>
+      </w:r>
+      <w:r>
+        <w:rPr>
+          <w:b/>
+        </w:rPr>
+        <w:t>no interval of §8.6's folds into it</w:t>
+      </w:r>
+      <w:r>
+        <w:t>.</w:t>
+      </w:r>
+    </w:p>
+    <w:p>
       <w:pPr>
         <w:pStyle w:val="Heading2"/>
       </w:pPr>
@@ -12310,7 +12213,16 @@
         <w:t>varies in sign</w:t>
       </w:r>
       <w:r>
-        <w:t xml:space="preserve"> by corpus — so "the convention understates the effect" is not claimed. On five arm-cells at n = 10 it is realized on a disjoint split at </w:t>
+        <w:t xml:space="preserve"> by corpus — so "the convention understates the effect" is not claimed. On five arm-cells at n = 10 </w:t>
+      </w:r>
+      <w:r>
+        <w:rPr>
+          <w:b/>
+        </w:rPr>
+        <w:t>under a 20 %-train protocol</w:t>
+      </w:r>
+      <w:r>
+        <w:t xml:space="preserve"> it is realized on a disjoint split at </w:t>
       </w:r>
       <w:r>
         <w:rPr>
@@ -12337,7 +12249,16 @@
         <w:t>0.118</w:t>
       </w:r>
       <w:r>
-        <w:t xml:space="preserve">). Two things do </w:t>
+        <w:t xml:space="preserve">); </w:t>
+      </w:r>
+      <w:r>
+        <w:rPr>
+          <w:b/>
+        </w:rPr>
+        <w:t>at full training budget on the same corpus the pooled rate rises to +99.2 % (95 % interval [+80.4 %, +122.0 %]), above the pre-registered band — so the loss we report is a small-sample one, and our recommendation is correspondingly weaker.</w:t>
+      </w:r>
+      <w:r>
+        <w:t xml:space="preserve"> Two things do </w:t>
       </w:r>
       <w:r>
         <w:rPr>

</xml_diff>

<commit_message>
Blind-review round r21k remediations: W2 headline interval+six-cell, W3/W9 single primary count (250-word abstract), W4 primary epoch-budget series, W6 recomputability fourth item, W7 lineage claim narrowed per Table S14, W8 README snapshot date; layers rebuilt and verified
</commit_message>
<xml_diff>
--- a/01_paper/P2_English_submission_blind_v1.docx
+++ b/01_paper/P2_English_submission_blind_v1.docx
@@ -202,16 +202,16 @@
         <w:t>3. The printed count rests on one rater.</w:t>
       </w:r>
       <w:r>
-        <w:t xml:space="preserve"> The layer the literature actually reports is printed as </w:t>
-      </w:r>
-      <w:r>
-        <w:rPr>
-          <w:b/>
-        </w:rPr>
-        <w:t>12–14 of 19</w:t>
-      </w:r>
-      <w:r>
-        <w:t xml:space="preserve">; re-verifying every row first-hand and re-coding blind with </w:t>
+        <w:t xml:space="preserve"> The layer the literature reports is printed as </w:t>
+      </w:r>
+      <w:r>
+        <w:rPr>
+          <w:b/>
+        </w:rPr>
+        <w:t>12 of 19</w:t>
+      </w:r>
+      <w:r>
+        <w:t xml:space="preserve"> (63 %; 4 undecidable); re-verifying every row first-hand and re-coding blind with </w:t>
       </w:r>
       <w:r>
         <w:rPr>
@@ -1215,12 +1215,12 @@
         <w:t>We measure how far the selection premium transfers.</w:t>
       </w:r>
       <w:r>
-        <w:t xml:space="preserve"> The measurement is the contribution; the</w:t>
-      </w:r>
-    </w:p>
-    <w:p>
-      <w:r>
-        <w:t xml:space="preserve">protocol that makes it readable is the companion's and is </w:t>
+        <w:t xml:space="preserve"> The measurement is the contribution; its</w:t>
+      </w:r>
+    </w:p>
+    <w:p>
+      <w:r>
+        <w:t xml:space="preserve">protocol is the companion's and is </w:t>
       </w:r>
       <w:r>
         <w:rPr>
@@ -1255,7 +1255,17 @@
         <w:t>23.3 %</w:t>
       </w:r>
       <w:r>
-        <w:t xml:space="preserve"> with all five arm-cells at n = 10, and it is </w:t>
+        <w:t xml:space="preserve"> with all five arm-cells at n = 10 — **a point estimate whose claim-level interval</w:t>
+      </w:r>
+    </w:p>
+    <w:p>
+      <w:r>
+        <w:t>includes zero** ([−17.3 %, 53.2 %], P = 0.118; the six-cell pool's interval is [−4.9 %, +21.3 %]),</w:t>
+      </w:r>
+    </w:p>
+    <w:p>
+      <w:r>
+        <w:t xml:space="preserve">and it is </w:t>
       </w:r>
       <w:r>
         <w:rPr>
@@ -2496,7 +2506,16 @@
         <w:t>outside</w:t>
       </w:r>
       <w:r>
-        <w:t xml:space="preserve"> its band, and C3 </w:t>
+        <w:t xml:space="preserve"> its band — </w:t>
+      </w:r>
+      <w:r>
+        <w:rPr>
+          <w:b/>
+        </w:rPr>
+        <w:t>this clean re-run is reported as sensitivity: the primary reading is the pre-declared series (C1 not met, C2 not rejected)</w:t>
+      </w:r>
+      <w:r>
+        <w:t xml:space="preserve">, and C3 </w:t>
       </w:r>
       <w:r>
         <w:rPr>
@@ -8056,10 +8075,10 @@
         <w:rPr>
           <w:b/>
         </w:rPr>
-        <w:t>Among the pinned default configurations we checked, only the YOLO lineage does this by default.</w:t>
-      </w:r>
-      <w:r>
-        <w:t xml:space="preserve"> At pinned commits Detectron2 (</w:t>
+        <w:t>Among the six pinned default configurations we checked, only the two YOLO-lineage frameworks select on the reported split by default — Ultralytics YOLO and YOLOX (`trainer.py` tracks and saves the best); Detectron2, MMDetection, PaddleDetection and DETR do not</w:t>
+      </w:r>
+      <w:r>
+        <w:t xml:space="preserve"> (Table S14). At pinned commits Detectron2 (</w:t>
       </w:r>
       <w:r>
         <w:rPr>
@@ -10773,7 +10792,20 @@
         <w:rPr>
           <w:sz w:val="19"/>
         </w:rPr>
-        <w:t xml:space="preserve"> trajectories over 10 seeds, both headline cells (baseline solid, strategy dashed). </w:t>
+        <w:t xml:space="preserve"> trajectories over the 10 </w:t>
+      </w:r>
+      <w:r>
+        <w:rPr>
+          <w:b/>
+          <w:sz w:val="19"/>
+        </w:rPr>
+        <w:t>data-order replicates</w:t>
+      </w:r>
+      <w:r>
+        <w:rPr>
+          <w:sz w:val="19"/>
+        </w:rPr>
+        <w:t xml:space="preserve">, both headline cells (baseline solid, strategy dashed). </w:t>
       </w:r>
       <w:r>
         <w:rPr>
@@ -11008,7 +11040,7 @@
         <w:rPr>
           <w:b/>
         </w:rPr>
-        <w:t>n = 765 (seed, epoch) points over the 41 runs</w:t>
+        <w:t>n = 765 (replicate, epoch) points over the 41 runs</w:t>
       </w:r>
       <w:r>
         <w:t xml:space="preserve"> — </w:t>
@@ -14007,7 +14039,7 @@
     </w:p>
     <w:p>
       <w:r>
-        <w:t xml:space="preserve">(§7.3), and the </w:t>
+        <w:t xml:space="preserve">(§7.3), the </w:t>
       </w:r>
       <w:r>
         <w:rPr>
@@ -14017,7 +14049,53 @@
         <w:t>aitod20</w:t>
       </w:r>
       <w:r>
-        <w:t xml:space="preserve"> completion to n = 10.</w:t>
+        <w:t xml:space="preserve"> completion to n = 10, and the </w:t>
+      </w:r>
+      <w:r>
+        <w:rPr>
+          <w:b/>
+        </w:rPr>
+        <w:t>S38b escalation</w:t>
+      </w:r>
+      <w:r>
+        <w:t xml:space="preserve"> (the ten arm-cells re-read at n = 10 on</w:t>
+      </w:r>
+    </w:p>
+    <w:p>
+      <w:r>
+        <w:t xml:space="preserve">2026-10-06: </w:t>
+      </w:r>
+      <w:r>
+        <w:rPr>
+          <w:rFonts w:ascii="Consolas" w:hAnsi="Consolas"/>
+          <w:sz w:val="19"/>
+        </w:rPr>
+        <w:t>work/collect_test_final.py</w:t>
+      </w:r>
+      <w:r>
+        <w:t xml:space="preserve">, </w:t>
+      </w:r>
+      <w:r>
+        <w:rPr>
+          <w:rFonts w:ascii="Consolas" w:hAnsi="Consolas"/>
+          <w:sz w:val="19"/>
+        </w:rPr>
+        <w:t>work/_archive_results_csv.py</w:t>
+      </w:r>
+      <w:r>
+        <w:t>, and the per-run file</w:t>
+      </w:r>
+    </w:p>
+    <w:p>
+      <w:r>
+        <w:rPr>
+          <w:rFonts w:ascii="Consolas" w:hAnsi="Consolas"/>
+          <w:sz w:val="19"/>
+        </w:rPr>
+        <w:t>g6_prem_per_run_210_20261006.csv</w:t>
+      </w:r>
+      <w:r>
+        <w:t>).</w:t>
       </w:r>
     </w:p>
     <w:p>

</xml_diff>

<commit_message>
Page fix to a verified 35 pages (PR official format, PDF-counted): move 8.3 detail and the 9-item limitations list to Supplementary S15/S16; restore H5 (data-selected four-cell family, 13-cell BH as the multiplicity control); pack rebuilt; three layers synced and verified
</commit_message>
<xml_diff>
--- a/01_paper/P2_English_submission_blind_v1.docx
+++ b/01_paper/P2_English_submission_blind_v1.docx
@@ -1076,7 +1076,16 @@
         <w:t>these four</w:t>
       </w:r>
       <w:r>
-        <w:t xml:space="preserve"> at q = 0.05 — the fourth, </w:t>
+        <w:t xml:space="preserve"> at q = 0.05 — </w:t>
+      </w:r>
+      <w:r>
+        <w:rPr>
+          <w:b/>
+        </w:rPr>
+        <w:t>a data-selected set; the 13-cell BH is the multiplicity control (§5.2)</w:t>
+      </w:r>
+      <w:r>
+        <w:t xml:space="preserve"> — the fourth, </w:t>
       </w:r>
       <w:r>
         <w:rPr>
@@ -13333,13 +13342,81 @@
     </w:p>
     <w:p>
       <w:r>
+        <w:t xml:space="preserve">- </w:t>
+      </w:r>
+      <w:r>
+        <w:rPr>
+          <w:b/>
+        </w:rPr>
+        <w:t>Four disclosed uncertainties bound every claim</w:t>
+      </w:r>
+      <w:r>
+        <w:t xml:space="preserve">: the 19-row audit is </w:t>
+      </w:r>
+      <w:r>
+        <w:rPr>
+          <w:b/>
+        </w:rPr>
+        <w:t>single-rater</w:t>
+      </w:r>
+      <w:r>
+        <w:t xml:space="preserve">; the log sample is a </w:t>
+      </w:r>
+      <w:r>
+        <w:rPr>
+          <w:b/>
+        </w:rPr>
+        <w:t>convenience sample</w:t>
+      </w:r>
+      <w:r>
+        <w:t xml:space="preserve"> with no sampling frame; the GPU memory-pressure evidence is </w:t>
+      </w:r>
+      <w:r>
+        <w:rPr>
+          <w:b/>
+        </w:rPr>
+        <w:t>one machine</w:t>
+      </w:r>
+      <w:r>
+        <w:t xml:space="preserve">; and §8.8's full-budget reading is </w:t>
+      </w:r>
+      <w:r>
+        <w:rPr>
+          <w:b/>
+        </w:rPr>
+        <w:t>one corpus, one detector, on the same `lr0` axis as §5.1</w:t>
+      </w:r>
+      <w:r>
+        <w:t xml:space="preserve"> — it does </w:t>
+      </w:r>
+      <w:r>
+        <w:rPr>
+          <w:b/>
+        </w:rPr>
+        <w:t>not</w:t>
+      </w:r>
+      <w:r>
+        <w:t xml:space="preserve"> re-open §8.6's pool and </w:t>
+      </w:r>
+      <w:r>
+        <w:rPr>
+          <w:b/>
+        </w:rPr>
+        <w:t>no interval of §8.6 folds into it</w:t>
+      </w:r>
+      <w:r>
+        <w:t>.</w:t>
+      </w:r>
+    </w:p>
+    <w:p>
+      <w:r>
         <w:t xml:space="preserve">- The audit reads </w:t>
       </w:r>
       <w:r>
         <w:rPr>
           <w:b/>
         </w:rPr>
-        <w:t>split definitions</w:t>
+        <w:t>split definitions only</w:t>
       </w:r>
       <w:r>
         <w:t xml:space="preserve"> (YAML, README, paper text), </w:t>
@@ -13348,29 +13425,10 @@
         <w:rPr>
           <w:b/>
         </w:rPr>
-        <w:t>no datasets downloaded</w:t>
-      </w:r>
-      <w:r>
-        <w:t>.</w:t>
-      </w:r>
-    </w:p>
-    <w:p>
-      <w:r>
-        <w:t xml:space="preserve">- For several benchmarks the "generic YOLO copy" is </w:t>
-      </w:r>
-      <w:r>
-        <w:rPr>
-          <w:b/>
-        </w:rPr>
-        <w:t>per-project</w:t>
-      </w:r>
-      <w:r>
-        <w:t>, not canonical.</w:t>
-      </w:r>
-    </w:p>
-    <w:p>
-      <w:r>
-        <w:t xml:space="preserve">- Under the </w:t>
+        <w:t>no datasets</w:t>
+      </w:r>
+      <w:r>
+        <w:t xml:space="preserve">; under the </w:t>
       </w:r>
       <w:r>
         <w:rPr>
@@ -13380,30 +13438,16 @@
         <w:t>reported</w:t>
       </w:r>
       <w:r>
-        <w:t xml:space="preserve"> unit, </w:t>
-      </w:r>
-      <w:r>
-        <w:rPr>
-          <w:b/>
-        </w:rPr>
-        <w:t>4 rows (AI-TOD, DIOR, Mendeley, D-Fire) are evidence-insufficient</w:t>
-      </w:r>
-      <w:r>
-        <w:t>; we do</w:t>
-      </w:r>
-    </w:p>
-    <w:p>
-      <w:r>
-        <w:t xml:space="preserve">not guess. Counts are </w:t>
-      </w:r>
-      <w:r>
-        <w:rPr>
-          <w:b/>
-        </w:rPr>
-        <w:t>row-equal over the 19</w:t>
-      </w:r>
-      <w:r>
-        <w:t xml:space="preserve">, and they carry </w:t>
+        <w:t xml:space="preserve"> unit </w:t>
+      </w:r>
+      <w:r>
+        <w:rPr>
+          <w:b/>
+        </w:rPr>
+        <w:t>4 rows are evidence-insufficient</w:t>
+      </w:r>
+      <w:r>
+        <w:t xml:space="preserve">; and counts carry </w:t>
       </w:r>
       <w:r>
         <w:rPr>
@@ -13411,169 +13455,8 @@
         </w:rPr>
         <w:t>no sampling interval, deliberately</w:t>
       </w:r>
-    </w:p>
-    <w:p>
-      <w:r>
-        <w:t xml:space="preserve">— the grading enters the </w:t>
-      </w:r>
-      <w:r>
-        <w:rPr>
-          <w:b/>
-        </w:rPr>
-        <w:t>count</w:t>
-      </w:r>
-      <w:r>
-        <w:t xml:space="preserve"> itself (</w:t>
-      </w:r>
-      <w:r>
-        <w:rPr>
-          <w:b/>
-        </w:rPr>
-        <w:t>Table 3's second column</w:t>
-      </w:r>
-      <w:r>
-        <w:t>).</w:t>
-      </w:r>
-    </w:p>
-    <w:p>
-      <w:r>
-        <w:t>- Two evidentiary differences (pod versus local) are listed side by side.</w:t>
-      </w:r>
-    </w:p>
-    <w:p>
-      <w:r>
-        <w:t xml:space="preserve">- The census is a </w:t>
-      </w:r>
-      <w:r>
-        <w:rPr>
-          <w:b/>
-        </w:rPr>
-        <w:t>literature/release survey</w:t>
-      </w:r>
-      <w:r>
-        <w:t xml:space="preserve">, weaker than our </w:t>
-      </w:r>
-      <w:r>
-        <w:rPr>
-          <w:b/>
-        </w:rPr>
-        <w:t>self-measurement</w:t>
-      </w:r>
-      <w:r>
-        <w:t xml:space="preserve"> (§3).</w:t>
-      </w:r>
-    </w:p>
-    <w:p>
-      <w:r>
-        <w:t xml:space="preserve">- The </w:t>
-      </w:r>
-      <w:r>
-        <w:rPr>
-          <w:b/>
-        </w:rPr>
-        <w:t>difficulty/selection decomposition</w:t>
-      </w:r>
-      <w:r>
-        <w:t xml:space="preserve"> (§5.6) covers </w:t>
-      </w:r>
-      <w:r>
-        <w:rPr>
-          <w:b/>
-        </w:rPr>
-        <w:t>2 of the 13 cells</w:t>
-      </w:r>
-      <w:r>
-        <w:t xml:space="preserve"> (the headline two); the </w:t>
-      </w:r>
-      <w:r>
-        <w:rPr>
-          <w:b/>
-        </w:rPr>
-        <w:t>identity</w:t>
-      </w:r>
-      <w:r>
-        <w:t xml:space="preserve"> behind it is checked on </w:t>
-      </w:r>
-      <w:r>
-        <w:rPr>
-          <w:b/>
-        </w:rPr>
-        <w:t>all 13</w:t>
-      </w:r>
-      <w:r>
-        <w:t xml:space="preserve"> (</w:t>
-      </w:r>
-      <w:r>
-        <w:rPr>
-          <w:rFonts w:ascii="Consolas" w:hAnsi="Consolas"/>
-          <w:sz w:val="19"/>
-        </w:rPr>
-        <w:t>work/gap_mechanism_20260916.txt</w:t>
-      </w:r>
-      <w:r>
-        <w:t>) — what is scoped is the decomposition, not the identity.</w:t>
-      </w:r>
-    </w:p>
-    <w:p>
-      <w:r>
-        <w:t xml:space="preserve">- The intervention axis the headline comparisons use is </w:t>
-      </w:r>
-      <w:r>
-        <w:rPr>
-          <w:b/>
-        </w:rPr>
-        <w:t>`lr0` (`0.001 → 0.005`)</w:t>
-      </w:r>
-      <w:r>
-        <w:t xml:space="preserve">; two further orthogonal axes were run, one reproducing, as on </w:t>
-      </w:r>
-      <w:r>
-        <w:rPr>
-          <w:rFonts w:ascii="Consolas" w:hAnsi="Consolas"/>
-          <w:sz w:val="19"/>
-        </w:rPr>
-        <w:t>lr0</w:t>
-      </w:r>
-      <w:r>
-        <w:t xml:space="preserve">, the </w:t>
-      </w:r>
-      <w:r>
-        <w:rPr>
-          <w:b/>
-        </w:rPr>
-        <w:t>corpus-dependent character</w:t>
-      </w:r>
-      <w:r>
-        <w:t xml:space="preserve"> of the shift (</w:t>
-      </w:r>
-      <w:r>
-        <w:rPr>
-          <w:b/>
-        </w:rPr>
-        <w:t>Supplementary S8</w:t>
-      </w:r>
-      <w:r>
-        <w:t xml:space="preserve">, </w:t>
-      </w:r>
-      <w:r>
-        <w:rPr>
-          <w:b/>
-        </w:rPr>
-        <w:t>Table S40b</w:t>
-      </w:r>
-      <w:r>
-        <w:t>); the cross-lineage probe is</w:t>
-      </w:r>
-    </w:p>
-    <w:p>
-      <w:r>
-        <w:rPr>
-          <w:b/>
-        </w:rPr>
-        <w:t>one detector, two corpora, and incomparable magnitudes</w:t>
-      </w:r>
-      <w:r>
-        <w:t>.</w:t>
+      <w:r>
+        <w:t xml:space="preserve"> (the grading is in the count itself, Table 3 column 2).</w:t>
       </w:r>
     </w:p>
     <w:p>
@@ -13584,143 +13467,7 @@
         <w:rPr>
           <w:b/>
         </w:rPr>
-        <w:t>Four disclosed uncertainties</w:t>
-      </w:r>
-      <w:r>
-        <w:t xml:space="preserve"> bound our claims: the 19-row audit is </w:t>
-      </w:r>
-      <w:r>
-        <w:rPr>
-          <w:b/>
-        </w:rPr>
-        <w:t>single-rater</w:t>
-      </w:r>
-      <w:r>
-        <w:t xml:space="preserve">; the log sample is a </w:t>
-      </w:r>
-      <w:r>
-        <w:rPr>
-          <w:b/>
-        </w:rPr>
-        <w:t>convenience sample</w:t>
-      </w:r>
-      <w:r>
-        <w:t xml:space="preserve">; the GPU memory-pressure effect is </w:t>
-      </w:r>
-      <w:r>
-        <w:rPr>
-          <w:b/>
-        </w:rPr>
-        <w:t>bounded, not estimated</w:t>
-      </w:r>
-      <w:r>
-        <w:t xml:space="preserve"> (</w:t>
-      </w:r>
-      <w:r>
-        <w:rPr>
-          <w:b/>
-        </w:rPr>
-        <w:t>≤0.05 pp</w:t>
-      </w:r>
-      <w:r>
-        <w:t xml:space="preserve"> where same-config pairs can be compared, fresh replicates being bit-identical; cross-date comparisons carry a </w:t>
-      </w:r>
-      <w:r>
-        <w:rPr>
-          <w:b/>
-        </w:rPr>
-        <w:t>0.440 pp</w:t>
-      </w:r>
-      <w:r>
-        <w:t xml:space="preserve"> drift); and the §8.3 replicates vary the </w:t>
-      </w:r>
-      <w:r>
-        <w:rPr>
-          <w:b/>
-        </w:rPr>
-        <w:t>training file order</w:t>
-      </w:r>
-      <w:r>
-        <w:t xml:space="preserve">, not independent seeds. </w:t>
-      </w:r>
-      <w:r>
-        <w:rPr>
-          <w:b/>
-        </w:rPr>
-        <w:t>And, not as an uncertainty</w:t>
-      </w:r>
-      <w:r>
-        <w:t xml:space="preserve">: </w:t>
-      </w:r>
-      <w:r>
-        <w:rPr>
-          <w:b/>
-        </w:rPr>
-        <w:t>no interval here folds into §8.6's rate</w:t>
-      </w:r>
-      <w:r>
-        <w:t xml:space="preserve">. </w:t>
-      </w:r>
-      <w:r>
-        <w:rPr>
-          <w:b/>
-        </w:rPr>
-        <w:t>Supplementary S12</w:t>
-      </w:r>
-      <w:r>
-        <w:t>.</w:t>
-      </w:r>
-    </w:p>
-    <w:p>
-      <w:r>
-        <w:t xml:space="preserve">- The </w:t>
-      </w:r>
-      <w:r>
-        <w:rPr>
-          <w:b/>
-        </w:rPr>
-        <w:t>scale-dependence</w:t>
-      </w:r>
-      <w:r>
-        <w:t xml:space="preserve"> reading (§8.8) is **one corpus, one detector, the same </w:t>
-      </w:r>
-      <w:r>
-        <w:rPr>
-          <w:rFonts w:ascii="Consolas" w:hAnsi="Consolas"/>
-          <w:sz w:val="19"/>
-        </w:rPr>
-        <w:t>lr0</w:t>
-      </w:r>
-      <w:r>
-        <w:t xml:space="preserve"> axis as</w:t>
-      </w:r>
-    </w:p>
-    <w:p>
-      <w:r>
-        <w:t>§5.1</w:t>
-      </w:r>
-      <w:r>
-        <w:rPr>
-          <w:b/>
-        </w:rPr>
-        <w:t xml:space="preserve"> (20 runs, ten file orders per arm); it does </w:t>
-      </w:r>
-      <w:r>
-        <w:t>not</w:t>
-      </w:r>
-      <w:r>
-        <w:rPr>
-          <w:b/>
-        </w:rPr>
-        <w:t xml:space="preserve"> re-open §8.6's pool, and </w:t>
-      </w:r>
-      <w:r>
-        <w:t>no interval</w:t>
-      </w:r>
-    </w:p>
-    <w:p>
-      <w:r>
-        <w:t>of §8.6's folds into it**.</w:t>
+        <w:t>The full nine-item limitations list is in Supplementary §S16.</w:t>
       </w:r>
     </w:p>
     <w:p/>

</xml_diff>

<commit_message>
Land the mask_clean full-budget sibling as Supplementary 8.9/S17 (val-side premium +26.2 / +14.9 pp vs VisDrone's +0.27 pp; test-side realization explicitly NOT claimed); pack rebuilt (1c387b04); three layers synced and verified
</commit_message>
<xml_diff>
--- a/01_paper/P2_English_submission_blind_v1.docx
+++ b/01_paper/P2_English_submission_blind_v1.docx
@@ -11884,6 +11884,157 @@
           <w:sz w:val="20"/>
         </w:rPr>
         <w:t xml:space="preserve"> (Tables S46–S47: the per-arm table is S46).</w:t>
+      </w:r>
+    </w:p>
+    <w:p>
+      <w:pPr>
+        <w:pStyle w:val="Heading2"/>
+      </w:pPr>
+      <w:r>
+        <w:t>8.9 A second corpus at full budget: the premium is corpus-scale-dependent</w:t>
+      </w:r>
+    </w:p>
+    <w:p>
+      <w:r>
+        <w:rPr>
+          <w:b/>
+        </w:rPr>
+        <w:t>The same full-budget protocol on a second corpus</w:t>
+      </w:r>
+      <w:r>
+        <w:t xml:space="preserve"> (</w:t>
+      </w:r>
+      <w:r>
+        <w:rPr>
+          <w:rFonts w:ascii="Consolas" w:hAnsi="Consolas"/>
+          <w:sz w:val="19"/>
+        </w:rPr>
+        <w:t>mask_clean</w:t>
+      </w:r>
+      <w:r>
+        <w:t xml:space="preserve">: 5,220 train / 900 val / 919 test, </w:t>
+      </w:r>
+      <w:r>
+        <w:rPr>
+          <w:rFonts w:ascii="Consolas" w:hAnsi="Consolas"/>
+          <w:sz w:val="19"/>
+        </w:rPr>
+        <w:t>nc = 1</w:t>
+      </w:r>
+      <w:r>
+        <w:t xml:space="preserve">; 20 runs = 2 arms × ten file orders) gives a </w:t>
+      </w:r>
+      <w:r>
+        <w:rPr>
+          <w:b/>
+        </w:rPr>
+        <w:t>selection premium of +26.2 pp (`base100`) and +14.9 pp (`lr005_100ep`)</w:t>
+      </w:r>
+      <w:r>
+        <w:t xml:space="preserve"> — against </w:t>
+      </w:r>
+      <w:r>
+        <w:rPr>
+          <w:b/>
+        </w:rPr>
+        <w:t>+0.27 pp</w:t>
+      </w:r>
+      <w:r>
+        <w:t xml:space="preserve"> on the full-budget VisDrone cell above, a difference of two orders of magnitude on the same protocol. </w:t>
+      </w:r>
+      <w:r>
+        <w:rPr>
+          <w:b/>
+        </w:rPr>
+        <w:t>The direction is reproduced</w:t>
+      </w:r>
+      <w:r>
+        <w:t xml:space="preserve"> (</w:t>
+      </w:r>
+      <w:r>
+        <w:rPr>
+          <w:rFonts w:ascii="Consolas" w:hAnsi="Consolas"/>
+          <w:sz w:val="19"/>
+        </w:rPr>
+        <w:t>base100</w:t>
+      </w:r>
+      <w:r>
+        <w:t xml:space="preserve"> &gt; </w:t>
+      </w:r>
+      <w:r>
+        <w:rPr>
+          <w:rFonts w:ascii="Consolas" w:hAnsi="Consolas"/>
+          <w:sz w:val="19"/>
+        </w:rPr>
+        <w:t>lr005_100ep</w:t>
+      </w:r>
+      <w:r>
+        <w:t xml:space="preserve">, i.e. the higher </w:t>
+      </w:r>
+      <w:r>
+        <w:rPr>
+          <w:rFonts w:ascii="Consolas" w:hAnsi="Consolas"/>
+          <w:sz w:val="19"/>
+        </w:rPr>
+        <w:t>lr0</w:t>
+      </w:r>
+      <w:r>
+        <w:t xml:space="preserve"> buys down the premium by ~43 %). What this establishes is therefore </w:t>
+      </w:r>
+      <w:r>
+        <w:rPr>
+          <w:b/>
+        </w:rPr>
+        <w:t>scope</w:t>
+      </w:r>
+      <w:r>
+        <w:t xml:space="preserve">: the premium's </w:t>
+      </w:r>
+      <w:r>
+        <w:rPr>
+          <w:i/>
+        </w:rPr>
+        <w:t>size</w:t>
+      </w:r>
+      <w:r>
+        <w:t xml:space="preserve"> tracks corpus scale and fit, while its </w:t>
+      </w:r>
+      <w:r>
+        <w:rPr>
+          <w:i/>
+        </w:rPr>
+        <w:t>sign</w:t>
+      </w:r>
+      <w:r>
+        <w:t xml:space="preserve"> does not flip. The </w:t>
+      </w:r>
+      <w:r>
+        <w:rPr>
+          <w:b/>
+        </w:rPr>
+        <w:t>test-side realization for this corpus is not yet measured</w:t>
+      </w:r>
+      <w:r>
+        <w:t xml:space="preserve"> (it needs a per-epoch </w:t>
+      </w:r>
+      <w:r>
+        <w:rPr>
+          <w:rFonts w:ascii="Consolas" w:hAnsi="Consolas"/>
+          <w:sz w:val="19"/>
+        </w:rPr>
+        <w:t>test</w:t>
+      </w:r>
+      <w:r>
+        <w:t xml:space="preserve"> sweep this run set does not have) and is </w:t>
+      </w:r>
+      <w:r>
+        <w:rPr>
+          <w:b/>
+        </w:rPr>
+        <w:t>not claimed</w:t>
+      </w:r>
+      <w:r>
+        <w:t xml:space="preserve"> here.</w:t>
       </w:r>
     </w:p>
     <w:p>

</xml_diff>

<commit_message>
b1 closed: one checkpoint rule for both sides of the realization ratio (Supplement S18; 377-run check: e*=argmax in 341/377, premium shift <=0.086 pp, mean -0.002 pp); W1 leftover seed-budget -> replicate-budget; pack and layers rebuilt
</commit_message>
<xml_diff>
--- a/01_paper/P2_English_submission_blind_v1.docx
+++ b/01_paper/P2_English_submission_blind_v1.docx
@@ -163,7 +163,7 @@
         <w:t>claim-level interval includes zero</w:t>
       </w:r>
       <w:r>
-        <w:t xml:space="preserve">, and the arm-cell and run-weighted point estimates are </w:t>
+        <w:t xml:space="preserve">; arm-cell and run-weighted estimates are </w:t>
       </w:r>
       <w:r>
         <w:rPr>
@@ -172,16 +172,16 @@
         <w:t>descriptive</w:t>
       </w:r>
       <w:r>
-        <w:t xml:space="preserve">, as intervals only (Table 4). </w:t>
-      </w:r>
-      <w:r>
-        <w:rPr>
-          <w:b/>
-        </w:rPr>
-        <w:t>At full budget, 99 % (§8.8).</w:t>
-      </w:r>
-      <w:r>
-        <w:t xml:space="preserve"> No power analysis was registered; the nine </w:t>
+        <w:t xml:space="preserve"> intervals only (Table 4). </w:t>
+      </w:r>
+      <w:r>
+        <w:rPr>
+          <w:b/>
+        </w:rPr>
+        <w:t>At full budget, one corpus, one detector: 99 % (§8.8).</w:t>
+      </w:r>
+      <w:r>
+        <w:t xml:space="preserve"> No power analysis was registered; nine </w:t>
       </w:r>
       <w:r>
         <w:rPr>
@@ -1374,7 +1374,7 @@
         <w:rPr>
           <w:b/>
         </w:rPr>
-        <w:t>We disclose our own defects, and the corrections that followed</w:t>
+        <w:t>We disclose our own defects and the corrections</w:t>
       </w:r>
       <w:r>
         <w:t xml:space="preserve"> rather than removing them:</w:t>
@@ -2011,7 +2011,7 @@
         <w:rPr>
           <w:b/>
         </w:rPr>
-        <w:t>notation and formal statements: Supplementary S11</w:t>
+        <w:t>both sides at one checkpoint rule — Supplementary S11, S18</w:t>
       </w:r>
       <w:r>
         <w:t>).</w:t>
@@ -9032,7 +9032,7 @@
         <w:rPr>
           <w:b/>
         </w:rPr>
-        <w:t>seed-budget discipline</w:t>
+        <w:t>replicate-budget discipline</w:t>
       </w:r>
       <w:r>
         <w:t xml:space="preserve"> measured rather than assumed ([52]'s setting, §8.4). </w:t>

</xml_diff>

<commit_message>
r3 zero-GPU items closed: b3 (pool spans two budgets) and b2 (identifiability caveat binds where dgap's sign is read) as Supplement S20; b6 rule pointer in the article; pack and layers rebuilt
</commit_message>
<xml_diff>
--- a/01_paper/P2_English_submission_blind_v1.docx
+++ b/01_paper/P2_English_submission_blind_v1.docx
@@ -13641,7 +13641,16 @@
         <w:t>unit</w:t>
       </w:r>
       <w:r>
-        <w:t xml:space="preserve"> is named: the same nineteen benchmarks answer differently under each declared unit (Fig. 1, Table 3), and re-tallying them after the 2026-10-09 first-party correction record moves the </w:t>
+        <w:t xml:space="preserve"> is named: the same nineteen benchmarks answer differently under each declared unit (Fig. 1, Table 3; </w:t>
+      </w:r>
+      <w:r>
+        <w:rPr>
+          <w:b/>
+        </w:rPr>
+        <w:t>the `n_a` applicability rule itself is stated in Supplementary S12</w:t>
+      </w:r>
+      <w:r>
+        <w:t xml:space="preserve">), and re-tallying them after the 2026-10-09 first-party correction record moves the </w:t>
       </w:r>
       <w:r>
         <w:rPr>

</xml_diff>

<commit_message>
Section 8.9 upgraded to the full two-sided sibling result (mask_clean full budget, 20 runs, per-checkpoint test sweep): premium +26.2/+14.9 pp, realization +7.2%/-9.7%, pooled +1.44%, run-level bootstrap CI [-7.2%, +4.1%] includes zero; answers E1/C1 of the r3 reviews. Supplement S17 extended; pack and layers rebuilt
</commit_message>
<xml_diff>
--- a/01_paper/P2_English_submission_blind_v1.docx
+++ b/01_paper/P2_English_submission_blind_v1.docx
@@ -11891,7 +11891,7 @@
         <w:pStyle w:val="Heading2"/>
       </w:pPr>
       <w:r>
-        <w:t>8.9 A second corpus at full budget: the premium is corpus-scale-dependent</w:t>
+        <w:t>8.9 A second corpus at full budget: the premium and its realization are corpus properties</w:t>
       </w:r>
     </w:p>
     <w:p>
@@ -11922,119 +11922,406 @@
         <w:t>nc = 1</w:t>
       </w:r>
       <w:r>
-        <w:t xml:space="preserve">; 20 runs = 2 arms × ten file orders) gives a </w:t>
-      </w:r>
-      <w:r>
-        <w:rPr>
-          <w:b/>
-        </w:rPr>
-        <w:t>selection premium of +26.2 pp (`base100`) and +14.9 pp (`lr005_100ep`)</w:t>
-      </w:r>
-      <w:r>
-        <w:t xml:space="preserve"> — against </w:t>
-      </w:r>
-      <w:r>
-        <w:rPr>
-          <w:b/>
-        </w:rPr>
-        <w:t>+0.27 pp</w:t>
-      </w:r>
-      <w:r>
-        <w:t xml:space="preserve"> on the full-budget VisDrone cell above, a difference of two orders of magnitude on the same protocol. </w:t>
-      </w:r>
-      <w:r>
-        <w:rPr>
-          <w:b/>
-        </w:rPr>
-        <w:t>The direction is reproduced</w:t>
-      </w:r>
-      <w:r>
-        <w:t xml:space="preserve"> (</w:t>
+        <w:t xml:space="preserve">; 2 arms × ten file orders, 100 epochs, </w:t>
       </w:r>
       <w:r>
         <w:rPr>
           <w:rFonts w:ascii="Consolas" w:hAnsi="Consolas"/>
           <w:sz w:val="19"/>
         </w:rPr>
-        <w:t>base100</w:t>
-      </w:r>
-      <w:r>
-        <w:t xml:space="preserve"> &gt; </w:t>
+        <w:t>test</w:t>
+      </w:r>
+      <w:r>
+        <w:t xml:space="preserve"> side from a per-checkpoint sweep):</w:t>
+      </w:r>
+    </w:p>
+    <w:tbl>
+      <w:tblPr>
+        <w:tblStyle w:val="TableGrid"/>
+        <w:tblW w:type="auto" w:w="0"/>
+        <w:tblLook w:firstColumn="1" w:firstRow="1" w:lastColumn="0" w:lastRow="0" w:noHBand="0" w:noVBand="1" w:val="04A0"/>
+      </w:tblPr>
+      <w:tblGrid>
+        <w:gridCol w:w="1728"/>
+        <w:gridCol w:w="1728"/>
+        <w:gridCol w:w="1728"/>
+        <w:gridCol w:w="1728"/>
+        <w:gridCol w:w="1728"/>
+      </w:tblGrid>
+      <w:tr>
+        <w:tc>
+          <w:tcPr>
+            <w:tcW w:type="dxa" w:w="1728"/>
+          </w:tcPr>
+          <w:p>
+            <w:r>
+              <w:rPr>
+                <w:b/>
+                <w:sz w:val="18"/>
+              </w:rPr>
+              <w:t>Arm</w:t>
+            </w:r>
+          </w:p>
+        </w:tc>
+        <w:tc>
+          <w:tcPr>
+            <w:tcW w:type="dxa" w:w="1728"/>
+          </w:tcPr>
+          <w:p>
+            <w:r>
+              <w:rPr>
+                <w:b/>
+                <w:sz w:val="18"/>
+              </w:rPr>
+              <w:t>n</w:t>
+            </w:r>
+          </w:p>
+        </w:tc>
+        <w:tc>
+          <w:tcPr>
+            <w:tcW w:type="dxa" w:w="1728"/>
+          </w:tcPr>
+          <w:p>
+            <w:r>
+              <w:rPr>
+                <w:rFonts w:ascii="Consolas" w:hAnsi="Consolas"/>
+                <w:b/>
+                <w:sz w:val="18"/>
+              </w:rPr>
+              <w:t>prem_val</w:t>
+            </w:r>
+          </w:p>
+        </w:tc>
+        <w:tc>
+          <w:tcPr>
+            <w:tcW w:type="dxa" w:w="1728"/>
+          </w:tcPr>
+          <w:p>
+            <w:r>
+              <w:rPr>
+                <w:rFonts w:ascii="Consolas" w:hAnsi="Consolas"/>
+                <w:b/>
+                <w:sz w:val="18"/>
+              </w:rPr>
+              <w:t>prem_test</w:t>
+            </w:r>
+          </w:p>
+        </w:tc>
+        <w:tc>
+          <w:tcPr>
+            <w:tcW w:type="dxa" w:w="1728"/>
+          </w:tcPr>
+          <w:p>
+            <w:r>
+              <w:rPr>
+                <w:b/>
+                <w:sz w:val="18"/>
+              </w:rPr>
+              <w:t>realization</w:t>
+            </w:r>
+          </w:p>
+        </w:tc>
+      </w:tr>
+      <w:tr>
+        <w:tc>
+          <w:tcPr>
+            <w:tcW w:type="dxa" w:w="1728"/>
+          </w:tcPr>
+          <w:p>
+            <w:r>
+              <w:rPr>
+                <w:sz w:val="18"/>
+              </w:rPr>
+              <w:t>---</w:t>
+            </w:r>
+          </w:p>
+        </w:tc>
+        <w:tc>
+          <w:tcPr>
+            <w:tcW w:type="dxa" w:w="1728"/>
+          </w:tcPr>
+          <w:p>
+            <w:r>
+              <w:rPr>
+                <w:sz w:val="18"/>
+              </w:rPr>
+              <w:t>---:</w:t>
+            </w:r>
+          </w:p>
+        </w:tc>
+        <w:tc>
+          <w:tcPr>
+            <w:tcW w:type="dxa" w:w="1728"/>
+          </w:tcPr>
+          <w:p>
+            <w:r>
+              <w:rPr>
+                <w:sz w:val="18"/>
+              </w:rPr>
+              <w:t>---:</w:t>
+            </w:r>
+          </w:p>
+        </w:tc>
+        <w:tc>
+          <w:tcPr>
+            <w:tcW w:type="dxa" w:w="1728"/>
+          </w:tcPr>
+          <w:p>
+            <w:r>
+              <w:rPr>
+                <w:sz w:val="18"/>
+              </w:rPr>
+              <w:t>---:</w:t>
+            </w:r>
+          </w:p>
+        </w:tc>
+        <w:tc>
+          <w:tcPr>
+            <w:tcW w:type="dxa" w:w="1728"/>
+          </w:tcPr>
+          <w:p>
+            <w:r>
+              <w:rPr>
+                <w:sz w:val="18"/>
+              </w:rPr>
+              <w:t>---:</w:t>
+            </w:r>
+          </w:p>
+        </w:tc>
+      </w:tr>
+      <w:tr>
+        <w:tc>
+          <w:tcPr>
+            <w:tcW w:type="dxa" w:w="1728"/>
+          </w:tcPr>
+          <w:p>
+            <w:r>
+              <w:rPr>
+                <w:rFonts w:ascii="Consolas" w:hAnsi="Consolas"/>
+                <w:sz w:val="18"/>
+              </w:rPr>
+              <w:t>base100</w:t>
+            </w:r>
+          </w:p>
+        </w:tc>
+        <w:tc>
+          <w:tcPr>
+            <w:tcW w:type="dxa" w:w="1728"/>
+          </w:tcPr>
+          <w:p>
+            <w:r>
+              <w:rPr>
+                <w:sz w:val="18"/>
+              </w:rPr>
+              <w:t>10</w:t>
+            </w:r>
+          </w:p>
+        </w:tc>
+        <w:tc>
+          <w:tcPr>
+            <w:tcW w:type="dxa" w:w="1728"/>
+          </w:tcPr>
+          <w:p>
+            <w:r>
+              <w:rPr>
+                <w:sz w:val="18"/>
+              </w:rPr>
+              <w:t>+26.219</w:t>
+            </w:r>
+          </w:p>
+        </w:tc>
+        <w:tc>
+          <w:tcPr>
+            <w:tcW w:type="dxa" w:w="1728"/>
+          </w:tcPr>
+          <w:p>
+            <w:r>
+              <w:rPr>
+                <w:b/>
+                <w:sz w:val="18"/>
+              </w:rPr>
+              <w:t>+1.755</w:t>
+            </w:r>
+          </w:p>
+        </w:tc>
+        <w:tc>
+          <w:tcPr>
+            <w:tcW w:type="dxa" w:w="1728"/>
+          </w:tcPr>
+          <w:p>
+            <w:r>
+              <w:rPr>
+                <w:b/>
+                <w:sz w:val="18"/>
+              </w:rPr>
+              <w:t>+7.2 %</w:t>
+            </w:r>
+          </w:p>
+        </w:tc>
+      </w:tr>
+      <w:tr>
+        <w:tc>
+          <w:tcPr>
+            <w:tcW w:type="dxa" w:w="1728"/>
+          </w:tcPr>
+          <w:p>
+            <w:r>
+              <w:rPr>
+                <w:rFonts w:ascii="Consolas" w:hAnsi="Consolas"/>
+                <w:sz w:val="18"/>
+              </w:rPr>
+              <w:t>lr005_100ep</w:t>
+            </w:r>
+          </w:p>
+        </w:tc>
+        <w:tc>
+          <w:tcPr>
+            <w:tcW w:type="dxa" w:w="1728"/>
+          </w:tcPr>
+          <w:p>
+            <w:r>
+              <w:rPr>
+                <w:sz w:val="18"/>
+              </w:rPr>
+              <w:t>10</w:t>
+            </w:r>
+          </w:p>
+        </w:tc>
+        <w:tc>
+          <w:tcPr>
+            <w:tcW w:type="dxa" w:w="1728"/>
+          </w:tcPr>
+          <w:p>
+            <w:r>
+              <w:rPr>
+                <w:sz w:val="18"/>
+              </w:rPr>
+              <w:t>+14.883</w:t>
+            </w:r>
+          </w:p>
+        </w:tc>
+        <w:tc>
+          <w:tcPr>
+            <w:tcW w:type="dxa" w:w="1728"/>
+          </w:tcPr>
+          <w:p>
+            <w:r>
+              <w:rPr>
+                <w:b/>
+                <w:sz w:val="18"/>
+              </w:rPr>
+              <w:t>−1.165</w:t>
+            </w:r>
+          </w:p>
+        </w:tc>
+        <w:tc>
+          <w:tcPr>
+            <w:tcW w:type="dxa" w:w="1728"/>
+          </w:tcPr>
+          <w:p>
+            <w:r>
+              <w:rPr>
+                <w:b/>
+                <w:sz w:val="18"/>
+              </w:rPr>
+              <w:t>−9.7 %</w:t>
+            </w:r>
+          </w:p>
+        </w:tc>
+      </w:tr>
+    </w:tbl>
+    <w:p/>
+    <w:p>
+      <w:r>
+        <w:t xml:space="preserve">Pooled </w:t>
+      </w:r>
+      <w:r>
+        <w:rPr>
+          <w:b/>
+        </w:rPr>
+        <w:t>+1.44 %</w:t>
+      </w:r>
+      <w:r>
+        <w:t xml:space="preserve">; run-level bootstrap 95 % CI </w:t>
+      </w:r>
+      <w:r>
+        <w:rPr>
+          <w:b/>
+        </w:rPr>
+        <w:t>[−7.2 %, +4.1 %]</w:t>
+      </w:r>
+      <w:r>
+        <w:t xml:space="preserve"> — </w:t>
+      </w:r>
+      <w:r>
+        <w:rPr>
+          <w:b/>
+        </w:rPr>
+        <w:t>zero inside</w:t>
+      </w:r>
+      <w:r>
+        <w:t xml:space="preserve">; </w:t>
       </w:r>
       <w:r>
         <w:rPr>
           <w:rFonts w:ascii="Consolas" w:hAnsi="Consolas"/>
           <w:sz w:val="19"/>
         </w:rPr>
-        <w:t>lr005_100ep</w:t>
-      </w:r>
-      <w:r>
-        <w:t xml:space="preserve">, i.e. the higher </w:t>
-      </w:r>
-      <w:r>
-        <w:rPr>
-          <w:rFonts w:ascii="Consolas" w:hAnsi="Consolas"/>
-          <w:sz w:val="19"/>
-        </w:rPr>
-        <w:t>lr0</w:t>
-      </w:r>
-      <w:r>
-        <w:t xml:space="preserve"> buys down the premium by ~43 %). What this establishes is therefore </w:t>
-      </w:r>
-      <w:r>
-        <w:rPr>
-          <w:b/>
-        </w:rPr>
-        <w:t>scope</w:t>
-      </w:r>
-      <w:r>
-        <w:t xml:space="preserve">: the premium's </w:t>
+        <w:t>prem_test &gt; 0</w:t>
+      </w:r>
+      <w:r>
+        <w:t xml:space="preserve"> in </w:t>
+      </w:r>
+      <w:r>
+        <w:rPr>
+          <w:b/>
+        </w:rPr>
+        <w:t>12 of 20</w:t>
+      </w:r>
+      <w:r>
+        <w:t xml:space="preserve"> runs. </w:t>
+      </w:r>
+      <w:r>
+        <w:rPr>
+          <w:b/>
+        </w:rPr>
+        <w:t>Against §8.8</w:t>
+      </w:r>
+      <w:r>
+        <w:t xml:space="preserve"> (full-budget VisDrone: premium +0.27 pp, realization </w:t>
+      </w:r>
+      <w:r>
+        <w:rPr>
+          <w:b/>
+        </w:rPr>
+        <w:t>99 %</w:t>
+      </w:r>
+      <w:r>
+        <w:t xml:space="preserve">), the premium here is two orders of magnitude larger and </w:t>
+      </w:r>
+      <w:r>
+        <w:rPr>
+          <w:b/>
+        </w:rPr>
+        <w:t>only a minority survives</w:t>
+      </w:r>
+      <w:r>
+        <w:t xml:space="preserve"> — and the arms separate on the </w:t>
       </w:r>
       <w:r>
         <w:rPr>
           <w:i/>
         </w:rPr>
-        <w:t>size</w:t>
-      </w:r>
-      <w:r>
-        <w:t xml:space="preserve"> tracks corpus scale and fit, while its </w:t>
-      </w:r>
-      <w:r>
-        <w:rPr>
-          <w:i/>
-        </w:rPr>
-        <w:t>sign</w:t>
-      </w:r>
-      <w:r>
-        <w:t xml:space="preserve"> does not flip. The </w:t>
-      </w:r>
-      <w:r>
-        <w:rPr>
-          <w:b/>
-        </w:rPr>
-        <w:t>test-side realization for this corpus is not yet measured</w:t>
-      </w:r>
-      <w:r>
-        <w:t xml:space="preserve"> (it needs a per-epoch </w:t>
-      </w:r>
-      <w:r>
-        <w:rPr>
-          <w:rFonts w:ascii="Consolas" w:hAnsi="Consolas"/>
-          <w:sz w:val="19"/>
-        </w:rPr>
-        <w:t>test</w:t>
-      </w:r>
-      <w:r>
-        <w:t xml:space="preserve"> sweep this run set does not have) and is </w:t>
-      </w:r>
-      <w:r>
-        <w:rPr>
-          <w:b/>
-        </w:rPr>
-        <w:t>not claimed</w:t>
-      </w:r>
-      <w:r>
-        <w:t xml:space="preserve"> here.</w:t>
+        <w:t>realization</w:t>
+      </w:r>
+      <w:r>
+        <w:t xml:space="preserve"> (+7.2 % vs −9.7 %) rather than on the premium alone. </w:t>
+      </w:r>
+      <w:r>
+        <w:rPr>
+          <w:b/>
+        </w:rPr>
+        <w:t>Per-run detail: Supplementary S17.</w:t>
       </w:r>
     </w:p>
     <w:p>

</xml_diff>

<commit_message>
C3 closed without new runs: the clean re-run of the memory-pressure-flagged p_vistod15 runs is already in the release (Table S41) and is reproduced here to the printed digit (|clean2-clean1| = 0.000 in all four pairs; |archive-clean1| <= 0.15 pp); a one-line statement added to section 5.1. C2 launcher and C3 verifier scripts staged. E3 dropped per author. Pack and layers rebuilt
</commit_message>
<xml_diff>
--- a/01_paper/P2_English_submission_blind_v1.docx
+++ b/01_paper/P2_English_submission_blind_v1.docx
@@ -5900,7 +5900,16 @@
     </w:p>
     <w:p>
       <w:r>
-        <w:t xml:space="preserve">the attainable floor at n = 10. The </w:t>
+        <w:t xml:space="preserve">the attainable floor at n = 10. </w:t>
+      </w:r>
+      <w:r>
+        <w:rPr>
+          <w:b/>
+        </w:rPr>
+        <w:t>The `p_vistod15` runs flagged for memory pressure were re-run clean and reproduce to ≤0.15 pp, changing no reading (Supplementary S41).</w:t>
+      </w:r>
+      <w:r>
+        <w:t xml:space="preserve"> The </w:t>
       </w:r>
       <w:r>
         <w:rPr>
@@ -5920,12 +5929,7 @@
         <w:t>test</w:t>
       </w:r>
       <w:r>
-        <w:t xml:space="preserve"> it</w:t>
-      </w:r>
-    </w:p>
-    <w:p>
-      <w:r>
-        <w:t xml:space="preserve">reproduces the archived </w:t>
+        <w:t xml:space="preserve"> it reproduces the archived </w:t>
       </w:r>
       <w:r>
         <w:rPr>

</xml_diff>

<commit_message>
r4 remediation round: release 14 named-but-unreleased files (C2/E4/S38b inputs + scripts) in 02_release_data with sums and manifest rows; add Highlights (separate file), CRediT and generative-AI declarations; correct the S4 fitness statement, section 6.5's RetinaNet scope, the pool-boundary verdict claim and Table 4's caption; add the A/A-floor readings to Table 2's count; move two passages to the supplement; pack rebuilt and delivered with task-file metadata synced
</commit_message>
<xml_diff>
--- a/01_paper/P2_English_submission_blind_v1.docx
+++ b/01_paper/P2_English_submission_blind_v1.docx
@@ -79,7 +79,7 @@
         <w:t>2. The selection premium only partly survives.</w:t>
       </w:r>
       <w:r>
-        <w:t xml:space="preserve"> The premium is positive in every escalated cell; what changes sign by corpus is the </w:t>
+        <w:t xml:space="preserve"> The premium is positive in every escalated cell; the </w:t>
       </w:r>
       <w:r>
         <w:rPr>
@@ -88,7 +88,7 @@
         <w:t>paired Δgap</w:t>
       </w:r>
       <w:r>
-        <w:t xml:space="preserve"> — the arms' relative difference on </w:t>
+        <w:t xml:space="preserve"> (arms' </w:t>
       </w:r>
       <w:r>
         <w:rPr>
@@ -98,7 +98,7 @@
         <w:t>val</w:t>
       </w:r>
       <w:r>
-        <w:t xml:space="preserve"> versus on </w:t>
+        <w:t>-vs-</w:t>
       </w:r>
       <w:r>
         <w:rPr>
@@ -108,7 +108,25 @@
         <w:t>test</w:t>
       </w:r>
       <w:r>
-        <w:t xml:space="preserve"> — and not the selection term itself. The </w:t>
+        <w:t xml:space="preserve"> difference) changes sign by corpus, not the selection term — and </w:t>
+      </w:r>
+      <w:r>
+        <w:rPr>
+          <w:b/>
+        </w:rPr>
+        <w:t>only gaps above the ≈0.5 pp A/A floor count</w:t>
+      </w:r>
+      <w:r>
+        <w:t xml:space="preserve"> (</w:t>
+      </w:r>
+      <w:r>
+        <w:rPr>
+          <w:b/>
+        </w:rPr>
+        <w:t>S23</w:t>
+      </w:r>
+      <w:r>
+        <w:t xml:space="preserve">). The </w:t>
       </w:r>
       <w:r>
         <w:rPr>
@@ -4570,7 +4588,85 @@
         <w:rPr>
           <w:sz w:val="19"/>
         </w:rPr>
-        <w:t xml:space="preserve"> Tier 2 — the paired difference Δgap by corpus. Δgap &gt; 0 means </w:t>
+        <w:t xml:space="preserve"> Tier 2 — the paired difference Δgap by corpus. </w:t>
+      </w:r>
+      <w:r>
+        <w:rPr>
+          <w:b/>
+          <w:sz w:val="19"/>
+        </w:rPr>
+        <w:t>Resolution limit (pre-registered A/A control):</w:t>
+      </w:r>
+      <w:r>
+        <w:rPr>
+          <w:sz w:val="19"/>
+        </w:rPr>
+        <w:t xml:space="preserve"> two identically configured arms differing </w:t>
+      </w:r>
+      <w:r>
+        <w:rPr>
+          <w:i/>
+          <w:sz w:val="19"/>
+        </w:rPr>
+        <w:t>only</w:t>
+      </w:r>
+      <w:r>
+        <w:rPr>
+          <w:sz w:val="19"/>
+        </w:rPr>
+        <w:t xml:space="preserve"> in training file order give a spurious </w:t>
+      </w:r>
+      <w:r>
+        <w:rPr>
+          <w:b/>
+          <w:sz w:val="19"/>
+        </w:rPr>
+        <w:t>Δgap ≈ 0.5 pp</w:t>
+      </w:r>
+      <w:r>
+        <w:rPr>
+          <w:sz w:val="19"/>
+        </w:rPr>
+        <w:t xml:space="preserve"> (CI [+0.09, +0.84], </w:t>
+      </w:r>
+      <w:r>
+        <w:rPr>
+          <w:b/>
+          <w:sz w:val="19"/>
+        </w:rPr>
+        <w:t>S23</w:t>
+      </w:r>
+      <w:r>
+        <w:rPr>
+          <w:sz w:val="19"/>
+        </w:rPr>
+        <w:t xml:space="preserve">), so equal split difficulty is an </w:t>
+      </w:r>
+      <w:r>
+        <w:rPr>
+          <w:b/>
+          <w:sz w:val="19"/>
+        </w:rPr>
+        <w:t>assumption with a measured floor</w:t>
+      </w:r>
+      <w:r>
+        <w:rPr>
+          <w:sz w:val="19"/>
+        </w:rPr>
+        <w:t xml:space="preserve"> and </w:t>
+      </w:r>
+      <w:r>
+        <w:rPr>
+          <w:b/>
+          <w:sz w:val="19"/>
+        </w:rPr>
+        <w:t>gaps that small are not read as identified effects</w:t>
+      </w:r>
+      <w:r>
+        <w:rPr>
+          <w:sz w:val="19"/>
+        </w:rPr>
+        <w:t xml:space="preserve">. Δgap &gt; 0 means </w:t>
       </w:r>
       <w:r>
         <w:rPr>
@@ -4622,20 +4718,7 @@
         <w:rPr>
           <w:sz w:val="19"/>
         </w:rPr>
-        <w:t xml:space="preserve">). Equal split difficulty across arms is an </w:t>
-      </w:r>
-      <w:r>
-        <w:rPr>
-          <w:b/>
-          <w:sz w:val="19"/>
-        </w:rPr>
-        <w:t>assumption we state</w:t>
-      </w:r>
-      <w:r>
-        <w:rPr>
-          <w:sz w:val="19"/>
-        </w:rPr>
-        <w:t xml:space="preserve">; the selection contribution is the </w:t>
+        <w:t xml:space="preserve">). the selection contribution is the </w:t>
       </w:r>
       <w:r>
         <w:rPr>
@@ -5798,25 +5881,23 @@
         <w:t>Supplementary S12</w:t>
       </w:r>
       <w:r>
-        <w:t>.</w:t>
-      </w:r>
-    </w:p>
-    <w:p>
-      <w:r>
-        <w:rPr>
-          <w:b/>
-        </w:rPr>
-        <w:t>Both escalations met the criteria fixed in advance.</w:t>
-      </w:r>
-      <w:r>
-        <w:t xml:space="preserve"> </w:t>
+        <w:t xml:space="preserve">. </w:t>
+      </w:r>
+      <w:r>
+        <w:rPr>
+          <w:b/>
+        </w:rPr>
+        <w:t>Against the +0.47 pp floor</w:t>
+      </w:r>
+      <w:r>
+        <w:t xml:space="preserve"> (§S23): </w:t>
       </w:r>
       <w:r>
         <w:rPr>
           <w:rFonts w:ascii="Consolas" w:hAnsi="Consolas"/>
           <w:sz w:val="19"/>
         </w:rPr>
-        <w:t>dota15</w:t>
+        <w:t>shwd2sf</w:t>
       </w:r>
       <w:r>
         <w:t xml:space="preserve"> </w:t>
@@ -5825,28 +5906,17 @@
         <w:rPr>
           <w:b/>
         </w:rPr>
-        <w:t>+0.449 pp</w:t>
-      </w:r>
-      <w:r>
-        <w:t xml:space="preserve"> (</w:t>
-      </w:r>
-      <w:r>
-        <w:rPr>
-          <w:b/>
-        </w:rPr>
-        <w:t>10+/0−</w:t>
-      </w:r>
-      <w:r>
-        <w:t>);</w:t>
-      </w:r>
-    </w:p>
-    <w:p>
+        <w:t>+0.779</w:t>
+      </w:r>
+      <w:r>
+        <w:t xml:space="preserve"> is above it, </w:t>
+      </w:r>
       <w:r>
         <w:rPr>
           <w:rFonts w:ascii="Consolas" w:hAnsi="Consolas"/>
           <w:sz w:val="19"/>
         </w:rPr>
-        <w:t>p_aitovis</w:t>
+        <w:t>smoke2sf</w:t>
       </w:r>
       <w:r>
         <w:t xml:space="preserve"> </w:t>
@@ -5855,16 +5925,94 @@
         <w:rPr>
           <w:b/>
         </w:rPr>
-        <w:t>−1.226 pp</w:t>
-      </w:r>
-      <w:r>
-        <w:t xml:space="preserve"> and </w:t>
+        <w:t>+0.461</w:t>
+      </w:r>
+      <w:r>
+        <w:t xml:space="preserve"> is on it, and the two overstating cells (</w:t>
+      </w:r>
+      <w:r>
+        <w:rPr>
+          <w:b/>
+        </w:rPr>
+        <w:t>−1.23</w:t>
+      </w:r>
+      <w:r>
+        <w:t xml:space="preserve">, </w:t>
+      </w:r>
+      <w:r>
+        <w:rPr>
+          <w:b/>
+        </w:rPr>
+        <w:t>−3.32</w:t>
+      </w:r>
+      <w:r>
+        <w:t>) are an order of magnitude beyond it.</w:t>
+      </w:r>
+    </w:p>
+    <w:p>
+      <w:r>
+        <w:rPr>
+          <w:b/>
+        </w:rPr>
+        <w:t>Both escalations met the criteria fixed in advance.</w:t>
+      </w:r>
+      <w:r>
+        <w:t xml:space="preserve"> </w:t>
       </w:r>
       <w:r>
         <w:rPr>
           <w:rFonts w:ascii="Consolas" w:hAnsi="Consolas"/>
           <w:sz w:val="19"/>
         </w:rPr>
+        <w:t>dota15</w:t>
+      </w:r>
+      <w:r>
+        <w:t xml:space="preserve"> </w:t>
+      </w:r>
+      <w:r>
+        <w:rPr>
+          <w:b/>
+        </w:rPr>
+        <w:t>+0.449 pp</w:t>
+      </w:r>
+      <w:r>
+        <w:t xml:space="preserve"> (</w:t>
+      </w:r>
+      <w:r>
+        <w:rPr>
+          <w:b/>
+        </w:rPr>
+        <w:t>10+/0−</w:t>
+      </w:r>
+      <w:r>
+        <w:t>);</w:t>
+      </w:r>
+    </w:p>
+    <w:p>
+      <w:r>
+        <w:rPr>
+          <w:rFonts w:ascii="Consolas" w:hAnsi="Consolas"/>
+          <w:sz w:val="19"/>
+        </w:rPr>
+        <w:t>p_aitovis</w:t>
+      </w:r>
+      <w:r>
+        <w:t xml:space="preserve"> </w:t>
+      </w:r>
+      <w:r>
+        <w:rPr>
+          <w:b/>
+        </w:rPr>
+        <w:t>−1.226 pp</w:t>
+      </w:r>
+      <w:r>
+        <w:t xml:space="preserve"> and </w:t>
+      </w:r>
+      <w:r>
+        <w:rPr>
+          <w:rFonts w:ascii="Consolas" w:hAnsi="Consolas"/>
+          <w:sz w:val="19"/>
+        </w:rPr>
         <w:t>p_vistod15</w:t>
       </w:r>
       <w:r>
@@ -5900,7 +6048,25 @@
     </w:p>
     <w:p>
       <w:r>
-        <w:t xml:space="preserve">the attainable floor at n = 10. </w:t>
+        <w:t xml:space="preserve">the attainable floor at n = 10. (resolution limit: </w:t>
+      </w:r>
+      <w:r>
+        <w:rPr>
+          <w:b/>
+        </w:rPr>
+        <w:t>Supplementary S23</w:t>
+      </w:r>
+      <w:r>
+        <w:t xml:space="preserve">; see </w:t>
+      </w:r>
+      <w:r>
+        <w:rPr>
+          <w:b/>
+        </w:rPr>
+        <w:t>Table 2</w:t>
+      </w:r>
+      <w:r>
+        <w:t xml:space="preserve">’s caption.) </w:t>
       </w:r>
       <w:r>
         <w:rPr>
@@ -8192,16 +8358,6 @@
         <w:t>+0.0809 pp</w:t>
       </w:r>
       <w:r>
-        <w:t xml:space="preserve"> mean </w:t>
-      </w:r>
-      <w:r>
-        <w:rPr>
-          <w:rFonts w:ascii="Consolas" w:hAnsi="Consolas"/>
-          <w:sz w:val="19"/>
-        </w:rPr>
-        <w:t>prem_val</w:t>
-      </w:r>
-      <w:r>
         <w:t xml:space="preserve">, 95 % CI </w:t>
       </w:r>
       <w:r>
@@ -8211,21 +8367,52 @@
         <w:t>[26.9 %, 123.5 %]</w:t>
       </w:r>
       <w:r>
-        <w:t>)</w:t>
-      </w:r>
-    </w:p>
-    <w:p>
-      <w:r>
-        <w:t xml:space="preserve">(values, interval and per-run table: </w:t>
-      </w:r>
-      <w:r>
-        <w:rPr>
-          <w:b/>
-        </w:rPr>
-        <w:t>Supplementary S34</w:t>
-      </w:r>
-      <w:r>
-        <w:t xml:space="preserve">): the mechanism is </w:t>
+        <w:t xml:space="preserve">) — </w:t>
+      </w:r>
+      <w:r>
+        <w:rPr>
+          <w:b/>
+        </w:rPr>
+        <w:t>a sign-only claim</w:t>
+      </w:r>
+      <w:r>
+        <w:t xml:space="preserve">: the size is </w:t>
+      </w:r>
+      <w:r>
+        <w:rPr>
+          <w:b/>
+        </w:rPr>
+        <w:t>below the endpoint’s own noise</w:t>
+      </w:r>
+      <w:r>
+        <w:t xml:space="preserve"> (image-level SE ≈ </w:t>
+      </w:r>
+      <w:r>
+        <w:rPr>
+          <w:b/>
+        </w:rPr>
+        <w:t>0.18 pp</w:t>
+      </w:r>
+      <w:r>
+        <w:t xml:space="preserve">, </w:t>
+      </w:r>
+      <w:r>
+        <w:rPr>
+          <w:b/>
+        </w:rPr>
+        <w:t>S24</w:t>
+      </w:r>
+      <w:r>
+        <w:t xml:space="preserve">), so the printed magnitudes are </w:t>
+      </w:r>
+      <w:r>
+        <w:rPr>
+          <w:b/>
+        </w:rPr>
+        <w:t>not interpreted as an effect size</w:t>
+      </w:r>
+      <w:r>
+        <w:t xml:space="preserve">.: the mechanism is </w:t>
       </w:r>
       <w:r>
         <w:rPr>
@@ -8243,7 +8430,7 @@
         <w:t>second detector family</w:t>
       </w:r>
       <w:r>
-        <w:t xml:space="preserve"> (RetinaNet, both corpora) keeps the </w:t>
+        <w:t xml:space="preserve"> (RetinaNet) keeps the </w:t>
       </w:r>
       <w:r>
         <w:rPr>
@@ -8252,7 +8439,25 @@
         <w:t>direction</w:t>
       </w:r>
       <w:r>
-        <w:t xml:space="preserve"> but not the strength (</w:t>
+        <w:t xml:space="preserve"> on the second corpus but </w:t>
+      </w:r>
+      <w:r>
+        <w:rPr>
+          <w:b/>
+        </w:rPr>
+        <w:t>not on VisDrone</w:t>
+      </w:r>
+      <w:r>
+        <w:t xml:space="preserve"> (there the disjoint-split gain exceeds the selection gain, </w:t>
+      </w:r>
+      <w:r>
+        <w:rPr>
+          <w:b/>
+        </w:rPr>
+        <w:t>Table S34e</w:t>
+      </w:r>
+      <w:r>
+        <w:t>) (</w:t>
       </w:r>
       <w:r>
         <w:rPr>
@@ -9426,10 +9631,10 @@
         <w:rPr>
           <w:b/>
         </w:rPr>
-        <w:t>What this section claims, and what it does not.</w:t>
-      </w:r>
-      <w:r>
-        <w:t xml:space="preserve"> The rate below is the realization of the </w:t>
+        <w:t>Scope of the rate (§S20).</w:t>
+      </w:r>
+      <w:r>
+        <w:t xml:space="preserve"> The rate is the realization of the </w:t>
       </w:r>
       <w:r>
         <w:rPr>
@@ -9445,87 +9650,19 @@
         <w:rPr>
           <w:b/>
         </w:rPr>
-        <w:t>for the five arm-cells measured here, under the companion's protocol</w:t>
-      </w:r>
-      <w:r>
-        <w:t xml:space="preserve"> — </w:t>
-      </w:r>
-      <w:r>
-        <w:rPr>
-          <w:b/>
-        </w:rPr>
-        <w:t>not a constant</w:t>
-      </w:r>
-      <w:r>
-        <w:t>. The escalated cells reach a **pooled</w:t>
-      </w:r>
-    </w:p>
-    <w:p>
-      <w:r>
-        <w:t>55 %</w:t>
-      </w:r>
-      <w:r>
-        <w:rPr>
-          <w:b/>
-        </w:rPr>
-        <w:t xml:space="preserve">, but the two batches are </w:t>
-      </w:r>
-      <w:r>
-        <w:t>not pooled** (§8.1). "The</w:t>
-      </w:r>
-    </w:p>
-    <w:p>
-      <w:r>
-        <w:t xml:space="preserve">convention realizes about a quarter of the </w:t>
-      </w:r>
-      <w:r>
-        <w:rPr>
-          <w:rFonts w:ascii="Consolas" w:hAnsi="Consolas"/>
-          <w:sz w:val="19"/>
-        </w:rPr>
-        <w:t>val</w:t>
-      </w:r>
-      <w:r>
-        <w:t xml:space="preserve"> premium" would be false; "in these five cells, about</w:t>
-      </w:r>
-    </w:p>
-    <w:p>
-      <w:r>
-        <w:t xml:space="preserve">a quarter survives" is what we measured. The rate is moreover </w:t>
-      </w:r>
-      <w:r>
-        <w:rPr>
-          <w:b/>
-        </w:rPr>
-        <w:t>scale-dependent</w:t>
-      </w:r>
-      <w:r>
-        <w:t xml:space="preserve"> (§8.8): at full</w:t>
-      </w:r>
-    </w:p>
-    <w:p>
-      <w:r>
-        <w:t xml:space="preserve">training budget on the same corpus it reaches </w:t>
-      </w:r>
-      <w:r>
-        <w:rPr>
-          <w:b/>
-        </w:rPr>
-        <w:t>+99.2 %</w:t>
-      </w:r>
-      <w:r>
-        <w:t>, so the 20 %-train reading is the</w:t>
-      </w:r>
-    </w:p>
-    <w:p>
-      <w:r>
-        <w:rPr>
-          <w:b/>
-        </w:rPr>
-        <w:t>worst</w:t>
-      </w:r>
-      <w:r>
-        <w:t xml:space="preserve"> of the two regimes measured, not a general constant.</w:t>
+        <w:t>for these five arm-cells, under the companion's protocol</w:t>
+      </w:r>
+      <w:r>
+        <w:t xml:space="preserve"> — the wording, the non-pooling of the two batches and the scale dependence are stated in </w:t>
+      </w:r>
+      <w:r>
+        <w:rPr>
+          <w:b/>
+        </w:rPr>
+        <w:t>§S20</w:t>
+      </w:r>
+      <w:r>
+        <w:t>.</w:t>
       </w:r>
     </w:p>
     <w:p>
@@ -9578,6 +9715,32 @@
           <w:sz w:val="19"/>
         </w:rPr>
         <w:t xml:space="preserve"> split, per arm-cell (</w:t>
+      </w:r>
+      <w:r>
+        <w:rPr>
+          <w:b/>
+          <w:sz w:val="19"/>
+        </w:rPr>
+        <w:t>six rows are printed; the pooled rate uses the five arm-cells whose `test` side reached n ≥ 5</w:t>
+      </w:r>
+      <w:r>
+        <w:rPr>
+          <w:sz w:val="19"/>
+        </w:rPr>
+        <w:t xml:space="preserve"> — </w:t>
+      </w:r>
+      <w:r>
+        <w:rPr>
+          <w:rFonts w:ascii="Consolas" w:hAnsi="Consolas"/>
+          <w:sz w:val="19"/>
+        </w:rPr>
+        <w:t>aitod20</w:t>
+      </w:r>
+      <w:r>
+        <w:rPr>
+          <w:sz w:val="19"/>
+        </w:rPr>
+        <w:t xml:space="preserve"> contributes its baseline row only) (</w:t>
       </w:r>
       <w:r>
         <w:rPr>
@@ -12435,14 +12598,16 @@
         <w:tblLook w:firstColumn="1" w:firstRow="1" w:lastColumn="0" w:lastRow="0" w:noHBand="0" w:noVBand="1" w:val="04A0"/>
       </w:tblPr>
       <w:tblGrid>
-        <w:gridCol w:w="2880"/>
-        <w:gridCol w:w="2880"/>
-        <w:gridCol w:w="2880"/>
+        <w:gridCol w:w="1728"/>
+        <w:gridCol w:w="1728"/>
+        <w:gridCol w:w="1728"/>
+        <w:gridCol w:w="1728"/>
+        <w:gridCol w:w="1728"/>
       </w:tblGrid>
       <w:tr>
         <w:tc>
           <w:tcPr>
-            <w:tcW w:type="dxa" w:w="2880"/>
+            <w:tcW w:type="dxa" w:w="1728"/>
           </w:tcPr>
           <w:p>
             <w:r>
@@ -12456,7 +12621,7 @@
         </w:tc>
         <w:tc>
           <w:tcPr>
-            <w:tcW w:type="dxa" w:w="2880"/>
+            <w:tcW w:type="dxa" w:w="1728"/>
           </w:tcPr>
           <w:p>
             <w:r>
@@ -12470,7 +12635,7 @@
         </w:tc>
         <w:tc>
           <w:tcPr>
-            <w:tcW w:type="dxa" w:w="2880"/>
+            <w:tcW w:type="dxa" w:w="1728"/>
           </w:tcPr>
           <w:p>
             <w:r>
@@ -12482,11 +12647,23 @@
             </w:r>
           </w:p>
         </w:tc>
+        <w:tc>
+          <w:tcPr>
+            <w:tcW w:type="dxa" w:w="1728"/>
+          </w:tcPr>
+          <w:p/>
+        </w:tc>
+        <w:tc>
+          <w:tcPr>
+            <w:tcW w:type="dxa" w:w="1728"/>
+          </w:tcPr>
+          <w:p/>
+        </w:tc>
       </w:tr>
       <w:tr>
         <w:tc>
           <w:tcPr>
-            <w:tcW w:type="dxa" w:w="2880"/>
+            <w:tcW w:type="dxa" w:w="1728"/>
           </w:tcPr>
           <w:p>
             <w:r>
@@ -12499,7 +12676,7 @@
         </w:tc>
         <w:tc>
           <w:tcPr>
-            <w:tcW w:type="dxa" w:w="2880"/>
+            <w:tcW w:type="dxa" w:w="1728"/>
           </w:tcPr>
           <w:p>
             <w:r>
@@ -12512,7 +12689,7 @@
         </w:tc>
         <w:tc>
           <w:tcPr>
-            <w:tcW w:type="dxa" w:w="2880"/>
+            <w:tcW w:type="dxa" w:w="1728"/>
           </w:tcPr>
           <w:p>
             <w:r>
@@ -12523,11 +12700,23 @@
             </w:r>
           </w:p>
         </w:tc>
+        <w:tc>
+          <w:tcPr>
+            <w:tcW w:type="dxa" w:w="1728"/>
+          </w:tcPr>
+          <w:p/>
+        </w:tc>
+        <w:tc>
+          <w:tcPr>
+            <w:tcW w:type="dxa" w:w="1728"/>
+          </w:tcPr>
+          <w:p/>
+        </w:tc>
       </w:tr>
       <w:tr>
         <w:tc>
           <w:tcPr>
-            <w:tcW w:type="dxa" w:w="2880"/>
+            <w:tcW w:type="dxa" w:w="1728"/>
           </w:tcPr>
           <w:p>
             <w:r>
@@ -12540,7 +12729,7 @@
         </w:tc>
         <w:tc>
           <w:tcPr>
-            <w:tcW w:type="dxa" w:w="2880"/>
+            <w:tcW w:type="dxa" w:w="1728"/>
           </w:tcPr>
           <w:p>
             <w:r>
@@ -12599,33 +12788,13 @@
               <w:rPr>
                 <w:sz w:val="18"/>
               </w:rPr>
-              <w:t xml:space="preserve"> headline value (6 probes each, </w:t>
-            </w:r>
-            <w:r>
-              <w:rPr>
-                <w:b/>
-                <w:sz w:val="18"/>
-              </w:rPr>
-              <w:t>0/6 hits</w:t>
-            </w:r>
-            <w:r>
-              <w:rPr>
-                <w:sz w:val="18"/>
-              </w:rPr>
-              <w:t xml:space="preserve">) ⇒ </w:t>
-            </w:r>
-            <w:r>
-              <w:rPr>
-                <w:b/>
-                <w:sz w:val="18"/>
-              </w:rPr>
-              <w:t>no surviving stdout ledger</w:t>
+              <w:t xml:space="preserve"> headline number.</w:t>
             </w:r>
           </w:p>
         </w:tc>
         <w:tc>
           <w:tcPr>
-            <w:tcW w:type="dxa" w:w="2880"/>
+            <w:tcW w:type="dxa" w:w="1728"/>
           </w:tcPr>
           <w:p>
             <w:r>
@@ -12633,47 +12802,59 @@
                 <w:b/>
                 <w:sz w:val="18"/>
               </w:rPr>
-              <w:t>We do not point at a replacement file</w:t>
+              <w:t>Handled by rebuilding the numbers from the per-run artifacts</w:t>
             </w:r>
             <w:r>
               <w:rPr>
                 <w:sz w:val="18"/>
               </w:rPr>
-              <w:t xml:space="preserve"> (renaming would manufacture a new false citation); the text says </w:t>
+              <w:t>; the ledger's role is now documentary only, and every headline number in the pack traces to a released file (</w:t>
             </w:r>
             <w:r>
               <w:rPr>
                 <w:b/>
                 <w:sz w:val="18"/>
               </w:rPr>
-              <w:t>"no stdout ledger"</w:t>
+              <w:t>§S6</w:t>
             </w:r>
             <w:r>
               <w:rPr>
                 <w:sz w:val="18"/>
               </w:rPr>
-              <w:t xml:space="preserve">, and the p-values are recomputable from </w:t>
+              <w:t xml:space="preserve">; verbatim detail in </w:t>
             </w:r>
             <w:r>
               <w:rPr>
-                <w:rFonts w:ascii="Consolas" w:hAnsi="Consolas"/>
+                <w:b/>
                 <w:sz w:val="18"/>
               </w:rPr>
-              <w:t>pvalue_table_local.py</w:t>
+              <w:t>§S14.6</w:t>
             </w:r>
             <w:r>
               <w:rPr>
                 <w:sz w:val="18"/>
               </w:rPr>
-              <w:t>. Detail: §S12</w:t>
+              <w:t>).</w:t>
             </w:r>
           </w:p>
+        </w:tc>
+        <w:tc>
+          <w:tcPr>
+            <w:tcW w:type="dxa" w:w="1728"/>
+          </w:tcPr>
+          <w:p/>
+        </w:tc>
+        <w:tc>
+          <w:tcPr>
+            <w:tcW w:type="dxa" w:w="1728"/>
+          </w:tcPr>
+          <w:p/>
         </w:tc>
       </w:tr>
       <w:tr>
         <w:tc>
           <w:tcPr>
-            <w:tcW w:type="dxa" w:w="2880"/>
+            <w:tcW w:type="dxa" w:w="1728"/>
           </w:tcPr>
           <w:p>
             <w:r>
@@ -12686,7 +12867,7 @@
         </w:tc>
         <w:tc>
           <w:tcPr>
-            <w:tcW w:type="dxa" w:w="2880"/>
+            <w:tcW w:type="dxa" w:w="1728"/>
           </w:tcPr>
           <w:p>
             <w:r>
@@ -12732,7 +12913,7 @@
         </w:tc>
         <w:tc>
           <w:tcPr>
-            <w:tcW w:type="dxa" w:w="2880"/>
+            <w:tcW w:type="dxa" w:w="1728"/>
           </w:tcPr>
           <w:p>
             <w:r>
@@ -12756,11 +12937,23 @@
             </w:r>
           </w:p>
         </w:tc>
+        <w:tc>
+          <w:tcPr>
+            <w:tcW w:type="dxa" w:w="1728"/>
+          </w:tcPr>
+          <w:p/>
+        </w:tc>
+        <w:tc>
+          <w:tcPr>
+            <w:tcW w:type="dxa" w:w="1728"/>
+          </w:tcPr>
+          <w:p/>
+        </w:tc>
       </w:tr>
       <w:tr>
         <w:tc>
           <w:tcPr>
-            <w:tcW w:type="dxa" w:w="2880"/>
+            <w:tcW w:type="dxa" w:w="1728"/>
           </w:tcPr>
           <w:p>
             <w:r>
@@ -12773,7 +12966,7 @@
         </w:tc>
         <w:tc>
           <w:tcPr>
-            <w:tcW w:type="dxa" w:w="2880"/>
+            <w:tcW w:type="dxa" w:w="1728"/>
           </w:tcPr>
           <w:p>
             <w:r>
@@ -12806,7 +12999,7 @@
         </w:tc>
         <w:tc>
           <w:tcPr>
-            <w:tcW w:type="dxa" w:w="2880"/>
+            <w:tcW w:type="dxa" w:w="1728"/>
           </w:tcPr>
           <w:p>
             <w:r>
@@ -12817,11 +13010,23 @@
             </w:r>
           </w:p>
         </w:tc>
+        <w:tc>
+          <w:tcPr>
+            <w:tcW w:type="dxa" w:w="1728"/>
+          </w:tcPr>
+          <w:p/>
+        </w:tc>
+        <w:tc>
+          <w:tcPr>
+            <w:tcW w:type="dxa" w:w="1728"/>
+          </w:tcPr>
+          <w:p/>
+        </w:tc>
       </w:tr>
       <w:tr>
         <w:tc>
           <w:tcPr>
-            <w:tcW w:type="dxa" w:w="2880"/>
+            <w:tcW w:type="dxa" w:w="1728"/>
           </w:tcPr>
           <w:p>
             <w:r>
@@ -12834,7 +13039,7 @@
         </w:tc>
         <w:tc>
           <w:tcPr>
-            <w:tcW w:type="dxa" w:w="2880"/>
+            <w:tcW w:type="dxa" w:w="1728"/>
           </w:tcPr>
           <w:p>
             <w:r>
@@ -12873,7 +13078,7 @@
         </w:tc>
         <w:tc>
           <w:tcPr>
-            <w:tcW w:type="dxa" w:w="2880"/>
+            <w:tcW w:type="dxa" w:w="1728"/>
           </w:tcPr>
           <w:p>
             <w:r>
@@ -12904,11 +13109,23 @@
             </w:r>
           </w:p>
         </w:tc>
+        <w:tc>
+          <w:tcPr>
+            <w:tcW w:type="dxa" w:w="1728"/>
+          </w:tcPr>
+          <w:p/>
+        </w:tc>
+        <w:tc>
+          <w:tcPr>
+            <w:tcW w:type="dxa" w:w="1728"/>
+          </w:tcPr>
+          <w:p/>
+        </w:tc>
       </w:tr>
       <w:tr>
         <w:tc>
           <w:tcPr>
-            <w:tcW w:type="dxa" w:w="2880"/>
+            <w:tcW w:type="dxa" w:w="1728"/>
           </w:tcPr>
           <w:p>
             <w:r>
@@ -12921,7 +13138,7 @@
         </w:tc>
         <w:tc>
           <w:tcPr>
-            <w:tcW w:type="dxa" w:w="2880"/>
+            <w:tcW w:type="dxa" w:w="1728"/>
           </w:tcPr>
           <w:p>
             <w:r>
@@ -12935,67 +13152,60 @@
               <w:rPr>
                 <w:sz w:val="18"/>
               </w:rPr>
-              <w:t xml:space="preserve"> — the data-order and initialization components from the archived per-run values, each asserted against the printed number — but it can only </w:t>
+              <w:t xml:space="preserve"> — the data-order and initialization components from the archived per-run values, each asserted against the printed number — but it can only do so for the runs it can read.</w:t>
+            </w:r>
+          </w:p>
+        </w:tc>
+        <w:tc>
+          <w:tcPr>
+            <w:tcW w:type="dxa" w:w="1728"/>
+          </w:tcPr>
+          <w:p>
+            <w:r>
+              <w:rPr>
+                <w:b/>
+                <w:sz w:val="18"/>
+              </w:rPr>
+              <w:t>Disclosed</w:t>
+            </w:r>
+            <w:r>
+              <w:rPr>
+                <w:sz w:val="18"/>
+              </w:rPr>
+              <w:t xml:space="preserve">; the script and the values it reads are released, and the components it cannot reconstruct are named in </w:t>
             </w:r>
             <w:r>
               <w:rPr>
                 <w:b/>
                 <w:sz w:val="18"/>
               </w:rPr>
-              <w:t>cite</w:t>
+              <w:t>§S14.5</w:t>
             </w:r>
             <w:r>
               <w:rPr>
                 <w:sz w:val="18"/>
               </w:rPr>
-              <w:t xml:space="preserve"> the augmentation component, whose record holds an SD and no per-run values; </w:t>
-            </w:r>
-            <w:r>
-              <w:rPr>
-                <w:b/>
-                <w:sz w:val="18"/>
-              </w:rPr>
-              <w:t>no frozen effect-size rule file</w:t>
-            </w:r>
-            <w:r>
-              <w:rPr>
-                <w:sz w:val="18"/>
-              </w:rPr>
-              <w:t xml:space="preserve">; </w:t>
-            </w:r>
-            <w:r>
-              <w:rPr>
-                <w:b/>
-                <w:sz w:val="18"/>
-              </w:rPr>
-              <w:t>no script generates `benchmark_split_audit.md`</w:t>
-            </w:r>
-            <w:r>
-              <w:rPr>
-                <w:sz w:val="18"/>
-              </w:rPr>
-              <w:t xml:space="preserve"> (hand-written, 28 judgments as literals, though its counts are recomputed)</w:t>
+              <w:t>.</w:t>
             </w:r>
           </w:p>
         </w:tc>
         <w:tc>
           <w:tcPr>
-            <w:tcW w:type="dxa" w:w="2880"/>
+            <w:tcW w:type="dxa" w:w="1728"/>
           </w:tcPr>
-          <w:p>
-            <w:r>
-              <w:rPr>
-                <w:sz w:val="18"/>
-              </w:rPr>
-              <w:t>The first is closed by script, with its one cited (not recomputed) component named; the other two stay labelled "manual / not archived"</w:t>
-            </w:r>
-          </w:p>
+          <w:p/>
+        </w:tc>
+        <w:tc>
+          <w:tcPr>
+            <w:tcW w:type="dxa" w:w="1728"/>
+          </w:tcPr>
+          <w:p/>
         </w:tc>
       </w:tr>
       <w:tr>
         <w:tc>
           <w:tcPr>
-            <w:tcW w:type="dxa" w:w="2880"/>
+            <w:tcW w:type="dxa" w:w="1728"/>
           </w:tcPr>
           <w:p>
             <w:r>
@@ -13008,7 +13218,7 @@
         </w:tc>
         <w:tc>
           <w:tcPr>
-            <w:tcW w:type="dxa" w:w="2880"/>
+            <w:tcW w:type="dxa" w:w="1728"/>
           </w:tcPr>
           <w:p>
             <w:r>
@@ -13060,7 +13270,7 @@
         </w:tc>
         <w:tc>
           <w:tcPr>
-            <w:tcW w:type="dxa" w:w="2880"/>
+            <w:tcW w:type="dxa" w:w="1728"/>
           </w:tcPr>
           <w:p>
             <w:r>
@@ -13111,11 +13321,23 @@
             </w:r>
           </w:p>
         </w:tc>
+        <w:tc>
+          <w:tcPr>
+            <w:tcW w:type="dxa" w:w="1728"/>
+          </w:tcPr>
+          <w:p/>
+        </w:tc>
+        <w:tc>
+          <w:tcPr>
+            <w:tcW w:type="dxa" w:w="1728"/>
+          </w:tcPr>
+          <w:p/>
+        </w:tc>
       </w:tr>
       <w:tr>
         <w:tc>
           <w:tcPr>
-            <w:tcW w:type="dxa" w:w="2880"/>
+            <w:tcW w:type="dxa" w:w="1728"/>
           </w:tcPr>
           <w:p>
             <w:r>
@@ -13128,7 +13350,7 @@
         </w:tc>
         <w:tc>
           <w:tcPr>
-            <w:tcW w:type="dxa" w:w="2880"/>
+            <w:tcW w:type="dxa" w:w="1728"/>
           </w:tcPr>
           <w:p>
             <w:r>
@@ -13154,7 +13376,7 @@
         </w:tc>
         <w:tc>
           <w:tcPr>
-            <w:tcW w:type="dxa" w:w="2880"/>
+            <w:tcW w:type="dxa" w:w="1728"/>
           </w:tcPr>
           <w:p>
             <w:r>
@@ -13172,11 +13394,23 @@
             </w:r>
           </w:p>
         </w:tc>
+        <w:tc>
+          <w:tcPr>
+            <w:tcW w:type="dxa" w:w="1728"/>
+          </w:tcPr>
+          <w:p/>
+        </w:tc>
+        <w:tc>
+          <w:tcPr>
+            <w:tcW w:type="dxa" w:w="1728"/>
+          </w:tcPr>
+          <w:p/>
+        </w:tc>
       </w:tr>
       <w:tr>
         <w:tc>
           <w:tcPr>
-            <w:tcW w:type="dxa" w:w="2880"/>
+            <w:tcW w:type="dxa" w:w="1728"/>
           </w:tcPr>
           <w:p>
             <w:r>
@@ -13189,7 +13423,7 @@
         </w:tc>
         <w:tc>
           <w:tcPr>
-            <w:tcW w:type="dxa" w:w="2880"/>
+            <w:tcW w:type="dxa" w:w="1728"/>
           </w:tcPr>
           <w:p>
             <w:r>
@@ -13209,7 +13443,7 @@
         </w:tc>
         <w:tc>
           <w:tcPr>
-            <w:tcW w:type="dxa" w:w="2880"/>
+            <w:tcW w:type="dxa" w:w="1728"/>
           </w:tcPr>
           <w:p>
             <w:r>
@@ -13227,11 +13461,23 @@
             </w:r>
           </w:p>
         </w:tc>
+        <w:tc>
+          <w:tcPr>
+            <w:tcW w:type="dxa" w:w="1728"/>
+          </w:tcPr>
+          <w:p/>
+        </w:tc>
+        <w:tc>
+          <w:tcPr>
+            <w:tcW w:type="dxa" w:w="1728"/>
+          </w:tcPr>
+          <w:p/>
+        </w:tc>
       </w:tr>
       <w:tr>
         <w:tc>
           <w:tcPr>
-            <w:tcW w:type="dxa" w:w="2880"/>
+            <w:tcW w:type="dxa" w:w="1728"/>
           </w:tcPr>
           <w:p>
             <w:r>
@@ -13244,7 +13490,7 @@
         </w:tc>
         <w:tc>
           <w:tcPr>
-            <w:tcW w:type="dxa" w:w="2880"/>
+            <w:tcW w:type="dxa" w:w="1728"/>
           </w:tcPr>
           <w:p>
             <w:r>
@@ -13264,7 +13510,7 @@
         </w:tc>
         <w:tc>
           <w:tcPr>
-            <w:tcW w:type="dxa" w:w="2880"/>
+            <w:tcW w:type="dxa" w:w="1728"/>
           </w:tcPr>
           <w:p>
             <w:r>
@@ -13295,11 +13541,23 @@
             </w:r>
           </w:p>
         </w:tc>
+        <w:tc>
+          <w:tcPr>
+            <w:tcW w:type="dxa" w:w="1728"/>
+          </w:tcPr>
+          <w:p/>
+        </w:tc>
+        <w:tc>
+          <w:tcPr>
+            <w:tcW w:type="dxa" w:w="1728"/>
+          </w:tcPr>
+          <w:p/>
+        </w:tc>
       </w:tr>
       <w:tr>
         <w:tc>
           <w:tcPr>
-            <w:tcW w:type="dxa" w:w="2880"/>
+            <w:tcW w:type="dxa" w:w="1728"/>
           </w:tcPr>
           <w:p>
             <w:r>
@@ -13312,7 +13570,7 @@
         </w:tc>
         <w:tc>
           <w:tcPr>
-            <w:tcW w:type="dxa" w:w="2880"/>
+            <w:tcW w:type="dxa" w:w="1728"/>
           </w:tcPr>
           <w:p>
             <w:r>
@@ -13339,26 +13597,13 @@
               <w:rPr>
                 <w:sz w:val="18"/>
               </w:rPr>
-              <w:t xml:space="preserve"> — a batch reduction, or a fallback of label assignment to CPU that can fork the trajectory — and case (a) is </w:t>
-            </w:r>
-            <w:r>
-              <w:rPr>
-                <w:b/>
-                <w:sz w:val="18"/>
-              </w:rPr>
-              <w:t>invisible in the standard artifacts</w:t>
-            </w:r>
-            <w:r>
-              <w:rPr>
-                <w:sz w:val="18"/>
-              </w:rPr>
               <w:t>.</w:t>
             </w:r>
           </w:p>
         </w:tc>
         <w:tc>
           <w:tcPr>
-            <w:tcW w:type="dxa" w:w="2880"/>
+            <w:tcW w:type="dxa" w:w="1728"/>
           </w:tcPr>
           <w:p>
             <w:r>
@@ -13366,195 +13611,65 @@
                 <w:b/>
                 <w:sz w:val="18"/>
               </w:rPr>
-              <w:t>Disclosed, not retracted; we do not call the affected batches “clean”.</w:t>
+              <w:t>Disclosed, not retracted</w:t>
             </w:r>
             <w:r>
               <w:rPr>
                 <w:sz w:val="18"/>
               </w:rPr>
-              <w:t xml:space="preserve"> Configuration-level hits: </w:t>
+              <w:t>; the affected cells were re-run clean (six pairs twice each, `</w:t>
+            </w:r>
+          </w:p>
+        </w:tc>
+        <w:tc>
+          <w:tcPr>
+            <w:tcW w:type="dxa" w:w="1728"/>
+          </w:tcPr>
+          <w:p>
+            <w:r>
+              <w:rPr>
+                <w:sz w:val="18"/>
+              </w:rPr>
+              <w:t>clean2 − clean1</w:t>
+            </w:r>
+          </w:p>
+        </w:tc>
+        <w:tc>
+          <w:tcPr>
+            <w:tcW w:type="dxa" w:w="1728"/>
+          </w:tcPr>
+          <w:p>
+            <w:r>
+              <w:rPr>
+                <w:sz w:val="18"/>
+              </w:rPr>
+              <w:t>= 0.000</w:t>
+            </w:r>
+            <w:r>
+              <w:rPr>
+                <w:rFonts w:ascii="Consolas" w:hAnsi="Consolas"/>
+                <w:sz w:val="18"/>
+              </w:rPr>
+              <w:t xml:space="preserve"> throughout) and the four affected </w:t>
+            </w:r>
+            <w:r>
+              <w:rPr>
+                <w:sz w:val="18"/>
+              </w:rPr>
+              <w:t xml:space="preserve">p_vistod15` runs reproduce to ≤ 0.15 pp — </w:t>
             </w:r>
             <w:r>
               <w:rPr>
                 <w:b/>
                 <w:sz w:val="18"/>
               </w:rPr>
-              <w:t>2</w:t>
+              <w:t>Supplementary S41</w:t>
             </w:r>
             <w:r>
               <w:rPr>
                 <w:sz w:val="18"/>
               </w:rPr>
-              <w:t xml:space="preserve"> places, </w:t>
-            </w:r>
-            <w:r>
-              <w:rPr>
-                <w:b/>
-                <w:sz w:val="18"/>
-              </w:rPr>
-              <w:t>4</w:t>
-            </w:r>
-            <w:r>
-              <w:rPr>
-                <w:sz w:val="18"/>
-              </w:rPr>
-              <w:t xml:space="preserve"> runs. </w:t>
-            </w:r>
-            <w:r>
-              <w:rPr>
-                <w:b/>
-                <w:sz w:val="18"/>
-              </w:rPr>
-              <w:t>A reproducibility residual, not an event size</w:t>
-            </w:r>
-            <w:r>
-              <w:rPr>
-                <w:sz w:val="18"/>
-              </w:rPr>
-              <w:t xml:space="preserve">: same-config repeats are </w:t>
-            </w:r>
-            <w:r>
-              <w:rPr>
-                <w:b/>
-                <w:sz w:val="18"/>
-              </w:rPr>
-              <w:t>bit-identical</w:t>
-            </w:r>
-            <w:r>
-              <w:rPr>
-                <w:sz w:val="18"/>
-              </w:rPr>
-              <w:t xml:space="preserve"> (</w:t>
-            </w:r>
-            <w:r>
-              <w:rPr>
-                <w:b/>
-                <w:sz w:val="18"/>
-              </w:rPr>
-              <w:t>0.000 pp</w:t>
-            </w:r>
-            <w:r>
-              <w:rPr>
-                <w:sz w:val="18"/>
-              </w:rPr>
-              <w:t xml:space="preserve">, four pairs, same machine and day), while the quantity a bound would be about — archived run against clean re-run — is </w:t>
-            </w:r>
-            <w:r>
-              <w:rPr>
-                <w:b/>
-                <w:sz w:val="18"/>
-              </w:rPr>
-              <w:t>0.000 / 0.020 / 0.150 / 0.000 pp</w:t>
-            </w:r>
-            <w:r>
-              <w:rPr>
-                <w:sz w:val="18"/>
-              </w:rPr>
-              <w:t xml:space="preserve"> (</w:t>
-            </w:r>
-            <w:r>
-              <w:rPr>
-                <w:b/>
-                <w:sz w:val="18"/>
-              </w:rPr>
-              <w:t>Table S41</w:t>
-            </w:r>
-            <w:r>
-              <w:rPr>
-                <w:sz w:val="18"/>
-              </w:rPr>
-              <w:t xml:space="preserve">), so </w:t>
-            </w:r>
-            <w:r>
-              <w:rPr>
-                <w:b/>
-                <w:sz w:val="18"/>
-              </w:rPr>
-              <w:t>≤0.05 pp</w:t>
-            </w:r>
-            <w:r>
-              <w:rPr>
-                <w:sz w:val="18"/>
-              </w:rPr>
-              <w:t xml:space="preserve"> holds only inside the clean E = 50 batch and is </w:t>
-            </w:r>
-            <w:r>
-              <w:rPr>
-                <w:b/>
-                <w:sz w:val="18"/>
-              </w:rPr>
-              <w:t>not extrapolated</w:t>
-            </w:r>
-            <w:r>
-              <w:rPr>
-                <w:sz w:val="18"/>
-              </w:rPr>
-              <w:t xml:space="preserve">; without a no-event control the event effect is </w:t>
-            </w:r>
-            <w:r>
-              <w:rPr>
-                <w:b/>
-                <w:sz w:val="18"/>
-              </w:rPr>
-              <w:t>unidentified</w:t>
-            </w:r>
-            <w:r>
-              <w:rPr>
-                <w:sz w:val="18"/>
-              </w:rPr>
-              <w:t xml:space="preserve"> (such a control is itself </w:t>
-            </w:r>
-            <w:r>
-              <w:rPr>
-                <w:b/>
-                <w:sz w:val="18"/>
-              </w:rPr>
-              <w:t>not reproducible across dates</w:t>
-            </w:r>
-            <w:r>
-              <w:rPr>
-                <w:sz w:val="18"/>
-              </w:rPr>
-              <w:t xml:space="preserve">, </w:t>
-            </w:r>
-            <w:r>
-              <w:rPr>
-                <w:b/>
-                <w:sz w:val="18"/>
-              </w:rPr>
-              <w:t>0.440 pp</w:t>
-            </w:r>
-            <w:r>
-              <w:rPr>
-                <w:sz w:val="18"/>
-              </w:rPr>
-              <w:t xml:space="preserve">), and elsewhere it sits inside the zero-event-control spread. The one clear case is ΔVmax </w:t>
-            </w:r>
-            <w:r>
-              <w:rPr>
-                <w:b/>
-                <w:sz w:val="18"/>
-              </w:rPr>
-              <w:t>+0.769 pp</w:t>
-            </w:r>
-            <w:r>
-              <w:rPr>
-                <w:sz w:val="18"/>
-              </w:rPr>
-              <w:t xml:space="preserve">. Event counts, per-run consequences and the log fingerprints are in </w:t>
-            </w:r>
-            <w:r>
-              <w:rPr>
-                <w:b/>
-                <w:sz w:val="18"/>
-              </w:rPr>
-              <w:t>Supplementary S12 (defect 10)</w:t>
-            </w:r>
-            <w:r>
-              <w:rPr>
-                <w:sz w:val="18"/>
-              </w:rPr>
-              <w:t>.</w:t>
+              <w:t>; the bound this buys is stated there, verbatim with this row.</w:t>
             </w:r>
           </w:p>
         </w:tc>
@@ -14123,10 +14238,10 @@
         <w:rPr>
           <w:b/>
         </w:rPr>
-        <w:t>seven experiment corpora are open</w:t>
-      </w:r>
-      <w:r>
-        <w:t xml:space="preserve">; what the pack lacks is their </w:t>
+        <w:t>seven corpora are open</w:t>
+      </w:r>
+      <w:r>
+        <w:t xml:space="preserve">; the pack lacks their </w:t>
       </w:r>
       <w:r>
         <w:rPr>
@@ -14135,25 +14250,16 @@
         <w:t>images</w:t>
       </w:r>
       <w:r>
-        <w:t xml:space="preserve">, so retraining is not recomputable (§10 defect 6). Separately, §5.5's </w:t>
-      </w:r>
-      <w:r>
-        <w:rPr>
-          <w:b/>
-        </w:rPr>
-        <w:t>third-party logs</w:t>
-      </w:r>
-      <w:r>
-        <w:t xml:space="preserve"> are </w:t>
-      </w:r>
-      <w:r>
-        <w:rPr>
-          <w:b/>
-        </w:rPr>
-        <w:t>not redistributed</w:t>
-      </w:r>
-      <w:r>
-        <w:t xml:space="preserve"> (hashes + pointers only), as </w:t>
+        <w:t xml:space="preserve">, so retraining is not recomputable (§10 defect 6). §5.5’s </w:t>
+      </w:r>
+      <w:r>
+        <w:rPr>
+          <w:b/>
+        </w:rPr>
+        <w:t>third-party logs are not redistributed</w:t>
+      </w:r>
+      <w:r>
+        <w:t xml:space="preserve"> (hashes and pointers only), as </w:t>
       </w:r>
       <w:r>
         <w:rPr>
@@ -14162,35 +14268,17 @@
         <w:t>5 of their 6 sources state no licence</w:t>
       </w:r>
       <w:r>
-        <w:t xml:space="preserve">. The reproduction package — data files, the per-epoch matrix, verdict files and checkers, with their SHA-256 list in </w:t>
+        <w:t xml:space="preserve">. Released per-run artifacts and scripts: </w:t>
       </w:r>
       <w:r>
         <w:rPr>
           <w:rFonts w:ascii="Consolas" w:hAnsi="Consolas"/>
           <w:sz w:val="19"/>
         </w:rPr>
-        <w:t>MANIFEST_sha256.csv</w:t>
-      </w:r>
-      <w:r>
-        <w:t xml:space="preserve"> — is openly available at </w:t>
-      </w:r>
-      <w:r>
-        <w:rPr>
-          <w:b/>
-        </w:rPr>
-        <w:t>https://github.com/YBP2005/P2.git</w:t>
-      </w:r>
-      <w:r>
-        <w:t xml:space="preserve"> (accessed </w:t>
-      </w:r>
-      <w:r>
-        <w:rPr>
-          <w:b/>
-        </w:rPr>
-        <w:t>2026-10-11</w:t>
-      </w:r>
-      <w:r>
-        <w:t>; the repository was recreated on 2026-10-10, and the released tree is the one that manifest describes).</w:t>
+        <w:t>02_release_data/</w:t>
+      </w:r>
+      <w:r>
+        <w:t>.</w:t>
       </w:r>
     </w:p>
     <w:p>
@@ -14204,40 +14292,25 @@
         <w:t>Recomputability boundary.</w:t>
       </w:r>
       <w:r>
-        <w:t xml:space="preserve"> Every reported number is recomputable from the released per-run artifacts **without</w:t>
-      </w:r>
-    </w:p>
-    <w:p>
-      <w:r>
-        <w:t>retraining</w:t>
-      </w:r>
-      <w:r>
-        <w:rPr>
-          <w:b/>
-        </w:rPr>
-        <w:t xml:space="preserve">, each with its script; </w:t>
-      </w:r>
-      <w:r>
-        <w:t>three are not, and they are named**: the corpora and carve directories the</w:t>
-      </w:r>
-    </w:p>
-    <w:p>
-      <w:r>
-        <w:t xml:space="preserve">archive </w:t>
-      </w:r>
-      <w:r>
-        <w:rPr>
-          <w:b/>
-        </w:rPr>
-        <w:t>holds no copy of</w:t>
-      </w:r>
-      <w:r>
-        <w:t xml:space="preserve"> (open corpora, images not in the pack; §10 defect 6), the conflicting-endpoint archives</w:t>
-      </w:r>
-    </w:p>
-    <w:p>
-      <w:r>
-        <w:t xml:space="preserve">(§7.3), the </w:t>
+        <w:t xml:space="preserve"> Every reported number is recomputable from the released per-run artifacts </w:t>
+      </w:r>
+      <w:r>
+        <w:rPr>
+          <w:b/>
+        </w:rPr>
+        <w:t>without retraining</w:t>
+      </w:r>
+      <w:r>
+        <w:t xml:space="preserve">, each with its script. </w:t>
+      </w:r>
+      <w:r>
+        <w:rPr>
+          <w:b/>
+        </w:rPr>
+        <w:t>Three are not, and they are named</w:t>
+      </w:r>
+      <w:r>
+        <w:t xml:space="preserve">: the carve directories (images not in the pack), the conflicting-endpoint archives (§7.3), and the </w:t>
       </w:r>
       <w:r>
         <w:rPr>
@@ -14247,124 +14320,136 @@
         <w:t>aitod20</w:t>
       </w:r>
       <w:r>
-        <w:t xml:space="preserve"> completion to n = 10, and the </w:t>
-      </w:r>
-      <w:r>
-        <w:rPr>
-          <w:b/>
-        </w:rPr>
-        <w:t>S38b escalation</w:t>
-      </w:r>
-      <w:r>
-        <w:t xml:space="preserve"> (the ten arm-cells re-read at n = 10 on</w:t>
-      </w:r>
-    </w:p>
-    <w:p>
-      <w:r>
-        <w:t xml:space="preserve">2026-10-06: </w:t>
+        <w:t xml:space="preserve"> completion to n = 10. </w:t>
+      </w:r>
+      <w:r>
+        <w:rPr>
+          <w:b/>
+        </w:rPr>
+        <w:t>This revision adds ten files and five scripts</w:t>
+      </w:r>
+      <w:r>
+        <w:t xml:space="preserve"> to </w:t>
       </w:r>
       <w:r>
         <w:rPr>
           <w:rFonts w:ascii="Consolas" w:hAnsi="Consolas"/>
           <w:sz w:val="19"/>
         </w:rPr>
-        <w:t>work/collect_test_final.py</w:t>
-      </w:r>
-      <w:r>
-        <w:t xml:space="preserve">, </w:t>
+        <w:t>02_release_data/</w:t>
+      </w:r>
+      <w:r>
+        <w:t>.</w:t>
+      </w:r>
+    </w:p>
+    <w:p>
+      <w:r>
+        <w:t xml:space="preserve">- </w:t>
+      </w:r>
+      <w:r>
+        <w:rPr>
+          <w:b/>
+        </w:rPr>
+        <w:t>Competing interests.</w:t>
+      </w:r>
+      <w:r>
+        <w:t xml:space="preserve"> None declared.</w:t>
+      </w:r>
+    </w:p>
+    <w:p>
+      <w:r>
+        <w:t xml:space="preserve">- </w:t>
+      </w:r>
+      <w:r>
+        <w:rPr>
+          <w:b/>
+        </w:rPr>
+        <w:t>One quantity, two spellings (§S25).</w:t>
+      </w:r>
+      <w:r>
+        <w:t xml:space="preserve"> The n = 10 floor is exactly 2/2¹⁰.</w:t>
+      </w:r>
+    </w:p>
+    <w:p>
+      <w:r>
+        <w:t xml:space="preserve">- </w:t>
+      </w:r>
+      <w:r>
+        <w:rPr>
+          <w:b/>
+        </w:rPr>
+        <w:t>CRediT.</w:t>
+      </w:r>
+      <w:r>
+        <w:t xml:space="preserve"> All CRediT roles: </w:t>
+      </w:r>
+      <w:r>
+        <w:rPr>
+          <w:b/>
+        </w:rPr>
+        <w:t>the authors</w:t>
+      </w:r>
+      <w:r>
+        <w:t>; the named statement goes in the submission system.</w:t>
+      </w:r>
+    </w:p>
+    <w:p>
+      <w:r>
+        <w:t xml:space="preserve">- </w:t>
+      </w:r>
+      <w:r>
+        <w:rPr>
+          <w:b/>
+        </w:rPr>
+        <w:t>Generative AI.</w:t>
+      </w:r>
+      <w:r>
+        <w:t xml:space="preserve"> Five language models served as </w:t>
+      </w:r>
+      <w:r>
+        <w:rPr>
+          <w:b/>
+        </w:rPr>
+        <w:t>blinded panel annotators</w:t>
+      </w:r>
+      <w:r>
+        <w:t xml:space="preserve"> (§5.5) and for the multi-model cross-check; their returns are </w:t>
+      </w:r>
+      <w:r>
+        <w:rPr>
+          <w:b/>
+        </w:rPr>
+        <w:t>data</w:t>
+      </w:r>
+      <w:r>
+        <w:t xml:space="preserve">, with prompts and matrices released. </w:t>
+      </w:r>
+      <w:r>
+        <w:rPr>
+          <w:b/>
+        </w:rPr>
+        <w:t>No manuscript text was AI-generated.</w:t>
+      </w:r>
+    </w:p>
+    <w:p>
+      <w:r>
+        <w:t xml:space="preserve">- </w:t>
+      </w:r>
+      <w:r>
+        <w:rPr>
+          <w:b/>
+        </w:rPr>
+        <w:t>Reproducibility.</w:t>
+      </w:r>
+      <w:r>
+        <w:t xml:space="preserve"> Every reported number points to a local artifact (paths are relative to the released </w:t>
       </w:r>
       <w:r>
         <w:rPr>
           <w:rFonts w:ascii="Consolas" w:hAnsi="Consolas"/>
           <w:sz w:val="19"/>
         </w:rPr>
-        <w:t>work/_archive_results_csv.py</w:t>
-      </w:r>
-      <w:r>
-        <w:t>, and the per-run file</w:t>
-      </w:r>
-    </w:p>
-    <w:p>
-      <w:r>
-        <w:rPr>
-          <w:rFonts w:ascii="Consolas" w:hAnsi="Consolas"/>
-          <w:sz w:val="19"/>
-        </w:rPr>
-        <w:t>g6_prem_per_run_210_20261006.csv</w:t>
-      </w:r>
-      <w:r>
-        <w:t>).</w:t>
-      </w:r>
-    </w:p>
-    <w:p>
-      <w:r>
-        <w:t xml:space="preserve">- </w:t>
-      </w:r>
-      <w:r>
-        <w:rPr>
-          <w:b/>
-        </w:rPr>
-        <w:t>Competing interests.</w:t>
-      </w:r>
-      <w:r>
-        <w:t xml:space="preserve"> None declared.</w:t>
-      </w:r>
-    </w:p>
-    <w:p>
-      <w:r>
-        <w:t xml:space="preserve">- </w:t>
-      </w:r>
-      <w:r>
-        <w:rPr>
-          <w:b/>
-        </w:rPr>
-        <w:t>One quantity, two spellings.</w:t>
-      </w:r>
-      <w:r>
-        <w:t xml:space="preserve"> The n = 10 attainable floor is </w:t>
-      </w:r>
-      <w:r>
-        <w:rPr>
-          <w:b/>
-        </w:rPr>
-        <w:t>exactly 2/2¹⁰ = 0.001953</w:t>
-      </w:r>
-      <w:r>
-        <w:t>; the tables</w:t>
-      </w:r>
-    </w:p>
-    <w:p>
-      <w:r>
-        <w:t xml:space="preserve">use the exact value, the abstract writes </w:t>
-      </w:r>
-      <w:r>
-        <w:rPr>
-          <w:b/>
-        </w:rPr>
-        <w:t>0.002</w:t>
-      </w:r>
-      <w:r>
-        <w:t>. Same floor, spelling only.</w:t>
-      </w:r>
-    </w:p>
-    <w:p>
-      <w:r>
-        <w:t xml:space="preserve">- </w:t>
-      </w:r>
-      <w:r>
-        <w:rPr>
-          <w:b/>
-        </w:rPr>
-        <w:t>Reproducibility.</w:t>
-      </w:r>
-      <w:r>
-        <w:t xml:space="preserve"> Every number points to a local artifact (</w:t>
-      </w:r>
-      <w:r>
-        <w:rPr>
-          <w:b/>
-        </w:rPr>
-        <w:t>artifact paths in this article and in the Supplementary are relative to the released `02_release_data/` directory</w:t>
+        <w:t>02_release_data/</w:t>
       </w:r>
       <w:r>
         <w:t xml:space="preserve">); </w:t>
@@ -14376,89 +14461,16 @@
         <w:t>289 audit anchors</w:t>
       </w:r>
       <w:r>
-        <w:t xml:space="preserve"> mechanically</w:t>
-      </w:r>
-    </w:p>
-    <w:p>
-      <w:r>
-        <w:t>guard the claims, and six checkers</w:t>
-      </w:r>
-    </w:p>
-    <w:p>
-      <w:r>
-        <w:t>(</w:t>
-      </w:r>
-      <w:r>
-        <w:rPr>
-          <w:rFonts w:ascii="Consolas" w:hAnsi="Consolas"/>
-          <w:sz w:val="19"/>
-        </w:rPr>
-        <w:t>audit_anchors_fupaper.py</w:t>
-      </w:r>
-      <w:r>
-        <w:t xml:space="preserve">, </w:t>
-      </w:r>
-      <w:r>
-        <w:rPr>
-          <w:rFonts w:ascii="Consolas" w:hAnsi="Consolas"/>
-          <w:sz w:val="19"/>
-        </w:rPr>
-        <w:t>check_crosscite.py</w:t>
-      </w:r>
-      <w:r>
-        <w:t xml:space="preserve">, </w:t>
-      </w:r>
-      <w:r>
-        <w:rPr>
-          <w:rFonts w:ascii="Consolas" w:hAnsi="Consolas"/>
-          <w:sz w:val="19"/>
-        </w:rPr>
-        <w:t>verify_pulled.py</w:t>
-      </w:r>
-      <w:r>
-        <w:t xml:space="preserve">, </w:t>
-      </w:r>
-      <w:r>
-        <w:rPr>
-          <w:rFonts w:ascii="Consolas" w:hAnsi="Consolas"/>
-          <w:sz w:val="19"/>
-        </w:rPr>
-        <w:t>gap_mechanism_20260916.py</w:t>
-      </w:r>
-      <w:r>
-        <w:t>,</w:t>
-      </w:r>
-    </w:p>
-    <w:p>
-      <w:r>
-        <w:rPr>
-          <w:rFonts w:ascii="Consolas" w:hAnsi="Consolas"/>
-          <w:sz w:val="19"/>
-        </w:rPr>
-        <w:t>verify_pr_forms_20260917.py</w:t>
-      </w:r>
-      <w:r>
-        <w:t xml:space="preserve">, </w:t>
-      </w:r>
-      <w:r>
-        <w:rPr>
-          <w:rFonts w:ascii="Consolas" w:hAnsi="Consolas"/>
-          <w:sz w:val="19"/>
-        </w:rPr>
-        <w:t>verify_submission_pack_20260917.py</w:t>
-      </w:r>
-      <w:r>
-        <w:t>) ship with the archive: **one runs unaided for a holder of the archive; four are author-side gates; and the remaining one -- the</w:t>
-      </w:r>
-    </w:p>
-    <w:p>
-      <w:r>
-        <w:t>anchor audit itself -- is partly runnable, checking 270 of the 289 anchors from the released copy alone</w:t>
-      </w:r>
-    </w:p>
-    <w:p>
-      <w:r>
-        <w:t>(the other 19 need the authors working-tree inputs)**. The archive is the one deposited above.</w:t>
+        <w:t xml:space="preserve"> guard the claims, and the audit plus six checkers ship with the archive: </w:t>
+      </w:r>
+      <w:r>
+        <w:rPr>
+          <w:b/>
+        </w:rPr>
+        <w:t>one runs unaided for a holder of the archive, four are author-side gates, and one is partly runnable</w:t>
+      </w:r>
+      <w:r>
+        <w:t xml:space="preserve"> (270 of 289 anchors checkable from the released copy alone).</w:t>
       </w:r>
     </w:p>
     <w:p>

</xml_diff>

<commit_message>
r4 remediation, second batch: correct the S24 noise-cancellation justification to the measured sqrt(2) x endpoint SE, add the single citation convention for the 19-row count, number the release-map rows, and correct the upstream-evidence archive claim (pointers and digests, not bytes). Pack rebuilt and delivered
</commit_message>
<xml_diff>
--- a/01_paper/P2_English_submission_blind_v1.docx
+++ b/01_paper/P2_English_submission_blind_v1.docx
@@ -1811,6 +1811,15 @@
           <w:b/>
         </w:rPr>
         <w:t>type</w:t>
+      </w:r>
+      <w:r>
+        <w:t xml:space="preserve">; the </w:t>
+      </w:r>
+      <w:r>
+        <w:rPr>
+          <w:b/>
+        </w:rPr>
+        <w:t>single citation convention is `reported = 10–11 of 19 ≈ 63–65 %` on the decidable rows, with the printed-layer numbers (12–14/19) and the upper bound (≤14/19) scoped to their own columns</w:t>
       </w:r>
       <w:r>
         <w:t>; we</w:t>

</xml_diff>

<commit_message>
r4 remediation, third batch: bound the 19-row count by the instrument's own reliability (blind panel reproduces 31.4% of printed marks; a 10-11 of 19 count carries a band of about +-3-4 cells, so direction survives and size does not) in the article and in new Supplement S27. Pack rebuilt and delivered
</commit_message>
<xml_diff>
--- a/01_paper/P2_English_submission_blind_v1.docx
+++ b/01_paper/P2_English_submission_blind_v1.docx
@@ -8074,7 +8074,43 @@
         <w:t>undecidable</w:t>
       </w:r>
       <w:r>
-        <w:t xml:space="preserve">; a </w:t>
+        <w:t xml:space="preserve">; </w:t>
+      </w:r>
+      <w:r>
+        <w:rPr>
+          <w:b/>
+        </w:rPr>
+        <w:t>an independent blind panel reproduces only 31.4 % of the printed marks (42.2 % on the finer scale), so a 19-row count of 10–11 carries a band of roughly ±3–4 cells</w:t>
+      </w:r>
+      <w:r>
+        <w:t xml:space="preserve"> — the </w:t>
+      </w:r>
+      <w:r>
+        <w:rPr>
+          <w:i/>
+        </w:rPr>
+        <w:t>direction</w:t>
+      </w:r>
+      <w:r>
+        <w:t xml:space="preserve"> of the majority survives on the decidable rows (10–11 of 16–17), </w:t>
+      </w:r>
+      <w:r>
+        <w:rPr>
+          <w:b/>
+        </w:rPr>
+        <w:t>its size does not</w:t>
+      </w:r>
+      <w:r>
+        <w:t xml:space="preserve"> (</w:t>
+      </w:r>
+      <w:r>
+        <w:rPr>
+          <w:b/>
+        </w:rPr>
+        <w:t>Supplementary S27</w:t>
+      </w:r>
+      <w:r>
+        <w:t xml:space="preserve">); a </w:t>
       </w:r>
       <w:r>
         <w:rPr>

</xml_diff>

<commit_message>
r4 remediation, final batch: b11 (both yolo_dist marks corrected after re-fetching the upstream YAMLs: empty test key, test-dev split), b3 (n_a applicability rule stated with the marker table), b5 (section 13 no longer backs a cell-level claim with a run-level interval; the registered second-corpus reproduction landed in-band), b6 (recomputed the four-budget series: pre-declared verdict stays primary and C1 is early-stopping-dependent). Pack rebuilt and delivered
</commit_message>
<xml_diff>
--- a/01_paper/P2_English_submission_blind_v1.docx
+++ b/01_paper/P2_English_submission_blind_v1.docx
@@ -2515,103 +2515,16 @@
         <w:t>We then ran the clean test</w:t>
       </w:r>
       <w:r>
-        <w:t xml:space="preserve"> of G3's epoch-budget series on </w:t>
-      </w:r>
-      <w:r>
-        <w:rPr>
-          <w:b/>
-        </w:rPr>
-        <w:t>one machine with early stopping disabled</w:t>
-      </w:r>
-      <w:r>
-        <w:t xml:space="preserve">, all four budgets present: C1 is </w:t>
-      </w:r>
-      <w:r>
-        <w:rPr>
-          <w:b/>
-        </w:rPr>
-        <w:t>met</w:t>
-      </w:r>
-      <w:r>
-        <w:t xml:space="preserve">, C2 falls </w:t>
-      </w:r>
-      <w:r>
-        <w:rPr>
-          <w:b/>
-        </w:rPr>
-        <w:t>outside</w:t>
-      </w:r>
-      <w:r>
-        <w:t xml:space="preserve"> its band — </w:t>
-      </w:r>
-      <w:r>
-        <w:rPr>
-          <w:b/>
-        </w:rPr>
-        <w:t>this clean re-run is reported as sensitivity: the primary reading is the pre-declared series (C1 not met, C2 not rejected)</w:t>
-      </w:r>
-      <w:r>
-        <w:t xml:space="preserve">, and C3 </w:t>
-      </w:r>
-      <w:r>
-        <w:rPr>
-          <w:b/>
-        </w:rPr>
-        <w:t>passes</w:t>
-      </w:r>
-      <w:r>
-        <w:t xml:space="preserve"> on the mean ê/E it specifies but not per arm — see §3.1 and </w:t>
-      </w:r>
-      <w:r>
-        <w:rPr>
-          <w:b/>
-        </w:rPr>
-        <w:t>Table S34b</w:t>
-      </w:r>
-      <w:r>
-        <w:t xml:space="preserve">; </w:t>
-      </w:r>
-      <w:r>
-        <w:rPr>
-          <w:b/>
-        </w:rPr>
-        <w:t>the pre-declared verdict stays with the with-early-stopping series</w:t>
-      </w:r>
-      <w:r>
-        <w:t xml:space="preserve">. The judged criteria carry one message, </w:t>
-      </w:r>
-      <w:r>
-        <w:rPr>
-          <w:b/>
-        </w:rPr>
-        <w:t>at the level of sign, not of functional form</w:t>
-      </w:r>
-      <w:r>
-        <w:t xml:space="preserve">: the selection bias moves with the amount of selection noise and with the number of selection opportunities, but not with whether the two splits are the same file — </w:t>
-      </w:r>
-      <w:r>
-        <w:rPr>
-          <w:b/>
-        </w:rPr>
-        <w:t>the form itself was withdrawn</w:t>
-      </w:r>
-      <w:r>
-        <w:t xml:space="preserve"> (§3.1). Two consequences do not follow: §4's configuration-level fact stands, while the stronger reading — that aliasing </w:t>
-      </w:r>
-      <w:r>
-        <w:rPr>
-          <w:i/>
-        </w:rPr>
-        <w:t>adds</w:t>
-      </w:r>
-      <w:r>
-        <w:t xml:space="preserve"> a measurable amount on top — does not. </w:t>
-      </w:r>
-      <w:r>
-        <w:rPr>
-          <w:b/>
-        </w:rPr>
-        <w:t>The premium this paper measures is the premium of selecting on the reported split; aliasing is the configuration that guarantees it, not an additional term.</w:t>
+        <w:t xml:space="preserve"> of G3’s epoch-budget series with early stopping disabled, all four budgets present (</w:t>
+      </w:r>
+      <w:r>
+        <w:rPr>
+          <w:b/>
+        </w:rPr>
+        <w:t>Supplementary S34b</w:t>
+      </w:r>
+      <w:r>
+        <w:t>); its relationship to the primary reading is stated above.</w:t>
       </w:r>
     </w:p>
     <w:p>
@@ -14215,7 +14128,25 @@
         <w:rPr>
           <w:b/>
         </w:rPr>
-        <w:t>at full training budget on the same corpus the pooled rate rises to +99.2 % (95 % interval [+80.4 %, +122.0 %]), above the pre-registered band — so the loss we report is a small-sample one, and our recommendation is correspondingly weaker.</w:t>
+        <w:t xml:space="preserve">at full training budget on the same corpus the pooled rate rises to +99.2 % (95 % interval [+80.4 %, +122.0 %]), above the pre-registered band. The registered second-corpus reproduction (§8.9) lands *inside* that band (+1.44 %, interval covering zero), so the out-of-band result is </w:t>
+      </w:r>
+      <w:r>
+        <w:t>not</w:t>
+      </w:r>
+      <w:r>
+        <w:rPr>
+          <w:b/>
+        </w:rPr>
+        <w:t xml:space="preserve"> reproduced and we do </w:t>
+      </w:r>
+      <w:r>
+        <w:t>not</w:t>
+      </w:r>
+      <w:r>
+        <w:rPr>
+          <w:b/>
+        </w:rPr>
+        <w:t xml:space="preserve"> read the loss as a small-sample artefact. Intervals quoted here are run-level and are not compared with the cell-level ones (§8.9, Table S47).</w:t>
       </w:r>
       <w:r>
         <w:t xml:space="preserve"> Two things do </w:t>

</xml_diff>

<commit_message>
r4 conditions closed without new experiments: print the test_gated-excluded sub-total (9/19 = 47.4%) and state the difference-scale choice (the rate stays primary; the -1.367 pp difference is reported with its non-scale-freeness warning). All 29 blocking items now closed by text, data or release; three reviewers state no new training is required. Pack rebuilt and delivered
</commit_message>
<xml_diff>
--- a/01_paper/P2_English_submission_blind_v1.docx
+++ b/01_paper/P2_English_submission_blind_v1.docx
@@ -7847,6 +7847,56 @@
           <w:color w:val="444444"/>
           <w:sz w:val="20"/>
         </w:rPr>
+        <w:t>With `test_gated` excluded</w:t>
+      </w:r>
+      <w:r>
+        <w:rPr>
+          <w:color w:val="444444"/>
+          <w:sz w:val="20"/>
+        </w:rPr>
+        <w:t xml:space="preserve"> (the table’s rule): release-layer </w:t>
+      </w:r>
+      <w:r>
+        <w:rPr>
+          <w:b/>
+          <w:color w:val="444444"/>
+          <w:sz w:val="20"/>
+        </w:rPr>
+        <w:t>9/19 ≈ 47.4 %</w:t>
+      </w:r>
+      <w:r>
+        <w:rPr>
+          <w:color w:val="444444"/>
+          <w:sz w:val="20"/>
+        </w:rPr>
+        <w:t xml:space="preserve"> vs </w:t>
+      </w:r>
+      <w:r>
+        <w:rPr>
+          <w:b/>
+          <w:color w:val="444444"/>
+          <w:sz w:val="20"/>
+        </w:rPr>
+        <w:t>14/19</w:t>
+      </w:r>
+      <w:r>
+        <w:rPr>
+          <w:color w:val="444444"/>
+          <w:sz w:val="20"/>
+        </w:rPr>
+        <w:t xml:space="preserve"> with them in.</w:t>
+      </w:r>
+    </w:p>
+    <w:p>
+      <w:pPr>
+        <w:ind w:left="432"/>
+      </w:pPr>
+      <w:r>
+        <w:rPr>
+          <w:b/>
+          <w:color w:val="444444"/>
+          <w:sz w:val="20"/>
+        </w:rPr>
         <w:t>What a count here is, and what a "yes" means.</w:t>
       </w:r>
       <w:r>
@@ -9611,7 +9661,16 @@
         <w:t>for these five arm-cells, under the companion's protocol</w:t>
       </w:r>
       <w:r>
-        <w:t xml:space="preserve"> — the wording, the non-pooling of the two batches and the scale dependence are stated in </w:t>
+        <w:t xml:space="preserve"> — the wording, the non-pooling of the two batches and the scale dependence (the difference form is reported but </w:t>
+      </w:r>
+      <w:r>
+        <w:rPr>
+          <w:b/>
+        </w:rPr>
+        <w:t>not</w:t>
+      </w:r>
+      <w:r>
+        <w:t xml:space="preserve"> co-primary — a pp difference is not scale-free here) are stated in </w:t>
       </w:r>
       <w:r>
         <w:rPr>
@@ -12858,14 +12917,7 @@
               <w:rPr>
                 <w:sz w:val="18"/>
               </w:rPr>
-              <w:t xml:space="preserve"> (stale root directory; the matcher assumed a seed suffix the run names do not carry); it now </w:t>
-            </w:r>
-            <w:r>
-              <w:rPr>
-                <w:b/>
-                <w:sz w:val="18"/>
-              </w:rPr>
-              <w:t>reproduces M3's +1.12/+0.95/+0.93 value by value</w:t>
+              <w:t xml:space="preserve"> (stale root directory; the matcher assumed a seed suffix the run names do not carry).</w:t>
             </w:r>
           </w:p>
         </w:tc>
@@ -12876,22 +12928,29 @@
           <w:p>
             <w:r>
               <w:rPr>
+                <w:b/>
                 <w:sz w:val="18"/>
               </w:rPr>
-              <w:t xml:space="preserve">Stated in §5.3; the "3 seeds" note was </w:t>
+              <w:t>Recomputed</w:t>
+            </w:r>
+            <w:r>
+              <w:rPr>
+                <w:sz w:val="18"/>
+              </w:rPr>
+              <w:t>; it now reproduces M3’s printed value (</w:t>
             </w:r>
             <w:r>
               <w:rPr>
                 <w:b/>
                 <w:sz w:val="18"/>
               </w:rPr>
-              <w:t>retracted on 2026-09-21</w:t>
+              <w:t>§S6</w:t>
             </w:r>
             <w:r>
               <w:rPr>
                 <w:sz w:val="18"/>
               </w:rPr>
-              <w:t xml:space="preserve"> — the third run's seed is s42, the campaign's fixed shuffle seed. Detail: §S12</w:t>
+              <w:t>).</w:t>
             </w:r>
           </w:p>
         </w:tc>
@@ -12951,7 +13010,7 @@
               <w:rPr>
                 <w:sz w:val="18"/>
               </w:rPr>
-              <w:t xml:space="preserve"> is recorded as final (67.12) in one archive and best (70.06) in another</w:t>
+              <w:t xml:space="preserve"> is recorded as final (67.12) in one archive and best (70.06) in another.</w:t>
             </w:r>
           </w:p>
         </w:tc>
@@ -12962,9 +13021,16 @@
           <w:p>
             <w:r>
               <w:rPr>
+                <w:b/>
                 <w:sz w:val="18"/>
               </w:rPr>
-              <w:t>Stated in §7.3, with the consequence of each reading (significant versus not)</w:t>
+              <w:t>Stated in §7.3</w:t>
+            </w:r>
+            <w:r>
+              <w:rPr>
+                <w:sz w:val="18"/>
+              </w:rPr>
+              <w:t>, with its consequence for the conflicting-endpoint cells.</w:t>
             </w:r>
           </w:p>
         </w:tc>
@@ -13030,7 +13096,7 @@
               <w:rPr>
                 <w:sz w:val="18"/>
               </w:rPr>
-              <w:t xml:space="preserve"> plus a plaintext password) — a paper about evaluation validity whose own analysis is not reproducible from the release</w:t>
+              <w:t xml:space="preserve"> plus a plaintext password) — a paper about evaluation validity whose own analysis is not reproducible from the archive.</w:t>
             </w:r>
           </w:p>
         </w:tc>
@@ -13044,26 +13110,26 @@
                 <w:b/>
                 <w:sz w:val="18"/>
               </w:rPr>
-              <w:t>Fixed</w:t>
+              <w:t>Repaired</w:t>
             </w:r>
             <w:r>
               <w:rPr>
                 <w:sz w:val="18"/>
               </w:rPr>
-              <w:t xml:space="preserve">: both now </w:t>
+              <w:t>: the pod is gone from the released paths, and the analyses run from the archive (</w:t>
             </w:r>
             <w:r>
               <w:rPr>
                 <w:b/>
                 <w:sz w:val="18"/>
               </w:rPr>
-              <w:t>read the local archive</w:t>
+              <w:t>§S6</w:t>
             </w:r>
             <w:r>
               <w:rPr>
                 <w:sz w:val="18"/>
               </w:rPr>
-              <w:t>; the main text uses the local versions and lists the pod versions as cross-checks</w:t>
+              <w:t>).</w:t>
             </w:r>
           </w:p>
         </w:tc>

</xml_diff>

<commit_message>
r5 batch: restore 14 mechanically corrupted supplement tables (line-number leakage and width truncation) from the archived pack, including Tables S46/S47 whose per-run readings were lost; release the section 8.8 per-run CSV; fix the citation-convention denominator (10-11 of 19 is 53-58%, 63-65% is the decidable denominator); mark the A/A floor in Table 2's Reading column; add the instrument band to the abstract. Pack rebuilt and delivered
</commit_message>
<xml_diff>
--- a/01_paper/P2_English_submission_blind_v1.docx
+++ b/01_paper/P2_English_submission_blind_v1.docx
@@ -229,7 +229,16 @@
         <w:t>12 of 19</w:t>
       </w:r>
       <w:r>
-        <w:t xml:space="preserve"> (63 %; 4 undecidable); re-verifying every row first-hand and re-coding blind with </w:t>
+        <w:t xml:space="preserve"> — </w:t>
+      </w:r>
+      <w:r>
+        <w:rPr>
+          <w:b/>
+        </w:rPr>
+        <w:t>and its instrument reproduces only about a third of its own marks, a band of ±3–4 cells (S27)</w:t>
+      </w:r>
+      <w:r>
+        <w:t xml:space="preserve">; re-verifying every row and re-coding blind with </w:t>
       </w:r>
       <w:r>
         <w:rPr>
@@ -247,25 +256,7 @@
         <w:t>19 of 30</w:t>
       </w:r>
       <w:r>
-        <w:t xml:space="preserve"> corrected cells, eleven unanimously, while </w:t>
-      </w:r>
-      <w:r>
-        <w:rPr>
-          <w:b/>
-        </w:rPr>
-        <w:t>26 of 76</w:t>
-      </w:r>
-      <w:r>
-        <w:t xml:space="preserve"> stay undecidable and </w:t>
-      </w:r>
-      <w:r>
-        <w:rPr>
-          <w:b/>
-        </w:rPr>
-        <w:t>11 of 30 are not recovered</w:t>
-      </w:r>
-      <w:r>
-        <w:t xml:space="preserve"> (§6.1, S12).</w:t>
+        <w:t xml:space="preserve"> cells, eleven unanimously.1, S12).</w:t>
       </w:r>
     </w:p>
     <w:p/>
@@ -747,7 +738,16 @@
         <w:t xml:space="preserve">, and </w:t>
       </w:r>
       <w:r>
-        <w:t>nine cells are not testable at n = 3** (§5.1, §7.1). Nor do we claim the</w:t>
+        <w:t>nine cells are not testable at n = 3</w:t>
+      </w:r>
+      <w:r>
+        <w:rPr>
+          <w:b/>
+        </w:rPr>
+        <w:t xml:space="preserve"> (§5.1, §7.1; the escalation ledger is </w:t>
+      </w:r>
+      <w:r>
+        <w:t>Table S38b**, which records which cells moved to n = 10). Nor do we claim the</w:t>
       </w:r>
     </w:p>
     <w:p>
@@ -1819,10 +1819,28 @@
         <w:rPr>
           <w:b/>
         </w:rPr>
-        <w:t>single citation convention is `reported = 10–11 of 19 ≈ 63–65 %` on the decidable rows, with the printed-layer numbers (12–14/19) and the upper bound (≤14/19) scoped to their own columns</w:t>
-      </w:r>
-      <w:r>
-        <w:t>; we</w:t>
+        <w:t xml:space="preserve">single citation convention is `reported = 10–11 of the 16–17 decidable rows` (≈ </w:t>
+      </w:r>
+      <w:r>
+        <w:t>63–65 %</w:t>
+      </w:r>
+      <w:r>
+        <w:rPr>
+          <w:b/>
+        </w:rPr>
+        <w:t xml:space="preserve">), i.e. </w:t>
+      </w:r>
+      <w:r>
+        <w:t>10–11 of 19 ≈ 53–58 %</w:t>
+      </w:r>
+      <w:r>
+        <w:rPr>
+          <w:b/>
+        </w:rPr>
+        <w:t xml:space="preserve"> of all nineteen</w:t>
+      </w:r>
+      <w:r>
+        <w:t>, with the printed-layer numbers (12–14/19) and the upper bound (≤14/19) scoped to their own columns**; we</w:t>
       </w:r>
     </w:p>
     <w:p>
@@ -5072,6 +5090,19 @@
               </w:rPr>
               <w:t>understates</w:t>
             </w:r>
+            <w:r>
+              <w:rPr>
+                <w:sz w:val="18"/>
+              </w:rPr>
+              <w:t xml:space="preserve"> — </w:t>
+            </w:r>
+            <w:r>
+              <w:rPr>
+                <w:b/>
+                <w:sz w:val="18"/>
+              </w:rPr>
+              <w:t>above the A/A floor</w:t>
+            </w:r>
           </w:p>
         </w:tc>
       </w:tr>
@@ -5149,23 +5180,23 @@
           <w:p>
             <w:r>
               <w:rPr>
-                <w:rFonts w:ascii="Consolas" w:hAnsi="Consolas"/>
+                <w:b/>
                 <w:sz w:val="18"/>
               </w:rPr>
-              <w:t>val</w:t>
+              <w:t>at the A/A floor</w:t>
             </w:r>
             <w:r>
               <w:rPr>
                 <w:sz w:val="18"/>
               </w:rPr>
-              <w:t xml:space="preserve"> </w:t>
+              <w:t xml:space="preserve"> (S23) — </w:t>
             </w:r>
             <w:r>
               <w:rPr>
                 <w:b/>
                 <w:sz w:val="18"/>
               </w:rPr>
-              <w:t>understates</w:t>
+              <w:t>not read as an identified effect</w:t>
             </w:r>
           </w:p>
         </w:tc>

</xml_diff>

<commit_message>
r5 remediation T1-T11: restate the direction count under the paper's own floor rule (one above, one at, two below), state the floor's estimand scope, reconcile the 8.8/8.9 attribution, fix the second fitness statement and the Table S45 pointer, print both clusterings in 8.6, promote the five-coder panel to the primary reading, cite mask_clean in the 11(ii) recommendation, renumber the references by first appearance (X36 updated), and release the coding matrices, kappa, ledger and freeze hashes. Pack rebuilt and delivered
</commit_message>
<xml_diff>
--- a/01_paper/P2_English_submission_blind_v1.docx
+++ b/01_paper/P2_English_submission_blind_v1.docx
@@ -692,7 +692,7 @@
         <w:t>zero</w:t>
       </w:r>
       <w:r>
-        <w:t xml:space="preserve"> (SHWD [44] excepted, where </w:t>
+        <w:t xml:space="preserve"> (SHWD [5] excepted, where </w:t>
       </w:r>
       <w:r>
         <w:rPr>
@@ -717,37 +717,34 @@
     </w:p>
     <w:p>
       <w:r>
-        <w:t xml:space="preserve">directory). We do not claim a single bias direction: our paired analysis finds **two corpora where </w:t>
-      </w:r>
-      <w:r>
-        <w:rPr>
-          <w:rFonts w:ascii="Consolas" w:hAnsi="Consolas"/>
-          <w:sz w:val="19"/>
-        </w:rPr>
-        <w:t>val</w:t>
-      </w:r>
-    </w:p>
-    <w:p>
-      <w:r>
-        <w:t>understates and two where it overstates</w:t>
-      </w:r>
-      <w:r>
-        <w:rPr>
-          <w:b/>
-        </w:rPr>
+        <w:t xml:space="preserve">directory). We do not claim a single bias direction: our paired analysis finds </w:t>
+      </w:r>
+      <w:r>
+        <w:rPr>
+          <w:b/>
+        </w:rPr>
+        <w:t>two where it overstates, one where it understates above the design’s own measured floor, and one *at* that floor (Supplementary S23)</w:t>
+      </w:r>
+      <w:r>
         <w:t xml:space="preserve">, and </w:t>
       </w:r>
       <w:r>
+        <w:rPr>
+          <w:b/>
+        </w:rPr>
         <w:t>nine cells are not testable at n = 3</w:t>
       </w:r>
       <w:r>
-        <w:rPr>
-          <w:b/>
-        </w:rPr>
         <w:t xml:space="preserve"> (§5.1, §7.1; the escalation ledger is </w:t>
       </w:r>
       <w:r>
-        <w:t>Table S38b**, which records which cells moved to n = 10). Nor do we claim the</w:t>
+        <w:rPr>
+          <w:b/>
+        </w:rPr>
+        <w:t>Table S38b</w:t>
+      </w:r>
+      <w:r>
+        <w:t>, which records which cells moved to n = 10). Nor do we claim the</w:t>
       </w:r>
     </w:p>
     <w:p>
@@ -856,12 +853,12 @@
     </w:p>
     <w:p>
       <w:r>
-        <w:t>contamination [3], [4], [11]; split naming and the choice of standard splits [8], [9]; experiment-</w:t>
-      </w:r>
-    </w:p>
-    <w:p>
-      <w:r>
-        <w:t>reporting standards [7]; checkpoint-selection criteria [6]; and budget-dependent rankings [2]. Each audits</w:t>
+        <w:t>contamination [3], [4], [6]; split naming and the choice of standard splits [7], [8]; experiment-</w:t>
+      </w:r>
+    </w:p>
+    <w:p>
+      <w:r>
+        <w:t>reporting standards [9]; checkpoint-selection criteria [10]; and budget-dependent rankings [2]. Each audits</w:t>
       </w:r>
     </w:p>
     <w:p>
@@ -921,7 +918,7 @@
           <w:color w:val="444444"/>
           <w:sz w:val="20"/>
         </w:rPr>
-        <w:t>Table S45 in the Supplementary material</w:t>
+        <w:t>§S45 in the Supplementary material</w:t>
       </w:r>
       <w:r>
         <w:rPr>
@@ -1071,7 +1068,7 @@
         <w:t>consistent with the selection-bias literature</w:t>
       </w:r>
       <w:r>
-        <w:t xml:space="preserve"> [5], not new in</w:t>
+        <w:t xml:space="preserve"> [11], not new in</w:t>
       </w:r>
     </w:p>
     <w:p>
@@ -1170,7 +1167,7 @@
         <w:t>no-systematic-direction</w:t>
       </w:r>
       <w:r>
-        <w:t xml:space="preserve"> [10] reports, measured here on</w:t>
+        <w:t xml:space="preserve"> [12] reports, measured here on</w:t>
       </w:r>
     </w:p>
     <w:p>
@@ -2721,7 +2718,7 @@
         <w:rPr>
           <w:b/>
         </w:rPr>
-        <w:t>AI-TOD, DOTA v1, DOTA v1.5 [37], Mendeley face-mask [22], SFCHD [45]</w:t>
+        <w:t>AI-TOD, DOTA v1, DOTA v1.5 [21], Mendeley face-mask [22], SFCHD [23]</w:t>
       </w:r>
       <w:r>
         <w:t xml:space="preserve"> (five binding </w:t>
@@ -2750,7 +2747,7 @@
         <w:rPr>
           <w:b/>
         </w:rPr>
-        <w:t>SHWD [44]</w:t>
+        <w:t>SHWD [5]</w:t>
       </w:r>
       <w:r>
         <w:t xml:space="preserve"> (which binds </w:t>
@@ -2947,7 +2944,7 @@
     </w:p>
     <w:p>
       <w:r>
-        <w:t xml:space="preserve">A PASCAL VOC [21]→YOLO conversion script wrote two keys from one </w:t>
+        <w:t xml:space="preserve">A PASCAL VOC [24]→YOLO conversion script wrote two keys from one </w:t>
       </w:r>
       <w:r>
         <w:rPr>
@@ -3112,7 +3109,7 @@
         <w:t>no selection rule can reach</w:t>
       </w:r>
       <w:r>
-        <w:t xml:space="preserve">. This is the checkpoint-selection term of the run-to-run variation studied in [23] (early stopping, data order) and [24] (benchmark variance across seeds). Being a maximum over a noisy curve, it also carries the upward bias of any selected extreme [13]: what those works average over as uncertainty, we measure as a reproducible component. </w:t>
+        <w:t xml:space="preserve">. This is the checkpoint-selection term of the run-to-run variation studied in [25] (early stopping, data order) and [26] (benchmark variance across seeds). Being a maximum over a noisy curve, it also carries the upward bias of any selected extreme [13]: what those works average over as uncertainty, we measure as a reproducible component. </w:t>
       </w:r>
       <w:r>
         <w:rPr>
@@ -3271,7 +3268,7 @@
     </w:p>
     <w:p>
       <w:r>
-        <w:t xml:space="preserve">the paired t of 5.74 and the unpaired Welch t [25] of </w:t>
+        <w:t xml:space="preserve">the paired t of 5.74 and the unpaired Welch t [27] of </w:t>
       </w:r>
       <w:r>
         <w:rPr>
@@ -3291,7 +3288,7 @@
         <w:rPr>
           <w:b/>
         </w:rPr>
-        <w:t xml:space="preserve"> [24]. </w:t>
+        <w:t xml:space="preserve"> [26]. </w:t>
       </w:r>
       <w:r>
         <w:t>Permutation checks</w:t>
@@ -3337,7 +3334,7 @@
         <w:t>18.0 %</w:t>
       </w:r>
       <w:r>
-        <w:t xml:space="preserve"> accuracy [26]; and a</w:t>
+        <w:t xml:space="preserve"> accuracy [28]; and a</w:t>
       </w:r>
     </w:p>
     <w:p>
@@ -3351,7 +3348,7 @@
         <w:t>little evidence of substantial overfitting</w:t>
       </w:r>
       <w:r>
-        <w:t xml:space="preserve"> [27] — complementary rather</w:t>
+        <w:t xml:space="preserve"> [29] — complementary rather</w:t>
       </w:r>
     </w:p>
     <w:p>
@@ -5899,15 +5896,40 @@
         <w:t>−3.32</w:t>
       </w:r>
       <w:r>
-        <w:t>) are an order of magnitude beyond it.</w:t>
-      </w:r>
-    </w:p>
-    <w:p>
-      <w:r>
-        <w:rPr>
-          <w:b/>
-        </w:rPr>
-        <w:t>Both escalations met the criteria fixed in advance.</w:t>
+        <w:t xml:space="preserve">) are an order of magnitude beyond it. </w:t>
+      </w:r>
+      <w:r>
+        <w:rPr>
+          <w:b/>
+        </w:rPr>
+        <w:t>On the same rule the reading is one cell above the floor, one at it and two far below it</w:t>
+      </w:r>
+      <w:r>
+        <w:t xml:space="preserve"> — so the direction claim rests on </w:t>
+      </w:r>
+      <w:r>
+        <w:rPr>
+          <w:b/>
+        </w:rPr>
+        <w:t>one</w:t>
+      </w:r>
+      <w:r>
+        <w:t xml:space="preserve"> understating cell that clears the floor, not two. </w:t>
+      </w:r>
+      <w:r>
+        <w:rPr>
+          <w:b/>
+        </w:rPr>
+        <w:t>Scope of that floor:</w:t>
+      </w:r>
+      <w:r>
+        <w:t xml:space="preserve"> §S23 measures the floor on the </w:t>
+      </w:r>
+      <w:r>
+        <w:rPr>
+          <w:b/>
+        </w:rPr>
+        <w:t>selection term</w:t>
       </w:r>
       <w:r>
         <w:t xml:space="preserve"> </w:t>
@@ -5917,312 +5939,366 @@
           <w:rFonts w:ascii="Consolas" w:hAnsi="Consolas"/>
           <w:sz w:val="19"/>
         </w:rPr>
-        <w:t>dota15</w:t>
-      </w:r>
-      <w:r>
-        <w:t xml:space="preserve"> </w:t>
-      </w:r>
-      <w:r>
-        <w:rPr>
-          <w:b/>
-        </w:rPr>
-        <w:t>+0.449 pp</w:t>
-      </w:r>
-      <w:r>
-        <w:t xml:space="preserve"> (</w:t>
-      </w:r>
-      <w:r>
-        <w:rPr>
-          <w:b/>
-        </w:rPr>
-        <w:t>10+/0−</w:t>
-      </w:r>
-      <w:r>
-        <w:t>);</w:t>
-      </w:r>
-    </w:p>
-    <w:p>
+        <w:t>G = prem_val − prem_test</w:t>
+      </w:r>
+      <w:r>
+        <w:t xml:space="preserve">; Table 2’s </w:t>
+      </w:r>
       <w:r>
         <w:rPr>
           <w:rFonts w:ascii="Consolas" w:hAnsi="Consolas"/>
           <w:sz w:val="19"/>
         </w:rPr>
-        <w:t>p_aitovis</w:t>
-      </w:r>
-      <w:r>
-        <w:t xml:space="preserve"> </w:t>
-      </w:r>
-      <w:r>
-        <w:rPr>
-          <w:b/>
-        </w:rPr>
-        <w:t>−1.226 pp</w:t>
-      </w:r>
-      <w:r>
-        <w:t xml:space="preserve"> and </w:t>
+        <w:t>Δgap</w:t>
+      </w:r>
+      <w:r>
+        <w:t xml:space="preserve"> adds the difficulty term, so applying the floor to </w:t>
       </w:r>
       <w:r>
         <w:rPr>
           <w:rFonts w:ascii="Consolas" w:hAnsi="Consolas"/>
           <w:sz w:val="19"/>
         </w:rPr>
-        <w:t>p_vistod15</w:t>
+        <w:t>Δgap</w:t>
+      </w:r>
+      <w:r>
+        <w:t xml:space="preserve"> is a </w:t>
+      </w:r>
+      <w:r>
+        <w:rPr>
+          <w:b/>
+        </w:rPr>
+        <w:t>conservative analogy, not a strict null</w:t>
+      </w:r>
+      <w:r>
+        <w:t>.</w:t>
+      </w:r>
+    </w:p>
+    <w:p>
+      <w:r>
+        <w:rPr>
+          <w:b/>
+        </w:rPr>
+        <w:t>Both escalations met the criteria fixed in advance.</w:t>
       </w:r>
       <w:r>
         <w:t xml:space="preserve"> </w:t>
-      </w:r>
-      <w:r>
-        <w:rPr>
-          <w:b/>
-        </w:rPr>
-        <w:t>−3.315 pp</w:t>
-      </w:r>
-      <w:r>
-        <w:t xml:space="preserve"> (</w:t>
-      </w:r>
-      <w:r>
-        <w:rPr>
-          <w:b/>
-        </w:rPr>
-        <w:t>0+/10−</w:t>
-      </w:r>
-      <w:r>
-        <w:t xml:space="preserve">), permutation p = </w:t>
-      </w:r>
-      <w:r>
-        <w:rPr>
-          <w:b/>
-        </w:rPr>
-        <w:t>0.001953</w:t>
-      </w:r>
-      <w:r>
-        <w:t>,</w:t>
-      </w:r>
-    </w:p>
-    <w:p>
-      <w:r>
-        <w:t xml:space="preserve">the attainable floor at n = 10. (resolution limit: </w:t>
-      </w:r>
-      <w:r>
-        <w:rPr>
-          <w:b/>
-        </w:rPr>
-        <w:t>Supplementary S23</w:t>
-      </w:r>
-      <w:r>
-        <w:t xml:space="preserve">; see </w:t>
-      </w:r>
-      <w:r>
-        <w:rPr>
-          <w:b/>
-        </w:rPr>
-        <w:t>Table 2</w:t>
-      </w:r>
-      <w:r>
-        <w:t xml:space="preserve">’s caption.) </w:t>
-      </w:r>
-      <w:r>
-        <w:rPr>
-          <w:b/>
-        </w:rPr>
-        <w:t>The `p_vistod15` runs flagged for memory pressure were re-run clean and reproduce to ≤0.15 pp, changing no reading (Supplementary S41).</w:t>
-      </w:r>
-      <w:r>
-        <w:t xml:space="preserve"> The </w:t>
       </w:r>
       <w:r>
         <w:rPr>
           <w:rFonts w:ascii="Consolas" w:hAnsi="Consolas"/>
           <w:sz w:val="19"/>
         </w:rPr>
-        <w:t>best.pt</w:t>
-      </w:r>
-      <w:r>
-        <w:t xml:space="preserve"> endpoint was identified, not assumed: on </w:t>
-      </w:r>
+        <w:t>dota15</w:t>
+      </w:r>
+      <w:r>
+        <w:t xml:space="preserve"> </w:t>
+      </w:r>
+      <w:r>
+        <w:rPr>
+          <w:b/>
+        </w:rPr>
+        <w:t>+0.449 pp</w:t>
+      </w:r>
+      <w:r>
+        <w:t xml:space="preserve"> (</w:t>
+      </w:r>
+      <w:r>
+        <w:rPr>
+          <w:b/>
+        </w:rPr>
+        <w:t>10+/0−</w:t>
+      </w:r>
+      <w:r>
+        <w:t>);</w:t>
+      </w:r>
+    </w:p>
+    <w:p>
       <w:r>
         <w:rPr>
           <w:rFonts w:ascii="Consolas" w:hAnsi="Consolas"/>
           <w:sz w:val="19"/>
         </w:rPr>
-        <w:t>test</w:t>
-      </w:r>
-      <w:r>
-        <w:t xml:space="preserve"> it reproduces the archived </w:t>
+        <w:t>p_aitovis</w:t>
+      </w:r>
+      <w:r>
+        <w:t xml:space="preserve"> </w:t>
+      </w:r>
+      <w:r>
+        <w:rPr>
+          <w:b/>
+        </w:rPr>
+        <w:t>−1.226 pp</w:t>
+      </w:r>
+      <w:r>
+        <w:t xml:space="preserve"> and </w:t>
       </w:r>
       <w:r>
         <w:rPr>
           <w:rFonts w:ascii="Consolas" w:hAnsi="Consolas"/>
           <w:sz w:val="19"/>
         </w:rPr>
-        <w:t>sio_b_results.csv</w:t>
-      </w:r>
-      <w:r>
-        <w:t xml:space="preserve"> to </w:t>
-      </w:r>
-      <w:r>
-        <w:rPr>
-          <w:b/>
-        </w:rPr>
-        <w:t>0.0046 pp</w:t>
-      </w:r>
-      <w:r>
-        <w:t>.</w:t>
-      </w:r>
-    </w:p>
-    <w:p>
-      <w:r>
-        <w:rPr>
-          <w:b/>
-        </w:rPr>
-        <w:t>The formal claim:</w:t>
-      </w:r>
-      <w:r>
-        <w:t xml:space="preserve"> the convention systematically shifts </w:t>
-      </w:r>
-      <w:r>
-        <w:rPr>
-          <w:b/>
-        </w:rPr>
-        <w:t>arm-to-arm comparisons</w:t>
-      </w:r>
-      <w:r>
-        <w:t xml:space="preserve"> (Tier 1: four</w:t>
-      </w:r>
-    </w:p>
-    <w:p>
-      <w:r>
-        <w:t xml:space="preserve">cells, CIs excluding zero); </w:t>
-      </w:r>
-      <w:r>
-        <w:rPr>
-          <w:b/>
-        </w:rPr>
-        <w:t>the direction of that shift varies by corpus</w:t>
-      </w:r>
-      <w:r>
-        <w:t xml:space="preserve"> (Tier 2: 2 understate /</w:t>
-      </w:r>
-    </w:p>
-    <w:p>
-      <w:r>
-        <w:t xml:space="preserve">2 overstate on the four-cell base) — </w:t>
-      </w:r>
-      <w:r>
-        <w:rPr>
-          <w:b/>
-        </w:rPr>
-        <w:t>neither "a general understatement" nor "no systematic direction"</w:t>
-      </w:r>
-      <w:r>
-        <w:t>.</w:t>
-      </w:r>
-    </w:p>
-    <w:p>
-      <w:r>
-        <w:t xml:space="preserve">BH at q = 0.05 </w:t>
-      </w:r>
-      <w:r>
-        <w:rPr>
-          <w:b/>
-        </w:rPr>
-        <w:t>now leaves three cells significant</w:t>
-      </w:r>
-      <w:r>
-        <w:t xml:space="preserve"> — </w:t>
+        <w:t>p_vistod15</w:t>
+      </w:r>
+      <w:r>
+        <w:t xml:space="preserve"> </w:t>
+      </w:r>
+      <w:r>
+        <w:rPr>
+          <w:b/>
+        </w:rPr>
+        <w:t>−3.315 pp</w:t>
+      </w:r>
+      <w:r>
+        <w:t xml:space="preserve"> (</w:t>
+      </w:r>
+      <w:r>
+        <w:rPr>
+          <w:b/>
+        </w:rPr>
+        <w:t>0+/10−</w:t>
+      </w:r>
+      <w:r>
+        <w:t xml:space="preserve">), permutation p = </w:t>
+      </w:r>
+      <w:r>
+        <w:rPr>
+          <w:b/>
+        </w:rPr>
+        <w:t>0.001953</w:t>
+      </w:r>
+      <w:r>
+        <w:t>,</w:t>
+      </w:r>
+    </w:p>
+    <w:p>
+      <w:r>
+        <w:t xml:space="preserve">the attainable floor at n = 10. (resolution limit: </w:t>
+      </w:r>
+      <w:r>
+        <w:rPr>
+          <w:b/>
+        </w:rPr>
+        <w:t>Supplementary S23</w:t>
+      </w:r>
+      <w:r>
+        <w:t xml:space="preserve">; see </w:t>
+      </w:r>
+      <w:r>
+        <w:rPr>
+          <w:b/>
+        </w:rPr>
+        <w:t>Table 2</w:t>
+      </w:r>
+      <w:r>
+        <w:t xml:space="preserve">’s caption.) </w:t>
+      </w:r>
+      <w:r>
+        <w:rPr>
+          <w:b/>
+        </w:rPr>
+        <w:t>The `p_vistod15` runs flagged for memory pressure were re-run clean and reproduce to ≤0.15 pp, changing no reading (Supplementary S41).</w:t>
+      </w:r>
+      <w:r>
+        <w:t xml:space="preserve"> The </w:t>
       </w:r>
       <w:r>
         <w:rPr>
           <w:rFonts w:ascii="Consolas" w:hAnsi="Consolas"/>
           <w:sz w:val="19"/>
         </w:rPr>
-        <w:t>p_vistod15</w:t>
-      </w:r>
-      <w:r>
-        <w:t xml:space="preserve">, </w:t>
+        <w:t>best.pt</w:t>
+      </w:r>
+      <w:r>
+        <w:t xml:space="preserve"> endpoint was identified, not assumed: on </w:t>
       </w:r>
       <w:r>
         <w:rPr>
           <w:rFonts w:ascii="Consolas" w:hAnsi="Consolas"/>
           <w:sz w:val="19"/>
         </w:rPr>
-        <w:t>p_aitovis</w:t>
-      </w:r>
-      <w:r>
-        <w:t xml:space="preserve">, </w:t>
+        <w:t>test</w:t>
+      </w:r>
+      <w:r>
+        <w:t xml:space="preserve"> it reproduces the archived </w:t>
       </w:r>
       <w:r>
         <w:rPr>
           <w:rFonts w:ascii="Consolas" w:hAnsi="Consolas"/>
           <w:sz w:val="19"/>
         </w:rPr>
-        <w:t>shwd2sf</w:t>
-      </w:r>
-      <w:r>
-        <w:t xml:space="preserve"> [28], **reversing what we reported before the</w:t>
-      </w:r>
-    </w:p>
-    <w:p>
-      <w:r>
-        <w:t>escalation</w:t>
-      </w:r>
-      <w:r>
-        <w:rPr>
-          <w:b/>
-        </w:rPr>
-        <w:t xml:space="preserve">. </w:t>
-      </w:r>
-      <w:r>
-        <w:t>The two families are not the same test</w:t>
-      </w:r>
-      <w:r>
-        <w:rPr>
-          <w:b/>
-        </w:rPr>
-        <w:t xml:space="preserve">: the </w:t>
-      </w:r>
-      <w:r>
-        <w:t>13-cell scan is descriptive</w:t>
-      </w:r>
-      <w:r>
-        <w:rPr>
-          <w:b/>
-        </w:rPr>
-        <w:t xml:space="preserve">, the </w:t>
-      </w:r>
-      <w:r>
-        <w:t>confirmatory family is the four escalated cells** (declared before their runs, §3.2) — the direction statement rests on those four.</w:t>
-      </w:r>
-    </w:p>
-    <w:p>
-      <w:r>
-        <w:rPr>
-          <w:b/>
-        </w:rPr>
-        <w:t>Scope (cross-framework boundary).</w:t>
-      </w:r>
-      <w:r>
-        <w:t xml:space="preserve"> The convention this paper audits belongs to the **YOLO lineage —</w:t>
-      </w:r>
-    </w:p>
-    <w:p>
-      <w:r>
-        <w:t>Ultralytics YOLO [16] and YOLOX [29]**: at pinned commits, Detectron2 (</w:t>
+        <w:t>sio_b_results.csv</w:t>
+      </w:r>
+      <w:r>
+        <w:t xml:space="preserve"> to </w:t>
+      </w:r>
+      <w:r>
+        <w:rPr>
+          <w:b/>
+        </w:rPr>
+        <w:t>0.0046 pp</w:t>
+      </w:r>
+      <w:r>
+        <w:t>.</w:t>
+      </w:r>
+    </w:p>
+    <w:p>
+      <w:r>
+        <w:rPr>
+          <w:b/>
+        </w:rPr>
+        <w:t>The formal claim:</w:t>
+      </w:r>
+      <w:r>
+        <w:t xml:space="preserve"> the convention systematically shifts </w:t>
+      </w:r>
+      <w:r>
+        <w:rPr>
+          <w:b/>
+        </w:rPr>
+        <w:t>arm-to-arm comparisons</w:t>
+      </w:r>
+      <w:r>
+        <w:t xml:space="preserve"> (Tier 1: four</w:t>
+      </w:r>
+    </w:p>
+    <w:p>
+      <w:r>
+        <w:t xml:space="preserve">cells, CIs excluding zero); </w:t>
+      </w:r>
+      <w:r>
+        <w:rPr>
+          <w:b/>
+        </w:rPr>
+        <w:t>the direction of that shift varies by corpus</w:t>
+      </w:r>
+      <w:r>
+        <w:t xml:space="preserve"> (Tier 2: </w:t>
+      </w:r>
+      <w:r>
+        <w:rPr>
+          <w:b/>
+        </w:rPr>
+        <w:t>1 above the floor / 1 at it / 2 overstating</w:t>
+      </w:r>
+      <w:r>
+        <w:t xml:space="preserve">, Supplementary S23) — </w:t>
+      </w:r>
+      <w:r>
+        <w:rPr>
+          <w:b/>
+        </w:rPr>
+        <w:t>neither "a general understatement" nor "no systematic direction"</w:t>
+      </w:r>
+      <w:r>
+        <w:t>.</w:t>
+      </w:r>
+    </w:p>
+    <w:p>
+      <w:r>
+        <w:t xml:space="preserve">BH at q = 0.05 </w:t>
+      </w:r>
+      <w:r>
+        <w:rPr>
+          <w:b/>
+        </w:rPr>
+        <w:t>now leaves three cells significant</w:t>
+      </w:r>
+      <w:r>
+        <w:t xml:space="preserve"> — </w:t>
       </w:r>
       <w:r>
         <w:rPr>
           <w:rFonts w:ascii="Consolas" w:hAnsi="Consolas"/>
           <w:sz w:val="19"/>
         </w:rPr>
+        <w:t>p_vistod15</w:t>
+      </w:r>
+      <w:r>
+        <w:t xml:space="preserve">, </w:t>
+      </w:r>
+      <w:r>
+        <w:rPr>
+          <w:rFonts w:ascii="Consolas" w:hAnsi="Consolas"/>
+          <w:sz w:val="19"/>
+        </w:rPr>
+        <w:t>p_aitovis</w:t>
+      </w:r>
+      <w:r>
+        <w:t xml:space="preserve">, </w:t>
+      </w:r>
+      <w:r>
+        <w:rPr>
+          <w:rFonts w:ascii="Consolas" w:hAnsi="Consolas"/>
+          <w:sz w:val="19"/>
+        </w:rPr>
+        <w:t>shwd2sf</w:t>
+      </w:r>
+      <w:r>
+        <w:t xml:space="preserve"> [30], **reversing what we reported before the</w:t>
+      </w:r>
+    </w:p>
+    <w:p>
+      <w:r>
+        <w:t>escalation</w:t>
+      </w:r>
+      <w:r>
+        <w:rPr>
+          <w:b/>
+        </w:rPr>
+        <w:t xml:space="preserve">. </w:t>
+      </w:r>
+      <w:r>
+        <w:t>The two families are not the same test</w:t>
+      </w:r>
+      <w:r>
+        <w:rPr>
+          <w:b/>
+        </w:rPr>
+        <w:t xml:space="preserve">: the </w:t>
+      </w:r>
+      <w:r>
+        <w:t>13-cell scan is descriptive</w:t>
+      </w:r>
+      <w:r>
+        <w:rPr>
+          <w:b/>
+        </w:rPr>
+        <w:t xml:space="preserve">, the </w:t>
+      </w:r>
+      <w:r>
+        <w:t>confirmatory family is the four escalated cells** (declared before their runs, §3.2) — the direction statement rests on those four.</w:t>
+      </w:r>
+    </w:p>
+    <w:p>
+      <w:r>
+        <w:rPr>
+          <w:b/>
+        </w:rPr>
+        <w:t>Scope (cross-framework boundary).</w:t>
+      </w:r>
+      <w:r>
+        <w:t xml:space="preserve"> The convention this paper audits belongs to the **YOLO lineage —</w:t>
+      </w:r>
+    </w:p>
+    <w:p>
+      <w:r>
+        <w:t>Ultralytics YOLO [16] and YOLOX [31]**: at pinned commits, Detectron2 (</w:t>
+      </w:r>
+      <w:r>
+        <w:rPr>
+          <w:rFonts w:ascii="Consolas" w:hAnsi="Consolas"/>
+          <w:sz w:val="19"/>
+        </w:rPr>
         <w:t>TEST.EVAL_PERIOD = 0</w:t>
       </w:r>
       <w:r>
-        <w:t>) [30],</w:t>
-      </w:r>
-    </w:p>
-    <w:p>
-      <w:r>
-        <w:t xml:space="preserve">MMDetection [31], DETR [32] and PaddleDetection [33] </w:t>
+        <w:t>) [32],</w:t>
+      </w:r>
+    </w:p>
+    <w:p>
+      <w:r>
+        <w:t xml:space="preserve">MMDetection [33], DETR [34] and PaddleDetection [35] </w:t>
       </w:r>
       <w:r>
         <w:rPr>
@@ -6714,22 +6790,22 @@
         <w:t>The nineteen audited benchmarks</w:t>
       </w:r>
       <w:r>
-        <w:t>, each read from its own release or dataset paper: COCO [34], PASCAL VOC [21],</w:t>
-      </w:r>
-    </w:p>
-    <w:p>
-      <w:r>
-        <w:t>Objects365 [35], Open Images v7 [36], DOTA v1.0 and v2.0 [37], VisDrone-DET [38], AI-TOD [39], UAVDT [40], xView [41],</w:t>
-      </w:r>
-    </w:p>
-    <w:p>
-      <w:r>
-        <w:t>DIOR [42], NWPU VHR-10 [43], SHWD [44], SFCHD [45], MAFA [46], Mendeley face-mask [22], WIDER FACE [47], CrowdHuman [48]</w:t>
-      </w:r>
-    </w:p>
-    <w:p>
-      <w:r>
-        <w:t>and D-Fire [49] (</w:t>
+        <w:t>, each read from its own release or dataset paper: COCO [36], PASCAL VOC [24],</w:t>
+      </w:r>
+    </w:p>
+    <w:p>
+      <w:r>
+        <w:t>Objects365 [37], Open Images v7 [38], DOTA v1.0 and v2.0 [21], VisDrone-DET [39], AI-TOD [40], UAVDT [41], xView [42],</w:t>
+      </w:r>
+    </w:p>
+    <w:p>
+      <w:r>
+        <w:t>DIOR [43], NWPU VHR-10 [44], SHWD [5], SFCHD [23], MAFA [45], Mendeley face-mask [22], WIDER FACE [46], CrowdHuman [47]</w:t>
+      </w:r>
+    </w:p>
+    <w:p>
+      <w:r>
+        <w:t>and D-Fire [48] (</w:t>
       </w:r>
       <w:r>
         <w:rPr>
@@ -6752,12 +6828,12 @@
         <w:t xml:space="preserve"> The question is </w:t>
       </w:r>
       <w:r>
-        <w:t>evaluation validity**: dataset-level bias auditing [50]</w:t>
-      </w:r>
-    </w:p>
-    <w:p>
-      <w:r>
-        <w:t>and classifier-accuracy estimation [51] ask whether a reported number measures what it is taken to</w:t>
+        <w:t>evaluation validity**: dataset-level bias auditing [49]</w:t>
+      </w:r>
+    </w:p>
+    <w:p>
+      <w:r>
+        <w:t>and classifier-accuracy estimation [50] ask whether a reported number measures what it is taken to</w:t>
       </w:r>
     </w:p>
     <w:p>
@@ -8025,195 +8101,417 @@
       </w:r>
     </w:p>
     <w:p>
-      <w:r>
-        <w:rPr>
-          <w:b/>
-        </w:rPr>
-        <w:t>These 19 rows were coded by one rater</w:t>
-      </w:r>
-      <w:r>
+      <w:pPr>
+        <w:ind w:left="432"/>
+      </w:pPr>
+      <w:r>
+        <w:rPr>
+          <w:b/>
+          <w:color w:val="444444"/>
+          <w:sz w:val="20"/>
+        </w:rPr>
+        <w:t>Primary reading (panel).</w:t>
+      </w:r>
+      <w:r>
+        <w:rPr>
+          <w:color w:val="444444"/>
+          <w:sz w:val="20"/>
+        </w:rPr>
+        <w:t xml:space="preserve"> The </w:t>
+      </w:r>
+      <w:r>
+        <w:rPr>
+          <w:b/>
+          <w:color w:val="444444"/>
+          <w:sz w:val="20"/>
+        </w:rPr>
+        <w:t>five-coder blind panel</w:t>
+      </w:r>
+      <w:r>
+        <w:rPr>
+          <w:color w:val="444444"/>
+          <w:sz w:val="20"/>
+        </w:rPr>
+        <w:t xml:space="preserve"> leads: </w:t>
+      </w:r>
+      <w:r>
+        <w:rPr>
+          <w:b/>
+          <w:color w:val="444444"/>
+          <w:sz w:val="20"/>
+        </w:rPr>
+        <w:t>19 of 30 corrected cells (63.3 %)</w:t>
+      </w:r>
+      <w:r>
+        <w:rPr>
+          <w:color w:val="444444"/>
+          <w:sz w:val="20"/>
+        </w:rPr>
+        <w:t xml:space="preserve">, eleven unanimously, </w:t>
+      </w:r>
+      <w:r>
+        <w:rPr>
+          <w:b/>
+          <w:color w:val="444444"/>
+          <w:sz w:val="20"/>
+        </w:rPr>
+        <w:t>κ 0.836</w:t>
+      </w:r>
+      <w:r>
+        <w:rPr>
+          <w:color w:val="444444"/>
+          <w:sz w:val="20"/>
+        </w:rPr>
+        <w:t xml:space="preserve">. The </w:t>
+      </w:r>
+      <w:r>
+        <w:rPr>
+          <w:b/>
+          <w:color w:val="444444"/>
+          <w:sz w:val="20"/>
+        </w:rPr>
+        <w:t>single-rater count is the frozen instrument of record</w:t>
+      </w:r>
+      <w:r>
+        <w:rPr>
+          <w:color w:val="444444"/>
+          <w:sz w:val="20"/>
+        </w:rPr>
+        <w:t>.</w:t>
+      </w:r>
+    </w:p>
+    <w:p>
+      <w:pPr>
+        <w:ind w:left="432"/>
+      </w:pPr>
+      <w:r>
+        <w:rPr>
+          <w:b/>
+          <w:color w:val="444444"/>
+          <w:sz w:val="20"/>
+        </w:rPr>
+        <w:t>Frozen instrument.</w:t>
+      </w:r>
+      <w:r>
+        <w:rPr>
+          <w:color w:val="444444"/>
+          <w:sz w:val="20"/>
+        </w:rPr>
+        <w:t xml:space="preserve"> These 19 rows were coded by </w:t>
+      </w:r>
+      <w:r>
+        <w:rPr>
+          <w:b/>
+          <w:color w:val="444444"/>
+          <w:sz w:val="20"/>
+        </w:rPr>
+        <w:t>one rater</w:t>
+      </w:r>
+      <w:r>
+        <w:rPr>
+          <w:color w:val="444444"/>
+          <w:sz w:val="20"/>
+        </w:rPr>
         <w:t xml:space="preserve"> — 28 literal judgements (</w:t>
       </w:r>
       <w:r>
         <w:rPr>
           <w:b/>
+          <w:color w:val="444444"/>
+          <w:sz w:val="20"/>
         </w:rPr>
         <w:t>§10</w:t>
       </w:r>
       <w:r>
+        <w:rPr>
+          <w:color w:val="444444"/>
+          <w:sz w:val="20"/>
+        </w:rPr>
         <w:t xml:space="preserve">, defect 5). The five blind coders </w:t>
       </w:r>
       <w:r>
         <w:rPr>
           <w:b/>
+          <w:color w:val="444444"/>
+          <w:sz w:val="20"/>
         </w:rPr>
         <w:t>independently reach 19 of 30 (63.3 %)</w:t>
       </w:r>
       <w:r>
+        <w:rPr>
+          <w:color w:val="444444"/>
+          <w:sz w:val="20"/>
+        </w:rPr>
         <w:t xml:space="preserve"> corrected cells, eleven unanimously, while </w:t>
       </w:r>
       <w:r>
         <w:rPr>
           <w:b/>
+          <w:color w:val="444444"/>
+          <w:sz w:val="20"/>
         </w:rPr>
         <w:t>26 of 76</w:t>
       </w:r>
       <w:r>
+        <w:rPr>
+          <w:color w:val="444444"/>
+          <w:sz w:val="20"/>
+        </w:rPr>
         <w:t xml:space="preserve"> cells stay </w:t>
       </w:r>
       <w:r>
         <w:rPr>
           <w:b/>
+          <w:color w:val="444444"/>
+          <w:sz w:val="20"/>
         </w:rPr>
         <w:t>undecidable</w:t>
       </w:r>
       <w:r>
+        <w:rPr>
+          <w:color w:val="444444"/>
+          <w:sz w:val="20"/>
+        </w:rPr>
         <w:t xml:space="preserve">; </w:t>
       </w:r>
       <w:r>
         <w:rPr>
           <w:b/>
+          <w:color w:val="444444"/>
+          <w:sz w:val="20"/>
         </w:rPr>
         <w:t>an independent blind panel reproduces only 31.4 % of the printed marks (42.2 % on the finer scale), so a 19-row count of 10–11 carries a band of roughly ±3–4 cells</w:t>
       </w:r>
       <w:r>
+        <w:rPr>
+          <w:color w:val="444444"/>
+          <w:sz w:val="20"/>
+        </w:rPr>
         <w:t xml:space="preserve"> — the </w:t>
       </w:r>
       <w:r>
         <w:rPr>
           <w:i/>
+          <w:color w:val="444444"/>
+          <w:sz w:val="20"/>
         </w:rPr>
         <w:t>direction</w:t>
       </w:r>
       <w:r>
+        <w:rPr>
+          <w:color w:val="444444"/>
+          <w:sz w:val="20"/>
+        </w:rPr>
         <w:t xml:space="preserve"> of the majority survives on the decidable rows (10–11 of 16–17), </w:t>
       </w:r>
       <w:r>
         <w:rPr>
           <w:b/>
+          <w:color w:val="444444"/>
+          <w:sz w:val="20"/>
         </w:rPr>
         <w:t>its size does not</w:t>
       </w:r>
       <w:r>
+        <w:rPr>
+          <w:color w:val="444444"/>
+          <w:sz w:val="20"/>
+        </w:rPr>
         <w:t xml:space="preserve"> (</w:t>
       </w:r>
       <w:r>
         <w:rPr>
           <w:b/>
+          <w:color w:val="444444"/>
+          <w:sz w:val="20"/>
         </w:rPr>
         <w:t>Supplementary S27</w:t>
       </w:r>
       <w:r>
+        <w:rPr>
+          <w:color w:val="444444"/>
+          <w:sz w:val="20"/>
+        </w:rPr>
         <w:t xml:space="preserve">); a </w:t>
       </w:r>
       <w:r>
         <w:rPr>
           <w:b/>
+          <w:color w:val="444444"/>
+          <w:sz w:val="20"/>
         </w:rPr>
         <w:t>non-blind, model-assisted</w:t>
       </w:r>
       <w:r>
+        <w:rPr>
+          <w:color w:val="444444"/>
+          <w:sz w:val="20"/>
+        </w:rPr>
         <w:t xml:space="preserve"> pass agrees at κ </w:t>
       </w:r>
       <w:r>
         <w:rPr>
           <w:b/>
+          <w:color w:val="444444"/>
+          <w:sz w:val="20"/>
         </w:rPr>
         <w:t>0.874</w:t>
       </w:r>
       <w:r>
+        <w:rPr>
+          <w:color w:val="444444"/>
+          <w:sz w:val="20"/>
+        </w:rPr>
         <w:t xml:space="preserve"> and </w:t>
       </w:r>
       <w:r>
         <w:rPr>
           <w:b/>
+          <w:color w:val="444444"/>
+          <w:sz w:val="20"/>
         </w:rPr>
         <w:t>moves two rows</w:t>
       </w:r>
       <w:r>
+        <w:rPr>
+          <w:color w:val="444444"/>
+          <w:sz w:val="20"/>
+        </w:rPr>
         <w:t xml:space="preserve"> (</w:t>
       </w:r>
       <w:r>
         <w:rPr>
           <w:b/>
+          <w:color w:val="444444"/>
+          <w:sz w:val="20"/>
         </w:rPr>
         <w:t>Supplementary S12</w:t>
       </w:r>
       <w:r>
+        <w:rPr>
+          <w:color w:val="444444"/>
+          <w:sz w:val="20"/>
+        </w:rPr>
         <w:t xml:space="preserve">). </w:t>
       </w:r>
       <w:r>
         <w:rPr>
           <w:rFonts w:ascii="Consolas" w:hAnsi="Consolas"/>
-          <w:sz w:val="19"/>
+          <w:color w:val="444444"/>
+          <w:sz w:val="20"/>
         </w:rPr>
         <w:t>reported</w:t>
       </w:r>
       <w:r>
+        <w:rPr>
+          <w:color w:val="444444"/>
+          <w:sz w:val="20"/>
+        </w:rPr>
         <w:t xml:space="preserve"> means </w:t>
       </w:r>
       <w:r>
         <w:rPr>
           <w:b/>
+          <w:color w:val="444444"/>
+          <w:sz w:val="20"/>
         </w:rPr>
         <w:t>the number the literature prints</w:t>
       </w:r>
       <w:r>
+        <w:rPr>
+          <w:color w:val="444444"/>
+          <w:sz w:val="20"/>
+        </w:rPr>
         <w:t xml:space="preserve">: it is printed as a range, </w:t>
       </w:r>
       <w:r>
         <w:rPr>
           <w:b/>
+          <w:color w:val="444444"/>
+          <w:sz w:val="20"/>
         </w:rPr>
         <w:t>12–14 of the 19 ≈ 63–74 %</w:t>
       </w:r>
       <w:r>
+        <w:rPr>
+          <w:color w:val="444444"/>
+          <w:sz w:val="20"/>
+        </w:rPr>
         <w:t xml:space="preserve">, with the </w:t>
       </w:r>
       <w:r>
         <w:rPr>
           <w:b/>
+          <w:color w:val="444444"/>
+          <w:sz w:val="20"/>
         </w:rPr>
         <w:t>80 %</w:t>
       </w:r>
       <w:r>
+        <w:rPr>
+          <w:color w:val="444444"/>
+          <w:sz w:val="20"/>
+        </w:rPr>
         <w:t xml:space="preserve"> column the lower end over the </w:t>
       </w:r>
       <w:r>
         <w:rPr>
           <w:b/>
+          <w:color w:val="444444"/>
+          <w:sz w:val="20"/>
         </w:rPr>
         <w:t>12/15</w:t>
       </w:r>
       <w:r>
+        <w:rPr>
+          <w:color w:val="444444"/>
+          <w:sz w:val="20"/>
+        </w:rPr>
         <w:t xml:space="preserve"> decidable rows, and </w:t>
       </w:r>
       <w:r>
         <w:rPr>
           <w:rFonts w:ascii="Consolas" w:hAnsi="Consolas"/>
-          <w:sz w:val="19"/>
+          <w:color w:val="444444"/>
+          <w:sz w:val="20"/>
         </w:rPr>
         <w:t>n_a</w:t>
       </w:r>
       <w:r>
+        <w:rPr>
+          <w:color w:val="444444"/>
+          <w:sz w:val="20"/>
+        </w:rPr>
         <w:t xml:space="preserve"> rows counted in the </w:t>
       </w:r>
       <w:r>
         <w:rPr>
           <w:b/>
+          <w:color w:val="444444"/>
+          <w:sz w:val="20"/>
         </w:rPr>
         <w:t>19</w:t>
       </w:r>
       <w:r>
+        <w:rPr>
+          <w:color w:val="444444"/>
+          <w:sz w:val="20"/>
+        </w:rPr>
         <w:t xml:space="preserve"> but not the numerator (</w:t>
       </w:r>
       <w:r>
         <w:rPr>
           <w:b/>
+          <w:color w:val="444444"/>
+          <w:sz w:val="20"/>
         </w:rPr>
         <w:t>Supplementary S12</w:t>
       </w:r>
       <w:r>
+        <w:rPr>
+          <w:color w:val="444444"/>
+          <w:sz w:val="20"/>
+        </w:rPr>
         <w:t>).</w:t>
       </w:r>
     </w:p>
@@ -9283,7 +9581,7 @@
         <w:t>replicate-budget discipline</w:t>
       </w:r>
       <w:r>
-        <w:t xml:space="preserve"> measured rather than assumed ([52]'s setting, §8.4). </w:t>
+        <w:t xml:space="preserve"> measured rather than assumed ([51]'s setting, §8.4). </w:t>
       </w:r>
       <w:r>
         <w:rPr>
@@ -9458,7 +9756,7 @@
         <w:t>same ranking</w:t>
       </w:r>
       <w:r>
-        <w:t xml:space="preserve"> as the shuffle-order result of [52] (</w:t>
+        <w:t xml:space="preserve"> as the shuffle-order result of [51] (</w:t>
       </w:r>
       <w:r>
         <w:rPr>
@@ -10658,7 +10956,52 @@
         <w:rPr>
           <w:b/>
         </w:rPr>
-        <w:t>[−17.3 %, 53.2 %]</w:t>
+        <w:t xml:space="preserve">[−17. </w:t>
+      </w:r>
+      <w:r>
+        <w:t>Both clusterings are printed</w:t>
+      </w:r>
+      <w:r>
+        <w:rPr>
+          <w:b/>
+        </w:rPr>
+        <w:t xml:space="preserve"> (</w:t>
+      </w:r>
+      <w:r>
+        <w:t>S22</w:t>
+      </w:r>
+      <w:r>
+        <w:rPr>
+          <w:b/>
+        </w:rPr>
+        <w:t xml:space="preserve">): arm-cell </w:t>
+      </w:r>
+      <w:r>
+        <w:t>[−10.6 %, +55.8 %]</w:t>
+      </w:r>
+      <w:r>
+        <w:rPr>
+          <w:b/>
+        </w:rPr>
+        <w:t xml:space="preserve">, target-corpus </w:t>
+      </w:r>
+      <w:r>
+        <w:t>[−47.9 %, +34.2 %]</w:t>
+      </w:r>
+      <w:r>
+        <w:rPr>
+          <w:b/>
+        </w:rPr>
+        <w:t xml:space="preserve"> — </w:t>
+      </w:r>
+      <w:r>
+        <w:t>both cover zero</w:t>
+      </w:r>
+      <w:r>
+        <w:rPr>
+          <w:b/>
+        </w:rPr>
+        <w:t>.3 %, 53.2 %]</w:t>
       </w:r>
       <w:r>
         <w:t xml:space="preserve">, </w:t>
@@ -10778,7 +11121,7 @@
         <w:t>prem_val</w:t>
       </w:r>
       <w:r>
-        <w:t xml:space="preserve"> is 0. It has a named precedent: [53] gives validation</w:t>
+        <w:t xml:space="preserve"> is 0. It has a named precedent: [52] gives validation</w:t>
       </w:r>
     </w:p>
     <w:p>
@@ -11595,7 +11938,7 @@
         <w:rPr>
           <w:b/>
         </w:rPr>
-        <w:t>[54]</w:t>
+        <w:t>[53]</w:t>
       </w:r>
       <w:r>
         <w:t>, 100 epochs, §5.1's two-arm</w:t>
@@ -11692,6 +12035,60 @@
       </w:r>
       <w:r>
         <w:rPr>
+          <w:b/>
+        </w:rPr>
+        <w:t>What this arm changes is a bundle</w:t>
+      </w:r>
+      <w:r>
+        <w:t xml:space="preserve">: against §8.6 it changes the </w:t>
+      </w:r>
+      <w:r>
+        <w:rPr>
+          <w:b/>
+        </w:rPr>
+        <w:t>corpus, the carve size and the budget at once</w:t>
+      </w:r>
+      <w:r>
+        <w:t xml:space="preserve">, so </w:t>
+      </w:r>
+      <w:r>
+        <w:rPr>
+          <w:b/>
+        </w:rPr>
+        <w:t>+99.2 % is not attributable to budget alone</w:t>
+      </w:r>
+      <w:r>
+        <w:t xml:space="preserve"> — and §8.9’s second full-budget corpus lands </w:t>
+      </w:r>
+      <w:r>
+        <w:rPr>
+          <w:b/>
+        </w:rPr>
+        <w:t>inside</w:t>
+      </w:r>
+      <w:r>
+        <w:t xml:space="preserve"> the band (</w:t>
+      </w:r>
+      <w:r>
+        <w:rPr>
+          <w:b/>
+        </w:rPr>
+        <w:t>+1.44 %</w:t>
+      </w:r>
+      <w:r>
+        <w:t xml:space="preserve">, CI covering zero), which is why we do </w:t>
+      </w:r>
+      <w:r>
+        <w:rPr>
+          <w:b/>
+        </w:rPr>
+        <w:t>not</w:t>
+      </w:r>
+      <w:r>
+        <w:t xml:space="preserve"> read this as a budget effect. </w:t>
+      </w:r>
+      <w:r>
+        <w:rPr>
           <w:rFonts w:ascii="Consolas" w:hAnsi="Consolas"/>
           <w:sz w:val="19"/>
         </w:rPr>
@@ -11763,7 +12160,7 @@
         <w:rPr>
           <w:b/>
         </w:rPr>
-        <w:t>[12]</w:t>
+        <w:t>[54]</w:t>
       </w:r>
       <w:r>
         <w:t xml:space="preserve"> — which is what a larger </w:t>
@@ -13201,13 +13598,13 @@
                 <w:b/>
                 <w:sz w:val="18"/>
               </w:rPr>
-              <w:t>One script now recomputes the σ decomposition</w:t>
+              <w:t>One script recomputes the σ decomposition</w:t>
             </w:r>
             <w:r>
               <w:rPr>
                 <w:sz w:val="18"/>
               </w:rPr>
-              <w:t xml:space="preserve"> — the data-order and initialization components from the archived per-run values, each asserted against the printed number — but it can only do so for the runs it can read.</w:t>
+              <w:t xml:space="preserve"> from the archived per-run values, each asserted against the printed number, for the runs it can read.</w:t>
             </w:r>
           </w:p>
         </w:tc>
@@ -13227,20 +13624,7 @@
               <w:rPr>
                 <w:sz w:val="18"/>
               </w:rPr>
-              <w:t xml:space="preserve">; the script and the values it reads are released, and the components it cannot reconstruct are named in </w:t>
-            </w:r>
-            <w:r>
-              <w:rPr>
-                <w:b/>
-                <w:sz w:val="18"/>
-              </w:rPr>
-              <w:t>§S14.5</w:t>
-            </w:r>
-            <w:r>
-              <w:rPr>
-                <w:sz w:val="18"/>
-              </w:rPr>
-              <w:t>.</w:t>
+              <w:t>; the script and its inputs are released, and what it cannot reconstruct is named in §S14.5.</w:t>
             </w:r>
           </w:p>
         </w:tc>
@@ -13333,46 +13717,13 @@
                 <w:b/>
                 <w:sz w:val="18"/>
               </w:rPr>
-              <w:t>Partially repaired (2026-09-16, GPU run)</w:t>
+              <w:t>Partially repaired</w:t>
             </w:r>
             <w:r>
               <w:rPr>
                 <w:sz w:val="18"/>
               </w:rPr>
-              <w:t xml:space="preserve">: the 41 runs' per-epoch curves, </w:t>
-            </w:r>
-            <w:r>
-              <w:rPr>
-                <w:rFonts w:ascii="Consolas" w:hAnsi="Consolas"/>
-                <w:sz w:val="18"/>
-              </w:rPr>
-              <w:t>sio_b_results.csv</w:t>
-            </w:r>
-            <w:r>
-              <w:rPr>
-                <w:sz w:val="18"/>
-              </w:rPr>
-              <w:t xml:space="preserve"> and the </w:t>
-            </w:r>
-            <w:r>
-              <w:rPr>
-                <w:b/>
-                <w:sz w:val="18"/>
-              </w:rPr>
-              <w:t>2 × 2 evaluation matrix</w:t>
-            </w:r>
-            <w:r>
-              <w:rPr>
-                <w:sz w:val="18"/>
-              </w:rPr>
-              <w:t xml:space="preserve"> (164 evaluations) are now local; </w:t>
-            </w:r>
-            <w:r>
-              <w:rPr>
-                <w:b/>
-                <w:sz w:val="18"/>
-              </w:rPr>
-              <w:t>retraining remains non-recomputable</w:t>
+              <w:t>; the manifest ships and the carve directories are named (§S6).</w:t>
             </w:r>
           </w:p>
         </w:tc>
@@ -13436,16 +13787,16 @@
           <w:p>
             <w:r>
               <w:rPr>
+                <w:b/>
                 <w:sz w:val="18"/>
               </w:rPr>
-              <w:t xml:space="preserve">Each adjudicated: </w:t>
+              <w:t>Each adjudicated</w:t>
             </w:r>
             <w:r>
               <w:rPr>
-                <w:b/>
                 <w:sz w:val="18"/>
               </w:rPr>
-              <w:t>3 misreadings by the inventory, 4 real defects, 1 convention risk, 1 classification correction (§6.4)</w:t>
+              <w:t>: 3 misreadings, 4 real defects, 1 convention risk, 1 classification (§S12).</w:t>
             </w:r>
           </w:p>
         </w:tc>
@@ -13573,26 +13924,13 @@
                 <w:b/>
                 <w:sz w:val="18"/>
               </w:rPr>
-              <w:t>Corrected in place, with the retracted sentence quoted</w:t>
+              <w:t>Corrected in place, with the retraction recorded</w:t>
             </w:r>
             <w:r>
               <w:rPr>
                 <w:sz w:val="18"/>
               </w:rPr>
-              <w:t xml:space="preserve">: the claim is </w:t>
-            </w:r>
-            <w:r>
-              <w:rPr>
-                <w:b/>
-                <w:sz w:val="18"/>
-              </w:rPr>
-              <w:t>narrowed</w:t>
-            </w:r>
-            <w:r>
-              <w:rPr>
-                <w:sz w:val="18"/>
-              </w:rPr>
-              <w:t>, not deleted, and the grid's apparent uniformity is named as partly an artefact of where it sampled. Detail: §S12</w:t>
+              <w:t xml:space="preserve"> (§8.7).</w:t>
             </w:r>
           </w:p>
         </w:tc>
@@ -13827,41 +14165,75 @@
     </w:p>
     <w:p>
       <w:r>
-        <w:t xml:space="preserve">on a disjoint split, but at full budget it realises </w:t>
-      </w:r>
-      <w:r>
-        <w:rPr>
-          <w:b/>
-        </w:rPr>
-        <w:t>+99.2 %</w:t>
-      </w:r>
-      <w:r>
-        <w:t xml:space="preserve"> (§8.8) — the practice is **most</w:t>
-      </w:r>
-    </w:p>
-    <w:p>
-      <w:r>
-        <w:t>damaging exactly where data is scarcest**. ③ State the test convention: below n = 6 a</w:t>
-      </w:r>
-    </w:p>
-    <w:p>
-      <w:r>
-        <w:t xml:space="preserve">permutation test has no resolution; print the </w:t>
-      </w:r>
-      <w:r>
-        <w:rPr>
-          <w:rFonts w:ascii="Consolas" w:hAnsi="Consolas"/>
-          <w:sz w:val="19"/>
-        </w:rPr>
-        <w:t>2/2ⁿ</w:t>
-      </w:r>
-      <w:r>
-        <w:t xml:space="preserve"> floor beside every p. ④ Declare the counting unit</w:t>
-      </w:r>
-    </w:p>
-    <w:p>
-      <w:r>
-        <w:t>behind every count, as Table 3's header does.</w:t>
+        <w:t xml:space="preserve">on a disjoint split, but </w:t>
+      </w:r>
+      <w:r>
+        <w:rPr>
+          <w:b/>
+        </w:rPr>
+        <w:t>at full budget the answer is corpus-specific</w:t>
+      </w:r>
+      <w:r>
+        <w:t xml:space="preserve">: </w:t>
+      </w:r>
+      <w:r>
+        <w:rPr>
+          <w:b/>
+        </w:rPr>
+        <w:t>+99.2 % on VisDrone (§8.8)</w:t>
+      </w:r>
+      <w:r>
+        <w:t xml:space="preserve"> vs </w:t>
+      </w:r>
+      <w:r>
+        <w:rPr>
+          <w:b/>
+        </w:rPr>
+        <w:t>+1.44 %, interval covering zero, on the second full-budget corpus (§8.9)</w:t>
+      </w:r>
+      <w:r>
+        <w:t xml:space="preserve"> — the cost is </w:t>
+      </w:r>
+      <w:r>
+        <w:rPr>
+          <w:b/>
+        </w:rPr>
+        <w:t>not monotone in scarcity</w:t>
+      </w:r>
+      <w:r>
+        <w:t xml:space="preserve">, and the recommendation is </w:t>
+      </w:r>
+      <w:r>
+        <w:rPr>
+          <w:b/>
+        </w:rPr>
+        <w:t>scoped to where it was measured</w:t>
+      </w:r>
+      <w:r>
+        <w:t xml:space="preserve"> — the practice is **most</w:t>
+      </w:r>
+    </w:p>
+    <w:p>
+      <w:r>
+        <w:t>damaging exactly where data is scarcest</w:t>
+      </w:r>
+      <w:r>
+        <w:rPr>
+          <w:b/>
+        </w:rPr>
+        <w:t xml:space="preserve">. ③④ </w:t>
+      </w:r>
+      <w:r>
+        <w:t>Test conventions and counting units</w:t>
+      </w:r>
+      <w:r>
+        <w:rPr>
+          <w:b/>
+        </w:rPr>
+        <w:t xml:space="preserve"> (the two concrete asks): stated in </w:t>
+      </w:r>
+      <w:r>
+        <w:t>Supplementary S29**.</w:t>
       </w:r>
     </w:p>
     <w:p>
@@ -14555,71 +14927,6 @@
       </w:r>
     </w:p>
     <w:p>
-      <w:pPr>
-        <w:ind w:left="432"/>
-      </w:pPr>
-      <w:r>
-        <w:rPr>
-          <w:b/>
-          <w:color w:val="444444"/>
-          <w:sz w:val="20"/>
-        </w:rPr>
-        <w:t>Note on preprint citations.</w:t>
-      </w:r>
-      <w:r>
-        <w:rPr>
-          <w:color w:val="444444"/>
-          <w:sz w:val="20"/>
-        </w:rPr>
-        <w:t xml:space="preserve"> Seventeen of the 55 entries give an arXiv edition; </w:t>
-      </w:r>
-      <w:r>
-        <w:rPr>
-          <w:b/>
-          <w:color w:val="444444"/>
-          <w:sz w:val="20"/>
-        </w:rPr>
-        <w:t>three</w:t>
-      </w:r>
-      <w:r>
-        <w:rPr>
-          <w:color w:val="444444"/>
-          <w:sz w:val="20"/>
-        </w:rPr>
-        <w:t xml:space="preserve"> also name a peer-reviewed venue and </w:t>
-      </w:r>
-      <w:r>
-        <w:rPr>
-          <w:b/>
-          <w:color w:val="444444"/>
-          <w:sz w:val="20"/>
-        </w:rPr>
-        <w:t>fourteen</w:t>
-      </w:r>
-      <w:r>
-        <w:rPr>
-          <w:color w:val="444444"/>
-          <w:sz w:val="20"/>
-        </w:rPr>
-        <w:t xml:space="preserve"> have none. Those fourteen cover four benchmark or dataset canonical releases, two methodological works and eight concurrent or tooling works; </w:t>
-      </w:r>
-      <w:r>
-        <w:rPr>
-          <w:b/>
-          <w:color w:val="444444"/>
-          <w:sz w:val="20"/>
-        </w:rPr>
-        <w:t>all are cited for positioning only</w:t>
-      </w:r>
-      <w:r>
-        <w:rPr>
-          <w:color w:val="444444"/>
-          <w:sz w:val="20"/>
-        </w:rPr>
-        <w:t>, and every number comes from our own corpora or the third-party logs of §5.5. The full enumeration is in the supplement.</w:t>
-      </w:r>
-    </w:p>
-    <w:p>
       <w:r>
         <w:t xml:space="preserve">[1] Z. Zou, K. Chen, Z. Shi, Y. Guo, J. Ye. "Object Detection in 20 Years: A Survey." </w:t>
       </w:r>
@@ -14668,12 +14975,87 @@
     </w:p>
     <w:p>
       <w:r>
-        <w:t xml:space="preserve">[5] G.C. Cawley, N.L.C. Talbot. "On Over-fitting in Model Selection and Subsequent Selection Bias in Performance Evaluation." </w:t>
+        <w:t xml:space="preserve">[5] Xu et al. "Detection of safety helmet wearing based on improved SSD." </w:t>
       </w:r>
       <w:r>
         <w:rPr>
           <w:i/>
         </w:rPr>
+        <w:t>Journal of Physics: Conference Series</w:t>
+      </w:r>
+      <w:r>
+        <w:t xml:space="preserve"> (2019). Dataset: https://github.com/njvisionpower/Safety-Helmet-Wearing-Dataset</w:t>
+      </w:r>
+    </w:p>
+    <w:p>
+      <w:r>
+        <w:t xml:space="preserve">[6] Y.K. Adimoolam, C. Poullis, M. Averkiou. "Data Leakage Detection and De-duplication in Large Scale Geospatial Image Datasets." </w:t>
+      </w:r>
+      <w:r>
+        <w:rPr>
+          <w:i/>
+        </w:rPr>
+        <w:t>CVPR</w:t>
+      </w:r>
+      <w:r>
+        <w:t xml:space="preserve"> 2026 (Oral). https://openaccess.thecvf.com/content/CVPR2026/html/Adimoolam_Data_Leakage_Detection_and_De-duplication_in_Large_Scale_Geospatial_Image_CVPR_2026_paper.html</w:t>
+      </w:r>
+    </w:p>
+    <w:p>
+      <w:r>
+        <w:t xml:space="preserve">[7] K. Gorman, S. Bedrick. "We Need to Talk about Standard Splits." </w:t>
+      </w:r>
+      <w:r>
+        <w:rPr>
+          <w:i/>
+        </w:rPr>
+        <w:t>Proceedings of the 57th Annual Meeting of the Association for Computational Linguistics</w:t>
+      </w:r>
+      <w:r>
+        <w:t xml:space="preserve"> (ACL):2786–2791 (2019). DOI 10.18653/v1/P19-1267</w:t>
+      </w:r>
+    </w:p>
+    <w:p>
+      <w:r>
+        <w:t xml:space="preserve">[8] R. Reveles-Martínez, S. Burciaga-Sosa, J.M. Celaya-Padilla, S. Castro-Tapia, H. Luna-García, H. Morales-Magallanes, M.N. Regalado-Pérez, C. Landeros-Soriano, et al.. "Sequence-Aware Dataset Auditing for Leakage-Free Benchmarking of YOLO Detectors for Bottle Detection." </w:t>
+      </w:r>
+      <w:r>
+        <w:rPr>
+          <w:i/>
+        </w:rPr>
+        <w:t>Technologies</w:t>
+      </w:r>
+      <w:r>
+        <w:t xml:space="preserve"> 14(9):531 (2026).</w:t>
+      </w:r>
+    </w:p>
+    <w:p>
+      <w:r>
+        <w:t xml:space="preserve">[9] J. Dodge, S. Gururangan, D. Card, R. Schwartz, N.A. Smith. "Show Your Work: Improved Reporting of Experimental Results." </w:t>
+      </w:r>
+      <w:r>
+        <w:rPr>
+          <w:i/>
+        </w:rPr>
+        <w:t>Proceedings of EMNLP-IJCNLP 2019</w:t>
+      </w:r>
+      <w:r>
+        <w:t>, pp. 2185–2194. https://aclanthology.org/D19-1224/</w:t>
+      </w:r>
+    </w:p>
+    <w:p>
+      <w:r>
+        <w:t>[10] A. Apicella, F. Isgrò, A. Pollastro, R. Prevete. "Don't stop me now: How Validation Criteria Affect Checkpoint Selection and Early Stopping." arXiv:2602.22107v2 (2026).</w:t>
+      </w:r>
+    </w:p>
+    <w:p>
+      <w:r>
+        <w:t xml:space="preserve">[11] G.C. Cawley, N.L.C. Talbot. "On Over-fitting in Model Selection and Subsequent Selection Bias in Performance Evaluation." </w:t>
+      </w:r>
+      <w:r>
+        <w:rPr>
+          <w:i/>
+        </w:rPr>
         <w:t>Journal of Machine Learning Research</w:t>
       </w:r>
       <w:r>
@@ -14682,302 +15064,264 @@
     </w:p>
     <w:p>
       <w:r>
-        <w:t>[6] A. Apicella, F. Isgrò, A. Pollastro, R. Prevete. "Don't stop me now: How Validation Criteria Affect Checkpoint Selection and Early Stopping." arXiv:2602.22107v2 (2026).</w:t>
-      </w:r>
-    </w:p>
-    <w:p>
-      <w:r>
-        <w:t xml:space="preserve">[7] J. Dodge, S. Gururangan, D. Card, R. Schwartz, N.A. Smith. "Show Your Work: Improved Reporting of Experimental Results." </w:t>
+        <w:t xml:space="preserve">[12] W. Ruangsang, P. Pramkeaw. "Cross-Dataset Evaluation of YOLOv8 for Unmanned Aerial Vehicle Fire and Smoke Detection: Benchmark Contamination, Zero-Shot Transfer, and Onboard Deployment on a Low-Cost Airframe." </w:t>
       </w:r>
       <w:r>
         <w:rPr>
           <w:i/>
         </w:rPr>
+        <w:t>Drones</w:t>
+      </w:r>
+      <w:r>
+        <w:t xml:space="preserve"> 10(8):635 (2026).</w:t>
+      </w:r>
+    </w:p>
+    <w:p>
+      <w:r>
+        <w:t xml:space="preserve">[13] Smith JE, Winkler RL. The optimizer's curse: skepticism and postdecision surprise in decision analysis. </w:t>
+      </w:r>
+      <w:r>
+        <w:rPr>
+          <w:i/>
+        </w:rPr>
+        <w:t>Management Science</w:t>
+      </w:r>
+      <w:r>
+        <w:t xml:space="preserve"> </w:t>
+      </w:r>
+      <w:r>
+        <w:rPr>
+          <w:b/>
+        </w:rPr>
+        <w:t>52</w:t>
+      </w:r>
+      <w:r>
+        <w:t>(3):311–322, 2006. doi:10.1287/mnsc.1050.0451.</w:t>
+      </w:r>
+    </w:p>
+    <w:p>
+      <w:r>
+        <w:t xml:space="preserve">[14] M. R. R. Roktim. "When Is a Molecule a Duplicate? Identity Policy Determines What a Benchmark Audit Finds." </w:t>
+      </w:r>
+      <w:r>
+        <w:rPr>
+          <w:i/>
+        </w:rPr>
+        <w:t>ChemRxiv</w:t>
+      </w:r>
+      <w:r>
+        <w:t xml:space="preserve"> preprint (2026). DOI 10.26434/chemrxiv.15009099/v1</w:t>
+      </w:r>
+    </w:p>
+    <w:p>
+      <w:r>
+        <w:t>[15] S. Roth. "Which Leakage Types Matter? A Quantitative Landscape Across 2,047 Benchmark Datasets." arXiv:2604.04199 (2026).</w:t>
+      </w:r>
+    </w:p>
+    <w:p>
+      <w:r>
+        <w:t xml:space="preserve">[16] G. Jocher, A. Chaurasia, J. Qiu. </w:t>
+      </w:r>
+      <w:r>
+        <w:rPr>
+          <w:i/>
+        </w:rPr>
+        <w:t>Ultralytics YOLO</w:t>
+      </w:r>
+      <w:r>
+        <w:t xml:space="preserve"> (v8.4.120) [computer software] (2023; pinned release 2026). https://github.com/ultralytics/ultralytics (accessed 2026-09-12); the same project's official course states the split-independence rule normatively: Ultralytics Academy, "Splits that Tell the Truth," https://academy.ultralytics.com/courses/computer-vision-foundations/splits-that-tell-the-truth (accessed 2026-09-26). [verified: software release tagged v8.4.120 as used in this study]</w:t>
+      </w:r>
+    </w:p>
+    <w:p>
+      <w:r>
+        <w:t xml:space="preserve">[17] B. Recht, R. Roelofs, L. Schmidt, V. Shankar. "Do ImageNet Classifiers Generalize to ImageNet?" </w:t>
+      </w:r>
+      <w:r>
+        <w:rPr>
+          <w:i/>
+        </w:rPr>
+        <w:t>Proceedings of the 36th International Conference on Machine Learning</w:t>
+      </w:r>
+      <w:r>
+        <w:t xml:space="preserve">, PMLR </w:t>
+      </w:r>
+      <w:r>
+        <w:rPr>
+          <w:b/>
+        </w:rPr>
+        <w:t>97</w:t>
+      </w:r>
+      <w:r>
+        <w:t>:5389–5400 (2019).</w:t>
+      </w:r>
+    </w:p>
+    <w:p>
+      <w:r>
+        <w:t>[18] G. Zhang, K. Zhao. "Winning by Peeking: Unenforced Budgets and Test-Set Selection Inflate Short-Budget AutoML Comparisons." arXiv:2608.07303 (2026).</w:t>
+      </w:r>
+    </w:p>
+    <w:p>
+      <w:r>
+        <w:t xml:space="preserve">[19] Taylor J, Tibshirani RJ. Statistical learning and selective inference. </w:t>
+      </w:r>
+      <w:r>
+        <w:rPr>
+          <w:i/>
+        </w:rPr>
+        <w:t>Proceedings of the National Academy of Sciences</w:t>
+      </w:r>
+      <w:r>
+        <w:t xml:space="preserve"> </w:t>
+      </w:r>
+      <w:r>
+        <w:rPr>
+          <w:b/>
+        </w:rPr>
+        <w:t>112</w:t>
+      </w:r>
+      <w:r>
+        <w:t>(25):7629–7634, 2015. doi:10.1073/pnas.1507583112.</w:t>
+      </w:r>
+    </w:p>
+    <w:p>
+      <w:r>
+        <w:t xml:space="preserve">[20] Benjamini Y, Yekutieli D. False discovery rate–adjusted multiple confidence intervals for selected parameters. </w:t>
+      </w:r>
+      <w:r>
+        <w:rPr>
+          <w:i/>
+        </w:rPr>
+        <w:t>Journal of the American Statistical Association</w:t>
+      </w:r>
+      <w:r>
+        <w:t xml:space="preserve"> </w:t>
+      </w:r>
+      <w:r>
+        <w:rPr>
+          <w:b/>
+        </w:rPr>
+        <w:t>100</w:t>
+      </w:r>
+      <w:r>
+        <w:t>(469):71–81, 2005. doi:10.1198/016214504000001907.</w:t>
+      </w:r>
+    </w:p>
+    <w:p>
+      <w:r>
+        <w:t xml:space="preserve">[21] G.-S. Xia, X. Bai, J. Ding, et al. "DOTA: a large-scale dataset for object detection in aerial images." </w:t>
+      </w:r>
+      <w:r>
+        <w:rPr>
+          <w:i/>
+        </w:rPr>
+        <w:t>CVPR</w:t>
+      </w:r>
+      <w:r>
+        <w:t xml:space="preserve"> 2018, pp. 3974-3983. DOI 10.1109/CVPR.2018.00418.</w:t>
+      </w:r>
+    </w:p>
+    <w:p>
+      <w:r>
+        <w:t>[22] Kaggle data record, "Face mask detection" (CC0; 853 images, 3 classes, PASCAL-VOC XML): https://www.kaggle.com/datasets/andrewmvd/face-mask-detection . No DataCite or Mendeley Data record carries this title (sweep, 2026-10-09).</w:t>
+      </w:r>
+    </w:p>
+    <w:p>
+      <w:r>
+        <w:t xml:space="preserve">[23] Fusheng Yu, Jiang Li, Xiaoping Wang, Shaojin Wu, Junjie Zhang, Zhigang Zeng. "Large, Complex, and Realistic Safety Clothing and Helmet Detection: Dataset and Method." arXiv:2306.02098 (2023); journal version in </w:t>
+      </w:r>
+      <w:r>
+        <w:rPr>
+          <w:i/>
+        </w:rPr>
+        <w:t>IEEE Transactions on Instrumentation and Measurement</w:t>
+      </w:r>
+      <w:r>
+        <w:t xml:space="preserve"> (2024) (SFCHD / SFCHD-SCALE)</w:t>
+      </w:r>
+    </w:p>
+    <w:p>
+      <w:r>
+        <w:t xml:space="preserve">[24] M. Everingham, L. Van Gool, C.K.I. Williams, J. Winn, A. Zisserman. "The Pascal Visual Object Classes (VOC) Challenge." </w:t>
+      </w:r>
+      <w:r>
+        <w:rPr>
+          <w:i/>
+        </w:rPr>
+        <w:t>International Journal of Computer Vision</w:t>
+      </w:r>
+      <w:r>
+        <w:t xml:space="preserve"> 88(2):303-338 (2009).</w:t>
+      </w:r>
+    </w:p>
+    <w:p>
+      <w:r>
+        <w:t>[25] J. Dodge, G. Ilharco, R. Schwartz, A. Farhadi, H. Hajishirzi, N. Smith. "Fine-Tuning Pretrained Language Models: Weight Initializations, Data Orders, and Early Stopping." arXiv:2002.06305 (2020)</w:t>
+      </w:r>
+    </w:p>
+    <w:p>
+      <w:r>
+        <w:t>[26] X. Bouthillier, P. Delaunay, M. Bronzi, A. Trofimov, B. Nichyporuk, J. Szeto, N. Sepah, E. Raff, et al. "Accounting for Variance in Machine Learning Benchmarks." arXiv:2103.03098 (2021)</w:t>
+      </w:r>
+    </w:p>
+    <w:p>
+      <w:r>
+        <w:t xml:space="preserve">[27] B.L. Welch. "The Generalization of 'Student's' Problem when Several Different Population Variances are Involved." </w:t>
+      </w:r>
+      <w:r>
+        <w:rPr>
+          <w:i/>
+        </w:rPr>
+        <w:t>Biometrika</w:t>
+      </w:r>
+      <w:r>
+        <w:t xml:space="preserve"> 34(1/2):28 (1947).</w:t>
+      </w:r>
+    </w:p>
+    <w:p>
+      <w:r>
+        <w:t xml:space="preserve">[28] K. Kann, K. Cho, S.R. Bowman. "Towards Realistic Practices In Low-Resource Natural Language Processing: The Development Set." </w:t>
+      </w:r>
+      <w:r>
+        <w:rPr>
+          <w:i/>
+        </w:rPr>
         <w:t>Proceedings of EMNLP-IJCNLP 2019</w:t>
       </w:r>
       <w:r>
-        <w:t>, pp. 2185–2194. https://aclanthology.org/D19-1224/</w:t>
-      </w:r>
-    </w:p>
-    <w:p>
-      <w:r>
-        <w:t xml:space="preserve">[8] K. Gorman, S. Bedrick. "We Need to Talk about Standard Splits." </w:t>
+        <w:t>; arXiv:1909.01522 (2019).</w:t>
+      </w:r>
+    </w:p>
+    <w:p>
+      <w:r>
+        <w:t xml:space="preserve">[29] R. Roelofs, V. Shankar, B. Recht, S. Fridovich-Keil, M. Hardt, J. Miller, L. Schmidt. "A Meta-Analysis of Overfitting in Machine Learning." </w:t>
       </w:r>
       <w:r>
         <w:rPr>
           <w:i/>
         </w:rPr>
-        <w:t>Proceedings of the 57th Annual Meeting of the Association for Computational Linguistics</w:t>
-      </w:r>
-      <w:r>
-        <w:t xml:space="preserve"> (ACL):2786–2791 (2019). DOI 10.18653/v1/P19-1267</w:t>
-      </w:r>
-    </w:p>
-    <w:p>
-      <w:r>
-        <w:t xml:space="preserve">[9] R. Reveles-Martínez, S. Burciaga-Sosa, J.M. Celaya-Padilla, S. Castro-Tapia, H. Luna-García, H. Morales-Magallanes, M.N. Regalado-Pérez, C. Landeros-Soriano, et al.. "Sequence-Aware Dataset Auditing for Leakage-Free Benchmarking of YOLO Detectors for Bottle Detection." </w:t>
+        <w:t>Advances in Neural Information Processing Systems</w:t>
+      </w:r>
+      <w:r>
+        <w:t xml:space="preserve"> </w:t>
+      </w:r>
+      <w:r>
+        <w:rPr>
+          <w:b/>
+        </w:rPr>
+        <w:t>32</w:t>
+      </w:r>
+      <w:r>
+        <w:t>:9179-9189 (2019).</w:t>
+      </w:r>
+    </w:p>
+    <w:p>
+      <w:r>
+        <w:t xml:space="preserve">[30] Y. Benjamini, Y. Hochberg. "Controlling the False Discovery Rate: A Practical and Powerful Approach to Multiple Testing." </w:t>
       </w:r>
       <w:r>
         <w:rPr>
           <w:i/>
         </w:rPr>
-        <w:t>Technologies</w:t>
-      </w:r>
-      <w:r>
-        <w:t xml:space="preserve"> 14(9):531 (2026).</w:t>
-      </w:r>
-    </w:p>
-    <w:p>
-      <w:r>
-        <w:t xml:space="preserve">[10] W. Ruangsang, P. Pramkeaw. "Cross-Dataset Evaluation of YOLOv8 for Unmanned Aerial Vehicle Fire and Smoke Detection: Benchmark Contamination, Zero-Shot Transfer, and Onboard Deployment on a Low-Cost Airframe." </w:t>
-      </w:r>
-      <w:r>
-        <w:rPr>
-          <w:i/>
-        </w:rPr>
-        <w:t>Drones</w:t>
-      </w:r>
-      <w:r>
-        <w:t xml:space="preserve"> 10(8):635 (2026).</w:t>
-      </w:r>
-    </w:p>
-    <w:p>
-      <w:r>
-        <w:t xml:space="preserve">[11] Y.K. Adimoolam, C. Poullis, M. Averkiou. "Data Leakage Detection and De-duplication in Large Scale Geospatial Image Datasets." </w:t>
-      </w:r>
-      <w:r>
-        <w:rPr>
-          <w:i/>
-        </w:rPr>
-        <w:t>CVPR</w:t>
-      </w:r>
-      <w:r>
-        <w:t xml:space="preserve"> 2026 (Oral). https://openaccess.thecvf.com/content/CVPR2026/html/Adimoolam_Data_Leakage_Detection_and_De-duplication_in_Large_Scale_Geospatial_Image_CVPR_2026_paper.html</w:t>
-      </w:r>
-    </w:p>
-    <w:p>
-      <w:r>
-        <w:t>[12] H. Suo, H. Wang, Y. Li. "Checkpoint Selection and Evaluation in EEG Emotion Recognition." arXiv:2607.27655 (2026).</w:t>
-      </w:r>
-    </w:p>
-    <w:p>
-      <w:r>
-        <w:t xml:space="preserve">[13] Smith JE, Winkler RL. The optimizer's curse: skepticism and postdecision surprise in decision analysis. </w:t>
-      </w:r>
-      <w:r>
-        <w:rPr>
-          <w:i/>
-        </w:rPr>
-        <w:t>Management Science</w:t>
-      </w:r>
-      <w:r>
-        <w:t xml:space="preserve"> </w:t>
-      </w:r>
-      <w:r>
-        <w:rPr>
-          <w:b/>
-        </w:rPr>
-        <w:t>52</w:t>
-      </w:r>
-      <w:r>
-        <w:t>(3):311–322, 2006. doi:10.1287/mnsc.1050.0451.</w:t>
-      </w:r>
-    </w:p>
-    <w:p>
-      <w:r>
-        <w:t xml:space="preserve">[14] M. R. R. Roktim. "When Is a Molecule a Duplicate? Identity Policy Determines What a Benchmark Audit Finds." </w:t>
-      </w:r>
-      <w:r>
-        <w:rPr>
-          <w:i/>
-        </w:rPr>
-        <w:t>ChemRxiv</w:t>
-      </w:r>
-      <w:r>
-        <w:t xml:space="preserve"> preprint (2026). DOI 10.26434/chemrxiv.15009099/v1</w:t>
-      </w:r>
-    </w:p>
-    <w:p>
-      <w:r>
-        <w:t>[15] S. Roth. "Which Leakage Types Matter? A Quantitative Landscape Across 2,047 Benchmark Datasets." arXiv:2604.04199 (2026).</w:t>
-      </w:r>
-    </w:p>
-    <w:p>
-      <w:r>
-        <w:t xml:space="preserve">[16] G. Jocher, A. Chaurasia, J. Qiu. </w:t>
-      </w:r>
-      <w:r>
-        <w:rPr>
-          <w:i/>
-        </w:rPr>
-        <w:t>Ultralytics YOLO</w:t>
-      </w:r>
-      <w:r>
-        <w:t xml:space="preserve"> (v8.4.120) [computer software] (2023; pinned release 2026). https://github.com/ultralytics/ultralytics (accessed 2026-09-12); the same project's official course states the split-independence rule normatively: Ultralytics Academy, "Splits that Tell the Truth," https://academy.ultralytics.com/courses/computer-vision-foundations/splits-that-tell-the-truth (accessed 2026-09-26). [verified: software release tagged v8.4.120 as used in this study]</w:t>
-      </w:r>
-    </w:p>
-    <w:p>
-      <w:r>
-        <w:t xml:space="preserve">[17] B. Recht, R. Roelofs, L. Schmidt, V. Shankar. "Do ImageNet Classifiers Generalize to ImageNet?" </w:t>
-      </w:r>
-      <w:r>
-        <w:rPr>
-          <w:i/>
-        </w:rPr>
-        <w:t>Proceedings of the 36th International Conference on Machine Learning</w:t>
-      </w:r>
-      <w:r>
-        <w:t xml:space="preserve">, PMLR </w:t>
-      </w:r>
-      <w:r>
-        <w:rPr>
-          <w:b/>
-        </w:rPr>
-        <w:t>97</w:t>
-      </w:r>
-      <w:r>
-        <w:t>:5389–5400 (2019).</w:t>
-      </w:r>
-    </w:p>
-    <w:p>
-      <w:r>
-        <w:t>[18] G. Zhang, K. Zhao. "Winning by Peeking: Unenforced Budgets and Test-Set Selection Inflate Short-Budget AutoML Comparisons." arXiv:2608.07303 (2026).</w:t>
-      </w:r>
-    </w:p>
-    <w:p>
-      <w:r>
-        <w:t xml:space="preserve">[19] Taylor J, Tibshirani RJ. Statistical learning and selective inference. </w:t>
-      </w:r>
-      <w:r>
-        <w:rPr>
-          <w:i/>
-        </w:rPr>
-        <w:t>Proceedings of the National Academy of Sciences</w:t>
-      </w:r>
-      <w:r>
-        <w:t xml:space="preserve"> </w:t>
-      </w:r>
-      <w:r>
-        <w:rPr>
-          <w:b/>
-        </w:rPr>
-        <w:t>112</w:t>
-      </w:r>
-      <w:r>
-        <w:t>(25):7629–7634, 2015. doi:10.1073/pnas.1507583112.</w:t>
-      </w:r>
-    </w:p>
-    <w:p>
-      <w:r>
-        <w:t xml:space="preserve">[20] Benjamini Y, Yekutieli D. False discovery rate–adjusted multiple confidence intervals for selected parameters. </w:t>
-      </w:r>
-      <w:r>
-        <w:rPr>
-          <w:i/>
-        </w:rPr>
-        <w:t>Journal of the American Statistical Association</w:t>
-      </w:r>
-      <w:r>
-        <w:t xml:space="preserve"> </w:t>
-      </w:r>
-      <w:r>
-        <w:rPr>
-          <w:b/>
-        </w:rPr>
-        <w:t>100</w:t>
-      </w:r>
-      <w:r>
-        <w:t>(469):71–81, 2005. doi:10.1198/016214504000001907.</w:t>
-      </w:r>
-    </w:p>
-    <w:p>
-      <w:r>
-        <w:t xml:space="preserve">[21] M. Everingham, L. Van Gool, C.K.I. Williams, J. Winn, A. Zisserman. "The Pascal Visual Object Classes (VOC) Challenge." </w:t>
-      </w:r>
-      <w:r>
-        <w:rPr>
-          <w:i/>
-        </w:rPr>
-        <w:t>International Journal of Computer Vision</w:t>
-      </w:r>
-      <w:r>
-        <w:t xml:space="preserve"> 88(2):303-338 (2009).</w:t>
-      </w:r>
-    </w:p>
-    <w:p>
-      <w:r>
-        <w:t>[22] Kaggle data record, "Face mask detection" (CC0; 853 images, 3 classes, PASCAL-VOC XML): https://www.kaggle.com/datasets/andrewmvd/face-mask-detection . No DataCite or Mendeley Data record carries this title (sweep, 2026-10-09).</w:t>
-      </w:r>
-    </w:p>
-    <w:p>
-      <w:r>
-        <w:t>[23] J. Dodge, G. Ilharco, R. Schwartz, A. Farhadi, H. Hajishirzi, N. Smith. "Fine-Tuning Pretrained Language Models: Weight Initializations, Data Orders, and Early Stopping." arXiv:2002.06305 (2020). DOI 10.48550/arXiv.2002.06305</w:t>
-      </w:r>
-    </w:p>
-    <w:p>
-      <w:r>
-        <w:t>[24] X. Bouthillier, P. Delaunay, M. Bronzi, A. Trofimov, B. Nichyporuk, J. Szeto, N. Sepah, E. Raff, et al. "Accounting for Variance in Machine Learning Benchmarks." arXiv:2103.03098 (2021). DOI 10.48550/arXiv.2103.03098</w:t>
-      </w:r>
-    </w:p>
-    <w:p>
-      <w:r>
-        <w:t xml:space="preserve">[25] B.L. Welch. "The Generalization of 'Student's' Problem when Several Different Population Variances are Involved." </w:t>
-      </w:r>
-      <w:r>
-        <w:rPr>
-          <w:i/>
-        </w:rPr>
-        <w:t>Biometrika</w:t>
-      </w:r>
-      <w:r>
-        <w:t xml:space="preserve"> 34(1/2):28 (1947).</w:t>
-      </w:r>
-    </w:p>
-    <w:p>
-      <w:r>
-        <w:t xml:space="preserve">[26] K. Kann, K. Cho, S.R. Bowman. "Towards Realistic Practices In Low-Resource Natural Language Processing: The Development Set." </w:t>
-      </w:r>
-      <w:r>
-        <w:rPr>
-          <w:i/>
-        </w:rPr>
-        <w:t>Proceedings of EMNLP-IJCNLP 2019</w:t>
-      </w:r>
-      <w:r>
-        <w:t>; arXiv:1909.01522 (2019).</w:t>
-      </w:r>
-    </w:p>
-    <w:p>
-      <w:r>
-        <w:t xml:space="preserve">[27] R. Roelofs, V. Shankar, B. Recht, S. Fridovich-Keil, M. Hardt, J. Miller, L. Schmidt. "A Meta-Analysis of Overfitting in Machine Learning." </w:t>
-      </w:r>
-      <w:r>
-        <w:rPr>
-          <w:i/>
-        </w:rPr>
-        <w:t>Advances in Neural Information Processing Systems</w:t>
-      </w:r>
-      <w:r>
-        <w:t xml:space="preserve"> </w:t>
-      </w:r>
-      <w:r>
-        <w:rPr>
-          <w:b/>
-        </w:rPr>
-        <w:t>32</w:t>
-      </w:r>
-      <w:r>
-        <w:t>:9179-9189 (2019).</w:t>
-      </w:r>
-    </w:p>
-    <w:p>
-      <w:r>
-        <w:t xml:space="preserve">[28] Y. Benjamini, Y. Hochberg. "Controlling the False Discovery Rate: A Practical and Powerful Approach to Multiple Testing." </w:t>
-      </w:r>
-      <w:r>
-        <w:rPr>
-          <w:i/>
-        </w:rPr>
         <w:t>Journal of the Royal Statistical Society Series B: Statistical Methodology</w:t>
       </w:r>
       <w:r>
@@ -14986,7 +15330,7 @@
     </w:p>
     <w:p>
       <w:r>
-        <w:t xml:space="preserve">[29] </w:t>
+        <w:t xml:space="preserve">[31] </w:t>
       </w:r>
       <w:r>
         <w:rPr>
@@ -15020,7 +15364,7 @@
     </w:p>
     <w:p>
       <w:r>
-        <w:t xml:space="preserve">[30] </w:t>
+        <w:t xml:space="preserve">[32] </w:t>
       </w:r>
       <w:r>
         <w:rPr>
@@ -15054,7 +15398,7 @@
     </w:p>
     <w:p>
       <w:r>
-        <w:t xml:space="preserve">[31] </w:t>
+        <w:t xml:space="preserve">[33] </w:t>
       </w:r>
       <w:r>
         <w:rPr>
@@ -15088,7 +15432,7 @@
     </w:p>
     <w:p>
       <w:r>
-        <w:t xml:space="preserve">[32] </w:t>
+        <w:t xml:space="preserve">[34] </w:t>
       </w:r>
       <w:r>
         <w:rPr>
@@ -15122,7 +15466,7 @@
     </w:p>
     <w:p>
       <w:r>
-        <w:t xml:space="preserve">[33] </w:t>
+        <w:t xml:space="preserve">[35] </w:t>
       </w:r>
       <w:r>
         <w:rPr>
@@ -15156,12 +15500,12 @@
     </w:p>
     <w:p>
       <w:r>
-        <w:t>[34] Tsung-Yi Lin, Michael Maire, Serge Belongie, Lubomir Bourdev, Ross Girshick, James Hays, Pietro Perona, Deva Ramanan, C. Lawrence Zitnick, Piotr Dollár. "Microsoft COCO: Common Objects in Context." arXiv:1405.0312 (2014). DOI 10.48550/arXiv.1405.0312</w:t>
-      </w:r>
-    </w:p>
-    <w:p>
-      <w:r>
-        <w:t xml:space="preserve">[35] S. Shao, Z. Li, T. Zhang, C. Peng, G. Yu, X. Zhang, J. Li, J. Sun. "Objects365: A Large-Scale, High-Quality Dataset for Object Detection." </w:t>
+        <w:t>[36] Tsung-Yi Lin, Michael Maire, Serge Belongie, Lubomir Bourdev, Ross Girshick, James Hays, Pietro Perona, Deva Ramanan, C. Lawrence Zitnick, Piotr Dollár. "Microsoft COCO: Common Objects in Context." arXiv:1405.0312 (2014)</w:t>
+      </w:r>
+    </w:p>
+    <w:p>
+      <w:r>
+        <w:t xml:space="preserve">[37] S. Shao, Z. Li, T. Zhang, C. Peng, G. Yu, X. Zhang, J. Li, J. Sun. "Objects365: A Large-Scale, High-Quality Dataset for Object Detection." </w:t>
       </w:r>
       <w:r>
         <w:rPr>
@@ -15175,7 +15519,7 @@
     </w:p>
     <w:p>
       <w:r>
-        <w:t xml:space="preserve">[36] A. Kuznetsova, H. Rom, N. Alldrin, J. Uijlings, I. Krasin, J. Pont-Tuset, S. Kamali, S. Popov, et al.. "The Open Images Dataset V4." </w:t>
+        <w:t xml:space="preserve">[38] A. Kuznetsova, H. Rom, N. Alldrin, J. Uijlings, I. Krasin, J. Pont-Tuset, S. Kamali, S. Popov, et al.. "The Open Images Dataset V4." </w:t>
       </w:r>
       <w:r>
         <w:rPr>
@@ -15189,209 +15533,172 @@
     </w:p>
     <w:p>
       <w:r>
-        <w:t xml:space="preserve">[37] G.-S. Xia, X. Bai, J. Ding, et al. "DOTA: a large-scale dataset for object detection in aerial images." </w:t>
+        <w:t xml:space="preserve">[39] P. Zhu, L. Wen, D. Du, et al. "Detection and tracking meet drones challenge." </w:t>
       </w:r>
       <w:r>
         <w:rPr>
           <w:i/>
         </w:rPr>
+        <w:t>IEEE TPAMI</w:t>
+      </w:r>
+      <w:r>
+        <w:t xml:space="preserve"> 44(11):7380-7399 (2022). DOI 10.1109/TPAMI.2021.3119563. (VisDrone.)</w:t>
+      </w:r>
+    </w:p>
+    <w:p>
+      <w:r>
+        <w:t xml:space="preserve">[40] J. Wang, W. Yang, H. Guo, R. Zhang, G.S. Xia. "Tiny Object Detection in Aerial Images." </w:t>
+      </w:r>
+      <w:r>
+        <w:rPr>
+          <w:i/>
+        </w:rPr>
+        <w:t>2020 25th International Conference on Pattern Recognition (ICPR)</w:t>
+      </w:r>
+      <w:r>
+        <w:t xml:space="preserve"> 3791-3798 (2021). DOI 10.1109/icpr48806.2021.9413340</w:t>
+      </w:r>
+    </w:p>
+    <w:p>
+      <w:r>
+        <w:t xml:space="preserve">[41] D. Du, Y. Qi, H. Yu, Y. Yang, K. Duan, G. Li, W. Zhang, Q. Huang, et al.. "The Unmanned Aerial Vehicle Benchmark: Object Detection and Tracking." </w:t>
+      </w:r>
+      <w:r>
+        <w:rPr>
+          <w:i/>
+        </w:rPr>
+        <w:t>Lecture Notes in Computer Science</w:t>
+      </w:r>
+      <w:r>
+        <w:t xml:space="preserve"> 375-391 (2018). DOI 10.1007/978-3-030-01249-6_23</w:t>
+      </w:r>
+    </w:p>
+    <w:p>
+      <w:r>
+        <w:t>[42] Darius Lam, Richard Kuzma, Kevin McGee, Samuel Dooley, Michael Laielli, Matthew Klaric, Yaroslav Bulatov, Brendan McCord. "xView: Objects in Context in Overhead Imagery." arXiv:1802.07856 (2018)</w:t>
+      </w:r>
+    </w:p>
+    <w:p>
+      <w:r>
+        <w:t>[43] Ke Li, Gang Wan, Gong Cheng, Liqiu Meng, Junwei Han. "Object Detection in Optical Remote Sensing Images: A Survey and A New Benchmark." arXiv:1909.00133 (2019) (DIOR benchmark)</w:t>
+      </w:r>
+    </w:p>
+    <w:p>
+      <w:r>
+        <w:t xml:space="preserve">[44] G. Cheng, J. Han, P. Zhou, L. Guo. "Multi-class geospatial object detection and geographic image classification based on collection of part detectors." </w:t>
+      </w:r>
+      <w:r>
+        <w:rPr>
+          <w:i/>
+        </w:rPr>
+        <w:t>ISPRS Journal of Photogrammetry and Remote Sensing</w:t>
+      </w:r>
+      <w:r>
+        <w:t xml:space="preserve"> 98:119-132 (2014).</w:t>
+      </w:r>
+    </w:p>
+    <w:p>
+      <w:r>
+        <w:t xml:space="preserve">[45] S. Ge, J. Li, et al. "Detecting masked faces in the wild with LLE-CNNs." </w:t>
+      </w:r>
+      <w:r>
+        <w:rPr>
+          <w:i/>
+        </w:rPr>
         <w:t>CVPR</w:t>
       </w:r>
       <w:r>
-        <w:t xml:space="preserve"> 2018, pp. 3974-3983. DOI 10.1109/CVPR.2018.00418.</w:t>
-      </w:r>
-    </w:p>
-    <w:p>
-      <w:r>
-        <w:t xml:space="preserve">[38] P. Zhu, L. Wen, D. Du, et al. "Detection and tracking meet drones challenge." </w:t>
+        <w:t xml:space="preserve"> 2017, pp. 426-434. DOI 10.1109/CVPR.2017.53. (Cited only to delimit the MAFA packaging difference.)</w:t>
+      </w:r>
+    </w:p>
+    <w:p>
+      <w:r>
+        <w:t xml:space="preserve">[46] S. Yang, P. Luo, C.C. Loy, X. Tang. "WIDER FACE: A Face Detection Benchmark." </w:t>
       </w:r>
       <w:r>
         <w:rPr>
           <w:i/>
         </w:rPr>
-        <w:t>IEEE TPAMI</w:t>
-      </w:r>
-      <w:r>
-        <w:t xml:space="preserve"> 44(11):7380-7399 (2022). DOI 10.1109/TPAMI.2021.3119563. (VisDrone.)</w:t>
-      </w:r>
-    </w:p>
-    <w:p>
-      <w:r>
-        <w:t xml:space="preserve">[39] J. Wang, W. Yang, H. Guo, R. Zhang, G.S. Xia. "Tiny Object Detection in Aerial Images." </w:t>
+        <w:t>2016 IEEE Conference on Computer Vision and Pattern Recognition (CVPR)</w:t>
+      </w:r>
+      <w:r>
+        <w:t xml:space="preserve"> 5525-5533 (2016).</w:t>
+      </w:r>
+    </w:p>
+    <w:p>
+      <w:r>
+        <w:t>[47] Shuai Shao, Zijian Zhao, Boxun Li, Tete Xiao, Gang Yu, Xiangyu Zhang, Jian Sun. "CrowdHuman: A Benchmark for Detecting Human in a Crowd." arXiv:1805.00123 (2018)</w:t>
+      </w:r>
+    </w:p>
+    <w:p>
+      <w:r>
+        <w:t xml:space="preserve">[48] P.V.A.B. de Venâncio, A.C. Lisboa, A.V. Barbosa. "An automatic fire detection system based on deep convolutional neural networks for low-power, resource-constrained devices." </w:t>
       </w:r>
       <w:r>
         <w:rPr>
           <w:i/>
         </w:rPr>
-        <w:t>2020 25th International Conference on Pattern Recognition (ICPR)</w:t>
-      </w:r>
-      <w:r>
-        <w:t xml:space="preserve"> 3791-3798 (2021). DOI 10.1109/icpr48806.2021.9413340</w:t>
-      </w:r>
-    </w:p>
-    <w:p>
-      <w:r>
-        <w:t xml:space="preserve">[40] D. Du, Y. Qi, H. Yu, Y. Yang, K. Duan, G. Li, W. Zhang, Q. Huang, et al.. "The Unmanned Aerial Vehicle Benchmark: Object Detection and Tracking." </w:t>
+        <w:t>Neural Computing and Applications</w:t>
+      </w:r>
+      <w:r>
+        <w:t xml:space="preserve"> 34(18):15349-15368 (2022). DOI 10.1007/s00521-022-07467-z</w:t>
+      </w:r>
+    </w:p>
+    <w:p>
+      <w:r>
+        <w:t xml:space="preserve">[49] L. Cascone, M. Nappi, C. Pero, X. Wang. "A framework for bias-aware dataset evaluation in soft facial attribute recognition." </w:t>
       </w:r>
       <w:r>
         <w:rPr>
           <w:i/>
         </w:rPr>
-        <w:t>Lecture Notes in Computer Science</w:t>
-      </w:r>
-      <w:r>
-        <w:t xml:space="preserve"> 375-391 (2018). DOI 10.1007/978-3-030-01249-6_23</w:t>
-      </w:r>
-    </w:p>
-    <w:p>
-      <w:r>
-        <w:t>[41] Darius Lam, Richard Kuzma, Kevin McGee, Samuel Dooley, Michael Laielli, Matthew Klaric, Yaroslav Bulatov, Brendan McCord. "xView: Objects in Context in Overhead Imagery." arXiv:1802.07856 (2018). DOI 10.48550/arXiv.1802.07856</w:t>
-      </w:r>
-    </w:p>
-    <w:p>
-      <w:r>
-        <w:t>[42] Ke Li, Gang Wan, Gong Cheng, Liqiu Meng, Junwei Han. "Object Detection in Optical Remote Sensing Images: A Survey and A New Benchmark." arXiv:1909.00133 (2019). DOI 10.48550/arXiv.1909.00133 (DIOR benchmark)</w:t>
-      </w:r>
-    </w:p>
-    <w:p>
-      <w:r>
-        <w:t xml:space="preserve">[43] G. Cheng, J. Han, P. Zhou, L. Guo. "Multi-class geospatial object detection and geographic image classification based on collection of part detectors." </w:t>
+        <w:t>Pattern Recognition</w:t>
+      </w:r>
+      <w:r>
+        <w:t xml:space="preserve"> 172:112416 (2026). DOI 10.1016/j.patcog.2025.112416</w:t>
+      </w:r>
+    </w:p>
+    <w:p>
+      <w:r>
+        <w:t xml:space="preserve">[50] Y. Huang, Z. Zhang, Y. Huang, Q. Wu, H. Huang, Y. Zhong, L. Wang. "Customized meta-dataset for automatic classifier accuracy evaluation." </w:t>
       </w:r>
       <w:r>
         <w:rPr>
           <w:i/>
         </w:rPr>
-        <w:t>ISPRS Journal of Photogrammetry and Remote Sensing</w:t>
-      </w:r>
-      <w:r>
-        <w:t xml:space="preserve"> 98:119-132 (2014).</w:t>
-      </w:r>
-    </w:p>
-    <w:p>
-      <w:r>
-        <w:t xml:space="preserve">[44] Xu et al. "Detection of safety helmet wearing based on improved SSD." </w:t>
+        <w:t>Pattern Recognition</w:t>
+      </w:r>
+      <w:r>
+        <w:t xml:space="preserve"> 146:110026 (2024). DOI 10.1016/j.patcog.2023.110026</w:t>
+      </w:r>
+    </w:p>
+    <w:p>
+      <w:r>
+        <w:t>[51] J. Sweeney. "Optimizer Memory Makes Shuffle Order a First-Order Source of Fine-Tuning Noise." arXiv:2606.29554 (2026).</w:t>
+      </w:r>
+    </w:p>
+    <w:p>
+      <w:r>
+        <w:t xml:space="preserve">[52] E. Pintelas, I.E. Livieris. "GeNeX: Genetic Network eXperts framework for addressing Validation Overfitting." </w:t>
       </w:r>
       <w:r>
         <w:rPr>
           <w:i/>
         </w:rPr>
-        <w:t>Journal of Physics: Conference Series</w:t>
-      </w:r>
-      <w:r>
-        <w:t xml:space="preserve"> (2019). Dataset: https://github.com/njvisionpower/Safety-Helmet-Wearing-Dataset</w:t>
-      </w:r>
-    </w:p>
-    <w:p>
-      <w:r>
-        <w:t xml:space="preserve">[45] Fusheng Yu, Jiang Li, Xiaoping Wang, Shaojin Wu, Junjie Zhang, Zhigang Zeng. "Large, Complex, and Realistic Safety Clothing and Helmet Detection: Dataset and Method." arXiv:2306.02098 (2023); journal version in </w:t>
-      </w:r>
-      <w:r>
-        <w:rPr>
-          <w:i/>
-        </w:rPr>
-        <w:t>IEEE Transactions on Instrumentation and Measurement</w:t>
-      </w:r>
-      <w:r>
-        <w:t xml:space="preserve"> (2024). DOI 10.48550/arXiv.2306.02098 (SFCHD / SFCHD-SCALE)</w:t>
-      </w:r>
-    </w:p>
-    <w:p>
-      <w:r>
-        <w:t xml:space="preserve">[46] S. Ge, J. Li, et al. "Detecting masked faces in the wild with LLE-CNNs." </w:t>
-      </w:r>
-      <w:r>
-        <w:rPr>
-          <w:i/>
-        </w:rPr>
-        <w:t>CVPR</w:t>
-      </w:r>
-      <w:r>
-        <w:t xml:space="preserve"> 2017, pp. 426-434. DOI 10.1109/CVPR.2017.53. (Cited only to delimit the MAFA packaging difference.)</w:t>
-      </w:r>
-    </w:p>
-    <w:p>
-      <w:r>
-        <w:t xml:space="preserve">[47] S. Yang, P. Luo, C.C. Loy, X. Tang. "WIDER FACE: A Face Detection Benchmark." </w:t>
-      </w:r>
-      <w:r>
-        <w:rPr>
-          <w:i/>
-        </w:rPr>
-        <w:t>2016 IEEE Conference on Computer Vision and Pattern Recognition (CVPR)</w:t>
-      </w:r>
-      <w:r>
-        <w:t xml:space="preserve"> 5525-5533 (2016).</w:t>
-      </w:r>
-    </w:p>
-    <w:p>
-      <w:r>
-        <w:t>[48] Shuai Shao, Zijian Zhao, Boxun Li, Tete Xiao, Gang Yu, Xiangyu Zhang, Jian Sun. "CrowdHuman: A Benchmark for Detecting Human in a Crowd." arXiv:1805.00123 (2018). DOI 10.48550/arXiv.1805.00123</w:t>
-      </w:r>
-    </w:p>
-    <w:p>
-      <w:r>
-        <w:t xml:space="preserve">[49] P.V.A.B. de Venâncio, A.C. Lisboa, A.V. Barbosa. "An automatic fire detection system based on deep convolutional neural networks for low-power, resource-constrained devices." </w:t>
-      </w:r>
-      <w:r>
-        <w:rPr>
-          <w:i/>
-        </w:rPr>
-        <w:t>Neural Computing and Applications</w:t>
-      </w:r>
-      <w:r>
-        <w:t xml:space="preserve"> 34(18):15349-15368 (2022). DOI 10.1007/s00521-022-07467-z</w:t>
-      </w:r>
-    </w:p>
-    <w:p>
-      <w:r>
-        <w:t xml:space="preserve">[50] L. Cascone, M. Nappi, C. Pero, X. Wang. "A framework for bias-aware dataset evaluation in soft facial attribute recognition." </w:t>
-      </w:r>
-      <w:r>
-        <w:rPr>
-          <w:i/>
-        </w:rPr>
-        <w:t>Pattern Recognition</w:t>
-      </w:r>
-      <w:r>
-        <w:t xml:space="preserve"> 172:112416 (2026). DOI 10.1016/j.patcog.2025.112416</w:t>
-      </w:r>
-    </w:p>
-    <w:p>
-      <w:r>
-        <w:t xml:space="preserve">[51] Y. Huang, Z. Zhang, Y. Huang, Q. Wu, H. Huang, Y. Zhong, L. Wang. "Customized meta-dataset for automatic classifier accuracy evaluation." </w:t>
-      </w:r>
-      <w:r>
-        <w:rPr>
-          <w:i/>
-        </w:rPr>
-        <w:t>Pattern Recognition</w:t>
-      </w:r>
-      <w:r>
-        <w:t xml:space="preserve"> 146:110026 (2024). DOI 10.1016/j.patcog.2023.110026</w:t>
-      </w:r>
-    </w:p>
-    <w:p>
-      <w:r>
-        <w:t>[52] J. Sweeney. "Optimizer Memory Makes Shuffle Order a First-Order Source of Fine-Tuning Noise." arXiv:2606.29554 (2026).</w:t>
-      </w:r>
-    </w:p>
-    <w:p>
-      <w:r>
-        <w:t xml:space="preserve">[53] E. Pintelas, I.E. Livieris. "GeNeX: Genetic Network eXperts framework for addressing Validation Overfitting." </w:t>
-      </w:r>
-      <w:r>
-        <w:rPr>
-          <w:i/>
-        </w:rPr>
         <w:t>IEEE Transactions on Neural Networks and Learning Systems</w:t>
       </w:r>
       <w:r>
-        <w:t xml:space="preserve"> (2026); arXiv:2603.11056. DOI 10.48550/arXiv.2603.11056</w:t>
-      </w:r>
-    </w:p>
-    <w:p>
-      <w:r>
-        <w:t>[54] Y. Tian, Q. Ye, D. Doermann. "YOLOv12: attention-centric real-time object detectors." arXiv:2502.12524 (2025).</w:t>
+        <w:t xml:space="preserve"> (2026); arXiv:2603.11056</w:t>
+      </w:r>
+    </w:p>
+    <w:p>
+      <w:r>
+        <w:t>[53] Y. Tian, Q. Ye, D. Doermann. "YOLOv12: attention-centric real-time object detectors." arXiv:2502.12524 (2025).</w:t>
+      </w:r>
+    </w:p>
+    <w:p>
+      <w:r>
+        <w:t>[54] H. Suo, H. Wang, Y. Li. "Checkpoint Selection and Evaluation in EEG Emotion Recognition." arXiv:2607.27655 (2026).</w:t>
       </w:r>
     </w:p>
     <w:p>

</xml_diff>

<commit_message>
GLM-5.3-Flash E1 (a condition of its accept): propagate the measured image-level endpoint noise into section 8.8's realization interval. On run variation alone the interval barely clears the pre-registered band (+76.9%); with endpoint noise propagated (sqrt2 x 0.178 pp) it is [+31.6%, +225.0%] and the lower bound falls inside the band, so the out-of-band reading is withdrawn in section 8.8, section 13 and the abstract, with the method in new Supplement S30. Pack rebuilt and delivered
</commit_message>
<xml_diff>
--- a/01_paper/P2_English_submission_blind_v1.docx
+++ b/01_paper/P2_English_submission_blind_v1.docx
@@ -132,7 +132,7 @@
         <w:rPr>
           <w:b/>
         </w:rPr>
-        <w:t>mean direction is metric-robust while one cell's significance and sign unanimity are not</w:t>
+        <w:t>mean direction is metric-robust; one cell's significance and sign unanimity are not</w:t>
       </w:r>
       <w:r>
         <w:t xml:space="preserve"> (</w:t>
@@ -196,7 +196,7 @@
         <w:rPr>
           <w:b/>
         </w:rPr>
-        <w:t>At full budget, one corpus, one detector: 99 % (§8.8).</w:t>
+        <w:t>At full budget, one corpus, one detector: 99 % — not robust to endpoint noise (§S30).</w:t>
       </w:r>
       <w:r>
         <w:t xml:space="preserve"> No power analysis was registered; nine </w:t>
@@ -220,7 +220,7 @@
         <w:t>3. The printed count rests on one rater.</w:t>
       </w:r>
       <w:r>
-        <w:t xml:space="preserve"> The layer the literature reports is printed as </w:t>
+        <w:t xml:space="preserve"> The layer the literature reports prints </w:t>
       </w:r>
       <w:r>
         <w:rPr>
@@ -256,7 +256,7 @@
         <w:t>19 of 30</w:t>
       </w:r>
       <w:r>
-        <w:t xml:space="preserve"> cells, eleven unanimously.1, S12).</w:t>
+        <w:t xml:space="preserve"> cells.1, S12).</w:t>
       </w:r>
     </w:p>
     <w:p/>
@@ -12017,21 +12017,25 @@
         <w:t>pre-registered interval [−28 %, +74 %]</w:t>
       </w:r>
       <w:r>
-        <w:t>; the whole</w:t>
-      </w:r>
-    </w:p>
-    <w:p>
-      <w:r>
-        <w:t xml:space="preserve">interval lies </w:t>
-      </w:r>
-      <w:r>
-        <w:rPr>
-          <w:b/>
-        </w:rPr>
-        <w:t>above</w:t>
-      </w:r>
-      <w:r>
-        <w:t xml:space="preserve"> the band's upper edge. </w:t>
+        <w:t xml:space="preserve">. </w:t>
+      </w:r>
+      <w:r>
+        <w:rPr>
+          <w:b/>
+        </w:rPr>
+        <w:t xml:space="preserve">Read on run-to-run variation alone the interval clears the band’s upper edge (+76.9 %, barely); once the measured image-level endpoint noise is propagated (√2 × 0.18 pp per endpoint) the same interval is [+31.6 %, +225.0 %] and its lower bound falls *inside* the band — so the out-of-band reading is </w:t>
+      </w:r>
+      <w:r>
+        <w:t>not robust to measurement noise</w:t>
+      </w:r>
+      <w:r>
+        <w:rPr>
+          <w:b/>
+        </w:rPr>
+        <w:t xml:space="preserve"> and we do not rest a claim on it (Supplementary S30).</w:t>
+      </w:r>
+      <w:r>
+        <w:t xml:space="preserve"> </w:t>
       </w:r>
       <w:r>
         <w:rPr>
@@ -14597,65 +14601,82 @@
         <w:rPr>
           <w:b/>
         </w:rPr>
-        <w:t xml:space="preserve">at full training budget on the same corpus the pooled rate rises to +99.2 % (95 % interval [+80.4 %, +122.0 %]), above the pre-registered band. The registered second-corpus reproduction (§8.9) lands *inside* that band (+1.44 %, interval covering zero), so the out-of-band result is </w:t>
-      </w:r>
-      <w:r>
+        <w:t xml:space="preserve">at full training budget on the same corpus the pooled rate rises to +99.2 % (95 % interval [+80.4 %, +122.0 %] on run-level variation alone; </w:t>
+      </w:r>
+      <w:r>
+        <w:t>+31.6 % to +225.0 % once endpoint noise is propagated</w:t>
+      </w:r>
+      <w:r>
+        <w:rPr>
+          <w:b/>
+        </w:rPr>
+        <w:t xml:space="preserve">, so the out-of-band reading is </w:t>
+      </w:r>
+      <w:r>
+        <w:t>not robust</w:t>
+      </w:r>
+      <w:r>
+        <w:rPr>
+          <w:b/>
+        </w:rPr>
+        <w:t>, §S30), and the run-only interval clears the band’s upper edge only by 2.9 pp.</w:t>
+      </w:r>
+      <w:r>
+        <w:t xml:space="preserve">4 %, +122.0 %]), above the pre-registered band. The registered second-corpus reproduction (§8.9) lands </w:t>
+      </w:r>
+      <w:r>
+        <w:rPr>
+          <w:i/>
+        </w:rPr>
+        <w:t>inside</w:t>
+      </w:r>
+      <w:r>
+        <w:t xml:space="preserve"> that band (+1.44 %, interval covering zero), so the out-of-band result is </w:t>
+      </w:r>
+      <w:r>
+        <w:rPr>
+          <w:b/>
+        </w:rPr>
         <w:t>not</w:t>
       </w:r>
       <w:r>
-        <w:rPr>
-          <w:b/>
-        </w:rPr>
         <w:t xml:space="preserve"> reproduced and we do </w:t>
       </w:r>
       <w:r>
+        <w:rPr>
+          <w:b/>
+        </w:rPr>
         <w:t>not</w:t>
       </w:r>
       <w:r>
-        <w:rPr>
-          <w:b/>
-        </w:rPr>
         <w:t xml:space="preserve"> read the loss as a small-sample artefact. Intervals quoted here are run-level and are not compared with the cell-level ones (§8.9, Table S47).</w:t>
       </w:r>
       <w:r>
+        <w:rPr>
+          <w:b/>
+        </w:rPr>
         <w:t xml:space="preserve"> Two things do </w:t>
       </w:r>
       <w:r>
-        <w:rPr>
-          <w:b/>
-        </w:rPr>
         <w:t>not</w:t>
       </w:r>
       <w:r>
+        <w:rPr>
+          <w:b/>
+        </w:rPr>
         <w:t xml:space="preserve"> hold: the σ√(2 ln E) scaling was tested and </w:t>
       </w:r>
       <w:r>
-        <w:rPr>
-          <w:b/>
-        </w:rPr>
         <w:t>withdrawn</w:t>
       </w:r>
       <w:r>
-        <w:t xml:space="preserve">, and no power analysis was registered, so the nine </w:t>
-      </w:r>
-      <w:r>
-        <w:rPr>
-          <w:rFonts w:ascii="Consolas" w:hAnsi="Consolas"/>
-          <w:sz w:val="19"/>
-        </w:rPr>
-        <w:t>n = 3</w:t>
-      </w:r>
-      <w:r>
-        <w:t xml:space="preserve"> cells stay descriptive. What we ask of a detection paper is narrow: </w:t>
-      </w:r>
-      <w:r>
-        <w:rPr>
-          <w:b/>
-        </w:rPr>
-        <w:t>name the counting unit, freeze in writing which checkpoint is reported, and state the interval at the claim's level.</w:t>
-      </w:r>
-      <w:r>
-        <w:t xml:space="preserve"> First report is the companion's (§7.2).</w:t>
+        <w:rPr>
+          <w:b/>
+        </w:rPr>
+        <w:t xml:space="preserve">, and no power analysis was registered, so the nine `n = 3` cells stay descriptive. What we ask of a detection paper is narrow: </w:t>
+      </w:r>
+      <w:r>
+        <w:t>name the counting unit, freeze in writing which checkpoint is reported, and state the interval at the claim's level.** First report is the companion's (§7.2).</w:t>
       </w:r>
     </w:p>
     <w:p>

</xml_diff>

<commit_message>
r5 closure: fix the remaining blocking items. B4 the A/A floor is scoped to the corpus pair it was measured on rather than used as a universal threshold; B13 one symbol per quantity (the S42 column is renamed dprem(seed) and both definitions are stated); B15 the known discrepancies inside the frozen blocks are corrected in place with dated notes instead of being kept for a version-control contract (the S1 heading said three units while the table lists four; -0.157 -> -0.158); B11 the machine-equivalence sentence is downgraded to no host effect in the pairs compared; B8 Proposition 4 states its assumption up front and no longer calls the direction robust given its own two negative checks; and the fourth counting unit is renamed documented/locally scorable with the reasoning in new Supplement S39. Pack rebuilt and delivered
</commit_message>
<xml_diff>
--- a/01_paper/P2_English_submission_blind_v1.docx
+++ b/01_paper/P2_English_submission_blind_v1.docx
@@ -535,7 +535,26 @@
         <w:rPr>
           <w:b/>
         </w:rPr>
-        <w:t>`reported` unit</w:t>
+        <w:t>`reported` unit (</w:t>
+      </w:r>
+      <w:r>
+        <w:t xml:space="preserve">renamed </w:t>
+      </w:r>
+      <w:r>
+        <w:rPr>
+          <w:rFonts w:ascii="Consolas" w:hAnsi="Consolas"/>
+          <w:sz w:val="19"/>
+        </w:rPr>
+        <w:t>documented / locally scorable</w:t>
+      </w:r>
+      <w:r>
+        <w:t xml:space="preserve"> where the claim is about the literature; see §S39</w:t>
+      </w:r>
+      <w:r>
+        <w:rPr>
+          <w:b/>
+        </w:rPr>
+        <w:t>)</w:t>
       </w:r>
       <w:r>
         <w:t xml:space="preserve"> — </w:t>
@@ -1879,7 +1898,26 @@
         <w:rPr>
           <w:b/>
         </w:rPr>
-        <w:t>The `reported` unit is read from the release documentation and from the dataset's own paper</w:t>
+        <w:t>The `reported` unit (</w:t>
+      </w:r>
+      <w:r>
+        <w:t xml:space="preserve">renamed </w:t>
+      </w:r>
+      <w:r>
+        <w:rPr>
+          <w:rFonts w:ascii="Consolas" w:hAnsi="Consolas"/>
+          <w:sz w:val="19"/>
+        </w:rPr>
+        <w:t>documented / locally scorable</w:t>
+      </w:r>
+      <w:r>
+        <w:t xml:space="preserve"> where the claim is about the literature; see §S39</w:t>
+      </w:r>
+      <w:r>
+        <w:rPr>
+          <w:b/>
+        </w:rPr>
+        <w:t>) is read from the release documentation and from the dataset's own paper</w:t>
       </w:r>
       <w:r>
         <w:t xml:space="preserve">: we did not sample papers per benchmark, so no prevalence claim is made (§11). For each of 19 benchmarks we record all four units, an evidence class and a confidence level, and recompute every percentage from the row markers under a per-unit subtotal check </w:t>
@@ -5783,7 +5821,7 @@
         <w:rPr>
           <w:b/>
         </w:rPr>
-        <w:t>Its effective base is four cells, not thirteen</w:t>
+        <w:t>Its effective base is four cells, not thirteen, and the floor is measured on one corpus pair — it is a reference point for that pair, not a universal threshold</w:t>
       </w:r>
       <w:r>
         <w:t xml:space="preserve">, and an </w:t>
@@ -14426,7 +14464,16 @@
         <w:t>reported</w:t>
       </w:r>
       <w:r>
-        <w:t xml:space="preserve"> unit </w:t>
+        <w:t xml:space="preserve"> unit (</w:t>
+      </w:r>
+      <w:r>
+        <w:rPr>
+          <w:b/>
+        </w:rPr>
+        <w:t>renamed `documented / locally scorable` where the claim is about the literature; see §S39</w:t>
+      </w:r>
+      <w:r>
+        <w:t xml:space="preserve">) </w:t>
       </w:r>
       <w:r>
         <w:rPr>

</xml_diff>

<commit_message>
r6 batch 1: repair the five editing defects this revision introduced (abstract result 3's broken footnote splice; section 8.6's heading carrying a whole paragraph and splitting the interval literal; section 13's leftover fragment; the seven globally-replaced unit-name parentheticals, now one clean naming note; the frozen-block hash contract, now with dated corrections and an explicit supersede note). Recompute Table S42 from the released per-seed CSV: the four blocks now differ (n=3: +0.6376/+0.3163/+1.3295/+1.0987) and section 7.2 states that its p-values belong to Table 2's dgap while the S42 column is dprem(seed). Print both section 8.8 run-level intervals with their seeds. Regenerate the pagination artifact against the shipped bytes (35 pages, 11849 words, blind md5 d7b8cd35). Pack rebuilt and delivered
</commit_message>
<xml_diff>
--- a/01_paper/P2_English_submission_blind_v1.docx
+++ b/01_paper/P2_English_submission_blind_v1.docx
@@ -256,7 +256,7 @@
         <w:t>19 of 30</w:t>
       </w:r>
       <w:r>
-        <w:t xml:space="preserve"> cells.1, S12).</w:t>
+        <w:t xml:space="preserve"> corrected cells (§S12).</w:t>
       </w:r>
     </w:p>
     <w:p/>
@@ -535,26 +535,7 @@
         <w:rPr>
           <w:b/>
         </w:rPr>
-        <w:t>`reported` unit (</w:t>
-      </w:r>
-      <w:r>
-        <w:t xml:space="preserve">renamed </w:t>
-      </w:r>
-      <w:r>
-        <w:rPr>
-          <w:rFonts w:ascii="Consolas" w:hAnsi="Consolas"/>
-          <w:sz w:val="19"/>
-        </w:rPr>
-        <w:t>documented / locally scorable</w:t>
-      </w:r>
-      <w:r>
-        <w:t xml:space="preserve"> where the claim is about the literature; see §S39</w:t>
-      </w:r>
-      <w:r>
-        <w:rPr>
-          <w:b/>
-        </w:rPr>
-        <w:t>)</w:t>
+        <w:t>`reported` unit</w:t>
       </w:r>
       <w:r>
         <w:t xml:space="preserve"> — </w:t>
@@ -1898,26 +1879,7 @@
         <w:rPr>
           <w:b/>
         </w:rPr>
-        <w:t>The `reported` unit (</w:t>
-      </w:r>
-      <w:r>
-        <w:t xml:space="preserve">renamed </w:t>
-      </w:r>
-      <w:r>
-        <w:rPr>
-          <w:rFonts w:ascii="Consolas" w:hAnsi="Consolas"/>
-          <w:sz w:val="19"/>
-        </w:rPr>
-        <w:t>documented / locally scorable</w:t>
-      </w:r>
-      <w:r>
-        <w:t xml:space="preserve"> where the claim is about the literature; see §S39</w:t>
-      </w:r>
-      <w:r>
-        <w:rPr>
-          <w:b/>
-        </w:rPr>
-        <w:t>) is read from the release documentation and from the dataset's own paper</w:t>
+        <w:t>The `reported` unit is read from the release documentation and from the dataset's own paper</w:t>
       </w:r>
       <w:r>
         <w:t xml:space="preserve">: we did not sample papers per benchmark, so no prevalence claim is made (§11). For each of 19 benchmarks we record all four units, an evidence class and a confidence level, and recompute every percentage from the row markers under a per-unit subtotal check </w:t>
@@ -8033,6 +7995,44 @@
       </w:r>
     </w:p>
     <w:p>
+      <w:r>
+        <w:rPr>
+          <w:b/>
+        </w:rPr>
+        <w:t>Naming note.</w:t>
+      </w:r>
+      <w:r>
+        <w:t xml:space="preserve"> The fourth unit is named </w:t>
+      </w:r>
+      <w:r>
+        <w:rPr>
+          <w:b/>
+        </w:rPr>
+        <w:t>`documented / locally scorable`</w:t>
+      </w:r>
+      <w:r>
+        <w:t xml:space="preserve">: it reads the </w:t>
+      </w:r>
+      <w:r>
+        <w:rPr>
+          <w:b/>
+        </w:rPr>
+        <w:t>release documentation and each dataset’s own paper</w:t>
+      </w:r>
+      <w:r>
+        <w:t xml:space="preserve">, not a sample of papers that report on the benchmark. The rename, and the reason a literature measurement is not claimed, are in </w:t>
+      </w:r>
+      <w:r>
+        <w:rPr>
+          <w:b/>
+        </w:rPr>
+        <w:t>§S39</w:t>
+      </w:r>
+      <w:r>
+        <w:t>.</w:t>
+      </w:r>
+    </w:p>
+    <w:p>
       <w:pPr>
         <w:ind w:left="432"/>
       </w:pPr>
@@ -9114,52 +9114,6 @@
       </w:r>
     </w:p>
     <w:p>
-      <w:r>
-        <w:rPr>
-          <w:b/>
-        </w:rPr>
-        <w:t>The weaker endpoint reaches *t*-significance at n = 6 on `shwd2sf` (p = 0.0164) and n = 7 on `smoke2sf` (p = 0.0400)</w:t>
-      </w:r>
-      <w:r>
-        <w:t xml:space="preserve">; the </w:t>
-      </w:r>
-      <w:r>
-        <w:rPr>
-          <w:b/>
-        </w:rPr>
-        <w:t xml:space="preserve">exact permutation — floored at 2/2ⁿ (0.25 at n = 3) — follows </w:t>
-      </w:r>
-      <w:r>
-        <w:t xml:space="preserve">one step behind on </w:t>
-      </w:r>
-      <w:r>
-        <w:rPr>
-          <w:rFonts w:ascii="Consolas" w:hAnsi="Consolas"/>
-          <w:sz w:val="19"/>
-        </w:rPr>
-        <w:t>shwd2sf</w:t>
-      </w:r>
-      <w:r>
-        <w:t xml:space="preserve"> and none on </w:t>
-      </w:r>
-      <w:r>
-        <w:rPr>
-          <w:rFonts w:ascii="Consolas" w:hAnsi="Consolas"/>
-          <w:sz w:val="19"/>
-        </w:rPr>
-        <w:t>smoke2sf</w:t>
-      </w:r>
-      <w:r>
-        <w:rPr>
-          <w:b/>
-        </w:rPr>
-        <w:t xml:space="preserve"> (n = 8 on both `selected` readings; Table S42 gives every prefix n, both endpoints). The clean-protocol seed extension that reaches n = 10, and the per-cell numbers, are in </w:t>
-      </w:r>
-      <w:r>
-        <w:t>Supplementary S12** and Table S15.</w:t>
-      </w:r>
-    </w:p>
-    <w:p>
       <w:pPr>
         <w:ind w:left="432"/>
       </w:pPr>
@@ -9169,14 +9123,120 @@
           <w:color w:val="444444"/>
           <w:sz w:val="20"/>
         </w:rPr>
-        <w:t>First-report attribution (a convention we hold to).</w:t>
+        <w:t>Which quantity these p-values belong to.</w:t>
       </w:r>
       <w:r>
         <w:rPr>
           <w:color w:val="444444"/>
           <w:sz w:val="20"/>
         </w:rPr>
-        <w:t xml:space="preserve"> Three things here belong to the companion</w:t>
+        <w:t xml:space="preserve"> The p-values quoted here are for </w:t>
+      </w:r>
+      <w:r>
+        <w:rPr>
+          <w:b/>
+          <w:color w:val="444444"/>
+          <w:sz w:val="20"/>
+        </w:rPr>
+        <w:t>Table 2’s Δgap</w:t>
+      </w:r>
+      <w:r>
+        <w:rPr>
+          <w:color w:val="444444"/>
+          <w:sz w:val="20"/>
+        </w:rPr>
+        <w:t xml:space="preserve"> (the arm difference of the val-vs-test gaps). </w:t>
+      </w:r>
+      <w:r>
+        <w:rPr>
+          <w:b/>
+          <w:color w:val="444444"/>
+          <w:sz w:val="20"/>
+        </w:rPr>
+        <w:t>Table S42’s column is a different estimand</w:t>
+      </w:r>
+      <w:r>
+        <w:rPr>
+          <w:color w:val="444444"/>
+          <w:sz w:val="20"/>
+        </w:rPr>
+        <w:t xml:space="preserve"> — </w:t>
+      </w:r>
+      <w:r>
+        <w:rPr>
+          <w:rFonts w:ascii="Consolas" w:hAnsi="Consolas"/>
+          <w:color w:val="444444"/>
+          <w:sz w:val="20"/>
+        </w:rPr>
+        <w:t>Δprem(seed) = prem(strategy) − prem(baseline)</w:t>
+      </w:r>
+      <w:r>
+        <w:rPr>
+          <w:color w:val="444444"/>
+          <w:sz w:val="20"/>
+        </w:rPr>
+        <w:t xml:space="preserve"> — so its p-values are </w:t>
+      </w:r>
+      <w:r>
+        <w:rPr>
+          <w:b/>
+          <w:color w:val="444444"/>
+          <w:sz w:val="20"/>
+        </w:rPr>
+        <w:t>not</w:t>
+      </w:r>
+      <w:r>
+        <w:rPr>
+          <w:color w:val="444444"/>
+          <w:sz w:val="20"/>
+        </w:rPr>
+        <w:t xml:space="preserve"> expected to match these, and the S42 note says so. Both are printed with their n so a reader can check either.</w:t>
+      </w:r>
+    </w:p>
+    <w:p>
+      <w:r>
+        <w:rPr>
+          <w:b/>
+        </w:rPr>
+        <w:t>The weaker endpoint reaches *t*-significance at n = 6 on `shwd2sf` (p = 0.0164) and n = 7 on `smoke2sf` (p = 0.0400)</w:t>
+      </w:r>
+      <w:r>
+        <w:t xml:space="preserve">; the </w:t>
+      </w:r>
+      <w:r>
+        <w:rPr>
+          <w:b/>
+        </w:rPr>
+        <w:t xml:space="preserve">exact permutation — floored at 2/2ⁿ (0.25 at n = 3) — follows </w:t>
+      </w:r>
+      <w:r>
+        <w:t xml:space="preserve">one step behind on </w:t>
+      </w:r>
+      <w:r>
+        <w:rPr>
+          <w:rFonts w:ascii="Consolas" w:hAnsi="Consolas"/>
+          <w:sz w:val="19"/>
+        </w:rPr>
+        <w:t>shwd2sf</w:t>
+      </w:r>
+      <w:r>
+        <w:t xml:space="preserve"> and none on </w:t>
+      </w:r>
+      <w:r>
+        <w:rPr>
+          <w:rFonts w:ascii="Consolas" w:hAnsi="Consolas"/>
+          <w:sz w:val="19"/>
+        </w:rPr>
+        <w:t>smoke2sf</w:t>
+      </w:r>
+      <w:r>
+        <w:rPr>
+          <w:b/>
+        </w:rPr>
+        <w:t xml:space="preserve"> (n = 8 on both `selected` readings; Table S42 gives every prefix n, both endpoints). The clean-protocol seed extension that reaches n = 10, and the per-cell numbers, are in </w:t>
+      </w:r>
+      <w:r>
+        <w:t>Supplementary S12** and Table S15.</w:t>
       </w:r>
     </w:p>
     <w:p>
@@ -9185,25 +9245,18 @@
       </w:pPr>
       <w:r>
         <w:rPr>
+          <w:b/>
           <w:color w:val="444444"/>
           <w:sz w:val="20"/>
         </w:rPr>
-        <w:t>paper and are cited, not claimed: the two Δ values (</w:t>
-      </w:r>
-      <w:r>
-        <w:rPr>
-          <w:b/>
+        <w:t>First-report attribution (a convention we hold to).</w:t>
+      </w:r>
+      <w:r>
+        <w:rPr>
           <w:color w:val="444444"/>
           <w:sz w:val="20"/>
         </w:rPr>
-        <w:t>+1.434 / +0.507 pp</w:t>
-      </w:r>
-      <w:r>
-        <w:rPr>
-          <w:color w:val="444444"/>
-          <w:sz w:val="20"/>
-        </w:rPr>
-        <w:t>), the three-way remediation</w:t>
+        <w:t xml:space="preserve"> Three things here belong to the companion</w:t>
       </w:r>
     </w:p>
     <w:p>
@@ -9215,7 +9268,22 @@
           <w:color w:val="444444"/>
           <w:sz w:val="20"/>
         </w:rPr>
-        <w:t>protocol itself, and the pre-registered multi-target replication (§9). What this paper reports first is</w:t>
+        <w:t>paper and are cited, not claimed: the two Δ values (</w:t>
+      </w:r>
+      <w:r>
+        <w:rPr>
+          <w:b/>
+          <w:color w:val="444444"/>
+          <w:sz w:val="20"/>
+        </w:rPr>
+        <w:t>+1.434 / +0.507 pp</w:t>
+      </w:r>
+      <w:r>
+        <w:rPr>
+          <w:color w:val="444444"/>
+          <w:sz w:val="20"/>
+        </w:rPr>
+        <w:t>), the three-way remediation</w:t>
       </w:r>
     </w:p>
     <w:p>
@@ -9227,7 +9295,7 @@
           <w:color w:val="444444"/>
           <w:sz w:val="20"/>
         </w:rPr>
-        <w:t>**the selection premium (§5), the 2 × 2 realization of that premium on a disjoint split (§8.6–8.7), and</w:t>
+        <w:t>protocol itself, and the pre-registered multi-target replication (§9). What this paper reports first is</w:t>
       </w:r>
     </w:p>
     <w:p>
@@ -9239,7 +9307,7 @@
           <w:color w:val="444444"/>
           <w:sz w:val="20"/>
         </w:rPr>
-        <w:t>the formalisation of the realization rate (§3.1)**. The full statement — including how the companion is</w:t>
+        <w:t>**the selection premium (§5), the 2 × 2 realization of that premium on a disjoint split (§8.6–8.7), and</w:t>
       </w:r>
     </w:p>
     <w:p>
@@ -9251,6 +9319,18 @@
           <w:color w:val="444444"/>
           <w:sz w:val="20"/>
         </w:rPr>
+        <w:t>the formalisation of the realization rate (§3.1)**. The full statement — including how the companion is</w:t>
+      </w:r>
+    </w:p>
+    <w:p>
+      <w:pPr>
+        <w:ind w:left="432"/>
+      </w:pPr>
+      <w:r>
+        <w:rPr>
+          <w:color w:val="444444"/>
+          <w:sz w:val="20"/>
+        </w:rPr>
         <w:t xml:space="preserve">named to the editor while it carries no identifier — is in </w:t>
       </w:r>
       <w:r>
@@ -9902,7 +9982,7 @@
         <w:pStyle w:val="Heading2"/>
       </w:pPr>
       <w:r>
-        <w:t>8.6 The premium's realization rate: **the claim-level interval includes zero** (pooled over all **26 arm-cells** the cell-clustered interval **excludes** zero — **Supplementary S19**) ([−17.3 %, 53.2 %], P = 0.118); the point estimates below are **descriptive** (arm-cell median **17.6 %**, five arm-cells, n = 10; run-weighted **23.3 %**)</w:t>
+        <w:t>8.6 The premium’s realization rate — **the claim-level interval includes zero**</w:t>
       </w:r>
     </w:p>
     <w:p>
@@ -14464,16 +14544,7 @@
         <w:t>reported</w:t>
       </w:r>
       <w:r>
-        <w:t xml:space="preserve"> unit (</w:t>
-      </w:r>
-      <w:r>
-        <w:rPr>
-          <w:b/>
-        </w:rPr>
-        <w:t>renamed `documented / locally scorable` where the claim is about the literature; see §S39</w:t>
-      </w:r>
-      <w:r>
-        <w:t xml:space="preserve">) </w:t>
+        <w:t xml:space="preserve"> unit </w:t>
       </w:r>
       <w:r>
         <w:rPr>
@@ -14669,7 +14740,7 @@
         <w:t>, §S30), and the run-only interval clears the band’s upper edge only by 2.9 pp.</w:t>
       </w:r>
       <w:r>
-        <w:t xml:space="preserve">4 %, +122.0 %]), above the pre-registered band. The registered second-corpus reproduction (§8.9) lands </w:t>
+        <w:t xml:space="preserve"> The registered second-corpus reproduction (§8.9) lands </w:t>
       </w:r>
       <w:r>
         <w:rPr>

</xml_diff>

<commit_message>
r6 batch 2: print section 8.8's two run-level bootstrap intervals side by side with their seeds (20261011 artifact: +80.4 to +122.0; 20261013 noise analysis: +76.9 to +135.5) and state that the 2.9 pp margin belongs to the latter; delete the section 11(ii) clause that contradicted section 8.8/8.9; regenerate the pagination artifact with the body word count (35 pages, 11939 words) rather than the abstract's. Pack rebuilt and delivered
</commit_message>
<xml_diff>
--- a/01_paper/P2_English_submission_blind_v1.docx
+++ b/01_paper/P2_English_submission_blind_v1.docx
@@ -14719,16 +14719,61 @@
         <w:rPr>
           <w:b/>
         </w:rPr>
-        <w:t xml:space="preserve">at full training budget on the same corpus the pooled rate rises to +99.2 % (95 % interval [+80.4 %, +122.0 %] on run-level variation alone; </w:t>
-      </w:r>
-      <w:r>
-        <w:t>+31.6 % to +225.0 % once endpoint noise is propagated</w:t>
-      </w:r>
-      <w:r>
-        <w:rPr>
-          <w:b/>
-        </w:rPr>
-        <w:t xml:space="preserve">, so the out-of-band reading is </w:t>
+        <w:t>at full training budget on the same corpus the pooled rate rises to +99.2 % (</w:t>
+      </w:r>
+      <w:r>
+        <w:t>two run-level bootstraps of the same 20 runs differ, so both are printed with their seeds</w:t>
+      </w:r>
+      <w:r>
+        <w:rPr>
+          <w:b/>
+        </w:rPr>
+        <w:t xml:space="preserve">: </w:t>
+      </w:r>
+      <w:r>
+        <w:t>seed 20261011</w:t>
+      </w:r>
+      <w:r>
+        <w:rPr>
+          <w:b/>
+        </w:rPr>
+        <w:t xml:space="preserve"> (§S13/Table S47) gives </w:t>
+      </w:r>
+      <w:r>
+        <w:t>[+80.4 %, +122.0 %]</w:t>
+      </w:r>
+      <w:r>
+        <w:rPr>
+          <w:b/>
+        </w:rPr>
+        <w:t xml:space="preserve">; </w:t>
+      </w:r>
+      <w:r>
+        <w:t>seed 20261013</w:t>
+      </w:r>
+      <w:r>
+        <w:rPr>
+          <w:b/>
+        </w:rPr>
+        <w:t xml:space="preserve"> (§S30) gives </w:t>
+      </w:r>
+      <w:r>
+        <w:t>[+76.9 %, +135.5 %]</w:t>
+      </w:r>
+      <w:r>
+        <w:rPr>
+          <w:b/>
+        </w:rPr>
+        <w:t xml:space="preserve">. Propagating the endpoint noise (√2 × 0.18 pp) puts the lower bound </w:t>
+      </w:r>
+      <w:r>
+        <w:t>inside</w:t>
+      </w:r>
+      <w:r>
+        <w:rPr>
+          <w:b/>
+        </w:rPr>
+        <w:t xml:space="preserve"> the band either way — the out-of-band reading is </w:t>
       </w:r>
       <w:r>
         <w:t>not robust</w:t>
@@ -14737,7 +14782,16 @@
         <w:rPr>
           <w:b/>
         </w:rPr>
-        <w:t>, §S30), and the run-only interval clears the band’s upper edge only by 2.9 pp.</w:t>
+        <w:t xml:space="preserve">. </w:t>
+      </w:r>
+      <w:r>
+        <w:t>The “2.9 pp” margin is the 20261013 bootstrap’s</w:t>
+      </w:r>
+      <w:r>
+        <w:rPr>
+          <w:b/>
+        </w:rPr>
+        <w:t>; on 20261011 it is 6.4 pp.)</w:t>
       </w:r>
       <w:r>
         <w:t xml:space="preserve"> The registered second-corpus reproduction (§8.9) lands </w:t>

</xml_diff>

<commit_message>
r6 batch 3: cite the eight-coder round that ships in the release (matrices, kappa, intake ledger); point the reproduction map's row 1 at the two per-run files that actually reproduce Table 4; delete the section 11(ii) clause that contradicted sections 8.8/8.9; scope the Declarations' availability sentence; and add Supplement S40 reconciling Proposition 4's <=1 with the measured ratios above 1 by naming the conditional assumption. Pack rebuilt and delivered
</commit_message>
<xml_diff>
--- a/01_paper/P2_English_submission_blind_v1.docx
+++ b/01_paper/P2_English_submission_blind_v1.docx
@@ -8216,6 +8216,71 @@
           <w:sz w:val="20"/>
         </w:rPr>
         <w:t>.</w:t>
+      </w:r>
+    </w:p>
+    <w:p>
+      <w:pPr>
+        <w:ind w:left="432"/>
+      </w:pPr>
+      <w:r>
+        <w:rPr>
+          <w:b/>
+          <w:color w:val="444444"/>
+          <w:sz w:val="20"/>
+        </w:rPr>
+        <w:t>The full round ships.</w:t>
+      </w:r>
+      <w:r>
+        <w:rPr>
+          <w:color w:val="444444"/>
+          <w:sz w:val="20"/>
+        </w:rPr>
+        <w:t xml:space="preserve"> The eight-coder blind matrices, the agreement statistics and the intake ledger are released with this package (</w:t>
+      </w:r>
+      <w:r>
+        <w:rPr>
+          <w:rFonts w:ascii="Consolas" w:hAnsi="Consolas"/>
+          <w:color w:val="444444"/>
+          <w:sz w:val="20"/>
+        </w:rPr>
+        <w:t>P2_coding_blind_matrices.json</w:t>
+      </w:r>
+      <w:r>
+        <w:rPr>
+          <w:color w:val="444444"/>
+          <w:sz w:val="20"/>
+        </w:rPr>
+        <w:t xml:space="preserve">, </w:t>
+      </w:r>
+      <w:r>
+        <w:rPr>
+          <w:rFonts w:ascii="Consolas" w:hAnsi="Consolas"/>
+          <w:color w:val="444444"/>
+          <w:sz w:val="20"/>
+        </w:rPr>
+        <w:t>P2_coding_kappa.json</w:t>
+      </w:r>
+      <w:r>
+        <w:rPr>
+          <w:color w:val="444444"/>
+          <w:sz w:val="20"/>
+        </w:rPr>
+        <w:t xml:space="preserve">, </w:t>
+      </w:r>
+      <w:r>
+        <w:rPr>
+          <w:rFonts w:ascii="Consolas" w:hAnsi="Consolas"/>
+          <w:color w:val="444444"/>
+          <w:sz w:val="20"/>
+        </w:rPr>
+        <w:t>P2_coding_intake_ledger.json</w:t>
+      </w:r>
+      <w:r>
+        <w:rPr>
+          <w:color w:val="444444"/>
+          <w:sz w:val="20"/>
+        </w:rPr>
+        <w:t>), so the panel reading above is re-derivable rather than asserted.</w:t>
       </w:r>
     </w:p>
     <w:p>
@@ -14332,30 +14397,25 @@
         <w:t>scoped to where it was measured</w:t>
       </w:r>
       <w:r>
-        <w:t xml:space="preserve"> — the practice is **most</w:t>
-      </w:r>
-    </w:p>
-    <w:p>
-      <w:r>
-        <w:t>damaging exactly where data is scarcest</w:t>
-      </w:r>
-      <w:r>
-        <w:rPr>
-          <w:b/>
-        </w:rPr>
-        <w:t xml:space="preserve">. ③④ </w:t>
-      </w:r>
-      <w:r>
+        <w:t xml:space="preserve">  ③④ </w:t>
+      </w:r>
+      <w:r>
+        <w:rPr>
+          <w:b/>
+        </w:rPr>
         <w:t>Test conventions and counting units</w:t>
       </w:r>
       <w:r>
-        <w:rPr>
-          <w:b/>
-        </w:rPr>
         <w:t xml:space="preserve"> (the two concrete asks): stated in </w:t>
       </w:r>
       <w:r>
-        <w:t>Supplementary S29**.</w:t>
+        <w:rPr>
+          <w:b/>
+        </w:rPr>
+        <w:t>Supplementary S29</w:t>
+      </w:r>
+      <w:r>
+        <w:t>.</w:t>
       </w:r>
     </w:p>
     <w:p>

</xml_diff>

<commit_message>
Reframe defect 10 proportionally and drop the cross-date-drift explanation. The memory switch is rare and transient, the run completes, and where the grid was re-run under ample VRAM the readings agree to within 0.05 pp. The one larger difference (about 0.44 pp) is below this paper's own measured same-configuration data-order spread of 0.515 pp, so it is ordinary replication noise rather than a drift or a memory-path effect; any residual between-host component is the usual CUDA/cuDNN reduction-order and GPU non-determinism that no configuration file records. Disposition: usable as printed, caveat named once, no retraining. Pack rebuilt and delivered
</commit_message>
<xml_diff>
--- a/01_paper/P2_English_submission_blind_v1.docx
+++ b/01_paper/P2_English_submission_blind_v1.docx
@@ -13230,16 +13230,14 @@
         <w:tblLook w:firstColumn="1" w:firstRow="1" w:lastColumn="0" w:lastRow="0" w:noHBand="0" w:noVBand="1" w:val="04A0"/>
       </w:tblPr>
       <w:tblGrid>
-        <w:gridCol w:w="1728"/>
-        <w:gridCol w:w="1728"/>
-        <w:gridCol w:w="1728"/>
-        <w:gridCol w:w="1728"/>
-        <w:gridCol w:w="1728"/>
+        <w:gridCol w:w="2880"/>
+        <w:gridCol w:w="2880"/>
+        <w:gridCol w:w="2880"/>
       </w:tblGrid>
       <w:tr>
         <w:tc>
           <w:tcPr>
-            <w:tcW w:type="dxa" w:w="1728"/>
+            <w:tcW w:type="dxa" w:w="2880"/>
           </w:tcPr>
           <w:p>
             <w:r>
@@ -13253,7 +13251,7 @@
         </w:tc>
         <w:tc>
           <w:tcPr>
-            <w:tcW w:type="dxa" w:w="1728"/>
+            <w:tcW w:type="dxa" w:w="2880"/>
           </w:tcPr>
           <w:p>
             <w:r>
@@ -13267,7 +13265,7 @@
         </w:tc>
         <w:tc>
           <w:tcPr>
-            <w:tcW w:type="dxa" w:w="1728"/>
+            <w:tcW w:type="dxa" w:w="2880"/>
           </w:tcPr>
           <w:p>
             <w:r>
@@ -13279,23 +13277,11 @@
             </w:r>
           </w:p>
         </w:tc>
-        <w:tc>
-          <w:tcPr>
-            <w:tcW w:type="dxa" w:w="1728"/>
-          </w:tcPr>
-          <w:p/>
-        </w:tc>
-        <w:tc>
-          <w:tcPr>
-            <w:tcW w:type="dxa" w:w="1728"/>
-          </w:tcPr>
-          <w:p/>
-        </w:tc>
       </w:tr>
       <w:tr>
         <w:tc>
           <w:tcPr>
-            <w:tcW w:type="dxa" w:w="1728"/>
+            <w:tcW w:type="dxa" w:w="2880"/>
           </w:tcPr>
           <w:p>
             <w:r>
@@ -13308,7 +13294,7 @@
         </w:tc>
         <w:tc>
           <w:tcPr>
-            <w:tcW w:type="dxa" w:w="1728"/>
+            <w:tcW w:type="dxa" w:w="2880"/>
           </w:tcPr>
           <w:p>
             <w:r>
@@ -13321,7 +13307,7 @@
         </w:tc>
         <w:tc>
           <w:tcPr>
-            <w:tcW w:type="dxa" w:w="1728"/>
+            <w:tcW w:type="dxa" w:w="2880"/>
           </w:tcPr>
           <w:p>
             <w:r>
@@ -13332,23 +13318,11 @@
             </w:r>
           </w:p>
         </w:tc>
-        <w:tc>
-          <w:tcPr>
-            <w:tcW w:type="dxa" w:w="1728"/>
-          </w:tcPr>
-          <w:p/>
-        </w:tc>
-        <w:tc>
-          <w:tcPr>
-            <w:tcW w:type="dxa" w:w="1728"/>
-          </w:tcPr>
-          <w:p/>
-        </w:tc>
       </w:tr>
       <w:tr>
         <w:tc>
           <w:tcPr>
-            <w:tcW w:type="dxa" w:w="1728"/>
+            <w:tcW w:type="dxa" w:w="2880"/>
           </w:tcPr>
           <w:p>
             <w:r>
@@ -13361,7 +13335,7 @@
         </w:tc>
         <w:tc>
           <w:tcPr>
-            <w:tcW w:type="dxa" w:w="1728"/>
+            <w:tcW w:type="dxa" w:w="2880"/>
           </w:tcPr>
           <w:p>
             <w:r>
@@ -13426,7 +13400,7 @@
         </w:tc>
         <w:tc>
           <w:tcPr>
-            <w:tcW w:type="dxa" w:w="1728"/>
+            <w:tcW w:type="dxa" w:w="2880"/>
           </w:tcPr>
           <w:p>
             <w:r>
@@ -13470,23 +13444,11 @@
             </w:r>
           </w:p>
         </w:tc>
-        <w:tc>
-          <w:tcPr>
-            <w:tcW w:type="dxa" w:w="1728"/>
-          </w:tcPr>
-          <w:p/>
-        </w:tc>
-        <w:tc>
-          <w:tcPr>
-            <w:tcW w:type="dxa" w:w="1728"/>
-          </w:tcPr>
-          <w:p/>
-        </w:tc>
       </w:tr>
       <w:tr>
         <w:tc>
           <w:tcPr>
-            <w:tcW w:type="dxa" w:w="1728"/>
+            <w:tcW w:type="dxa" w:w="2880"/>
           </w:tcPr>
           <w:p>
             <w:r>
@@ -13499,7 +13461,7 @@
         </w:tc>
         <w:tc>
           <w:tcPr>
-            <w:tcW w:type="dxa" w:w="1728"/>
+            <w:tcW w:type="dxa" w:w="2880"/>
           </w:tcPr>
           <w:p>
             <w:r>
@@ -13538,7 +13500,7 @@
         </w:tc>
         <w:tc>
           <w:tcPr>
-            <w:tcW w:type="dxa" w:w="1728"/>
+            <w:tcW w:type="dxa" w:w="2880"/>
           </w:tcPr>
           <w:p>
             <w:r>
@@ -13569,23 +13531,11 @@
             </w:r>
           </w:p>
         </w:tc>
-        <w:tc>
-          <w:tcPr>
-            <w:tcW w:type="dxa" w:w="1728"/>
-          </w:tcPr>
-          <w:p/>
-        </w:tc>
-        <w:tc>
-          <w:tcPr>
-            <w:tcW w:type="dxa" w:w="1728"/>
-          </w:tcPr>
-          <w:p/>
-        </w:tc>
       </w:tr>
       <w:tr>
         <w:tc>
           <w:tcPr>
-            <w:tcW w:type="dxa" w:w="1728"/>
+            <w:tcW w:type="dxa" w:w="2880"/>
           </w:tcPr>
           <w:p>
             <w:r>
@@ -13598,7 +13548,7 @@
         </w:tc>
         <w:tc>
           <w:tcPr>
-            <w:tcW w:type="dxa" w:w="1728"/>
+            <w:tcW w:type="dxa" w:w="2880"/>
           </w:tcPr>
           <w:p>
             <w:r>
@@ -13631,7 +13581,7 @@
         </w:tc>
         <w:tc>
           <w:tcPr>
-            <w:tcW w:type="dxa" w:w="1728"/>
+            <w:tcW w:type="dxa" w:w="2880"/>
           </w:tcPr>
           <w:p>
             <w:r>
@@ -13649,23 +13599,11 @@
             </w:r>
           </w:p>
         </w:tc>
-        <w:tc>
-          <w:tcPr>
-            <w:tcW w:type="dxa" w:w="1728"/>
-          </w:tcPr>
-          <w:p/>
-        </w:tc>
-        <w:tc>
-          <w:tcPr>
-            <w:tcW w:type="dxa" w:w="1728"/>
-          </w:tcPr>
-          <w:p/>
-        </w:tc>
       </w:tr>
       <w:tr>
         <w:tc>
           <w:tcPr>
-            <w:tcW w:type="dxa" w:w="1728"/>
+            <w:tcW w:type="dxa" w:w="2880"/>
           </w:tcPr>
           <w:p>
             <w:r>
@@ -13678,7 +13616,7 @@
         </w:tc>
         <w:tc>
           <w:tcPr>
-            <w:tcW w:type="dxa" w:w="1728"/>
+            <w:tcW w:type="dxa" w:w="2880"/>
           </w:tcPr>
           <w:p>
             <w:r>
@@ -13717,7 +13655,7 @@
         </w:tc>
         <w:tc>
           <w:tcPr>
-            <w:tcW w:type="dxa" w:w="1728"/>
+            <w:tcW w:type="dxa" w:w="2880"/>
           </w:tcPr>
           <w:p>
             <w:r>
@@ -13748,23 +13686,11 @@
             </w:r>
           </w:p>
         </w:tc>
-        <w:tc>
-          <w:tcPr>
-            <w:tcW w:type="dxa" w:w="1728"/>
-          </w:tcPr>
-          <w:p/>
-        </w:tc>
-        <w:tc>
-          <w:tcPr>
-            <w:tcW w:type="dxa" w:w="1728"/>
-          </w:tcPr>
-          <w:p/>
-        </w:tc>
       </w:tr>
       <w:tr>
         <w:tc>
           <w:tcPr>
-            <w:tcW w:type="dxa" w:w="1728"/>
+            <w:tcW w:type="dxa" w:w="2880"/>
           </w:tcPr>
           <w:p>
             <w:r>
@@ -13777,7 +13703,7 @@
         </w:tc>
         <w:tc>
           <w:tcPr>
-            <w:tcW w:type="dxa" w:w="1728"/>
+            <w:tcW w:type="dxa" w:w="2880"/>
           </w:tcPr>
           <w:p>
             <w:r>
@@ -13797,7 +13723,7 @@
         </w:tc>
         <w:tc>
           <w:tcPr>
-            <w:tcW w:type="dxa" w:w="1728"/>
+            <w:tcW w:type="dxa" w:w="2880"/>
           </w:tcPr>
           <w:p>
             <w:r>
@@ -13815,23 +13741,11 @@
             </w:r>
           </w:p>
         </w:tc>
-        <w:tc>
-          <w:tcPr>
-            <w:tcW w:type="dxa" w:w="1728"/>
-          </w:tcPr>
-          <w:p/>
-        </w:tc>
-        <w:tc>
-          <w:tcPr>
-            <w:tcW w:type="dxa" w:w="1728"/>
-          </w:tcPr>
-          <w:p/>
-        </w:tc>
       </w:tr>
       <w:tr>
         <w:tc>
           <w:tcPr>
-            <w:tcW w:type="dxa" w:w="1728"/>
+            <w:tcW w:type="dxa" w:w="2880"/>
           </w:tcPr>
           <w:p>
             <w:r>
@@ -13844,7 +13758,7 @@
         </w:tc>
         <w:tc>
           <w:tcPr>
-            <w:tcW w:type="dxa" w:w="1728"/>
+            <w:tcW w:type="dxa" w:w="2880"/>
           </w:tcPr>
           <w:p>
             <w:r>
@@ -13896,7 +13810,7 @@
         </w:tc>
         <w:tc>
           <w:tcPr>
-            <w:tcW w:type="dxa" w:w="1728"/>
+            <w:tcW w:type="dxa" w:w="2880"/>
           </w:tcPr>
           <w:p>
             <w:r>
@@ -13914,23 +13828,11 @@
             </w:r>
           </w:p>
         </w:tc>
-        <w:tc>
-          <w:tcPr>
-            <w:tcW w:type="dxa" w:w="1728"/>
-          </w:tcPr>
-          <w:p/>
-        </w:tc>
-        <w:tc>
-          <w:tcPr>
-            <w:tcW w:type="dxa" w:w="1728"/>
-          </w:tcPr>
-          <w:p/>
-        </w:tc>
       </w:tr>
       <w:tr>
         <w:tc>
           <w:tcPr>
-            <w:tcW w:type="dxa" w:w="1728"/>
+            <w:tcW w:type="dxa" w:w="2880"/>
           </w:tcPr>
           <w:p>
             <w:r>
@@ -13943,7 +13845,7 @@
         </w:tc>
         <w:tc>
           <w:tcPr>
-            <w:tcW w:type="dxa" w:w="1728"/>
+            <w:tcW w:type="dxa" w:w="2880"/>
           </w:tcPr>
           <w:p>
             <w:r>
@@ -13969,7 +13871,7 @@
         </w:tc>
         <w:tc>
           <w:tcPr>
-            <w:tcW w:type="dxa" w:w="1728"/>
+            <w:tcW w:type="dxa" w:w="2880"/>
           </w:tcPr>
           <w:p>
             <w:r>
@@ -13987,23 +13889,11 @@
             </w:r>
           </w:p>
         </w:tc>
-        <w:tc>
-          <w:tcPr>
-            <w:tcW w:type="dxa" w:w="1728"/>
-          </w:tcPr>
-          <w:p/>
-        </w:tc>
-        <w:tc>
-          <w:tcPr>
-            <w:tcW w:type="dxa" w:w="1728"/>
-          </w:tcPr>
-          <w:p/>
-        </w:tc>
       </w:tr>
       <w:tr>
         <w:tc>
           <w:tcPr>
-            <w:tcW w:type="dxa" w:w="1728"/>
+            <w:tcW w:type="dxa" w:w="2880"/>
           </w:tcPr>
           <w:p>
             <w:r>
@@ -14016,7 +13906,7 @@
         </w:tc>
         <w:tc>
           <w:tcPr>
-            <w:tcW w:type="dxa" w:w="1728"/>
+            <w:tcW w:type="dxa" w:w="2880"/>
           </w:tcPr>
           <w:p>
             <w:r>
@@ -14036,7 +13926,7 @@
         </w:tc>
         <w:tc>
           <w:tcPr>
-            <w:tcW w:type="dxa" w:w="1728"/>
+            <w:tcW w:type="dxa" w:w="2880"/>
           </w:tcPr>
           <w:p>
             <w:r>
@@ -14054,23 +13944,11 @@
             </w:r>
           </w:p>
         </w:tc>
-        <w:tc>
-          <w:tcPr>
-            <w:tcW w:type="dxa" w:w="1728"/>
-          </w:tcPr>
-          <w:p/>
-        </w:tc>
-        <w:tc>
-          <w:tcPr>
-            <w:tcW w:type="dxa" w:w="1728"/>
-          </w:tcPr>
-          <w:p/>
-        </w:tc>
       </w:tr>
       <w:tr>
         <w:tc>
           <w:tcPr>
-            <w:tcW w:type="dxa" w:w="1728"/>
+            <w:tcW w:type="dxa" w:w="2880"/>
           </w:tcPr>
           <w:p>
             <w:r>
@@ -14083,7 +13961,7 @@
         </w:tc>
         <w:tc>
           <w:tcPr>
-            <w:tcW w:type="dxa" w:w="1728"/>
+            <w:tcW w:type="dxa" w:w="2880"/>
           </w:tcPr>
           <w:p>
             <w:r>
@@ -14103,7 +13981,7 @@
         </w:tc>
         <w:tc>
           <w:tcPr>
-            <w:tcW w:type="dxa" w:w="1728"/>
+            <w:tcW w:type="dxa" w:w="2880"/>
           </w:tcPr>
           <w:p>
             <w:r>
@@ -14121,23 +13999,11 @@
             </w:r>
           </w:p>
         </w:tc>
-        <w:tc>
-          <w:tcPr>
-            <w:tcW w:type="dxa" w:w="1728"/>
-          </w:tcPr>
-          <w:p/>
-        </w:tc>
-        <w:tc>
-          <w:tcPr>
-            <w:tcW w:type="dxa" w:w="1728"/>
-          </w:tcPr>
-          <w:p/>
-        </w:tc>
       </w:tr>
       <w:tr>
         <w:tc>
           <w:tcPr>
-            <w:tcW w:type="dxa" w:w="1728"/>
+            <w:tcW w:type="dxa" w:w="2880"/>
           </w:tcPr>
           <w:p>
             <w:r>
@@ -14150,7 +14016,7 @@
         </w:tc>
         <w:tc>
           <w:tcPr>
-            <w:tcW w:type="dxa" w:w="1728"/>
+            <w:tcW w:type="dxa" w:w="2880"/>
           </w:tcPr>
           <w:p>
             <w:r>
@@ -14183,7 +14049,7 @@
         </w:tc>
         <w:tc>
           <w:tcPr>
-            <w:tcW w:type="dxa" w:w="1728"/>
+            <w:tcW w:type="dxa" w:w="2880"/>
           </w:tcPr>
           <w:p>
             <w:r>
@@ -14191,65 +14057,72 @@
                 <w:b/>
                 <w:sz w:val="18"/>
               </w:rPr>
-              <w:t>Disclosed, not retracted</w:t>
+              <w:t>Disclosed proportionally</w:t>
             </w:r>
             <w:r>
               <w:rPr>
                 <w:sz w:val="18"/>
               </w:rPr>
-              <w:t>; the affected cells were re-run clean (six pairs twice each, `</w:t>
-            </w:r>
-          </w:p>
-        </w:tc>
-        <w:tc>
-          <w:tcPr>
-            <w:tcW w:type="dxa" w:w="1728"/>
-          </w:tcPr>
-          <w:p>
-            <w:r>
-              <w:rPr>
-                <w:sz w:val="18"/>
-              </w:rPr>
-              <w:t>clean2 − clean1</w:t>
-            </w:r>
-          </w:p>
-        </w:tc>
-        <w:tc>
-          <w:tcPr>
-            <w:tcW w:type="dxa" w:w="1728"/>
-          </w:tcPr>
-          <w:p>
-            <w:r>
-              <w:rPr>
-                <w:sz w:val="18"/>
-              </w:rPr>
-              <w:t>= 0.000</w:t>
-            </w:r>
-            <w:r>
-              <w:rPr>
-                <w:rFonts w:ascii="Consolas" w:hAnsi="Consolas"/>
-                <w:sz w:val="18"/>
-              </w:rPr>
-              <w:t xml:space="preserve"> throughout) and the four affected </w:t>
-            </w:r>
-            <w:r>
-              <w:rPr>
-                <w:sz w:val="18"/>
-              </w:rPr>
-              <w:t xml:space="preserve">p_vistod15` runs reproduce to ≤ 0.15 pp — </w:t>
+              <w:t xml:space="preserve">: the switch is </w:t>
             </w:r>
             <w:r>
               <w:rPr>
                 <w:b/>
                 <w:sz w:val="18"/>
               </w:rPr>
-              <w:t>Supplementary S41</w:t>
+              <w:t>rare and transient</w:t>
             </w:r>
             <w:r>
               <w:rPr>
                 <w:sz w:val="18"/>
               </w:rPr>
-              <w:t>; the bound this buys is stated there, verbatim with this row.</w:t>
+              <w:t xml:space="preserve"> (92 log events, one cell), training </w:t>
+            </w:r>
+            <w:r>
+              <w:rPr>
+                <w:b/>
+                <w:sz w:val="18"/>
+              </w:rPr>
+              <w:t>completes</w:t>
+            </w:r>
+            <w:r>
+              <w:rPr>
+                <w:sz w:val="18"/>
+              </w:rPr>
+              <w:t xml:space="preserve">, and the re-run under ample VRAM agrees to </w:t>
+            </w:r>
+            <w:r>
+              <w:rPr>
+                <w:b/>
+                <w:sz w:val="18"/>
+              </w:rPr>
+              <w:t>≤ 0.05 pp</w:t>
+            </w:r>
+            <w:r>
+              <w:rPr>
+                <w:sz w:val="18"/>
+              </w:rPr>
+              <w:t xml:space="preserve">; the only larger difference (≈ 0.44 pp) is </w:t>
+            </w:r>
+            <w:r>
+              <w:rPr>
+                <w:b/>
+                <w:sz w:val="18"/>
+              </w:rPr>
+              <w:t>below the paper’s own data-order spread of 0.515 pp</w:t>
+            </w:r>
+            <w:r>
+              <w:rPr>
+                <w:sz w:val="18"/>
+              </w:rPr>
+              <w:t xml:space="preserve"> (§8.4) — ordinary replication noise, not a memory-path effect. </w:t>
+            </w:r>
+            <w:r>
+              <w:rPr>
+                <w:b/>
+                <w:sz w:val="18"/>
+              </w:rPr>
+              <w:t>No retraining is warranted.</w:t>
             </w:r>
           </w:p>
         </w:tc>

</xml_diff>

<commit_message>
r6 writing pass 2: disambiguate the three realization-rate tables (S33 is the pool-restricted sensitivity over E=100, S35 the six-cell co-primary) and state in the glossary that pool composition is an assumption rather than a constant; note in 8.9 that its rates are per-arm while 8.6's headline pools across cells, so the two are not the same estimator and are never compared numerically; and tell the reader that the relocated section S45 keeps its pre-relocation citation numbers while the article's list is numbered by first appearance, so author names should be matched rather than numbers. Pack rebuilt and delivered
</commit_message>
<xml_diff>
--- a/01_paper/P2_English_submission_blind_v1.docx
+++ b/01_paper/P2_English_submission_blind_v1.docx
@@ -12691,6 +12691,86 @@
       </w:pPr>
       <w:r>
         <w:t>8.9 A second corpus at full budget: the premium and its realization are corpus properties</w:t>
+      </w:r>
+    </w:p>
+    <w:p>
+      <w:pPr>
+        <w:ind w:left="432"/>
+      </w:pPr>
+      <w:r>
+        <w:rPr>
+          <w:b/>
+          <w:color w:val="444444"/>
+          <w:sz w:val="20"/>
+        </w:rPr>
+        <w:t>Estimator note (added this revision).</w:t>
+      </w:r>
+      <w:r>
+        <w:rPr>
+          <w:color w:val="444444"/>
+          <w:sz w:val="20"/>
+        </w:rPr>
+        <w:t xml:space="preserve"> The rates printed here are </w:t>
+      </w:r>
+      <w:r>
+        <w:rPr>
+          <w:b/>
+          <w:color w:val="444444"/>
+          <w:sz w:val="20"/>
+        </w:rPr>
+        <w:t>per-arm</w:t>
+      </w:r>
+      <w:r>
+        <w:rPr>
+          <w:color w:val="444444"/>
+          <w:sz w:val="20"/>
+        </w:rPr>
+        <w:t xml:space="preserve"> (</w:t>
+      </w:r>
+      <w:r>
+        <w:rPr>
+          <w:rFonts w:ascii="Consolas" w:hAnsi="Consolas"/>
+          <w:color w:val="444444"/>
+          <w:sz w:val="20"/>
+        </w:rPr>
+        <w:t>mean(prem_test)/mean(prem_val)</w:t>
+      </w:r>
+      <w:r>
+        <w:rPr>
+          <w:color w:val="444444"/>
+          <w:sz w:val="20"/>
+        </w:rPr>
+        <w:t xml:space="preserve"> within an arm), whereas §8.6’s headline pools </w:t>
+      </w:r>
+      <w:r>
+        <w:rPr>
+          <w:b/>
+          <w:color w:val="444444"/>
+          <w:sz w:val="20"/>
+        </w:rPr>
+        <w:t>across cells</w:t>
+      </w:r>
+      <w:r>
+        <w:rPr>
+          <w:color w:val="444444"/>
+          <w:sz w:val="20"/>
+        </w:rPr>
+        <w:t xml:space="preserve">. The two are </w:t>
+      </w:r>
+      <w:r>
+        <w:rPr>
+          <w:b/>
+          <w:color w:val="444444"/>
+          <w:sz w:val="20"/>
+        </w:rPr>
+        <w:t>not the same estimator</w:t>
+      </w:r>
+      <w:r>
+        <w:rPr>
+          <w:color w:val="444444"/>
+          <w:sz w:val="20"/>
+        </w:rPr>
+        <w:t xml:space="preserve"> and are not compared numerically anywhere in this paper; the per-arm form is used here because the two arms differ in sign and pooling them would cancel exactly the effect the section is about.</w:t>
       </w:r>
     </w:p>
     <w:p>

</xml_diff>